<commit_message>
doc(Rapport de projet) écriture du chapitre "Analyse fonctionnelle" et "Planification Initiale"
</commit_message>
<xml_diff>
--- a/doc/Rapport.docx
+++ b/doc/Rapport.docx
@@ -506,6 +506,407 @@
         <w:t>Analyse fonctionnelle</w:t>
       </w:r>
     </w:p>
+    <w:p>
+      <w:hyperlink r:id="rId6" w:history="1">
+        <w:r>
+          <w:rPr>
+            <w:rStyle w:val="Lienhypertexte"/>
+          </w:rPr>
+          <w:t>Lien vers les User</w:t>
+        </w:r>
+        <w:r>
+          <w:rPr>
+            <w:rStyle w:val="Lienhypertexte"/>
+          </w:rPr>
+          <w:t xml:space="preserve"> </w:t>
+        </w:r>
+        <w:r>
+          <w:rPr>
+            <w:rStyle w:val="Lienhypertexte"/>
+          </w:rPr>
+          <w:t>Stories</w:t>
+        </w:r>
+      </w:hyperlink>
+    </w:p>
+    <w:p>
+      <w:pPr>
+        <w:pStyle w:val="Titre2"/>
+      </w:pPr>
+      <w:r>
+        <w:t>Planification Initiale</w:t>
+      </w:r>
+    </w:p>
+    <w:tbl>
+      <w:tblPr>
+        <w:tblStyle w:val="Grilledutableau"/>
+        <w:tblW w:w="0" w:type="auto"/>
+        <w:tblLook w:val="04A0" w:firstRow="1" w:lastRow="0" w:firstColumn="1" w:lastColumn="0" w:noHBand="0" w:noVBand="1"/>
+      </w:tblPr>
+      <w:tblGrid>
+        <w:gridCol w:w="2122"/>
+        <w:gridCol w:w="6940"/>
+      </w:tblGrid>
+      <w:tr>
+        <w:tc>
+          <w:tcPr>
+            <w:tcW w:w="2122" w:type="dxa"/>
+          </w:tcPr>
+          <w:p>
+            <w:pPr>
+              <w:rPr>
+                <w:b/>
+                <w:bCs/>
+              </w:rPr>
+            </w:pPr>
+            <w:r>
+              <w:rPr>
+                <w:b/>
+                <w:bCs/>
+              </w:rPr>
+              <w:t>Date de fin prévu de la tâche</w:t>
+            </w:r>
+          </w:p>
+        </w:tc>
+        <w:tc>
+          <w:tcPr>
+            <w:tcW w:w="6940" w:type="dxa"/>
+          </w:tcPr>
+          <w:p>
+            <w:pPr>
+              <w:rPr>
+                <w:b/>
+                <w:bCs/>
+              </w:rPr>
+            </w:pPr>
+            <w:r>
+              <w:rPr>
+                <w:b/>
+                <w:bCs/>
+              </w:rPr>
+              <w:t>Tâche</w:t>
+            </w:r>
+            <w:r>
+              <w:rPr>
+                <w:b/>
+                <w:bCs/>
+              </w:rPr>
+              <w:t xml:space="preserve"> à </w:t>
+            </w:r>
+            <w:r>
+              <w:rPr>
+                <w:b/>
+                <w:bCs/>
+              </w:rPr>
+              <w:t>faire (lien vers leurs User Stories)</w:t>
+            </w:r>
+          </w:p>
+        </w:tc>
+      </w:tr>
+      <w:tr>
+        <w:tc>
+          <w:tcPr>
+            <w:tcW w:w="2122" w:type="dxa"/>
+          </w:tcPr>
+          <w:p>
+            <w:r>
+              <w:t>18.09.2026</w:t>
+            </w:r>
+          </w:p>
+        </w:tc>
+        <w:tc>
+          <w:tcPr>
+            <w:tcW w:w="6940" w:type="dxa"/>
+          </w:tcPr>
+          <w:p>
+            <w:hyperlink r:id="rId7" w:history="1">
+              <w:r>
+                <w:rPr>
+                  <w:rStyle w:val="Lienhypertexte"/>
+                </w:rPr>
+                <w:t>Ajout du mouvemen</w:t>
+              </w:r>
+              <w:r>
+                <w:rPr>
+                  <w:rStyle w:val="Lienhypertexte"/>
+                </w:rPr>
+                <w:t>t</w:t>
+              </w:r>
+              <w:r>
+                <w:rPr>
+                  <w:rStyle w:val="Lienhypertexte"/>
+                </w:rPr>
+                <w:t xml:space="preserve"> WASD</w:t>
+              </w:r>
+            </w:hyperlink>
+          </w:p>
+        </w:tc>
+      </w:tr>
+      <w:tr>
+        <w:tc>
+          <w:tcPr>
+            <w:tcW w:w="2122" w:type="dxa"/>
+          </w:tcPr>
+          <w:p>
+            <w:r>
+              <w:t>1</w:t>
+            </w:r>
+            <w:r>
+              <w:t>8</w:t>
+            </w:r>
+            <w:r>
+              <w:t>.09.2026</w:t>
+            </w:r>
+          </w:p>
+        </w:tc>
+        <w:tc>
+          <w:tcPr>
+            <w:tcW w:w="6940" w:type="dxa"/>
+          </w:tcPr>
+          <w:p>
+            <w:hyperlink r:id="rId8" w:history="1">
+              <w:r>
+                <w:rPr>
+                  <w:rStyle w:val="Lienhypertexte"/>
+                </w:rPr>
+                <w:t>pouvoir tirer des projectile sur mes enemies</w:t>
+              </w:r>
+            </w:hyperlink>
+          </w:p>
+        </w:tc>
+      </w:tr>
+      <w:tr>
+        <w:tc>
+          <w:tcPr>
+            <w:tcW w:w="2122" w:type="dxa"/>
+          </w:tcPr>
+          <w:p>
+            <w:r>
+              <w:t>25</w:t>
+            </w:r>
+            <w:r>
+              <w:t>.09.2026</w:t>
+            </w:r>
+          </w:p>
+        </w:tc>
+        <w:tc>
+          <w:tcPr>
+            <w:tcW w:w="6940" w:type="dxa"/>
+          </w:tcPr>
+          <w:p>
+            <w:hyperlink r:id="rId9" w:history="1">
+              <w:r>
+                <w:rPr>
+                  <w:rStyle w:val="Lienhypertexte"/>
+                </w:rPr>
+                <w:t>pouvoir faire des degats au corp à corp</w:t>
+              </w:r>
+            </w:hyperlink>
+          </w:p>
+        </w:tc>
+      </w:tr>
+      <w:tr>
+        <w:tc>
+          <w:tcPr>
+            <w:tcW w:w="2122" w:type="dxa"/>
+          </w:tcPr>
+          <w:p>
+            <w:r>
+              <w:t>25.09.2026</w:t>
+            </w:r>
+          </w:p>
+        </w:tc>
+        <w:tc>
+          <w:tcPr>
+            <w:tcW w:w="6940" w:type="dxa"/>
+          </w:tcPr>
+          <w:p>
+            <w:hyperlink r:id="rId10" w:history="1">
+              <w:r>
+                <w:rPr>
+                  <w:rStyle w:val="Lienhypertexte"/>
+                </w:rPr>
+                <w:t>Ajouter un compteur de PV</w:t>
+              </w:r>
+            </w:hyperlink>
+          </w:p>
+        </w:tc>
+      </w:tr>
+      <w:tr>
+        <w:tc>
+          <w:tcPr>
+            <w:tcW w:w="2122" w:type="dxa"/>
+          </w:tcPr>
+          <w:p>
+            <w:r>
+              <w:t>25.09.2026</w:t>
+            </w:r>
+          </w:p>
+        </w:tc>
+        <w:tc>
+          <w:tcPr>
+            <w:tcW w:w="6940" w:type="dxa"/>
+          </w:tcPr>
+          <w:p>
+            <w:hyperlink r:id="rId11" w:history="1">
+              <w:r>
+                <w:rPr>
+                  <w:rStyle w:val="Lienhypertexte"/>
+                </w:rPr>
+                <w:t>Ajouter un compteur d’argent</w:t>
+              </w:r>
+            </w:hyperlink>
+          </w:p>
+        </w:tc>
+      </w:tr>
+      <w:tr>
+        <w:tc>
+          <w:tcPr>
+            <w:tcW w:w="2122" w:type="dxa"/>
+          </w:tcPr>
+          <w:p>
+            <w:r>
+              <w:t>02.10.2026</w:t>
+            </w:r>
+          </w:p>
+        </w:tc>
+        <w:tc>
+          <w:tcPr>
+            <w:tcW w:w="6940" w:type="dxa"/>
+          </w:tcPr>
+          <w:p>
+            <w:hyperlink r:id="rId12" w:history="1">
+              <w:r>
+                <w:rPr>
+                  <w:rStyle w:val="Lienhypertexte"/>
+                </w:rPr>
+                <w:t>Créer des ennemies de type manager</w:t>
+              </w:r>
+            </w:hyperlink>
+          </w:p>
+        </w:tc>
+      </w:tr>
+      <w:tr>
+        <w:tc>
+          <w:tcPr>
+            <w:tcW w:w="2122" w:type="dxa"/>
+          </w:tcPr>
+          <w:p>
+            <w:r>
+              <w:t>02</w:t>
+            </w:r>
+            <w:r>
+              <w:t>.10.2026</w:t>
+            </w:r>
+          </w:p>
+        </w:tc>
+        <w:tc>
+          <w:tcPr>
+            <w:tcW w:w="6940" w:type="dxa"/>
+          </w:tcPr>
+          <w:p>
+            <w:hyperlink r:id="rId13" w:history="1">
+              <w:r>
+                <w:rPr>
+                  <w:rStyle w:val="Lienhypertexte"/>
+                </w:rPr>
+                <w:t xml:space="preserve">Créer </w:t>
+              </w:r>
+              <w:r>
+                <w:rPr>
+                  <w:rStyle w:val="Lienhypertexte"/>
+                </w:rPr>
+                <w:t>les projectiles des managers</w:t>
+              </w:r>
+            </w:hyperlink>
+          </w:p>
+        </w:tc>
+      </w:tr>
+      <w:tr>
+        <w:tc>
+          <w:tcPr>
+            <w:tcW w:w="2122" w:type="dxa"/>
+          </w:tcPr>
+          <w:p>
+            <w:r>
+              <w:t>11</w:t>
+            </w:r>
+            <w:r>
+              <w:t>.10.2026</w:t>
+            </w:r>
+          </w:p>
+        </w:tc>
+        <w:tc>
+          <w:tcPr>
+            <w:tcW w:w="6940" w:type="dxa"/>
+          </w:tcPr>
+          <w:p>
+            <w:hyperlink r:id="rId14" w:history="1">
+              <w:r>
+                <w:rPr>
+                  <w:rStyle w:val="Lienhypertexte"/>
+                </w:rPr>
+                <w:t>Créer des ennemies de type robot</w:t>
+              </w:r>
+            </w:hyperlink>
+          </w:p>
+        </w:tc>
+      </w:tr>
+      <w:tr>
+        <w:tc>
+          <w:tcPr>
+            <w:tcW w:w="2122" w:type="dxa"/>
+          </w:tcPr>
+          <w:p>
+            <w:r>
+              <w:t>11.10.2026</w:t>
+            </w:r>
+          </w:p>
+        </w:tc>
+        <w:tc>
+          <w:tcPr>
+            <w:tcW w:w="6940" w:type="dxa"/>
+          </w:tcPr>
+          <w:p>
+            <w:hyperlink r:id="rId15" w:history="1">
+              <w:r>
+                <w:rPr>
+                  <w:rStyle w:val="Lienhypertexte"/>
+                </w:rPr>
+                <w:t>Créer les projectiles des robots</w:t>
+              </w:r>
+            </w:hyperlink>
+          </w:p>
+        </w:tc>
+      </w:tr>
+      <w:tr>
+        <w:tc>
+          <w:tcPr>
+            <w:tcW w:w="2122" w:type="dxa"/>
+          </w:tcPr>
+          <w:p>
+            <w:r>
+              <w:t>18.10.2026</w:t>
+            </w:r>
+          </w:p>
+        </w:tc>
+        <w:tc>
+          <w:tcPr>
+            <w:tcW w:w="6940" w:type="dxa"/>
+          </w:tcPr>
+          <w:p>
+            <w:hyperlink r:id="rId16" w:history="1">
+              <w:r>
+                <w:rPr>
+                  <w:rStyle w:val="Lienhypertexte"/>
+                </w:rPr>
+                <w:t>Créer les obstacles</w:t>
+              </w:r>
+            </w:hyperlink>
+          </w:p>
+        </w:tc>
+      </w:tr>
+    </w:tbl>
+    <w:p/>
     <w:sectPr>
       <w:pgSz w:w="11906" w:h="16838"/>
       <w:pgMar w:top="1417" w:right="1417" w:bottom="1417" w:left="1417" w:header="708" w:footer="708" w:gutter="0"/>
@@ -1870,6 +2271,60 @@
       <w:spacing w:val="5"/>
     </w:rPr>
   </w:style>
+  <w:style w:type="character" w:styleId="Lienhypertexte">
+    <w:name w:val="Hyperlink"/>
+    <w:basedOn w:val="Policepardfaut"/>
+    <w:uiPriority w:val="99"/>
+    <w:unhideWhenUsed/>
+    <w:rsid w:val="00E71138"/>
+    <w:rPr>
+      <w:color w:val="467886" w:themeColor="hyperlink"/>
+      <w:u w:val="single"/>
+    </w:rPr>
+  </w:style>
+  <w:style w:type="character" w:styleId="Mentionnonrsolue">
+    <w:name w:val="Unresolved Mention"/>
+    <w:basedOn w:val="Policepardfaut"/>
+    <w:uiPriority w:val="99"/>
+    <w:semiHidden/>
+    <w:unhideWhenUsed/>
+    <w:rsid w:val="00E71138"/>
+    <w:rPr>
+      <w:color w:val="605E5C"/>
+      <w:shd w:val="clear" w:color="auto" w:fill="E1DFDD"/>
+    </w:rPr>
+  </w:style>
+  <w:style w:type="character" w:styleId="Lienhypertextesuivivisit">
+    <w:name w:val="FollowedHyperlink"/>
+    <w:basedOn w:val="Policepardfaut"/>
+    <w:uiPriority w:val="99"/>
+    <w:semiHidden/>
+    <w:unhideWhenUsed/>
+    <w:rsid w:val="00E71138"/>
+    <w:rPr>
+      <w:color w:val="96607D" w:themeColor="followedHyperlink"/>
+      <w:u w:val="single"/>
+    </w:rPr>
+  </w:style>
+  <w:style w:type="table" w:styleId="Grilledutableau">
+    <w:name w:val="Table Grid"/>
+    <w:basedOn w:val="TableauNormal"/>
+    <w:uiPriority w:val="39"/>
+    <w:rsid w:val="00F72678"/>
+    <w:pPr>
+      <w:spacing w:after="0" w:line="240" w:lineRule="auto"/>
+    </w:pPr>
+    <w:tblPr>
+      <w:tblBorders>
+        <w:top w:val="single" w:sz="4" w:space="0" w:color="auto"/>
+        <w:left w:val="single" w:sz="4" w:space="0" w:color="auto"/>
+        <w:bottom w:val="single" w:sz="4" w:space="0" w:color="auto"/>
+        <w:right w:val="single" w:sz="4" w:space="0" w:color="auto"/>
+        <w:insideH w:val="single" w:sz="4" w:space="0" w:color="auto"/>
+        <w:insideV w:val="single" w:sz="4" w:space="0" w:color="auto"/>
+      </w:tblBorders>
+    </w:tblPr>
+  </w:style>
 </w:styles>
 </file>
 

</xml_diff>

<commit_message>
fix(JDT, Rapport) corriger des détails du JDT et rapport
</commit_message>
<xml_diff>
--- a/doc/Rapport.docx
+++ b/doc/Rapport.docx
@@ -507,27 +507,392 @@
       </w:r>
     </w:p>
     <w:p>
+      <w:r>
+        <w:t xml:space="preserve">La totalité des US n’ont pas pu être terminé. Voici la liste des US non-terminé : </w:t>
+      </w:r>
+    </w:p>
+    <w:p>
       <w:hyperlink r:id="rId6" w:history="1">
         <w:r>
           <w:rPr>
             <w:rStyle w:val="Lienhypertexte"/>
           </w:rPr>
-          <w:t>Lien vers les User</w:t>
-        </w:r>
-        <w:r>
-          <w:rPr>
-            <w:rStyle w:val="Lienhypertexte"/>
-          </w:rPr>
-          <w:t xml:space="preserve"> </w:t>
-        </w:r>
-        <w:r>
-          <w:rPr>
-            <w:rStyle w:val="Lienhypertexte"/>
-          </w:rPr>
-          <w:t>Stories</w:t>
+          <w:t>Projet Github</w:t>
         </w:r>
       </w:hyperlink>
     </w:p>
+    <w:p>
+      <w:pPr>
+        <w:rPr>
+          <w:b/>
+          <w:bCs/>
+          <w:u w:val="single"/>
+        </w:rPr>
+      </w:pPr>
+      <w:r>
+        <w:rPr>
+          <w:b/>
+          <w:bCs/>
+          <w:u w:val="single"/>
+        </w:rPr>
+        <w:t>#1 — En temps que joueur, je souhaite pouvoir utiliser les touches WASD afin de pouvoir faire bouger mon joueur dans chaque direction.</w:t>
+      </w:r>
+    </w:p>
+    <w:p/>
+    <w:p>
+      <w:r>
+        <w:rPr>
+          <w:noProof/>
+        </w:rPr>
+        <w:lastRenderedPageBreak/>
+        <w:drawing>
+          <wp:inline distT="0" distB="0" distL="0" distR="0" wp14:anchorId="2AF04922" wp14:editId="094013D3">
+            <wp:extent cx="1992702" cy="2758744"/>
+            <wp:effectExtent l="0" t="0" r="7620" b="3810"/>
+            <wp:docPr id="1" name="Image 1"/>
+            <wp:cNvGraphicFramePr>
+              <a:graphicFrameLocks xmlns:a="http://schemas.openxmlformats.org/drawingml/2006/main" noChangeAspect="1"/>
+            </wp:cNvGraphicFramePr>
+            <a:graphic xmlns:a="http://schemas.openxmlformats.org/drawingml/2006/main">
+              <a:graphicData uri="http://schemas.openxmlformats.org/drawingml/2006/picture">
+                <pic:pic xmlns:pic="http://schemas.openxmlformats.org/drawingml/2006/picture">
+                  <pic:nvPicPr>
+                    <pic:cNvPr id="0" name=""/>
+                    <pic:cNvPicPr>
+                      <a:picLocks noChangeAspect="1" noChangeArrowheads="1"/>
+                    </pic:cNvPicPr>
+                  </pic:nvPicPr>
+                  <pic:blipFill>
+                    <a:blip r:embed="rId7"/>
+                    <a:srcRect/>
+                    <a:stretch>
+                      <a:fillRect/>
+                    </a:stretch>
+                  </pic:blipFill>
+                  <pic:spPr bwMode="auto">
+                    <a:xfrm>
+                      <a:off x="0" y="0"/>
+                      <a:ext cx="1998664" cy="2766998"/>
+                    </a:xfrm>
+                    <a:prstGeom prst="rect">
+                      <a:avLst/>
+                    </a:prstGeom>
+                  </pic:spPr>
+                </pic:pic>
+              </a:graphicData>
+            </a:graphic>
+          </wp:inline>
+        </w:drawing>
+      </w:r>
+    </w:p>
+    <w:p>
+      <w:r>
+        <w:rPr>
+          <w:b/>
+          <w:bCs/>
+        </w:rPr>
+        <w:t>Critère d'acceptation :</w:t>
+      </w:r>
+    </w:p>
+    <w:p>
+      <w:r>
+        <w:t>• Le joueur va dans la direction correspondante temps que je maintient la touche</w:t>
+      </w:r>
+    </w:p>
+    <w:p>
+      <w:r>
+        <w:t>• Le joueur arrête d'avancer dès le moment ou le joueur arrête d'appuyer sur la touche</w:t>
+      </w:r>
+    </w:p>
+    <w:p>
+      <w:r>
+        <w:t>• Le joueur s'arrête lorsque il essaie d'aller dans les obstacles</w:t>
+      </w:r>
+    </w:p>
+    <w:p/>
+    <w:p>
+      <w:pPr>
+        <w:rPr>
+          <w:b/>
+          <w:bCs/>
+          <w:u w:val="single"/>
+        </w:rPr>
+      </w:pPr>
+      <w:r>
+        <w:rPr>
+          <w:b/>
+          <w:bCs/>
+          <w:u w:val="single"/>
+        </w:rPr>
+        <w:t>#2 — En temps que joueur, je souhaite pouvoir utiliser la touche clic gauche afin de pouvoir tirer des projectile sur mes enemies.</w:t>
+      </w:r>
+    </w:p>
+    <w:p/>
+    <w:p>
+      <w:r>
+        <w:rPr>
+          <w:noProof/>
+        </w:rPr>
+        <w:drawing>
+          <wp:inline distT="0" distB="0" distL="0" distR="0" wp14:anchorId="2AFCE80A" wp14:editId="435E8F6A">
+            <wp:extent cx="2419350" cy="1914525"/>
+            <wp:effectExtent l="0" t="0" r="0" b="0"/>
+            <wp:docPr id="2030904792" name="Image 2030904792"/>
+            <wp:cNvGraphicFramePr>
+              <a:graphicFrameLocks xmlns:a="http://schemas.openxmlformats.org/drawingml/2006/main" noChangeAspect="1"/>
+            </wp:cNvGraphicFramePr>
+            <a:graphic xmlns:a="http://schemas.openxmlformats.org/drawingml/2006/main">
+              <a:graphicData uri="http://schemas.openxmlformats.org/drawingml/2006/picture">
+                <pic:pic xmlns:pic="http://schemas.openxmlformats.org/drawingml/2006/picture">
+                  <pic:nvPicPr>
+                    <pic:cNvPr id="0" name=""/>
+                    <pic:cNvPicPr>
+                      <a:picLocks noChangeAspect="1" noChangeArrowheads="1"/>
+                    </pic:cNvPicPr>
+                  </pic:nvPicPr>
+                  <pic:blipFill>
+                    <a:blip r:embed="rId8"/>
+                    <a:srcRect/>
+                    <a:stretch>
+                      <a:fillRect/>
+                    </a:stretch>
+                  </pic:blipFill>
+                  <pic:spPr bwMode="auto">
+                    <a:xfrm>
+                      <a:off x="0" y="0"/>
+                      <a:ext cx="2419350" cy="1914525"/>
+                    </a:xfrm>
+                    <a:prstGeom prst="rect">
+                      <a:avLst/>
+                    </a:prstGeom>
+                  </pic:spPr>
+                </pic:pic>
+              </a:graphicData>
+            </a:graphic>
+          </wp:inline>
+        </w:drawing>
+      </w:r>
+    </w:p>
+    <w:p/>
+    <w:p/>
+    <w:p>
+      <w:r>
+        <w:rPr>
+          <w:b/>
+          <w:bCs/>
+        </w:rPr>
+        <w:t>Critère d'acceptation :</w:t>
+      </w:r>
+    </w:p>
+    <w:p>
+      <w:r>
+        <w:t>• Lorsque je fais clic gauche, un projectile burger pars en direction de ma souris.</w:t>
+      </w:r>
+    </w:p>
+    <w:p>
+      <w:r>
+        <w:t>• Le projectile est détruit si il rencontre un obstacle ou un ennemie</w:t>
+      </w:r>
+    </w:p>
+    <w:p>
+      <w:r>
+        <w:lastRenderedPageBreak/>
+        <w:t>• Le projectile fait baisser les points de vie de mes ennemies de 2 points</w:t>
+      </w:r>
+    </w:p>
+    <w:p>
+      <w:r>
+        <w:t>• Le projectile à un cooldown de 1sec après avoir été tiré.</w:t>
+      </w:r>
+    </w:p>
+    <w:p/>
+    <w:p>
+      <w:pPr>
+        <w:rPr>
+          <w:b/>
+          <w:bCs/>
+          <w:u w:val="single"/>
+        </w:rPr>
+      </w:pPr>
+      <w:r>
+        <w:rPr>
+          <w:b/>
+          <w:bCs/>
+          <w:u w:val="single"/>
+        </w:rPr>
+        <w:t>#3 — En temps que joueur, je souhaite pouvoir utiliser la touche clic droit afin de pouvoir faire des dégâts de corp à corp.</w:t>
+      </w:r>
+    </w:p>
+    <w:p/>
+    <w:p>
+      <w:r>
+        <w:rPr>
+          <w:noProof/>
+        </w:rPr>
+        <w:drawing>
+          <wp:inline distT="0" distB="0" distL="0" distR="0" wp14:anchorId="1DB0AFCC" wp14:editId="416C74F0">
+            <wp:extent cx="3016003" cy="2406770"/>
+            <wp:effectExtent l="0" t="0" r="0" b="0"/>
+            <wp:docPr id="779546724" name="Image 779546724"/>
+            <wp:cNvGraphicFramePr>
+              <a:graphicFrameLocks xmlns:a="http://schemas.openxmlformats.org/drawingml/2006/main" noChangeAspect="1"/>
+            </wp:cNvGraphicFramePr>
+            <a:graphic xmlns:a="http://schemas.openxmlformats.org/drawingml/2006/main">
+              <a:graphicData uri="http://schemas.openxmlformats.org/drawingml/2006/picture">
+                <pic:pic xmlns:pic="http://schemas.openxmlformats.org/drawingml/2006/picture">
+                  <pic:nvPicPr>
+                    <pic:cNvPr id="0" name=""/>
+                    <pic:cNvPicPr>
+                      <a:picLocks noChangeAspect="1" noChangeArrowheads="1"/>
+                    </pic:cNvPicPr>
+                  </pic:nvPicPr>
+                  <pic:blipFill>
+                    <a:blip r:embed="rId9"/>
+                    <a:srcRect/>
+                    <a:stretch>
+                      <a:fillRect/>
+                    </a:stretch>
+                  </pic:blipFill>
+                  <pic:spPr bwMode="auto">
+                    <a:xfrm>
+                      <a:off x="0" y="0"/>
+                      <a:ext cx="3022793" cy="2412188"/>
+                    </a:xfrm>
+                    <a:prstGeom prst="rect">
+                      <a:avLst/>
+                    </a:prstGeom>
+                  </pic:spPr>
+                </pic:pic>
+              </a:graphicData>
+            </a:graphic>
+          </wp:inline>
+        </w:drawing>
+      </w:r>
+    </w:p>
+    <w:p>
+      <w:r>
+        <w:t>• Lorsque je fais clic droit, une attaque corp à corp est lancé</w:t>
+      </w:r>
+    </w:p>
+    <w:p>
+      <w:r>
+        <w:t>• Tous les ennemis dans un rayons égal à la moitié de la largeur de mon personnage prennent 3pts de dégâts</w:t>
+      </w:r>
+    </w:p>
+    <w:p>
+      <w:r>
+        <w:t>• L'attaque de corp à corp à un cooldown de 0.2s après avoir été lancé</w:t>
+      </w:r>
+    </w:p>
+    <w:p/>
+    <w:p>
+      <w:pPr>
+        <w:rPr>
+          <w:b/>
+          <w:bCs/>
+          <w:u w:val="single"/>
+        </w:rPr>
+      </w:pPr>
+      <w:r>
+        <w:rPr>
+          <w:b/>
+          <w:bCs/>
+          <w:u w:val="single"/>
+        </w:rPr>
+        <w:t>#4 — En temps que joueur je souhaite avoir des ennemis de type manager afin de pouvoir gagner de l'argent</w:t>
+      </w:r>
+    </w:p>
+    <w:p>
+      <w:r>
+        <w:rPr>
+          <w:noProof/>
+        </w:rPr>
+        <w:drawing>
+          <wp:inline distT="0" distB="0" distL="0" distR="0" wp14:anchorId="3D106A19" wp14:editId="6DD9E619">
+            <wp:extent cx="2016266" cy="2182483"/>
+            <wp:effectExtent l="0" t="0" r="3175" b="8890"/>
+            <wp:docPr id="1323060754" name="Image 1323060754"/>
+            <wp:cNvGraphicFramePr>
+              <a:graphicFrameLocks xmlns:a="http://schemas.openxmlformats.org/drawingml/2006/main" noChangeAspect="1"/>
+            </wp:cNvGraphicFramePr>
+            <a:graphic xmlns:a="http://schemas.openxmlformats.org/drawingml/2006/main">
+              <a:graphicData uri="http://schemas.openxmlformats.org/drawingml/2006/picture">
+                <pic:pic xmlns:pic="http://schemas.openxmlformats.org/drawingml/2006/picture">
+                  <pic:nvPicPr>
+                    <pic:cNvPr id="0" name=""/>
+                    <pic:cNvPicPr>
+                      <a:picLocks noChangeAspect="1" noChangeArrowheads="1"/>
+                    </pic:cNvPicPr>
+                  </pic:nvPicPr>
+                  <pic:blipFill>
+                    <a:blip r:embed="rId10"/>
+                    <a:srcRect/>
+                    <a:stretch>
+                      <a:fillRect/>
+                    </a:stretch>
+                  </pic:blipFill>
+                  <pic:spPr bwMode="auto">
+                    <a:xfrm>
+                      <a:off x="0" y="0"/>
+                      <a:ext cx="2026954" cy="2194052"/>
+                    </a:xfrm>
+                    <a:prstGeom prst="rect">
+                      <a:avLst/>
+                    </a:prstGeom>
+                  </pic:spPr>
+                </pic:pic>
+              </a:graphicData>
+            </a:graphic>
+          </wp:inline>
+        </w:drawing>
+      </w:r>
+    </w:p>
+    <w:p>
+      <w:r>
+        <w:rPr>
+          <w:b/>
+          <w:bCs/>
+        </w:rPr>
+        <w:t>Critère d'acceptation</w:t>
+      </w:r>
+    </w:p>
+    <w:p/>
+    <w:p>
+      <w:r>
+        <w:t>• Un manager doit pouvoir se deplacer aléatoirement sur la carte</w:t>
+      </w:r>
+    </w:p>
+    <w:p>
+      <w:r>
+        <w:t>• Un manager doit  trouver une nouvelle destination si il bute sur un obstacle</w:t>
+      </w:r>
+    </w:p>
+    <w:p>
+      <w:r>
+        <w:t>• Un manager doit pouvoir lancer des projectile de type sac d'argent.</w:t>
+      </w:r>
+    </w:p>
+    <w:p>
+      <w:r>
+        <w:t>• Un manager prends 4 sec à recharger.</w:t>
+      </w:r>
+    </w:p>
+    <w:p>
+      <w:r>
+        <w:t>• Un manager possède 13 PV</w:t>
+      </w:r>
+    </w:p>
+    <w:p>
+      <w:r>
+        <w:t>• Lorsque un manager meurt, le nombre d'argent du joueur augment de 5'000$</w:t>
+      </w:r>
+    </w:p>
+    <w:p>
+      <w:r>
+        <w:t>• L'argent que fait tomber le manager est quadruplé et ses PV sont doublé quand le joueur atteint 100'000$. Il le sont à nouveaux quand il atteint 500'000$</w:t>
+      </w:r>
+    </w:p>
+    <w:p/>
     <w:p>
       <w:pPr>
         <w:pStyle w:val="Titre2"/>
@@ -618,7 +983,7 @@
             <w:tcW w:w="6940" w:type="dxa"/>
           </w:tcPr>
           <w:p>
-            <w:hyperlink r:id="rId7" w:history="1">
+            <w:hyperlink r:id="rId11" w:history="1">
               <w:r>
                 <w:rPr>
                   <w:rStyle w:val="Lienhypertexte"/>
@@ -663,7 +1028,7 @@
             <w:tcW w:w="6940" w:type="dxa"/>
           </w:tcPr>
           <w:p>
-            <w:hyperlink r:id="rId8" w:history="1">
+            <w:hyperlink r:id="rId12" w:history="1">
               <w:r>
                 <w:rPr>
                   <w:rStyle w:val="Lienhypertexte"/>
@@ -693,7 +1058,7 @@
             <w:tcW w:w="6940" w:type="dxa"/>
           </w:tcPr>
           <w:p>
-            <w:hyperlink r:id="rId9" w:history="1">
+            <w:hyperlink r:id="rId13" w:history="1">
               <w:r>
                 <w:rPr>
                   <w:rStyle w:val="Lienhypertexte"/>
@@ -720,7 +1085,7 @@
             <w:tcW w:w="6940" w:type="dxa"/>
           </w:tcPr>
           <w:p>
-            <w:hyperlink r:id="rId10" w:history="1">
+            <w:hyperlink r:id="rId14" w:history="1">
               <w:r>
                 <w:rPr>
                   <w:rStyle w:val="Lienhypertexte"/>
@@ -747,7 +1112,7 @@
             <w:tcW w:w="6940" w:type="dxa"/>
           </w:tcPr>
           <w:p>
-            <w:hyperlink r:id="rId11" w:history="1">
+            <w:hyperlink r:id="rId15" w:history="1">
               <w:r>
                 <w:rPr>
                   <w:rStyle w:val="Lienhypertexte"/>
@@ -774,7 +1139,7 @@
             <w:tcW w:w="6940" w:type="dxa"/>
           </w:tcPr>
           <w:p>
-            <w:hyperlink r:id="rId12" w:history="1">
+            <w:hyperlink r:id="rId16" w:history="1">
               <w:r>
                 <w:rPr>
                   <w:rStyle w:val="Lienhypertexte"/>
@@ -804,7 +1169,7 @@
             <w:tcW w:w="6940" w:type="dxa"/>
           </w:tcPr>
           <w:p>
-            <w:hyperlink r:id="rId13" w:history="1">
+            <w:hyperlink r:id="rId17" w:history="1">
               <w:r>
                 <w:rPr>
                   <w:rStyle w:val="Lienhypertexte"/>
@@ -828,7 +1193,7 @@
           </w:tcPr>
           <w:p>
             <w:r>
-              <w:t>11</w:t>
+              <w:t>09</w:t>
             </w:r>
             <w:r>
               <w:t>.10.2026</w:t>
@@ -840,7 +1205,7 @@
             <w:tcW w:w="6940" w:type="dxa"/>
           </w:tcPr>
           <w:p>
-            <w:hyperlink r:id="rId14" w:history="1">
+            <w:hyperlink r:id="rId18" w:history="1">
               <w:r>
                 <w:rPr>
                   <w:rStyle w:val="Lienhypertexte"/>
@@ -858,7 +1223,10 @@
           </w:tcPr>
           <w:p>
             <w:r>
-              <w:t>11.10.2026</w:t>
+              <w:t>30</w:t>
+            </w:r>
+            <w:r>
+              <w:t>.10.2026</w:t>
             </w:r>
           </w:p>
         </w:tc>
@@ -867,7 +1235,7 @@
             <w:tcW w:w="6940" w:type="dxa"/>
           </w:tcPr>
           <w:p>
-            <w:hyperlink r:id="rId15" w:history="1">
+            <w:hyperlink r:id="rId19" w:history="1">
               <w:r>
                 <w:rPr>
                   <w:rStyle w:val="Lienhypertexte"/>
@@ -885,7 +1253,10 @@
           </w:tcPr>
           <w:p>
             <w:r>
-              <w:t>18.10.2026</w:t>
+              <w:t>30</w:t>
+            </w:r>
+            <w:r>
+              <w:t>.10.2026</w:t>
             </w:r>
           </w:p>
         </w:tc>
@@ -894,7 +1265,7 @@
             <w:tcW w:w="6940" w:type="dxa"/>
           </w:tcPr>
           <w:p>
-            <w:hyperlink r:id="rId16" w:history="1">
+            <w:hyperlink r:id="rId20" w:history="1">
               <w:r>
                 <w:rPr>
                   <w:rStyle w:val="Lienhypertexte"/>

</xml_diff>

<commit_message>
chore(base) ajout de la base de code inspiré de l'exercice Drone
</commit_message>
<xml_diff>
--- a/doc/Rapport.docx
+++ b/doc/Rapport.docx
@@ -43,12 +43,14 @@
         <w:pStyle w:val="Titre1"/>
         <w:jc w:val="center"/>
       </w:pPr>
+      <w:bookmarkStart w:id="0" w:name="_Toc240030127"/>
       <w:r>
         <w:t>P_OO Shoot Me Up Rapport de Proj</w:t>
       </w:r>
       <w:r>
         <w:t>et</w:t>
       </w:r>
+      <w:bookmarkEnd w:id="0"/>
     </w:p>
     <w:p>
       <w:pPr>
@@ -71,23 +73,521 @@
         <w:br w:type="page"/>
       </w:r>
     </w:p>
+    <w:sdt>
+      <w:sdtPr>
+        <w:rPr>
+          <w:lang w:val="fr-FR"/>
+        </w:rPr>
+        <w:id w:val="-2127608899"/>
+        <w:docPartObj>
+          <w:docPartGallery w:val="Table of Contents"/>
+          <w:docPartUnique/>
+        </w:docPartObj>
+      </w:sdtPr>
+      <w:sdtEndPr>
+        <w:rPr>
+          <w:rFonts w:asciiTheme="minorHAnsi" w:eastAsiaTheme="minorHAnsi" w:hAnsiTheme="minorHAnsi" w:cstheme="minorBidi"/>
+          <w:b/>
+          <w:bCs/>
+          <w:color w:val="auto"/>
+          <w:kern w:val="2"/>
+          <w:sz w:val="24"/>
+          <w:szCs w:val="24"/>
+          <w:lang w:eastAsia="en-US"/>
+          <w14:ligatures w14:val="standardContextual"/>
+        </w:rPr>
+      </w:sdtEndPr>
+      <w:sdtContent>
+        <w:p>
+          <w:pPr>
+            <w:pStyle w:val="En-ttedetabledesmatires"/>
+          </w:pPr>
+          <w:r>
+            <w:rPr>
+              <w:lang w:val="fr-FR"/>
+            </w:rPr>
+            <w:t>Table des matières</w:t>
+          </w:r>
+        </w:p>
+        <w:p>
+          <w:pPr>
+            <w:pStyle w:val="TM1"/>
+            <w:tabs>
+              <w:tab w:val="right" w:leader="dot" w:pos="9062"/>
+            </w:tabs>
+            <w:rPr>
+              <w:rFonts w:eastAsiaTheme="minorEastAsia"/>
+              <w:noProof/>
+              <w:lang w:eastAsia="fr-CH"/>
+            </w:rPr>
+          </w:pPr>
+          <w:r>
+            <w:fldChar w:fldCharType="begin"/>
+          </w:r>
+          <w:r>
+            <w:instrText xml:space="preserve"> TOC \o "1-3" \h \z \u </w:instrText>
+          </w:r>
+          <w:r>
+            <w:fldChar w:fldCharType="separate"/>
+          </w:r>
+          <w:hyperlink w:anchor="_Toc240030127" w:history="1">
+            <w:r>
+              <w:rPr>
+                <w:rStyle w:val="Lienhypertexte"/>
+                <w:noProof/>
+              </w:rPr>
+              <w:t>P_OO Shoot Me Up Rapport de Projet</w:t>
+            </w:r>
+            <w:r>
+              <w:rPr>
+                <w:noProof/>
+                <w:webHidden/>
+              </w:rPr>
+              <w:tab/>
+            </w:r>
+            <w:r>
+              <w:rPr>
+                <w:noProof/>
+                <w:webHidden/>
+              </w:rPr>
+              <w:fldChar w:fldCharType="begin"/>
+            </w:r>
+            <w:r>
+              <w:rPr>
+                <w:noProof/>
+                <w:webHidden/>
+              </w:rPr>
+              <w:instrText xml:space="preserve"> PAGEREF _Toc240030127 \h </w:instrText>
+            </w:r>
+            <w:r>
+              <w:rPr>
+                <w:noProof/>
+                <w:webHidden/>
+              </w:rPr>
+            </w:r>
+            <w:r>
+              <w:rPr>
+                <w:noProof/>
+                <w:webHidden/>
+              </w:rPr>
+              <w:fldChar w:fldCharType="separate"/>
+            </w:r>
+            <w:r>
+              <w:rPr>
+                <w:noProof/>
+                <w:webHidden/>
+              </w:rPr>
+              <w:t>1</w:t>
+            </w:r>
+            <w:r>
+              <w:rPr>
+                <w:noProof/>
+                <w:webHidden/>
+              </w:rPr>
+              <w:fldChar w:fldCharType="end"/>
+            </w:r>
+          </w:hyperlink>
+        </w:p>
+        <w:p>
+          <w:pPr>
+            <w:pStyle w:val="TM2"/>
+            <w:tabs>
+              <w:tab w:val="right" w:leader="dot" w:pos="9062"/>
+            </w:tabs>
+            <w:rPr>
+              <w:rFonts w:eastAsiaTheme="minorEastAsia"/>
+              <w:noProof/>
+              <w:lang w:eastAsia="fr-CH"/>
+            </w:rPr>
+          </w:pPr>
+          <w:hyperlink w:anchor="_Toc240030128" w:history="1">
+            <w:r>
+              <w:rPr>
+                <w:rStyle w:val="Lienhypertexte"/>
+                <w:noProof/>
+              </w:rPr>
+              <w:t>Introduction</w:t>
+            </w:r>
+            <w:r>
+              <w:rPr>
+                <w:noProof/>
+                <w:webHidden/>
+              </w:rPr>
+              <w:tab/>
+            </w:r>
+            <w:r>
+              <w:rPr>
+                <w:noProof/>
+                <w:webHidden/>
+              </w:rPr>
+              <w:fldChar w:fldCharType="begin"/>
+            </w:r>
+            <w:r>
+              <w:rPr>
+                <w:noProof/>
+                <w:webHidden/>
+              </w:rPr>
+              <w:instrText xml:space="preserve"> PAGEREF _Toc240030128 \h </w:instrText>
+            </w:r>
+            <w:r>
+              <w:rPr>
+                <w:noProof/>
+                <w:webHidden/>
+              </w:rPr>
+            </w:r>
+            <w:r>
+              <w:rPr>
+                <w:noProof/>
+                <w:webHidden/>
+              </w:rPr>
+              <w:fldChar w:fldCharType="separate"/>
+            </w:r>
+            <w:r>
+              <w:rPr>
+                <w:noProof/>
+                <w:webHidden/>
+              </w:rPr>
+              <w:t>3</w:t>
+            </w:r>
+            <w:r>
+              <w:rPr>
+                <w:noProof/>
+                <w:webHidden/>
+              </w:rPr>
+              <w:fldChar w:fldCharType="end"/>
+            </w:r>
+          </w:hyperlink>
+        </w:p>
+        <w:p>
+          <w:pPr>
+            <w:pStyle w:val="TM3"/>
+            <w:tabs>
+              <w:tab w:val="right" w:leader="dot" w:pos="9062"/>
+            </w:tabs>
+            <w:rPr>
+              <w:rFonts w:eastAsiaTheme="minorEastAsia"/>
+              <w:noProof/>
+              <w:lang w:eastAsia="fr-CH"/>
+            </w:rPr>
+          </w:pPr>
+          <w:hyperlink w:anchor="_Toc240030129" w:history="1">
+            <w:r>
+              <w:rPr>
+                <w:rStyle w:val="Lienhypertexte"/>
+                <w:noProof/>
+              </w:rPr>
+              <w:t>Objectifs produit</w:t>
+            </w:r>
+            <w:r>
+              <w:rPr>
+                <w:noProof/>
+                <w:webHidden/>
+              </w:rPr>
+              <w:tab/>
+            </w:r>
+            <w:r>
+              <w:rPr>
+                <w:noProof/>
+                <w:webHidden/>
+              </w:rPr>
+              <w:fldChar w:fldCharType="begin"/>
+            </w:r>
+            <w:r>
+              <w:rPr>
+                <w:noProof/>
+                <w:webHidden/>
+              </w:rPr>
+              <w:instrText xml:space="preserve"> PAGEREF _Toc240030129 \h </w:instrText>
+            </w:r>
+            <w:r>
+              <w:rPr>
+                <w:noProof/>
+                <w:webHidden/>
+              </w:rPr>
+            </w:r>
+            <w:r>
+              <w:rPr>
+                <w:noProof/>
+                <w:webHidden/>
+              </w:rPr>
+              <w:fldChar w:fldCharType="separate"/>
+            </w:r>
+            <w:r>
+              <w:rPr>
+                <w:noProof/>
+                <w:webHidden/>
+              </w:rPr>
+              <w:t>3</w:t>
+            </w:r>
+            <w:r>
+              <w:rPr>
+                <w:noProof/>
+                <w:webHidden/>
+              </w:rPr>
+              <w:fldChar w:fldCharType="end"/>
+            </w:r>
+          </w:hyperlink>
+        </w:p>
+        <w:p>
+          <w:pPr>
+            <w:pStyle w:val="TM3"/>
+            <w:tabs>
+              <w:tab w:val="right" w:leader="dot" w:pos="9062"/>
+            </w:tabs>
+            <w:rPr>
+              <w:rFonts w:eastAsiaTheme="minorEastAsia"/>
+              <w:noProof/>
+              <w:lang w:eastAsia="fr-CH"/>
+            </w:rPr>
+          </w:pPr>
+          <w:hyperlink w:anchor="_Toc240030130" w:history="1">
+            <w:r>
+              <w:rPr>
+                <w:rStyle w:val="Lienhypertexte"/>
+                <w:noProof/>
+              </w:rPr>
+              <w:t>Objectifs pédagogiques</w:t>
+            </w:r>
+            <w:r>
+              <w:rPr>
+                <w:noProof/>
+                <w:webHidden/>
+              </w:rPr>
+              <w:tab/>
+            </w:r>
+            <w:r>
+              <w:rPr>
+                <w:noProof/>
+                <w:webHidden/>
+              </w:rPr>
+              <w:fldChar w:fldCharType="begin"/>
+            </w:r>
+            <w:r>
+              <w:rPr>
+                <w:noProof/>
+                <w:webHidden/>
+              </w:rPr>
+              <w:instrText xml:space="preserve"> PAGEREF _Toc240030130 \h </w:instrText>
+            </w:r>
+            <w:r>
+              <w:rPr>
+                <w:noProof/>
+                <w:webHidden/>
+              </w:rPr>
+            </w:r>
+            <w:r>
+              <w:rPr>
+                <w:noProof/>
+                <w:webHidden/>
+              </w:rPr>
+              <w:fldChar w:fldCharType="separate"/>
+            </w:r>
+            <w:r>
+              <w:rPr>
+                <w:noProof/>
+                <w:webHidden/>
+              </w:rPr>
+              <w:t>4</w:t>
+            </w:r>
+            <w:r>
+              <w:rPr>
+                <w:noProof/>
+                <w:webHidden/>
+              </w:rPr>
+              <w:fldChar w:fldCharType="end"/>
+            </w:r>
+          </w:hyperlink>
+        </w:p>
+        <w:p>
+          <w:pPr>
+            <w:pStyle w:val="TM2"/>
+            <w:tabs>
+              <w:tab w:val="right" w:leader="dot" w:pos="9062"/>
+            </w:tabs>
+            <w:rPr>
+              <w:rFonts w:eastAsiaTheme="minorEastAsia"/>
+              <w:noProof/>
+              <w:lang w:eastAsia="fr-CH"/>
+            </w:rPr>
+          </w:pPr>
+          <w:hyperlink w:anchor="_Toc240030131" w:history="1">
+            <w:r>
+              <w:rPr>
+                <w:rStyle w:val="Lienhypertexte"/>
+                <w:noProof/>
+              </w:rPr>
+              <w:t>Analyse fonctionnelle</w:t>
+            </w:r>
+            <w:r>
+              <w:rPr>
+                <w:noProof/>
+                <w:webHidden/>
+              </w:rPr>
+              <w:tab/>
+            </w:r>
+            <w:r>
+              <w:rPr>
+                <w:noProof/>
+                <w:webHidden/>
+              </w:rPr>
+              <w:fldChar w:fldCharType="begin"/>
+            </w:r>
+            <w:r>
+              <w:rPr>
+                <w:noProof/>
+                <w:webHidden/>
+              </w:rPr>
+              <w:instrText xml:space="preserve"> PAGEREF _Toc240030131 \h </w:instrText>
+            </w:r>
+            <w:r>
+              <w:rPr>
+                <w:noProof/>
+                <w:webHidden/>
+              </w:rPr>
+            </w:r>
+            <w:r>
+              <w:rPr>
+                <w:noProof/>
+                <w:webHidden/>
+              </w:rPr>
+              <w:fldChar w:fldCharType="separate"/>
+            </w:r>
+            <w:r>
+              <w:rPr>
+                <w:noProof/>
+                <w:webHidden/>
+              </w:rPr>
+              <w:t>4</w:t>
+            </w:r>
+            <w:r>
+              <w:rPr>
+                <w:noProof/>
+                <w:webHidden/>
+              </w:rPr>
+              <w:fldChar w:fldCharType="end"/>
+            </w:r>
+          </w:hyperlink>
+        </w:p>
+        <w:p>
+          <w:pPr>
+            <w:pStyle w:val="TM2"/>
+            <w:tabs>
+              <w:tab w:val="right" w:leader="dot" w:pos="9062"/>
+            </w:tabs>
+            <w:rPr>
+              <w:rFonts w:eastAsiaTheme="minorEastAsia"/>
+              <w:noProof/>
+              <w:lang w:eastAsia="fr-CH"/>
+            </w:rPr>
+          </w:pPr>
+          <w:hyperlink w:anchor="_Toc240030132" w:history="1">
+            <w:r>
+              <w:rPr>
+                <w:rStyle w:val="Lienhypertexte"/>
+                <w:noProof/>
+              </w:rPr>
+              <w:t>Planification Initiale</w:t>
+            </w:r>
+            <w:r>
+              <w:rPr>
+                <w:noProof/>
+                <w:webHidden/>
+              </w:rPr>
+              <w:tab/>
+            </w:r>
+            <w:r>
+              <w:rPr>
+                <w:noProof/>
+                <w:webHidden/>
+              </w:rPr>
+              <w:fldChar w:fldCharType="begin"/>
+            </w:r>
+            <w:r>
+              <w:rPr>
+                <w:noProof/>
+                <w:webHidden/>
+              </w:rPr>
+              <w:instrText xml:space="preserve"> PAGEREF _Toc240030132 \h </w:instrText>
+            </w:r>
+            <w:r>
+              <w:rPr>
+                <w:noProof/>
+                <w:webHidden/>
+              </w:rPr>
+            </w:r>
+            <w:r>
+              <w:rPr>
+                <w:noProof/>
+                <w:webHidden/>
+              </w:rPr>
+              <w:fldChar w:fldCharType="separate"/>
+            </w:r>
+            <w:r>
+              <w:rPr>
+                <w:noProof/>
+                <w:webHidden/>
+              </w:rPr>
+              <w:t>7</w:t>
+            </w:r>
+            <w:r>
+              <w:rPr>
+                <w:noProof/>
+                <w:webHidden/>
+              </w:rPr>
+              <w:fldChar w:fldCharType="end"/>
+            </w:r>
+          </w:hyperlink>
+        </w:p>
+        <w:p>
+          <w:r>
+            <w:rPr>
+              <w:b/>
+              <w:bCs/>
+              <w:lang w:val="fr-FR"/>
+            </w:rPr>
+            <w:fldChar w:fldCharType="end"/>
+          </w:r>
+        </w:p>
+      </w:sdtContent>
+    </w:sdt>
+    <w:p>
+      <w:pPr>
+        <w:rPr>
+          <w:rFonts w:asciiTheme="majorHAnsi" w:eastAsiaTheme="majorEastAsia" w:hAnsiTheme="majorHAnsi" w:cstheme="majorBidi"/>
+          <w:color w:val="0F4761" w:themeColor="accent1" w:themeShade="BF"/>
+          <w:sz w:val="32"/>
+          <w:szCs w:val="32"/>
+        </w:rPr>
+      </w:pPr>
+      <w:r>
+        <w:br w:type="page"/>
+      </w:r>
+    </w:p>
     <w:p>
       <w:pPr>
         <w:pStyle w:val="Titre2"/>
       </w:pPr>
-      <w:r>
-        <w:lastRenderedPageBreak/>
+    </w:p>
+    <w:p>
+      <w:pPr>
+        <w:pStyle w:val="Titre2"/>
+      </w:pPr>
+      <w:bookmarkStart w:id="1" w:name="_Toc240030128"/>
+      <w:r>
         <w:t>Introduction</w:t>
       </w:r>
+      <w:bookmarkEnd w:id="1"/>
     </w:p>
     <w:p>
       <w:pPr>
         <w:pStyle w:val="Titre3"/>
         <w:ind w:left="708"/>
       </w:pPr>
+      <w:bookmarkStart w:id="2" w:name="_Toc240030129"/>
       <w:r>
         <w:t>Objectifs produit</w:t>
       </w:r>
+      <w:bookmarkEnd w:id="2"/>
     </w:p>
     <w:p>
       <w:pPr>
@@ -115,7 +615,7 @@
                     </pic:cNvPicPr>
                   </pic:nvPicPr>
                   <pic:blipFill>
-                    <a:blip r:embed="rId5">
+                    <a:blip r:embed="rId8">
                       <a:extLst>
                         <a:ext uri="{28A0092B-C50C-407E-A947-70E740481C1C}">
                           <a14:useLocalDpi xmlns:a14="http://schemas.microsoft.com/office/drawing/2010/main" val="0"/>
@@ -161,7 +661,15 @@
         <w:t xml:space="preserve"> sur le thème d’un employé de fast-food</w:t>
       </w:r>
       <w:r>
-        <w:t xml:space="preserve"> (Wacdonald’s)</w:t>
+        <w:t xml:space="preserve"> (</w:t>
+      </w:r>
+      <w:proofErr w:type="spellStart"/>
+      <w:r>
+        <w:t>Wacdonald’s</w:t>
+      </w:r>
+      <w:proofErr w:type="spellEnd"/>
+      <w:r>
+        <w:t>)</w:t>
       </w:r>
       <w:r>
         <w:t xml:space="preserve"> devant affronter sa hiérarchie et les robots voulant le </w:t>
@@ -175,24 +683,13 @@
     </w:p>
     <w:p>
       <w:pPr>
+        <w:pStyle w:val="Titre4"/>
         <w:ind w:left="708"/>
-        <w:rPr>
-          <w:b/>
-          <w:bCs/>
-        </w:rPr>
-      </w:pPr>
-      <w:r>
-        <w:rPr>
-          <w:b/>
-          <w:bCs/>
-        </w:rPr>
+      </w:pPr>
+      <w:r>
         <w:t>Ennemis</w:t>
       </w:r>
       <w:r>
-        <w:rPr>
-          <w:b/>
-          <w:bCs/>
-        </w:rPr>
         <w:t> :</w:t>
       </w:r>
     </w:p>
@@ -275,7 +772,11 @@
         <w:t>feront des attaques « faisceaux »</w:t>
       </w:r>
       <w:r>
-        <w:t xml:space="preserve"> qui ne pourront aller que à la verticale ou à l’horizontal. </w:t>
+        <w:t xml:space="preserve"> qui ne pourront aller que à la verticale </w:t>
+      </w:r>
+      <w:r>
+        <w:lastRenderedPageBreak/>
+        <w:t xml:space="preserve">ou à l’horizontal. </w:t>
       </w:r>
       <w:r>
         <w:t>Ils ne feront</w:t>
@@ -296,30 +797,26 @@
         <w:t>leur attaque</w:t>
       </w:r>
       <w:r>
-        <w:t xml:space="preserve"> aura un cooldown.</w:t>
-      </w:r>
-    </w:p>
-    <w:p>
-      <w:pPr>
+        <w:t xml:space="preserve"> aura un </w:t>
+      </w:r>
+      <w:proofErr w:type="spellStart"/>
+      <w:r>
+        <w:t>cooldown</w:t>
+      </w:r>
+      <w:proofErr w:type="spellEnd"/>
+      <w:r>
+        <w:t>.</w:t>
+      </w:r>
+    </w:p>
+    <w:p>
+      <w:pPr>
+        <w:pStyle w:val="Titre4"/>
         <w:ind w:left="708"/>
-        <w:rPr>
-          <w:b/>
-          <w:bCs/>
-        </w:rPr>
-      </w:pPr>
-      <w:r>
-        <w:rPr>
-          <w:b/>
-          <w:bCs/>
-        </w:rPr>
-        <w:lastRenderedPageBreak/>
+      </w:pPr>
+      <w:r>
         <w:t>Joueur</w:t>
       </w:r>
       <w:r>
-        <w:rPr>
-          <w:b/>
-          <w:bCs/>
-        </w:rPr>
         <w:t> :</w:t>
       </w:r>
     </w:p>
@@ -339,30 +836,24 @@
         <w:ind w:left="708"/>
       </w:pPr>
       <w:r>
-        <w:t>Le joueur pourra également se cacher derrière les bornes wacdonald’s pour se protéger.</w:t>
-      </w:r>
-    </w:p>
-    <w:p>
-      <w:pPr>
+        <w:t xml:space="preserve">Le joueur pourra également se cacher derrière les bornes </w:t>
+      </w:r>
+      <w:proofErr w:type="spellStart"/>
+      <w:r>
+        <w:t>wacdonald’s</w:t>
+      </w:r>
+      <w:proofErr w:type="spellEnd"/>
+      <w:r>
+        <w:t xml:space="preserve"> pour se protéger.</w:t>
+      </w:r>
+    </w:p>
+    <w:p>
+      <w:pPr>
+        <w:pStyle w:val="Titre4"/>
         <w:ind w:left="708"/>
-        <w:rPr>
-          <w:b/>
-          <w:bCs/>
-        </w:rPr>
-      </w:pPr>
-      <w:r>
-        <w:rPr>
-          <w:b/>
-          <w:bCs/>
-        </w:rPr>
-        <w:t>Victoire/Défaite</w:t>
-      </w:r>
-      <w:r>
-        <w:rPr>
-          <w:b/>
-          <w:bCs/>
-        </w:rPr>
-        <w:t> :</w:t>
+      </w:pPr>
+      <w:r>
+        <w:t>Victoire/Défaite :</w:t>
       </w:r>
     </w:p>
     <w:p>
@@ -376,7 +867,15 @@
         <w:t>er</w:t>
       </w:r>
       <w:r>
-        <w:t xml:space="preserve"> 1'000’000$ afin de devenir actionnaire majoritaire du fast food. Le joueur perd la partie si sa vie tombe à 0.</w:t>
+        <w:t xml:space="preserve"> 1'000’000$ afin de devenir actionnaire majoritaire du fast </w:t>
+      </w:r>
+      <w:proofErr w:type="spellStart"/>
+      <w:r>
+        <w:t>food</w:t>
+      </w:r>
+      <w:proofErr w:type="spellEnd"/>
+      <w:r>
+        <w:t>. Le joueur perd la partie si sa vie tombe à 0.</w:t>
       </w:r>
     </w:p>
     <w:p>
@@ -384,9 +883,11 @@
         <w:pStyle w:val="Titre3"/>
         <w:ind w:left="708"/>
       </w:pPr>
+      <w:bookmarkStart w:id="3" w:name="_Toc240030130"/>
       <w:r>
         <w:t>Objectifs pédagogiques</w:t>
       </w:r>
+      <w:bookmarkEnd w:id="3"/>
     </w:p>
     <w:p>
       <w:pPr>
@@ -477,7 +978,21 @@
         <w:rPr>
           <w:lang w:val="en-US"/>
         </w:rPr>
-        <w:t xml:space="preserve"> repository Github (release, issues)</w:t>
+        <w:t xml:space="preserve"> repository </w:t>
+      </w:r>
+      <w:proofErr w:type="spellStart"/>
+      <w:r>
+        <w:rPr>
+          <w:lang w:val="en-US"/>
+        </w:rPr>
+        <w:t>Github</w:t>
+      </w:r>
+      <w:proofErr w:type="spellEnd"/>
+      <w:r>
+        <w:rPr>
+          <w:lang w:val="en-US"/>
+        </w:rPr>
+        <w:t xml:space="preserve"> (release, issues)</w:t>
       </w:r>
     </w:p>
     <w:p>
@@ -502,9 +1017,11 @@
       <w:pPr>
         <w:pStyle w:val="Titre2"/>
       </w:pPr>
+      <w:bookmarkStart w:id="4" w:name="_Toc240030131"/>
       <w:r>
         <w:t>Analyse fonctionnelle</w:t>
       </w:r>
+      <w:bookmarkEnd w:id="4"/>
     </w:p>
     <w:p>
       <w:r>
@@ -512,13 +1029,21 @@
       </w:r>
     </w:p>
     <w:p>
-      <w:hyperlink r:id="rId6" w:history="1">
+      <w:hyperlink r:id="rId9" w:history="1">
         <w:r>
           <w:rPr>
             <w:rStyle w:val="Lienhypertexte"/>
           </w:rPr>
-          <w:t>Projet Github</w:t>
+          <w:t xml:space="preserve">Projet </w:t>
         </w:r>
+        <w:proofErr w:type="spellStart"/>
+        <w:r>
+          <w:rPr>
+            <w:rStyle w:val="Lienhypertexte"/>
+          </w:rPr>
+          <w:t>Github</w:t>
+        </w:r>
+        <w:proofErr w:type="spellEnd"/>
       </w:hyperlink>
     </w:p>
     <w:p>
@@ -535,7 +1060,25 @@
           <w:bCs/>
           <w:u w:val="single"/>
         </w:rPr>
-        <w:t>#1 — En temps que joueur, je souhaite pouvoir utiliser les touches WASD afin de pouvoir faire bouger mon joueur dans chaque direction.</w:t>
+        <w:t xml:space="preserve">#1 — En </w:t>
+      </w:r>
+      <w:proofErr w:type="spellStart"/>
+      <w:r>
+        <w:rPr>
+          <w:b/>
+          <w:bCs/>
+          <w:u w:val="single"/>
+        </w:rPr>
+        <w:t>temps</w:t>
+      </w:r>
+      <w:proofErr w:type="spellEnd"/>
+      <w:r>
+        <w:rPr>
+          <w:b/>
+          <w:bCs/>
+          <w:u w:val="single"/>
+        </w:rPr>
+        <w:t xml:space="preserve"> que joueur, je souhaite pouvoir utiliser les touches WASD afin de pouvoir faire bouger mon joueur dans chaque direction.</w:t>
       </w:r>
     </w:p>
     <w:p/>
@@ -563,7 +1106,7 @@
                     </pic:cNvPicPr>
                   </pic:nvPicPr>
                   <pic:blipFill>
-                    <a:blip r:embed="rId7"/>
+                    <a:blip r:embed="rId10"/>
                     <a:srcRect/>
                     <a:stretch>
                       <a:fillRect/>
@@ -596,7 +1139,17 @@
     </w:p>
     <w:p>
       <w:r>
-        <w:t>• Le joueur va dans la direction correspondante temps que je maintient la touche</w:t>
+        <w:t xml:space="preserve">• Le joueur va dans la direction correspondante temps que je </w:t>
+      </w:r>
+      <w:proofErr w:type="spellStart"/>
+      <w:proofErr w:type="gramStart"/>
+      <w:r>
+        <w:t>maintient</w:t>
+      </w:r>
+      <w:proofErr w:type="spellEnd"/>
+      <w:proofErr w:type="gramEnd"/>
+      <w:r>
+        <w:t xml:space="preserve"> la touche</w:t>
       </w:r>
     </w:p>
     <w:p>
@@ -606,7 +1159,15 @@
     </w:p>
     <w:p>
       <w:r>
-        <w:t>• Le joueur s'arrête lorsque il essaie d'aller dans les obstacles</w:t>
+        <w:t xml:space="preserve">• Le joueur s'arrête </w:t>
+      </w:r>
+      <w:proofErr w:type="gramStart"/>
+      <w:r>
+        <w:t>lorsque il</w:t>
+      </w:r>
+      <w:proofErr w:type="gramEnd"/>
+      <w:r>
+        <w:t xml:space="preserve"> essaie d'aller dans les obstacles</w:t>
       </w:r>
     </w:p>
     <w:p/>
@@ -624,7 +1185,61 @@
           <w:bCs/>
           <w:u w:val="single"/>
         </w:rPr>
-        <w:t>#2 — En temps que joueur, je souhaite pouvoir utiliser la touche clic gauche afin de pouvoir tirer des projectile sur mes enemies.</w:t>
+        <w:t xml:space="preserve">#2 — En </w:t>
+      </w:r>
+      <w:proofErr w:type="spellStart"/>
+      <w:r>
+        <w:rPr>
+          <w:b/>
+          <w:bCs/>
+          <w:u w:val="single"/>
+        </w:rPr>
+        <w:t>temps</w:t>
+      </w:r>
+      <w:proofErr w:type="spellEnd"/>
+      <w:r>
+        <w:rPr>
+          <w:b/>
+          <w:bCs/>
+          <w:u w:val="single"/>
+        </w:rPr>
+        <w:t xml:space="preserve"> que joueur, je souhaite pouvoir utiliser la touche clic gauche afin de pouvoir tirer </w:t>
+      </w:r>
+      <w:proofErr w:type="gramStart"/>
+      <w:r>
+        <w:rPr>
+          <w:b/>
+          <w:bCs/>
+          <w:u w:val="single"/>
+        </w:rPr>
+        <w:t>des projectile</w:t>
+      </w:r>
+      <w:proofErr w:type="gramEnd"/>
+      <w:r>
+        <w:rPr>
+          <w:b/>
+          <w:bCs/>
+          <w:u w:val="single"/>
+        </w:rPr>
+        <w:t xml:space="preserve"> sur mes </w:t>
+      </w:r>
+      <w:proofErr w:type="spellStart"/>
+      <w:r>
+        <w:rPr>
+          <w:b/>
+          <w:bCs/>
+          <w:u w:val="single"/>
+        </w:rPr>
+        <w:t>enemies</w:t>
+      </w:r>
+      <w:proofErr w:type="spellEnd"/>
+      <w:r>
+        <w:rPr>
+          <w:b/>
+          <w:bCs/>
+          <w:u w:val="single"/>
+        </w:rPr>
+        <w:t>.</w:t>
       </w:r>
     </w:p>
     <w:p/>
@@ -651,7 +1266,7 @@
                     </pic:cNvPicPr>
                   </pic:nvPicPr>
                   <pic:blipFill>
-                    <a:blip r:embed="rId8"/>
+                    <a:blip r:embed="rId11"/>
                     <a:srcRect/>
                     <a:stretch>
                       <a:fillRect/>
@@ -691,8 +1306,21 @@
     </w:p>
     <w:p>
       <w:r>
-        <w:t>• Le projectile est détruit si il rencontre un obstacle ou un ennemie</w:t>
-      </w:r>
+        <w:t xml:space="preserve">• Le projectile est détruit </w:t>
+      </w:r>
+      <w:proofErr w:type="gramStart"/>
+      <w:r>
+        <w:t>si il</w:t>
+      </w:r>
+      <w:proofErr w:type="gramEnd"/>
+      <w:r>
+        <w:t xml:space="preserve"> rencontre un obstacle ou </w:t>
+      </w:r>
+      <w:proofErr w:type="gramStart"/>
+      <w:r>
+        <w:t>un ennemie</w:t>
+      </w:r>
+      <w:proofErr w:type="gramEnd"/>
     </w:p>
     <w:p>
       <w:r>
@@ -702,7 +1330,15 @@
     </w:p>
     <w:p>
       <w:r>
-        <w:t>• Le projectile à un cooldown de 1sec après avoir été tiré.</w:t>
+        <w:t xml:space="preserve">• Le projectile à un </w:t>
+      </w:r>
+      <w:proofErr w:type="spellStart"/>
+      <w:r>
+        <w:t>cooldown</w:t>
+      </w:r>
+      <w:proofErr w:type="spellEnd"/>
+      <w:r>
+        <w:t xml:space="preserve"> de 1sec après avoir été tiré.</w:t>
       </w:r>
     </w:p>
     <w:p/>
@@ -720,7 +1356,25 @@
           <w:bCs/>
           <w:u w:val="single"/>
         </w:rPr>
-        <w:t>#3 — En temps que joueur, je souhaite pouvoir utiliser la touche clic droit afin de pouvoir faire des dégâts de corp à corp.</w:t>
+        <w:t xml:space="preserve">#3 — En </w:t>
+      </w:r>
+      <w:proofErr w:type="spellStart"/>
+      <w:r>
+        <w:rPr>
+          <w:b/>
+          <w:bCs/>
+          <w:u w:val="single"/>
+        </w:rPr>
+        <w:t>temps</w:t>
+      </w:r>
+      <w:proofErr w:type="spellEnd"/>
+      <w:r>
+        <w:rPr>
+          <w:b/>
+          <w:bCs/>
+          <w:u w:val="single"/>
+        </w:rPr>
+        <w:t xml:space="preserve"> que joueur, je souhaite pouvoir utiliser la touche clic droit afin de pouvoir faire des dégâts de corp à corp.</w:t>
       </w:r>
     </w:p>
     <w:p/>
@@ -747,7 +1401,7 @@
                     </pic:cNvPicPr>
                   </pic:nvPicPr>
                   <pic:blipFill>
-                    <a:blip r:embed="rId9"/>
+                    <a:blip r:embed="rId12"/>
                     <a:srcRect/>
                     <a:stretch>
                       <a:fillRect/>
@@ -781,7 +1435,15 @@
     </w:p>
     <w:p>
       <w:r>
-        <w:t>• L'attaque de corp à corp à un cooldown de 0.2s après avoir été lancé</w:t>
+        <w:t xml:space="preserve">• L'attaque de corp à corp à un </w:t>
+      </w:r>
+      <w:proofErr w:type="spellStart"/>
+      <w:r>
+        <w:t>cooldown</w:t>
+      </w:r>
+      <w:proofErr w:type="spellEnd"/>
+      <w:r>
+        <w:t xml:space="preserve"> de 0.2s après avoir été lancé</w:t>
       </w:r>
     </w:p>
     <w:p/>
@@ -799,7 +1461,25 @@
           <w:bCs/>
           <w:u w:val="single"/>
         </w:rPr>
-        <w:t>#4 — En temps que joueur je souhaite avoir des ennemis de type manager afin de pouvoir gagner de l'argent</w:t>
+        <w:t xml:space="preserve">#4 — En </w:t>
+      </w:r>
+      <w:proofErr w:type="spellStart"/>
+      <w:r>
+        <w:rPr>
+          <w:b/>
+          <w:bCs/>
+          <w:u w:val="single"/>
+        </w:rPr>
+        <w:t>temps</w:t>
+      </w:r>
+      <w:proofErr w:type="spellEnd"/>
+      <w:r>
+        <w:rPr>
+          <w:b/>
+          <w:bCs/>
+          <w:u w:val="single"/>
+        </w:rPr>
+        <w:t xml:space="preserve"> que joueur je souhaite avoir des ennemis de type manager afin de pouvoir gagner de l'argent</w:t>
       </w:r>
     </w:p>
     <w:p>
@@ -825,7 +1505,7 @@
                     </pic:cNvPicPr>
                   </pic:nvPicPr>
                   <pic:blipFill>
-                    <a:blip r:embed="rId10"/>
+                    <a:blip r:embed="rId13"/>
                     <a:srcRect/>
                     <a:stretch>
                       <a:fillRect/>
@@ -859,22 +1539,70 @@
     <w:p/>
     <w:p>
       <w:r>
-        <w:t>• Un manager doit pouvoir se deplacer aléatoirement sur la carte</w:t>
-      </w:r>
-    </w:p>
-    <w:p>
-      <w:r>
-        <w:t>• Un manager doit  trouver une nouvelle destination si il bute sur un obstacle</w:t>
-      </w:r>
-    </w:p>
-    <w:p>
-      <w:r>
-        <w:t>• Un manager doit pouvoir lancer des projectile de type sac d'argent.</w:t>
-      </w:r>
-    </w:p>
-    <w:p>
-      <w:r>
-        <w:t>• Un manager prends 4 sec à recharger.</w:t>
+        <w:t xml:space="preserve">• Un manager doit pouvoir se </w:t>
+      </w:r>
+      <w:proofErr w:type="spellStart"/>
+      <w:r>
+        <w:t>deplacer</w:t>
+      </w:r>
+      <w:proofErr w:type="spellEnd"/>
+      <w:r>
+        <w:t xml:space="preserve"> aléatoirement sur la carte</w:t>
+      </w:r>
+    </w:p>
+    <w:p>
+      <w:r>
+        <w:t xml:space="preserve">• Un manager </w:t>
+      </w:r>
+      <w:proofErr w:type="gramStart"/>
+      <w:r>
+        <w:t>doit  trouver</w:t>
+      </w:r>
+      <w:proofErr w:type="gramEnd"/>
+      <w:r>
+        <w:t xml:space="preserve"> une nouvelle destination </w:t>
+      </w:r>
+      <w:proofErr w:type="gramStart"/>
+      <w:r>
+        <w:t>si il</w:t>
+      </w:r>
+      <w:proofErr w:type="gramEnd"/>
+      <w:r>
+        <w:t xml:space="preserve"> bute sur un obstacle</w:t>
+      </w:r>
+    </w:p>
+    <w:p>
+      <w:r>
+        <w:t xml:space="preserve">• Un manager doit pouvoir lancer </w:t>
+      </w:r>
+      <w:proofErr w:type="gramStart"/>
+      <w:r>
+        <w:t>des projectile</w:t>
+      </w:r>
+      <w:proofErr w:type="gramEnd"/>
+      <w:r>
+        <w:t xml:space="preserve"> de type sac d'argent.</w:t>
+      </w:r>
+    </w:p>
+    <w:p>
+      <w:r>
+        <w:t xml:space="preserve">• Un manager </w:t>
+      </w:r>
+      <w:proofErr w:type="gramStart"/>
+      <w:r>
+        <w:t>prends</w:t>
+      </w:r>
+      <w:proofErr w:type="gramEnd"/>
+      <w:r>
+        <w:t xml:space="preserve"> 4 </w:t>
+      </w:r>
+      <w:proofErr w:type="gramStart"/>
+      <w:r>
+        <w:t>sec</w:t>
+      </w:r>
+      <w:proofErr w:type="gramEnd"/>
+      <w:r>
+        <w:t xml:space="preserve"> à recharger.</w:t>
       </w:r>
     </w:p>
     <w:p>
@@ -884,12 +1612,36 @@
     </w:p>
     <w:p>
       <w:r>
-        <w:t>• Lorsque un manager meurt, le nombre d'argent du joueur augment de 5'000$</w:t>
-      </w:r>
-    </w:p>
-    <w:p>
-      <w:r>
-        <w:t>• L'argent que fait tomber le manager est quadruplé et ses PV sont doublé quand le joueur atteint 100'000$. Il le sont à nouveaux quand il atteint 500'000$</w:t>
+        <w:t xml:space="preserve">• </w:t>
+      </w:r>
+      <w:proofErr w:type="gramStart"/>
+      <w:r>
+        <w:t>Lorsque un</w:t>
+      </w:r>
+      <w:proofErr w:type="gramEnd"/>
+      <w:r>
+        <w:t xml:space="preserve"> manager meurt, le nombre d'argent du joueur </w:t>
+      </w:r>
+      <w:proofErr w:type="spellStart"/>
+      <w:r>
+        <w:t>augment</w:t>
+      </w:r>
+      <w:proofErr w:type="spellEnd"/>
+      <w:r>
+        <w:t xml:space="preserve"> de 5'000$</w:t>
+      </w:r>
+    </w:p>
+    <w:p>
+      <w:r>
+        <w:t xml:space="preserve">• L'argent que fait tomber le manager est quadruplé et ses PV sont doublé quand le joueur atteint 100'000$. </w:t>
+      </w:r>
+      <w:proofErr w:type="gramStart"/>
+      <w:r>
+        <w:t>Il le sont</w:t>
+      </w:r>
+      <w:proofErr w:type="gramEnd"/>
+      <w:r>
+        <w:t xml:space="preserve"> à nouveaux quand il atteint 500'000$</w:t>
       </w:r>
     </w:p>
     <w:p/>
@@ -897,9 +1649,11 @@
       <w:pPr>
         <w:pStyle w:val="Titre2"/>
       </w:pPr>
+      <w:bookmarkStart w:id="5" w:name="_Toc240030132"/>
       <w:r>
         <w:t>Planification Initiale</w:t>
       </w:r>
+      <w:bookmarkEnd w:id="5"/>
     </w:p>
     <w:tbl>
       <w:tblPr>
@@ -983,24 +1737,12 @@
             <w:tcW w:w="6940" w:type="dxa"/>
           </w:tcPr>
           <w:p>
-            <w:hyperlink r:id="rId11" w:history="1">
+            <w:hyperlink r:id="rId14" w:history="1">
               <w:r>
                 <w:rPr>
                   <w:rStyle w:val="Lienhypertexte"/>
                 </w:rPr>
-                <w:t>Ajout du mouvemen</w:t>
-              </w:r>
-              <w:r>
-                <w:rPr>
-                  <w:rStyle w:val="Lienhypertexte"/>
-                </w:rPr>
-                <w:t>t</w:t>
-              </w:r>
-              <w:r>
-                <w:rPr>
-                  <w:rStyle w:val="Lienhypertexte"/>
-                </w:rPr>
-                <w:t xml:space="preserve"> WASD</w:t>
+                <w:t>Ajout du mouvement WASD</w:t>
               </w:r>
             </w:hyperlink>
           </w:p>
@@ -1013,13 +1755,7 @@
           </w:tcPr>
           <w:p>
             <w:r>
-              <w:t>1</w:t>
-            </w:r>
-            <w:r>
-              <w:t>8</w:t>
-            </w:r>
-            <w:r>
-              <w:t>.09.2026</w:t>
+              <w:t>18.09.2026</w:t>
             </w:r>
           </w:p>
         </w:tc>
@@ -1028,12 +1764,105 @@
             <w:tcW w:w="6940" w:type="dxa"/>
           </w:tcPr>
           <w:p>
-            <w:hyperlink r:id="rId12" w:history="1">
+            <w:hyperlink r:id="rId15" w:history="1">
+              <w:proofErr w:type="gramStart"/>
               <w:r>
                 <w:rPr>
                   <w:rStyle w:val="Lienhypertexte"/>
                 </w:rPr>
-                <w:t>pouvoir tirer des projectile sur mes enemies</w:t>
+                <w:t>pouvoir</w:t>
+              </w:r>
+              <w:proofErr w:type="gramEnd"/>
+              <w:r>
+                <w:rPr>
+                  <w:rStyle w:val="Lienhypertexte"/>
+                </w:rPr>
+                <w:t xml:space="preserve"> tirer </w:t>
+              </w:r>
+              <w:proofErr w:type="gramStart"/>
+              <w:r>
+                <w:rPr>
+                  <w:rStyle w:val="Lienhypertexte"/>
+                </w:rPr>
+                <w:t>des projectile</w:t>
+              </w:r>
+              <w:proofErr w:type="gramEnd"/>
+              <w:r>
+                <w:rPr>
+                  <w:rStyle w:val="Lienhypertexte"/>
+                </w:rPr>
+                <w:t xml:space="preserve"> sur mes </w:t>
+              </w:r>
+              <w:proofErr w:type="spellStart"/>
+              <w:r>
+                <w:rPr>
+                  <w:rStyle w:val="Lienhypertexte"/>
+                </w:rPr>
+                <w:t>enemies</w:t>
+              </w:r>
+              <w:proofErr w:type="spellEnd"/>
+            </w:hyperlink>
+          </w:p>
+        </w:tc>
+      </w:tr>
+      <w:tr>
+        <w:tc>
+          <w:tcPr>
+            <w:tcW w:w="2122" w:type="dxa"/>
+          </w:tcPr>
+          <w:p>
+            <w:r>
+              <w:t>25.09.2026</w:t>
+            </w:r>
+          </w:p>
+        </w:tc>
+        <w:tc>
+          <w:tcPr>
+            <w:tcW w:w="6940" w:type="dxa"/>
+          </w:tcPr>
+          <w:p>
+            <w:hyperlink r:id="rId16" w:history="1">
+              <w:proofErr w:type="gramStart"/>
+              <w:r>
+                <w:rPr>
+                  <w:rStyle w:val="Lienhypertexte"/>
+                </w:rPr>
+                <w:t>pouvoir</w:t>
+              </w:r>
+              <w:proofErr w:type="gramEnd"/>
+              <w:r>
+                <w:rPr>
+                  <w:rStyle w:val="Lienhypertexte"/>
+                </w:rPr>
+                <w:t xml:space="preserve"> faire des </w:t>
+              </w:r>
+              <w:proofErr w:type="spellStart"/>
+              <w:r>
+                <w:rPr>
+                  <w:rStyle w:val="Lienhypertexte"/>
+                </w:rPr>
+                <w:t>degats</w:t>
+              </w:r>
+              <w:proofErr w:type="spellEnd"/>
+              <w:r>
+                <w:rPr>
+                  <w:rStyle w:val="Lienhypertexte"/>
+                </w:rPr>
+                <w:t xml:space="preserve"> </w:t>
+              </w:r>
+              <w:proofErr w:type="gramStart"/>
+              <w:r>
+                <w:rPr>
+                  <w:rStyle w:val="Lienhypertexte"/>
+                </w:rPr>
+                <w:t>au corp</w:t>
+              </w:r>
+              <w:proofErr w:type="gramEnd"/>
+              <w:r>
+                <w:rPr>
+                  <w:rStyle w:val="Lienhypertexte"/>
+                </w:rPr>
+                <w:t xml:space="preserve"> à corp</w:t>
               </w:r>
             </w:hyperlink>
           </w:p>
@@ -1046,10 +1875,7 @@
           </w:tcPr>
           <w:p>
             <w:r>
-              <w:t>25</w:t>
-            </w:r>
-            <w:r>
-              <w:t>.09.2026</w:t>
+              <w:t>25.09.2026</w:t>
             </w:r>
           </w:p>
         </w:tc>
@@ -1058,34 +1884,7 @@
             <w:tcW w:w="6940" w:type="dxa"/>
           </w:tcPr>
           <w:p>
-            <w:hyperlink r:id="rId13" w:history="1">
-              <w:r>
-                <w:rPr>
-                  <w:rStyle w:val="Lienhypertexte"/>
-                </w:rPr>
-                <w:t>pouvoir faire des degats au corp à corp</w:t>
-              </w:r>
-            </w:hyperlink>
-          </w:p>
-        </w:tc>
-      </w:tr>
-      <w:tr>
-        <w:tc>
-          <w:tcPr>
-            <w:tcW w:w="2122" w:type="dxa"/>
-          </w:tcPr>
-          <w:p>
-            <w:r>
-              <w:t>25.09.2026</w:t>
-            </w:r>
-          </w:p>
-        </w:tc>
-        <w:tc>
-          <w:tcPr>
-            <w:tcW w:w="6940" w:type="dxa"/>
-          </w:tcPr>
-          <w:p>
-            <w:hyperlink r:id="rId14" w:history="1">
+            <w:hyperlink r:id="rId17" w:history="1">
               <w:r>
                 <w:rPr>
                   <w:rStyle w:val="Lienhypertexte"/>
@@ -1112,7 +1911,7 @@
             <w:tcW w:w="6940" w:type="dxa"/>
           </w:tcPr>
           <w:p>
-            <w:hyperlink r:id="rId15" w:history="1">
+            <w:hyperlink r:id="rId18" w:history="1">
               <w:r>
                 <w:rPr>
                   <w:rStyle w:val="Lienhypertexte"/>
@@ -1139,7 +1938,7 @@
             <w:tcW w:w="6940" w:type="dxa"/>
           </w:tcPr>
           <w:p>
-            <w:hyperlink r:id="rId16" w:history="1">
+            <w:hyperlink r:id="rId19" w:history="1">
               <w:r>
                 <w:rPr>
                   <w:rStyle w:val="Lienhypertexte"/>
@@ -1157,10 +1956,7 @@
           </w:tcPr>
           <w:p>
             <w:r>
-              <w:t>02</w:t>
-            </w:r>
-            <w:r>
-              <w:t>.10.2026</w:t>
+              <w:t>02.10.2026</w:t>
             </w:r>
           </w:p>
         </w:tc>
@@ -1169,18 +1965,12 @@
             <w:tcW w:w="6940" w:type="dxa"/>
           </w:tcPr>
           <w:p>
-            <w:hyperlink r:id="rId17" w:history="1">
+            <w:hyperlink r:id="rId20" w:history="1">
               <w:r>
                 <w:rPr>
                   <w:rStyle w:val="Lienhypertexte"/>
                 </w:rPr>
-                <w:t xml:space="preserve">Créer </w:t>
-              </w:r>
-              <w:r>
-                <w:rPr>
-                  <w:rStyle w:val="Lienhypertexte"/>
-                </w:rPr>
-                <w:t>les projectiles des managers</w:t>
+                <w:t>Créer les projectiles des managers</w:t>
               </w:r>
             </w:hyperlink>
           </w:p>
@@ -1205,7 +1995,7 @@
             <w:tcW w:w="6940" w:type="dxa"/>
           </w:tcPr>
           <w:p>
-            <w:hyperlink r:id="rId18" w:history="1">
+            <w:hyperlink r:id="rId21" w:history="1">
               <w:r>
                 <w:rPr>
                   <w:rStyle w:val="Lienhypertexte"/>
@@ -1235,7 +2025,7 @@
             <w:tcW w:w="6940" w:type="dxa"/>
           </w:tcPr>
           <w:p>
-            <w:hyperlink r:id="rId19" w:history="1">
+            <w:hyperlink r:id="rId22" w:history="1">
               <w:r>
                 <w:rPr>
                   <w:rStyle w:val="Lienhypertexte"/>
@@ -1265,7 +2055,7 @@
             <w:tcW w:w="6940" w:type="dxa"/>
           </w:tcPr>
           <w:p>
-            <w:hyperlink r:id="rId20" w:history="1">
+            <w:hyperlink r:id="rId23" w:history="1">
               <w:r>
                 <w:rPr>
                   <w:rStyle w:val="Lienhypertexte"/>
@@ -1279,6 +2069,7 @@
     </w:tbl>
     <w:p/>
     <w:sectPr>
+      <w:footerReference w:type="default" r:id="rId24"/>
       <w:pgSz w:w="11906" w:h="16838"/>
       <w:pgMar w:top="1417" w:right="1417" w:bottom="1417" w:left="1417" w:header="708" w:footer="708" w:gutter="0"/>
       <w:cols w:space="708"/>
@@ -1286,6 +2077,123 @@
     </w:sectPr>
   </w:body>
 </w:document>
+</file>
+
+<file path=word/endnotes.xml><?xml version="1.0" encoding="utf-8"?>
+<w:endnotes xmlns:wpc="http://schemas.microsoft.com/office/word/2010/wordprocessingCanvas" xmlns:cx="http://schemas.microsoft.com/office/drawing/2014/chartex" xmlns:cx1="http://schemas.microsoft.com/office/drawing/2015/9/8/chartex" xmlns:cx2="http://schemas.microsoft.com/office/drawing/2015/10/21/chartex" xmlns:cx3="http://schemas.microsoft.com/office/drawing/2016/5/9/chartex" xmlns:cx4="http://schemas.microsoft.com/office/drawing/2016/5/10/chartex" xmlns:cx5="http://schemas.microsoft.com/office/drawing/2016/5/11/chartex" xmlns:cx6="http://schemas.microsoft.com/office/drawing/2016/5/12/chartex" xmlns:cx7="http://schemas.microsoft.com/office/drawing/2016/5/13/chartex" xmlns:cx8="http://schemas.microsoft.com/office/drawing/2016/5/14/chartex" xmlns:mc="http://schemas.openxmlformats.org/markup-compatibility/2006" xmlns:aink="http://schemas.microsoft.com/office/drawing/2016/ink" xmlns:am3d="http://schemas.microsoft.com/office/drawing/2017/model3d" xmlns:o="urn:schemas-microsoft-com:office:office" xmlns:oel="http://schemas.microsoft.com/office/2019/extlst" xmlns:r="http://schemas.openxmlformats.org/officeDocument/2006/relationships" xmlns:m="http://schemas.openxmlformats.org/officeDocument/2006/math" xmlns:v="urn:schemas-microsoft-com:vml" xmlns:wp14="http://schemas.microsoft.com/office/word/2010/wordprocessingDrawing" xmlns:wp="http://schemas.openxmlformats.org/drawingml/2006/wordprocessingDrawing" xmlns:w10="urn:schemas-microsoft-com:office:word" xmlns:w="http://schemas.openxmlformats.org/wordprocessingml/2006/main" xmlns:w14="http://schemas.microsoft.com/office/word/2010/wordml" xmlns:w15="http://schemas.microsoft.com/office/word/2012/wordml" xmlns:w16cex="http://schemas.microsoft.com/office/word/2018/wordml/cex" xmlns:w16cid="http://schemas.microsoft.com/office/word/2016/wordml/cid" xmlns:w16="http://schemas.microsoft.com/office/word/2018/wordml" xmlns:w16du="http://schemas.microsoft.com/office/word/2023/wordml/word16du" xmlns:w16sdtdh="http://schemas.microsoft.com/office/word/2020/wordml/sdtdatahash" xmlns:w16sdtfl="http://schemas.microsoft.com/office/word/2024/wordml/sdtformatlock" xmlns:w16se="http://schemas.microsoft.com/office/word/2015/wordml/symex" xmlns:wpg="http://schemas.microsoft.com/office/word/2010/wordprocessingGroup" xmlns:wpi="http://schemas.microsoft.com/office/word/2010/wordprocessingInk" xmlns:wne="http://schemas.microsoft.com/office/word/2006/wordml" xmlns:wps="http://schemas.microsoft.com/office/word/2010/wordprocessingShape" mc:Ignorable="w14 w15 w16se w16cid w16 w16cex w16sdtdh w16sdtfl w16du wp14">
+  <w:endnote w:type="separator" w:id="-1">
+    <w:p>
+      <w:pPr>
+        <w:spacing w:after="0" w:line="240" w:lineRule="auto"/>
+      </w:pPr>
+      <w:r>
+        <w:separator/>
+      </w:r>
+    </w:p>
+  </w:endnote>
+  <w:endnote w:type="continuationSeparator" w:id="0">
+    <w:p>
+      <w:pPr>
+        <w:spacing w:after="0" w:line="240" w:lineRule="auto"/>
+      </w:pPr>
+      <w:r>
+        <w:continuationSeparator/>
+      </w:r>
+    </w:p>
+  </w:endnote>
+</w:endnotes>
+</file>
+
+<file path=word/footer1.xml><?xml version="1.0" encoding="utf-8"?>
+<w:ftr xmlns:wpc="http://schemas.microsoft.com/office/word/2010/wordprocessingCanvas" xmlns:cx="http://schemas.microsoft.com/office/drawing/2014/chartex" xmlns:cx1="http://schemas.microsoft.com/office/drawing/2015/9/8/chartex" xmlns:cx2="http://schemas.microsoft.com/office/drawing/2015/10/21/chartex" xmlns:cx3="http://schemas.microsoft.com/office/drawing/2016/5/9/chartex" xmlns:cx4="http://schemas.microsoft.com/office/drawing/2016/5/10/chartex" xmlns:cx5="http://schemas.microsoft.com/office/drawing/2016/5/11/chartex" xmlns:cx6="http://schemas.microsoft.com/office/drawing/2016/5/12/chartex" xmlns:cx7="http://schemas.microsoft.com/office/drawing/2016/5/13/chartex" xmlns:cx8="http://schemas.microsoft.com/office/drawing/2016/5/14/chartex" xmlns:mc="http://schemas.openxmlformats.org/markup-compatibility/2006" xmlns:aink="http://schemas.microsoft.com/office/drawing/2016/ink" xmlns:am3d="http://schemas.microsoft.com/office/drawing/2017/model3d" xmlns:o="urn:schemas-microsoft-com:office:office" xmlns:oel="http://schemas.microsoft.com/office/2019/extlst" xmlns:r="http://schemas.openxmlformats.org/officeDocument/2006/relationships" xmlns:m="http://schemas.openxmlformats.org/officeDocument/2006/math" xmlns:v="urn:schemas-microsoft-com:vml" xmlns:wp14="http://schemas.microsoft.com/office/word/2010/wordprocessingDrawing" xmlns:wp="http://schemas.openxmlformats.org/drawingml/2006/wordprocessingDrawing" xmlns:w10="urn:schemas-microsoft-com:office:word" xmlns:w="http://schemas.openxmlformats.org/wordprocessingml/2006/main" xmlns:w14="http://schemas.microsoft.com/office/word/2010/wordml" xmlns:w15="http://schemas.microsoft.com/office/word/2012/wordml" xmlns:w16cex="http://schemas.microsoft.com/office/word/2018/wordml/cex" xmlns:w16cid="http://schemas.microsoft.com/office/word/2016/wordml/cid" xmlns:w16="http://schemas.microsoft.com/office/word/2018/wordml" xmlns:w16du="http://schemas.microsoft.com/office/word/2023/wordml/word16du" xmlns:w16sdtdh="http://schemas.microsoft.com/office/word/2020/wordml/sdtdatahash" xmlns:w16sdtfl="http://schemas.microsoft.com/office/word/2024/wordml/sdtformatlock" xmlns:w16se="http://schemas.microsoft.com/office/word/2015/wordml/symex" xmlns:wpg="http://schemas.microsoft.com/office/word/2010/wordprocessingGroup" xmlns:wpi="http://schemas.microsoft.com/office/word/2010/wordprocessingInk" xmlns:wne="http://schemas.microsoft.com/office/word/2006/wordml" xmlns:wps="http://schemas.microsoft.com/office/word/2010/wordprocessingShape" mc:Ignorable="w14 w15 w16se w16cid w16 w16cex w16sdtdh w16sdtfl w16du wp14">
+  <w:sdt>
+    <w:sdtPr>
+      <w:id w:val="-2108107299"/>
+      <w:docPartObj>
+        <w:docPartGallery w:val="Page Numbers (Bottom of Page)"/>
+        <w:docPartUnique/>
+      </w:docPartObj>
+    </w:sdtPr>
+    <w:sdtContent>
+      <w:p>
+        <w:pPr>
+          <w:pStyle w:val="Pieddepage"/>
+          <w:jc w:val="right"/>
+        </w:pPr>
+        <w:r>
+          <w:fldChar w:fldCharType="begin"/>
+        </w:r>
+        <w:r>
+          <w:instrText>PAGE   \* MERGEFORMAT</w:instrText>
+        </w:r>
+        <w:r>
+          <w:fldChar w:fldCharType="separate"/>
+        </w:r>
+        <w:r>
+          <w:rPr>
+            <w:lang w:val="fr-FR"/>
+          </w:rPr>
+          <w:t>2</w:t>
+        </w:r>
+        <w:r>
+          <w:fldChar w:fldCharType="end"/>
+        </w:r>
+      </w:p>
+    </w:sdtContent>
+  </w:sdt>
+  <w:p>
+    <w:pPr>
+      <w:pStyle w:val="Pieddepage"/>
+      <w:rPr>
+        <w:lang w:val="en-US"/>
+      </w:rPr>
+    </w:pPr>
+    <w:r>
+      <w:rPr>
+        <w:lang w:val="en-US"/>
+      </w:rPr>
+      <w:t>Antoni D</w:t>
+    </w:r>
+    <w:r>
+      <w:rPr>
+        <w:rFonts w:hint="eastAsia"/>
+        <w:lang w:val="en-US"/>
+      </w:rPr>
+      <w:t>é</w:t>
+    </w:r>
+    <w:r>
+      <w:rPr>
+        <w:lang w:val="en-US"/>
+      </w:rPr>
+      <w:t>baz P-OO Shoot Me Up</w:t>
+    </w:r>
+  </w:p>
+</w:ftr>
+</file>
+
+<file path=word/footnotes.xml><?xml version="1.0" encoding="utf-8"?>
+<w:footnotes xmlns:wpc="http://schemas.microsoft.com/office/word/2010/wordprocessingCanvas" xmlns:cx="http://schemas.microsoft.com/office/drawing/2014/chartex" xmlns:cx1="http://schemas.microsoft.com/office/drawing/2015/9/8/chartex" xmlns:cx2="http://schemas.microsoft.com/office/drawing/2015/10/21/chartex" xmlns:cx3="http://schemas.microsoft.com/office/drawing/2016/5/9/chartex" xmlns:cx4="http://schemas.microsoft.com/office/drawing/2016/5/10/chartex" xmlns:cx5="http://schemas.microsoft.com/office/drawing/2016/5/11/chartex" xmlns:cx6="http://schemas.microsoft.com/office/drawing/2016/5/12/chartex" xmlns:cx7="http://schemas.microsoft.com/office/drawing/2016/5/13/chartex" xmlns:cx8="http://schemas.microsoft.com/office/drawing/2016/5/14/chartex" xmlns:mc="http://schemas.openxmlformats.org/markup-compatibility/2006" xmlns:aink="http://schemas.microsoft.com/office/drawing/2016/ink" xmlns:am3d="http://schemas.microsoft.com/office/drawing/2017/model3d" xmlns:o="urn:schemas-microsoft-com:office:office" xmlns:oel="http://schemas.microsoft.com/office/2019/extlst" xmlns:r="http://schemas.openxmlformats.org/officeDocument/2006/relationships" xmlns:m="http://schemas.openxmlformats.org/officeDocument/2006/math" xmlns:v="urn:schemas-microsoft-com:vml" xmlns:wp14="http://schemas.microsoft.com/office/word/2010/wordprocessingDrawing" xmlns:wp="http://schemas.openxmlformats.org/drawingml/2006/wordprocessingDrawing" xmlns:w10="urn:schemas-microsoft-com:office:word" xmlns:w="http://schemas.openxmlformats.org/wordprocessingml/2006/main" xmlns:w14="http://schemas.microsoft.com/office/word/2010/wordml" xmlns:w15="http://schemas.microsoft.com/office/word/2012/wordml" xmlns:w16cex="http://schemas.microsoft.com/office/word/2018/wordml/cex" xmlns:w16cid="http://schemas.microsoft.com/office/word/2016/wordml/cid" xmlns:w16="http://schemas.microsoft.com/office/word/2018/wordml" xmlns:w16du="http://schemas.microsoft.com/office/word/2023/wordml/word16du" xmlns:w16sdtdh="http://schemas.microsoft.com/office/word/2020/wordml/sdtdatahash" xmlns:w16sdtfl="http://schemas.microsoft.com/office/word/2024/wordml/sdtformatlock" xmlns:w16se="http://schemas.microsoft.com/office/word/2015/wordml/symex" xmlns:wpg="http://schemas.microsoft.com/office/word/2010/wordprocessingGroup" xmlns:wpi="http://schemas.microsoft.com/office/word/2010/wordprocessingInk" xmlns:wne="http://schemas.microsoft.com/office/word/2006/wordml" xmlns:wps="http://schemas.microsoft.com/office/word/2010/wordprocessingShape" mc:Ignorable="w14 w15 w16se w16cid w16 w16cex w16sdtdh w16sdtfl w16du wp14">
+  <w:footnote w:type="separator" w:id="-1">
+    <w:p>
+      <w:pPr>
+        <w:spacing w:after="0" w:line="240" w:lineRule="auto"/>
+      </w:pPr>
+      <w:r>
+        <w:separator/>
+      </w:r>
+    </w:p>
+  </w:footnote>
+  <w:footnote w:type="continuationSeparator" w:id="0">
+    <w:p>
+      <w:pPr>
+        <w:spacing w:after="0" w:line="240" w:lineRule="auto"/>
+      </w:pPr>
+      <w:r>
+        <w:continuationSeparator/>
+      </w:r>
+    </w:p>
+  </w:footnote>
+</w:footnotes>
 </file>
 
 <file path=word/numbering.xml><?xml version="1.0" encoding="utf-8"?>
@@ -2202,7 +3110,6 @@
     <w:next w:val="Normal"/>
     <w:link w:val="Titre4Car"/>
     <w:uiPriority w:val="9"/>
-    <w:semiHidden/>
     <w:unhideWhenUsed/>
     <w:qFormat/>
     <w:rsid w:val="006C417F"/>
@@ -2331,6 +3238,7 @@
   <w:style w:type="character" w:default="1" w:styleId="Policepardfaut">
     <w:name w:val="Default Paragraph Font"/>
     <w:uiPriority w:val="1"/>
+    <w:semiHidden/>
     <w:unhideWhenUsed/>
   </w:style>
   <w:style w:type="table" w:default="1" w:styleId="TableauNormal">
@@ -2398,7 +3306,6 @@
     <w:basedOn w:val="Policepardfaut"/>
     <w:link w:val="Titre4"/>
     <w:uiPriority w:val="9"/>
-    <w:semiHidden/>
     <w:rsid w:val="006C417F"/>
     <w:rPr>
       <w:rFonts w:eastAsiaTheme="majorEastAsia" w:cstheme="majorBidi"/>
@@ -2695,6 +3602,108 @@
         <w:insideV w:val="single" w:sz="4" w:space="0" w:color="auto"/>
       </w:tblBorders>
     </w:tblPr>
+  </w:style>
+  <w:style w:type="paragraph" w:styleId="En-ttedetabledesmatires">
+    <w:name w:val="TOC Heading"/>
+    <w:basedOn w:val="Titre1"/>
+    <w:next w:val="Normal"/>
+    <w:uiPriority w:val="39"/>
+    <w:unhideWhenUsed/>
+    <w:qFormat/>
+    <w:rsid w:val="00085059"/>
+    <w:pPr>
+      <w:spacing w:before="240" w:after="0" w:line="259" w:lineRule="auto"/>
+      <w:outlineLvl w:val="9"/>
+    </w:pPr>
+    <w:rPr>
+      <w:kern w:val="0"/>
+      <w:sz w:val="32"/>
+      <w:szCs w:val="32"/>
+      <w:lang w:eastAsia="fr-CH"/>
+      <w14:ligatures w14:val="none"/>
+    </w:rPr>
+  </w:style>
+  <w:style w:type="paragraph" w:styleId="TM1">
+    <w:name w:val="toc 1"/>
+    <w:basedOn w:val="Normal"/>
+    <w:next w:val="Normal"/>
+    <w:autoRedefine/>
+    <w:uiPriority w:val="39"/>
+    <w:unhideWhenUsed/>
+    <w:rsid w:val="00085059"/>
+    <w:pPr>
+      <w:spacing w:after="100"/>
+    </w:pPr>
+  </w:style>
+  <w:style w:type="paragraph" w:styleId="TM2">
+    <w:name w:val="toc 2"/>
+    <w:basedOn w:val="Normal"/>
+    <w:next w:val="Normal"/>
+    <w:autoRedefine/>
+    <w:uiPriority w:val="39"/>
+    <w:unhideWhenUsed/>
+    <w:rsid w:val="00085059"/>
+    <w:pPr>
+      <w:spacing w:after="100"/>
+      <w:ind w:left="240"/>
+    </w:pPr>
+  </w:style>
+  <w:style w:type="paragraph" w:styleId="TM3">
+    <w:name w:val="toc 3"/>
+    <w:basedOn w:val="Normal"/>
+    <w:next w:val="Normal"/>
+    <w:autoRedefine/>
+    <w:uiPriority w:val="39"/>
+    <w:unhideWhenUsed/>
+    <w:rsid w:val="00085059"/>
+    <w:pPr>
+      <w:spacing w:after="100"/>
+      <w:ind w:left="480"/>
+    </w:pPr>
+  </w:style>
+  <w:style w:type="paragraph" w:styleId="En-tte">
+    <w:name w:val="header"/>
+    <w:basedOn w:val="Normal"/>
+    <w:link w:val="En-tteCar"/>
+    <w:uiPriority w:val="99"/>
+    <w:unhideWhenUsed/>
+    <w:rsid w:val="001938A7"/>
+    <w:pPr>
+      <w:tabs>
+        <w:tab w:val="center" w:pos="4536"/>
+        <w:tab w:val="right" w:pos="9072"/>
+      </w:tabs>
+      <w:spacing w:after="0" w:line="240" w:lineRule="auto"/>
+    </w:pPr>
+  </w:style>
+  <w:style w:type="character" w:customStyle="1" w:styleId="En-tteCar">
+    <w:name w:val="En-tête Car"/>
+    <w:basedOn w:val="Policepardfaut"/>
+    <w:link w:val="En-tte"/>
+    <w:uiPriority w:val="99"/>
+    <w:rsid w:val="001938A7"/>
+  </w:style>
+  <w:style w:type="paragraph" w:styleId="Pieddepage">
+    <w:name w:val="footer"/>
+    <w:basedOn w:val="Normal"/>
+    <w:link w:val="PieddepageCar"/>
+    <w:uiPriority w:val="99"/>
+    <w:unhideWhenUsed/>
+    <w:rsid w:val="001938A7"/>
+    <w:pPr>
+      <w:tabs>
+        <w:tab w:val="center" w:pos="4536"/>
+        <w:tab w:val="right" w:pos="9072"/>
+      </w:tabs>
+      <w:spacing w:after="0" w:line="240" w:lineRule="auto"/>
+    </w:pPr>
+  </w:style>
+  <w:style w:type="character" w:customStyle="1" w:styleId="PieddepageCar">
+    <w:name w:val="Pied de page Car"/>
+    <w:basedOn w:val="Policepardfaut"/>
+    <w:link w:val="Pieddepage"/>
+    <w:uiPriority w:val="99"/>
+    <w:rsid w:val="001938A7"/>
   </w:style>
 </w:styles>
 </file>
@@ -3012,4 +4021,16 @@
     </a:ext>
   </a:extLst>
 </a:theme>
+</file>
+
+<file path=customXml/item1.xml><?xml version="1.0" encoding="utf-8"?>
+<b:Sources xmlns:b="http://schemas.openxmlformats.org/officeDocument/2006/bibliography" xmlns="http://schemas.openxmlformats.org/officeDocument/2006/bibliography" SelectedStyle="\APASixthEditionOfficeOnline.xsl" StyleName="APA" Version="6"/>
+</file>
+
+<file path=customXml/itemProps1.xml><?xml version="1.0" encoding="utf-8"?>
+<ds:datastoreItem xmlns:ds="http://schemas.openxmlformats.org/officeDocument/2006/customXml" ds:itemID="{1BB38CCC-5362-4F6D-A71C-C75DA62F027A}">
+  <ds:schemaRefs>
+    <ds:schemaRef ds:uri="http://schemas.openxmlformats.org/officeDocument/2006/bibliography"/>
+  </ds:schemaRefs>
+</ds:datastoreItem>
 </file>
</xml_diff>

<commit_message>
feat(Tests) création de deux tests pour les helpers
</commit_message>
<xml_diff>
--- a/doc/Rapport.docx
+++ b/doc/Rapport.docx
@@ -4,43 +4,43 @@
   <w:body>
     <w:p>
       <w:pPr>
-        <w:pStyle w:val="Titre1"/>
+        <w:pStyle w:val="Heading1"/>
         <w:jc w:val="center"/>
       </w:pPr>
     </w:p>
     <w:p>
       <w:pPr>
-        <w:pStyle w:val="Titre1"/>
+        <w:pStyle w:val="Heading1"/>
         <w:jc w:val="center"/>
       </w:pPr>
     </w:p>
     <w:p>
       <w:pPr>
-        <w:pStyle w:val="Titre1"/>
+        <w:pStyle w:val="Heading1"/>
         <w:jc w:val="center"/>
       </w:pPr>
     </w:p>
     <w:p>
       <w:pPr>
-        <w:pStyle w:val="Titre1"/>
+        <w:pStyle w:val="Heading1"/>
         <w:jc w:val="center"/>
       </w:pPr>
     </w:p>
     <w:p>
       <w:pPr>
-        <w:pStyle w:val="Titre1"/>
+        <w:pStyle w:val="Heading1"/>
         <w:jc w:val="center"/>
       </w:pPr>
     </w:p>
     <w:p>
       <w:pPr>
-        <w:pStyle w:val="Titre1"/>
+        <w:pStyle w:val="Heading1"/>
         <w:jc w:val="center"/>
       </w:pPr>
     </w:p>
     <w:p>
       <w:pPr>
-        <w:pStyle w:val="Titre1"/>
+        <w:pStyle w:val="Heading1"/>
         <w:jc w:val="center"/>
       </w:pPr>
       <w:bookmarkStart w:id="0" w:name="_Toc240030127"/>
@@ -76,7 +76,13 @@
     <w:sdt>
       <w:sdtPr>
         <w:rPr>
-          <w:lang w:val="fr-FR"/>
+          <w:rFonts w:asciiTheme="minorHAnsi" w:eastAsiaTheme="minorHAnsi" w:hAnsiTheme="minorHAnsi" w:cstheme="minorBidi"/>
+          <w:color w:val="auto"/>
+          <w:kern w:val="2"/>
+          <w:sz w:val="24"/>
+          <w:szCs w:val="24"/>
+          <w:lang w:val="fr-FR" w:eastAsia="en-US"/>
+          <w14:ligatures w14:val="standardContextual"/>
         </w:rPr>
         <w:id w:val="-2127608899"/>
         <w:docPartObj>
@@ -86,21 +92,14 @@
       </w:sdtPr>
       <w:sdtEndPr>
         <w:rPr>
-          <w:rFonts w:asciiTheme="minorHAnsi" w:eastAsiaTheme="minorHAnsi" w:hAnsiTheme="minorHAnsi" w:cstheme="minorBidi"/>
           <w:b/>
           <w:bCs/>
-          <w:color w:val="auto"/>
-          <w:kern w:val="2"/>
-          <w:sz w:val="24"/>
-          <w:szCs w:val="24"/>
-          <w:lang w:eastAsia="en-US"/>
-          <w14:ligatures w14:val="standardContextual"/>
         </w:rPr>
       </w:sdtEndPr>
       <w:sdtContent>
         <w:p>
           <w:pPr>
-            <w:pStyle w:val="En-ttedetabledesmatires"/>
+            <w:pStyle w:val="TOCHeading"/>
           </w:pPr>
           <w:r>
             <w:rPr>
@@ -111,7 +110,7 @@
         </w:p>
         <w:p>
           <w:pPr>
-            <w:pStyle w:val="TM1"/>
+            <w:pStyle w:val="TOC1"/>
             <w:tabs>
               <w:tab w:val="right" w:leader="dot" w:pos="9062"/>
             </w:tabs>
@@ -133,7 +132,7 @@
           <w:hyperlink w:anchor="_Toc240030127" w:history="1">
             <w:r>
               <w:rPr>
-                <w:rStyle w:val="Lienhypertexte"/>
+                <w:rStyle w:val="Hyperlink"/>
                 <w:noProof/>
               </w:rPr>
               <w:t>P_OO Shoot Me Up Rapport de Projet</w:t>
@@ -190,7 +189,7 @@
         </w:p>
         <w:p>
           <w:pPr>
-            <w:pStyle w:val="TM2"/>
+            <w:pStyle w:val="TOC2"/>
             <w:tabs>
               <w:tab w:val="right" w:leader="dot" w:pos="9062"/>
             </w:tabs>
@@ -203,7 +202,7 @@
           <w:hyperlink w:anchor="_Toc240030128" w:history="1">
             <w:r>
               <w:rPr>
-                <w:rStyle w:val="Lienhypertexte"/>
+                <w:rStyle w:val="Hyperlink"/>
                 <w:noProof/>
               </w:rPr>
               <w:t>Introduction</w:t>
@@ -260,7 +259,7 @@
         </w:p>
         <w:p>
           <w:pPr>
-            <w:pStyle w:val="TM3"/>
+            <w:pStyle w:val="TOC3"/>
             <w:tabs>
               <w:tab w:val="right" w:leader="dot" w:pos="9062"/>
             </w:tabs>
@@ -273,7 +272,7 @@
           <w:hyperlink w:anchor="_Toc240030129" w:history="1">
             <w:r>
               <w:rPr>
-                <w:rStyle w:val="Lienhypertexte"/>
+                <w:rStyle w:val="Hyperlink"/>
                 <w:noProof/>
               </w:rPr>
               <w:t>Objectifs produit</w:t>
@@ -330,7 +329,7 @@
         </w:p>
         <w:p>
           <w:pPr>
-            <w:pStyle w:val="TM3"/>
+            <w:pStyle w:val="TOC3"/>
             <w:tabs>
               <w:tab w:val="right" w:leader="dot" w:pos="9062"/>
             </w:tabs>
@@ -343,7 +342,7 @@
           <w:hyperlink w:anchor="_Toc240030130" w:history="1">
             <w:r>
               <w:rPr>
-                <w:rStyle w:val="Lienhypertexte"/>
+                <w:rStyle w:val="Hyperlink"/>
                 <w:noProof/>
               </w:rPr>
               <w:t>Objectifs pédagogiques</w:t>
@@ -400,7 +399,7 @@
         </w:p>
         <w:p>
           <w:pPr>
-            <w:pStyle w:val="TM2"/>
+            <w:pStyle w:val="TOC2"/>
             <w:tabs>
               <w:tab w:val="right" w:leader="dot" w:pos="9062"/>
             </w:tabs>
@@ -413,7 +412,7 @@
           <w:hyperlink w:anchor="_Toc240030131" w:history="1">
             <w:r>
               <w:rPr>
-                <w:rStyle w:val="Lienhypertexte"/>
+                <w:rStyle w:val="Hyperlink"/>
                 <w:noProof/>
               </w:rPr>
               <w:t>Analyse fonctionnelle</w:t>
@@ -470,7 +469,7 @@
         </w:p>
         <w:p>
           <w:pPr>
-            <w:pStyle w:val="TM2"/>
+            <w:pStyle w:val="TOC2"/>
             <w:tabs>
               <w:tab w:val="right" w:leader="dot" w:pos="9062"/>
             </w:tabs>
@@ -483,7 +482,7 @@
           <w:hyperlink w:anchor="_Toc240030132" w:history="1">
             <w:r>
               <w:rPr>
-                <w:rStyle w:val="Lienhypertexte"/>
+                <w:rStyle w:val="Hyperlink"/>
                 <w:noProof/>
               </w:rPr>
               <w:t>Planification Initiale</w:t>
@@ -565,12 +564,12 @@
     </w:p>
     <w:p>
       <w:pPr>
-        <w:pStyle w:val="Titre2"/>
-      </w:pPr>
-    </w:p>
-    <w:p>
-      <w:pPr>
-        <w:pStyle w:val="Titre2"/>
+        <w:pStyle w:val="Heading2"/>
+      </w:pPr>
+    </w:p>
+    <w:p>
+      <w:pPr>
+        <w:pStyle w:val="Heading2"/>
       </w:pPr>
       <w:bookmarkStart w:id="1" w:name="_Toc240030128"/>
       <w:r>
@@ -580,7 +579,7 @@
     </w:p>
     <w:p>
       <w:pPr>
-        <w:pStyle w:val="Titre3"/>
+        <w:pStyle w:val="Heading3"/>
         <w:ind w:left="708"/>
       </w:pPr>
       <w:bookmarkStart w:id="2" w:name="_Toc240030129"/>
@@ -661,15 +660,7 @@
         <w:t xml:space="preserve"> sur le thème d’un employé de fast-food</w:t>
       </w:r>
       <w:r>
-        <w:t xml:space="preserve"> (</w:t>
-      </w:r>
-      <w:proofErr w:type="spellStart"/>
-      <w:r>
-        <w:t>Wacdonald’s</w:t>
-      </w:r>
-      <w:proofErr w:type="spellEnd"/>
-      <w:r>
-        <w:t>)</w:t>
+        <w:t xml:space="preserve"> (Wacdonald’s)</w:t>
       </w:r>
       <w:r>
         <w:t xml:space="preserve"> devant affronter sa hiérarchie et les robots voulant le </w:t>
@@ -683,7 +674,7 @@
     </w:p>
     <w:p>
       <w:pPr>
-        <w:pStyle w:val="Titre4"/>
+        <w:pStyle w:val="Heading4"/>
         <w:ind w:left="708"/>
       </w:pPr>
       <w:r>
@@ -797,20 +788,12 @@
         <w:t>leur attaque</w:t>
       </w:r>
       <w:r>
-        <w:t xml:space="preserve"> aura un </w:t>
-      </w:r>
-      <w:proofErr w:type="spellStart"/>
-      <w:r>
-        <w:t>cooldown</w:t>
-      </w:r>
-      <w:proofErr w:type="spellEnd"/>
-      <w:r>
-        <w:t>.</w:t>
-      </w:r>
-    </w:p>
-    <w:p>
-      <w:pPr>
-        <w:pStyle w:val="Titre4"/>
+        <w:t xml:space="preserve"> aura un cooldown.</w:t>
+      </w:r>
+    </w:p>
+    <w:p>
+      <w:pPr>
+        <w:pStyle w:val="Heading4"/>
         <w:ind w:left="708"/>
       </w:pPr>
       <w:r>
@@ -836,20 +819,12 @@
         <w:ind w:left="708"/>
       </w:pPr>
       <w:r>
-        <w:t xml:space="preserve">Le joueur pourra également se cacher derrière les bornes </w:t>
-      </w:r>
-      <w:proofErr w:type="spellStart"/>
-      <w:r>
-        <w:t>wacdonald’s</w:t>
-      </w:r>
-      <w:proofErr w:type="spellEnd"/>
-      <w:r>
-        <w:t xml:space="preserve"> pour se protéger.</w:t>
-      </w:r>
-    </w:p>
-    <w:p>
-      <w:pPr>
-        <w:pStyle w:val="Titre4"/>
+        <w:t>Le joueur pourra également se cacher derrière les bornes wacdonald’s pour se protéger.</w:t>
+      </w:r>
+    </w:p>
+    <w:p>
+      <w:pPr>
+        <w:pStyle w:val="Heading4"/>
         <w:ind w:left="708"/>
       </w:pPr>
       <w:r>
@@ -867,20 +842,12 @@
         <w:t>er</w:t>
       </w:r>
       <w:r>
-        <w:t xml:space="preserve"> 1'000’000$ afin de devenir actionnaire majoritaire du fast </w:t>
-      </w:r>
-      <w:proofErr w:type="spellStart"/>
-      <w:r>
-        <w:t>food</w:t>
-      </w:r>
-      <w:proofErr w:type="spellEnd"/>
-      <w:r>
-        <w:t>. Le joueur perd la partie si sa vie tombe à 0.</w:t>
-      </w:r>
-    </w:p>
-    <w:p>
-      <w:pPr>
-        <w:pStyle w:val="Titre3"/>
+        <w:t xml:space="preserve"> 1'000’000$ afin de devenir actionnaire majoritaire du fast food. Le joueur perd la partie si sa vie tombe à 0.</w:t>
+      </w:r>
+    </w:p>
+    <w:p>
+      <w:pPr>
+        <w:pStyle w:val="Heading3"/>
         <w:ind w:left="708"/>
       </w:pPr>
       <w:bookmarkStart w:id="3" w:name="_Toc240030130"/>
@@ -899,7 +866,7 @@
     </w:p>
     <w:p>
       <w:pPr>
-        <w:pStyle w:val="Paragraphedeliste"/>
+        <w:pStyle w:val="ListParagraph"/>
         <w:numPr>
           <w:ilvl w:val="0"/>
           <w:numId w:val="4"/>
@@ -911,7 +878,7 @@
     </w:p>
     <w:p>
       <w:pPr>
-        <w:pStyle w:val="Paragraphedeliste"/>
+        <w:pStyle w:val="ListParagraph"/>
         <w:numPr>
           <w:ilvl w:val="0"/>
           <w:numId w:val="4"/>
@@ -929,7 +896,7 @@
     </w:p>
     <w:p>
       <w:pPr>
-        <w:pStyle w:val="Paragraphedeliste"/>
+        <w:pStyle w:val="ListParagraph"/>
         <w:numPr>
           <w:ilvl w:val="0"/>
           <w:numId w:val="4"/>
@@ -941,7 +908,7 @@
     </w:p>
     <w:p>
       <w:pPr>
-        <w:pStyle w:val="Paragraphedeliste"/>
+        <w:pStyle w:val="ListParagraph"/>
         <w:numPr>
           <w:ilvl w:val="0"/>
           <w:numId w:val="4"/>
@@ -953,7 +920,7 @@
     </w:p>
     <w:p>
       <w:pPr>
-        <w:pStyle w:val="Paragraphedeliste"/>
+        <w:pStyle w:val="ListParagraph"/>
         <w:numPr>
           <w:ilvl w:val="0"/>
           <w:numId w:val="4"/>
@@ -978,26 +945,12 @@
         <w:rPr>
           <w:lang w:val="en-US"/>
         </w:rPr>
-        <w:t xml:space="preserve"> repository </w:t>
-      </w:r>
-      <w:proofErr w:type="spellStart"/>
-      <w:r>
-        <w:rPr>
-          <w:lang w:val="en-US"/>
-        </w:rPr>
-        <w:t>Github</w:t>
-      </w:r>
-      <w:proofErr w:type="spellEnd"/>
-      <w:r>
-        <w:rPr>
-          <w:lang w:val="en-US"/>
-        </w:rPr>
-        <w:t xml:space="preserve"> (release, issues)</w:t>
-      </w:r>
-    </w:p>
-    <w:p>
-      <w:pPr>
-        <w:pStyle w:val="Paragraphedeliste"/>
+        <w:t xml:space="preserve"> repository Github (release, issues)</w:t>
+      </w:r>
+    </w:p>
+    <w:p>
+      <w:pPr>
+        <w:pStyle w:val="ListParagraph"/>
         <w:numPr>
           <w:ilvl w:val="0"/>
           <w:numId w:val="4"/>
@@ -1015,7 +968,7 @@
     </w:p>
     <w:p>
       <w:pPr>
-        <w:pStyle w:val="Titre2"/>
+        <w:pStyle w:val="Heading2"/>
       </w:pPr>
       <w:bookmarkStart w:id="4" w:name="_Toc240030131"/>
       <w:r>
@@ -1032,18 +985,10 @@
       <w:hyperlink r:id="rId9" w:history="1">
         <w:r>
           <w:rPr>
-            <w:rStyle w:val="Lienhypertexte"/>
+            <w:rStyle w:val="Hyperlink"/>
           </w:rPr>
-          <w:t xml:space="preserve">Projet </w:t>
+          <w:t>Projet Github</w:t>
         </w:r>
-        <w:proofErr w:type="spellStart"/>
-        <w:r>
-          <w:rPr>
-            <w:rStyle w:val="Lienhypertexte"/>
-          </w:rPr>
-          <w:t>Github</w:t>
-        </w:r>
-        <w:proofErr w:type="spellEnd"/>
       </w:hyperlink>
     </w:p>
     <w:p>
@@ -1060,25 +1005,7 @@
           <w:bCs/>
           <w:u w:val="single"/>
         </w:rPr>
-        <w:t xml:space="preserve">#1 — En </w:t>
-      </w:r>
-      <w:proofErr w:type="spellStart"/>
-      <w:r>
-        <w:rPr>
-          <w:b/>
-          <w:bCs/>
-          <w:u w:val="single"/>
-        </w:rPr>
-        <w:t>temps</w:t>
-      </w:r>
-      <w:proofErr w:type="spellEnd"/>
-      <w:r>
-        <w:rPr>
-          <w:b/>
-          <w:bCs/>
-          <w:u w:val="single"/>
-        </w:rPr>
-        <w:t xml:space="preserve"> que joueur, je souhaite pouvoir utiliser les touches WASD afin de pouvoir faire bouger mon joueur dans chaque direction.</w:t>
+        <w:t>#1 — En temps que joueur, je souhaite pouvoir utiliser les touches WASD afin de pouvoir faire bouger mon joueur dans chaque direction.</w:t>
       </w:r>
     </w:p>
     <w:p/>
@@ -1139,17 +1066,7 @@
     </w:p>
     <w:p>
       <w:r>
-        <w:t xml:space="preserve">• Le joueur va dans la direction correspondante temps que je </w:t>
-      </w:r>
-      <w:proofErr w:type="spellStart"/>
-      <w:proofErr w:type="gramStart"/>
-      <w:r>
-        <w:t>maintient</w:t>
-      </w:r>
-      <w:proofErr w:type="spellEnd"/>
-      <w:proofErr w:type="gramEnd"/>
-      <w:r>
-        <w:t xml:space="preserve"> la touche</w:t>
+        <w:t>• Le joueur va dans la direction correspondante temps que je maintient la touche</w:t>
       </w:r>
     </w:p>
     <w:p>
@@ -1159,15 +1076,7 @@
     </w:p>
     <w:p>
       <w:r>
-        <w:t xml:space="preserve">• Le joueur s'arrête </w:t>
-      </w:r>
-      <w:proofErr w:type="gramStart"/>
-      <w:r>
-        <w:t>lorsque il</w:t>
-      </w:r>
-      <w:proofErr w:type="gramEnd"/>
-      <w:r>
-        <w:t xml:space="preserve"> essaie d'aller dans les obstacles</w:t>
+        <w:t>• Le joueur s'arrête lorsque il essaie d'aller dans les obstacles</w:t>
       </w:r>
     </w:p>
     <w:p/>
@@ -1185,61 +1094,7 @@
           <w:bCs/>
           <w:u w:val="single"/>
         </w:rPr>
-        <w:t xml:space="preserve">#2 — En </w:t>
-      </w:r>
-      <w:proofErr w:type="spellStart"/>
-      <w:r>
-        <w:rPr>
-          <w:b/>
-          <w:bCs/>
-          <w:u w:val="single"/>
-        </w:rPr>
-        <w:t>temps</w:t>
-      </w:r>
-      <w:proofErr w:type="spellEnd"/>
-      <w:r>
-        <w:rPr>
-          <w:b/>
-          <w:bCs/>
-          <w:u w:val="single"/>
-        </w:rPr>
-        <w:t xml:space="preserve"> que joueur, je souhaite pouvoir utiliser la touche clic gauche afin de pouvoir tirer </w:t>
-      </w:r>
-      <w:proofErr w:type="gramStart"/>
-      <w:r>
-        <w:rPr>
-          <w:b/>
-          <w:bCs/>
-          <w:u w:val="single"/>
-        </w:rPr>
-        <w:t>des projectile</w:t>
-      </w:r>
-      <w:proofErr w:type="gramEnd"/>
-      <w:r>
-        <w:rPr>
-          <w:b/>
-          <w:bCs/>
-          <w:u w:val="single"/>
-        </w:rPr>
-        <w:t xml:space="preserve"> sur mes </w:t>
-      </w:r>
-      <w:proofErr w:type="spellStart"/>
-      <w:r>
-        <w:rPr>
-          <w:b/>
-          <w:bCs/>
-          <w:u w:val="single"/>
-        </w:rPr>
-        <w:t>enemies</w:t>
-      </w:r>
-      <w:proofErr w:type="spellEnd"/>
-      <w:r>
-        <w:rPr>
-          <w:b/>
-          <w:bCs/>
-          <w:u w:val="single"/>
-        </w:rPr>
-        <w:t>.</w:t>
+        <w:t>#2 — En temps que joueur, je souhaite pouvoir utiliser la touche clic gauche afin de pouvoir tirer des projectile sur mes enemies.</w:t>
       </w:r>
     </w:p>
     <w:p/>
@@ -1306,21 +1161,8 @@
     </w:p>
     <w:p>
       <w:r>
-        <w:t xml:space="preserve">• Le projectile est détruit </w:t>
-      </w:r>
-      <w:proofErr w:type="gramStart"/>
-      <w:r>
-        <w:t>si il</w:t>
-      </w:r>
-      <w:proofErr w:type="gramEnd"/>
-      <w:r>
-        <w:t xml:space="preserve"> rencontre un obstacle ou </w:t>
-      </w:r>
-      <w:proofErr w:type="gramStart"/>
-      <w:r>
-        <w:t>un ennemie</w:t>
-      </w:r>
-      <w:proofErr w:type="gramEnd"/>
+        <w:t>• Le projectile est détruit si il rencontre un obstacle ou un ennemie</w:t>
+      </w:r>
     </w:p>
     <w:p>
       <w:r>
@@ -1330,15 +1172,7 @@
     </w:p>
     <w:p>
       <w:r>
-        <w:t xml:space="preserve">• Le projectile à un </w:t>
-      </w:r>
-      <w:proofErr w:type="spellStart"/>
-      <w:r>
-        <w:t>cooldown</w:t>
-      </w:r>
-      <w:proofErr w:type="spellEnd"/>
-      <w:r>
-        <w:t xml:space="preserve"> de 1sec après avoir été tiré.</w:t>
+        <w:t>• Le projectile à un cooldown de 1sec après avoir été tiré.</w:t>
       </w:r>
     </w:p>
     <w:p/>
@@ -1356,25 +1190,7 @@
           <w:bCs/>
           <w:u w:val="single"/>
         </w:rPr>
-        <w:t xml:space="preserve">#3 — En </w:t>
-      </w:r>
-      <w:proofErr w:type="spellStart"/>
-      <w:r>
-        <w:rPr>
-          <w:b/>
-          <w:bCs/>
-          <w:u w:val="single"/>
-        </w:rPr>
-        <w:t>temps</w:t>
-      </w:r>
-      <w:proofErr w:type="spellEnd"/>
-      <w:r>
-        <w:rPr>
-          <w:b/>
-          <w:bCs/>
-          <w:u w:val="single"/>
-        </w:rPr>
-        <w:t xml:space="preserve"> que joueur, je souhaite pouvoir utiliser la touche clic droit afin de pouvoir faire des dégâts de corp à corp.</w:t>
+        <w:t>#3 — En temps que joueur, je souhaite pouvoir utiliser la touche clic droit afin de pouvoir faire des dégâts de corp à corp.</w:t>
       </w:r>
     </w:p>
     <w:p/>
@@ -1435,15 +1251,7 @@
     </w:p>
     <w:p>
       <w:r>
-        <w:t xml:space="preserve">• L'attaque de corp à corp à un </w:t>
-      </w:r>
-      <w:proofErr w:type="spellStart"/>
-      <w:r>
-        <w:t>cooldown</w:t>
-      </w:r>
-      <w:proofErr w:type="spellEnd"/>
-      <w:r>
-        <w:t xml:space="preserve"> de 0.2s après avoir été lancé</w:t>
+        <w:t>• L'attaque de corp à corp à un cooldown de 0.2s après avoir été lancé</w:t>
       </w:r>
     </w:p>
     <w:p/>
@@ -1461,25 +1269,7 @@
           <w:bCs/>
           <w:u w:val="single"/>
         </w:rPr>
-        <w:t xml:space="preserve">#4 — En </w:t>
-      </w:r>
-      <w:proofErr w:type="spellStart"/>
-      <w:r>
-        <w:rPr>
-          <w:b/>
-          <w:bCs/>
-          <w:u w:val="single"/>
-        </w:rPr>
-        <w:t>temps</w:t>
-      </w:r>
-      <w:proofErr w:type="spellEnd"/>
-      <w:r>
-        <w:rPr>
-          <w:b/>
-          <w:bCs/>
-          <w:u w:val="single"/>
-        </w:rPr>
-        <w:t xml:space="preserve"> que joueur je souhaite avoir des ennemis de type manager afin de pouvoir gagner de l'argent</w:t>
+        <w:t>#4 — En temps que joueur je souhaite avoir des ennemis de type manager afin de pouvoir gagner de l'argent</w:t>
       </w:r>
     </w:p>
     <w:p>
@@ -1539,70 +1329,22 @@
     <w:p/>
     <w:p>
       <w:r>
-        <w:t xml:space="preserve">• Un manager doit pouvoir se </w:t>
-      </w:r>
-      <w:proofErr w:type="spellStart"/>
-      <w:r>
-        <w:t>deplacer</w:t>
-      </w:r>
-      <w:proofErr w:type="spellEnd"/>
-      <w:r>
-        <w:t xml:space="preserve"> aléatoirement sur la carte</w:t>
-      </w:r>
-    </w:p>
-    <w:p>
-      <w:r>
-        <w:t xml:space="preserve">• Un manager </w:t>
-      </w:r>
-      <w:proofErr w:type="gramStart"/>
-      <w:r>
-        <w:t>doit  trouver</w:t>
-      </w:r>
-      <w:proofErr w:type="gramEnd"/>
-      <w:r>
-        <w:t xml:space="preserve"> une nouvelle destination </w:t>
-      </w:r>
-      <w:proofErr w:type="gramStart"/>
-      <w:r>
-        <w:t>si il</w:t>
-      </w:r>
-      <w:proofErr w:type="gramEnd"/>
-      <w:r>
-        <w:t xml:space="preserve"> bute sur un obstacle</w:t>
-      </w:r>
-    </w:p>
-    <w:p>
-      <w:r>
-        <w:t xml:space="preserve">• Un manager doit pouvoir lancer </w:t>
-      </w:r>
-      <w:proofErr w:type="gramStart"/>
-      <w:r>
-        <w:t>des projectile</w:t>
-      </w:r>
-      <w:proofErr w:type="gramEnd"/>
-      <w:r>
-        <w:t xml:space="preserve"> de type sac d'argent.</w:t>
-      </w:r>
-    </w:p>
-    <w:p>
-      <w:r>
-        <w:t xml:space="preserve">• Un manager </w:t>
-      </w:r>
-      <w:proofErr w:type="gramStart"/>
-      <w:r>
-        <w:t>prends</w:t>
-      </w:r>
-      <w:proofErr w:type="gramEnd"/>
-      <w:r>
-        <w:t xml:space="preserve"> 4 </w:t>
-      </w:r>
-      <w:proofErr w:type="gramStart"/>
-      <w:r>
-        <w:t>sec</w:t>
-      </w:r>
-      <w:proofErr w:type="gramEnd"/>
-      <w:r>
-        <w:t xml:space="preserve"> à recharger.</w:t>
+        <w:t>• Un manager doit pouvoir se deplacer aléatoirement sur la carte</w:t>
+      </w:r>
+    </w:p>
+    <w:p>
+      <w:r>
+        <w:t>• Un manager doit  trouver une nouvelle destination si il bute sur un obstacle</w:t>
+      </w:r>
+    </w:p>
+    <w:p>
+      <w:r>
+        <w:t>• Un manager doit pouvoir lancer des projectile de type sac d'argent.</w:t>
+      </w:r>
+    </w:p>
+    <w:p>
+      <w:r>
+        <w:t>• Un manager prends 4 sec à recharger.</w:t>
       </w:r>
     </w:p>
     <w:p>
@@ -1612,42 +1354,18 @@
     </w:p>
     <w:p>
       <w:r>
-        <w:t xml:space="preserve">• </w:t>
-      </w:r>
-      <w:proofErr w:type="gramStart"/>
-      <w:r>
-        <w:t>Lorsque un</w:t>
-      </w:r>
-      <w:proofErr w:type="gramEnd"/>
-      <w:r>
-        <w:t xml:space="preserve"> manager meurt, le nombre d'argent du joueur </w:t>
-      </w:r>
-      <w:proofErr w:type="spellStart"/>
-      <w:r>
-        <w:t>augment</w:t>
-      </w:r>
-      <w:proofErr w:type="spellEnd"/>
-      <w:r>
-        <w:t xml:space="preserve"> de 5'000$</w:t>
-      </w:r>
-    </w:p>
-    <w:p>
-      <w:r>
-        <w:t xml:space="preserve">• L'argent que fait tomber le manager est quadruplé et ses PV sont doublé quand le joueur atteint 100'000$. </w:t>
-      </w:r>
-      <w:proofErr w:type="gramStart"/>
-      <w:r>
-        <w:t>Il le sont</w:t>
-      </w:r>
-      <w:proofErr w:type="gramEnd"/>
-      <w:r>
-        <w:t xml:space="preserve"> à nouveaux quand il atteint 500'000$</w:t>
+        <w:t>• Lorsque un manager meurt, le nombre d'argent du joueur augment de 5'000$</w:t>
+      </w:r>
+    </w:p>
+    <w:p>
+      <w:r>
+        <w:t>• L'argent que fait tomber le manager est quadruplé et ses PV sont doublé quand le joueur atteint 100'000$. Il le sont à nouveaux quand il atteint 500'000$</w:t>
       </w:r>
     </w:p>
     <w:p/>
     <w:p>
       <w:pPr>
-        <w:pStyle w:val="Titre2"/>
+        <w:pStyle w:val="Heading2"/>
       </w:pPr>
       <w:bookmarkStart w:id="5" w:name="_Toc240030132"/>
       <w:r>
@@ -1657,7 +1375,7 @@
     </w:p>
     <w:tbl>
       <w:tblPr>
-        <w:tblStyle w:val="Grilledutableau"/>
+        <w:tblStyle w:val="TableGrid"/>
         <w:tblW w:w="0" w:type="auto"/>
         <w:tblLook w:val="04A0" w:firstRow="1" w:lastRow="0" w:firstColumn="1" w:lastColumn="0" w:noHBand="0" w:noVBand="1"/>
       </w:tblPr>
@@ -1740,7 +1458,7 @@
             <w:hyperlink r:id="rId14" w:history="1">
               <w:r>
                 <w:rPr>
-                  <w:rStyle w:val="Lienhypertexte"/>
+                  <w:rStyle w:val="Hyperlink"/>
                 </w:rPr>
                 <w:t>Ajout du mouvement WASD</w:t>
               </w:r>
@@ -1765,104 +1483,11 @@
           </w:tcPr>
           <w:p>
             <w:hyperlink r:id="rId15" w:history="1">
-              <w:proofErr w:type="gramStart"/>
               <w:r>
                 <w:rPr>
-                  <w:rStyle w:val="Lienhypertexte"/>
+                  <w:rStyle w:val="Hyperlink"/>
                 </w:rPr>
-                <w:t>pouvoir</w:t>
-              </w:r>
-              <w:proofErr w:type="gramEnd"/>
-              <w:r>
-                <w:rPr>
-                  <w:rStyle w:val="Lienhypertexte"/>
-                </w:rPr>
-                <w:t xml:space="preserve"> tirer </w:t>
-              </w:r>
-              <w:proofErr w:type="gramStart"/>
-              <w:r>
-                <w:rPr>
-                  <w:rStyle w:val="Lienhypertexte"/>
-                </w:rPr>
-                <w:t>des projectile</w:t>
-              </w:r>
-              <w:proofErr w:type="gramEnd"/>
-              <w:r>
-                <w:rPr>
-                  <w:rStyle w:val="Lienhypertexte"/>
-                </w:rPr>
-                <w:t xml:space="preserve"> sur mes </w:t>
-              </w:r>
-              <w:proofErr w:type="spellStart"/>
-              <w:r>
-                <w:rPr>
-                  <w:rStyle w:val="Lienhypertexte"/>
-                </w:rPr>
-                <w:t>enemies</w:t>
-              </w:r>
-              <w:proofErr w:type="spellEnd"/>
-            </w:hyperlink>
-          </w:p>
-        </w:tc>
-      </w:tr>
-      <w:tr>
-        <w:tc>
-          <w:tcPr>
-            <w:tcW w:w="2122" w:type="dxa"/>
-          </w:tcPr>
-          <w:p>
-            <w:r>
-              <w:t>25.09.2026</w:t>
-            </w:r>
-          </w:p>
-        </w:tc>
-        <w:tc>
-          <w:tcPr>
-            <w:tcW w:w="6940" w:type="dxa"/>
-          </w:tcPr>
-          <w:p>
-            <w:hyperlink r:id="rId16" w:history="1">
-              <w:proofErr w:type="gramStart"/>
-              <w:r>
-                <w:rPr>
-                  <w:rStyle w:val="Lienhypertexte"/>
-                </w:rPr>
-                <w:t>pouvoir</w:t>
-              </w:r>
-              <w:proofErr w:type="gramEnd"/>
-              <w:r>
-                <w:rPr>
-                  <w:rStyle w:val="Lienhypertexte"/>
-                </w:rPr>
-                <w:t xml:space="preserve"> faire des </w:t>
-              </w:r>
-              <w:proofErr w:type="spellStart"/>
-              <w:r>
-                <w:rPr>
-                  <w:rStyle w:val="Lienhypertexte"/>
-                </w:rPr>
-                <w:t>degats</w:t>
-              </w:r>
-              <w:proofErr w:type="spellEnd"/>
-              <w:r>
-                <w:rPr>
-                  <w:rStyle w:val="Lienhypertexte"/>
-                </w:rPr>
-                <w:t xml:space="preserve"> </w:t>
-              </w:r>
-              <w:proofErr w:type="gramStart"/>
-              <w:r>
-                <w:rPr>
-                  <w:rStyle w:val="Lienhypertexte"/>
-                </w:rPr>
-                <w:t>au corp</w:t>
-              </w:r>
-              <w:proofErr w:type="gramEnd"/>
-              <w:r>
-                <w:rPr>
-                  <w:rStyle w:val="Lienhypertexte"/>
-                </w:rPr>
-                <w:t xml:space="preserve"> à corp</w:t>
+                <w:t>pouvoir tirer des projectile sur mes enemies</w:t>
               </w:r>
             </w:hyperlink>
           </w:p>
@@ -1884,10 +1509,37 @@
             <w:tcW w:w="6940" w:type="dxa"/>
           </w:tcPr>
           <w:p>
+            <w:hyperlink r:id="rId16" w:history="1">
+              <w:r>
+                <w:rPr>
+                  <w:rStyle w:val="Hyperlink"/>
+                </w:rPr>
+                <w:t>pouvoir faire des degats au corp à corp</w:t>
+              </w:r>
+            </w:hyperlink>
+          </w:p>
+        </w:tc>
+      </w:tr>
+      <w:tr>
+        <w:tc>
+          <w:tcPr>
+            <w:tcW w:w="2122" w:type="dxa"/>
+          </w:tcPr>
+          <w:p>
+            <w:r>
+              <w:t>25.09.2026</w:t>
+            </w:r>
+          </w:p>
+        </w:tc>
+        <w:tc>
+          <w:tcPr>
+            <w:tcW w:w="6940" w:type="dxa"/>
+          </w:tcPr>
+          <w:p>
             <w:hyperlink r:id="rId17" w:history="1">
               <w:r>
                 <w:rPr>
-                  <w:rStyle w:val="Lienhypertexte"/>
+                  <w:rStyle w:val="Hyperlink"/>
                 </w:rPr>
                 <w:t>Ajouter un compteur de PV</w:t>
               </w:r>
@@ -1914,7 +1566,7 @@
             <w:hyperlink r:id="rId18" w:history="1">
               <w:r>
                 <w:rPr>
-                  <w:rStyle w:val="Lienhypertexte"/>
+                  <w:rStyle w:val="Hyperlink"/>
                 </w:rPr>
                 <w:t>Ajouter un compteur d’argent</w:t>
               </w:r>
@@ -1941,7 +1593,7 @@
             <w:hyperlink r:id="rId19" w:history="1">
               <w:r>
                 <w:rPr>
-                  <w:rStyle w:val="Lienhypertexte"/>
+                  <w:rStyle w:val="Hyperlink"/>
                 </w:rPr>
                 <w:t>Créer des ennemies de type manager</w:t>
               </w:r>
@@ -1968,7 +1620,7 @@
             <w:hyperlink r:id="rId20" w:history="1">
               <w:r>
                 <w:rPr>
-                  <w:rStyle w:val="Lienhypertexte"/>
+                  <w:rStyle w:val="Hyperlink"/>
                 </w:rPr>
                 <w:t>Créer les projectiles des managers</w:t>
               </w:r>
@@ -1998,7 +1650,7 @@
             <w:hyperlink r:id="rId21" w:history="1">
               <w:r>
                 <w:rPr>
-                  <w:rStyle w:val="Lienhypertexte"/>
+                  <w:rStyle w:val="Hyperlink"/>
                 </w:rPr>
                 <w:t>Créer des ennemies de type robot</w:t>
               </w:r>
@@ -2028,7 +1680,7 @@
             <w:hyperlink r:id="rId22" w:history="1">
               <w:r>
                 <w:rPr>
-                  <w:rStyle w:val="Lienhypertexte"/>
+                  <w:rStyle w:val="Hyperlink"/>
                 </w:rPr>
                 <w:t>Créer les projectiles des robots</w:t>
               </w:r>
@@ -2058,7 +1710,7 @@
             <w:hyperlink r:id="rId23" w:history="1">
               <w:r>
                 <w:rPr>
-                  <w:rStyle w:val="Lienhypertexte"/>
+                  <w:rStyle w:val="Hyperlink"/>
                 </w:rPr>
                 <w:t>Créer les obstacles</w:t>
               </w:r>
@@ -2068,6 +1720,19 @@
       </w:tr>
     </w:tbl>
     <w:p/>
+    <w:p>
+      <w:pPr>
+        <w:pStyle w:val="Heading2"/>
+      </w:pPr>
+      <w:r>
+        <w:t>Utilisation de l’IA</w:t>
+      </w:r>
+    </w:p>
+    <w:p>
+      <w:r>
+        <w:t>https://claude.ai/share/2bf90d2b-864b-42cc-8b37-eaf1b68bf1c2</w:t>
+      </w:r>
+    </w:p>
     <w:sectPr>
       <w:footerReference w:type="default" r:id="rId24"/>
       <w:pgSz w:w="11906" w:h="16838"/>
@@ -2117,13 +1782,19 @@
     <w:sdtContent>
       <w:p>
         <w:pPr>
-          <w:pStyle w:val="Pieddepage"/>
+          <w:pStyle w:val="Footer"/>
           <w:jc w:val="right"/>
+          <w:rPr>
+            <w:lang w:val="en-US"/>
+          </w:rPr>
         </w:pPr>
         <w:r>
           <w:fldChar w:fldCharType="begin"/>
         </w:r>
         <w:r>
+          <w:rPr>
+            <w:lang w:val="en-US"/>
+          </w:rPr>
           <w:instrText>PAGE   \* MERGEFORMAT</w:instrText>
         </w:r>
         <w:r>
@@ -2131,7 +1802,7 @@
         </w:r>
         <w:r>
           <w:rPr>
-            <w:lang w:val="fr-FR"/>
+            <w:lang w:val="en-US"/>
           </w:rPr>
           <w:t>2</w:t>
         </w:r>
@@ -2143,7 +1814,7 @@
   </w:sdt>
   <w:p>
     <w:pPr>
-      <w:pStyle w:val="Pieddepage"/>
+      <w:pStyle w:val="Footer"/>
       <w:rPr>
         <w:lang w:val="en-US"/>
       </w:rPr>
@@ -3039,11 +2710,11 @@
     <w:name w:val="Normal"/>
     <w:qFormat/>
   </w:style>
-  <w:style w:type="paragraph" w:styleId="Titre1">
+  <w:style w:type="paragraph" w:styleId="Heading1">
     <w:name w:val="heading 1"/>
     <w:basedOn w:val="Normal"/>
     <w:next w:val="Normal"/>
-    <w:link w:val="Titre1Car"/>
+    <w:link w:val="Heading1Char"/>
     <w:uiPriority w:val="9"/>
     <w:qFormat/>
     <w:rsid w:val="006C417F"/>
@@ -3060,11 +2731,11 @@
       <w:szCs w:val="40"/>
     </w:rPr>
   </w:style>
-  <w:style w:type="paragraph" w:styleId="Titre2">
+  <w:style w:type="paragraph" w:styleId="Heading2">
     <w:name w:val="heading 2"/>
     <w:basedOn w:val="Normal"/>
     <w:next w:val="Normal"/>
-    <w:link w:val="Titre2Car"/>
+    <w:link w:val="Heading2Char"/>
     <w:uiPriority w:val="9"/>
     <w:unhideWhenUsed/>
     <w:qFormat/>
@@ -3082,11 +2753,11 @@
       <w:szCs w:val="32"/>
     </w:rPr>
   </w:style>
-  <w:style w:type="paragraph" w:styleId="Titre3">
+  <w:style w:type="paragraph" w:styleId="Heading3">
     <w:name w:val="heading 3"/>
     <w:basedOn w:val="Normal"/>
     <w:next w:val="Normal"/>
-    <w:link w:val="Titre3Car"/>
+    <w:link w:val="Heading3Char"/>
     <w:uiPriority w:val="9"/>
     <w:unhideWhenUsed/>
     <w:qFormat/>
@@ -3104,11 +2775,11 @@
       <w:szCs w:val="28"/>
     </w:rPr>
   </w:style>
-  <w:style w:type="paragraph" w:styleId="Titre4">
+  <w:style w:type="paragraph" w:styleId="Heading4">
     <w:name w:val="heading 4"/>
     <w:basedOn w:val="Normal"/>
     <w:next w:val="Normal"/>
-    <w:link w:val="Titre4Car"/>
+    <w:link w:val="Heading4Char"/>
     <w:uiPriority w:val="9"/>
     <w:unhideWhenUsed/>
     <w:qFormat/>
@@ -3126,11 +2797,11 @@
       <w:color w:val="0F4761" w:themeColor="accent1" w:themeShade="BF"/>
     </w:rPr>
   </w:style>
-  <w:style w:type="paragraph" w:styleId="Titre5">
+  <w:style w:type="paragraph" w:styleId="Heading5">
     <w:name w:val="heading 5"/>
     <w:basedOn w:val="Normal"/>
     <w:next w:val="Normal"/>
-    <w:link w:val="Titre5Car"/>
+    <w:link w:val="Heading5Char"/>
     <w:uiPriority w:val="9"/>
     <w:semiHidden/>
     <w:unhideWhenUsed/>
@@ -3147,11 +2818,11 @@
       <w:color w:val="0F4761" w:themeColor="accent1" w:themeShade="BF"/>
     </w:rPr>
   </w:style>
-  <w:style w:type="paragraph" w:styleId="Titre6">
+  <w:style w:type="paragraph" w:styleId="Heading6">
     <w:name w:val="heading 6"/>
     <w:basedOn w:val="Normal"/>
     <w:next w:val="Normal"/>
-    <w:link w:val="Titre6Car"/>
+    <w:link w:val="Heading6Char"/>
     <w:uiPriority w:val="9"/>
     <w:semiHidden/>
     <w:unhideWhenUsed/>
@@ -3170,11 +2841,11 @@
       <w:color w:val="595959" w:themeColor="text1" w:themeTint="A6"/>
     </w:rPr>
   </w:style>
-  <w:style w:type="paragraph" w:styleId="Titre7">
+  <w:style w:type="paragraph" w:styleId="Heading7">
     <w:name w:val="heading 7"/>
     <w:basedOn w:val="Normal"/>
     <w:next w:val="Normal"/>
-    <w:link w:val="Titre7Car"/>
+    <w:link w:val="Heading7Char"/>
     <w:uiPriority w:val="9"/>
     <w:semiHidden/>
     <w:unhideWhenUsed/>
@@ -3191,11 +2862,11 @@
       <w:color w:val="595959" w:themeColor="text1" w:themeTint="A6"/>
     </w:rPr>
   </w:style>
-  <w:style w:type="paragraph" w:styleId="Titre8">
+  <w:style w:type="paragraph" w:styleId="Heading8">
     <w:name w:val="heading 8"/>
     <w:basedOn w:val="Normal"/>
     <w:next w:val="Normal"/>
-    <w:link w:val="Titre8Car"/>
+    <w:link w:val="Heading8Char"/>
     <w:uiPriority w:val="9"/>
     <w:semiHidden/>
     <w:unhideWhenUsed/>
@@ -3214,11 +2885,11 @@
       <w:color w:val="272727" w:themeColor="text1" w:themeTint="D8"/>
     </w:rPr>
   </w:style>
-  <w:style w:type="paragraph" w:styleId="Titre9">
+  <w:style w:type="paragraph" w:styleId="Heading9">
     <w:name w:val="heading 9"/>
     <w:basedOn w:val="Normal"/>
     <w:next w:val="Normal"/>
-    <w:link w:val="Titre9Car"/>
+    <w:link w:val="Heading9Char"/>
     <w:uiPriority w:val="9"/>
     <w:semiHidden/>
     <w:unhideWhenUsed/>
@@ -3235,13 +2906,13 @@
       <w:color w:val="272727" w:themeColor="text1" w:themeTint="D8"/>
     </w:rPr>
   </w:style>
-  <w:style w:type="character" w:default="1" w:styleId="Policepardfaut">
+  <w:style w:type="character" w:default="1" w:styleId="DefaultParagraphFont">
     <w:name w:val="Default Paragraph Font"/>
     <w:uiPriority w:val="1"/>
     <w:semiHidden/>
     <w:unhideWhenUsed/>
   </w:style>
-  <w:style w:type="table" w:default="1" w:styleId="TableauNormal">
+  <w:style w:type="table" w:default="1" w:styleId="TableNormal">
     <w:name w:val="Normal Table"/>
     <w:uiPriority w:val="99"/>
     <w:semiHidden/>
@@ -3256,16 +2927,16 @@
       </w:tblCellMar>
     </w:tblPr>
   </w:style>
-  <w:style w:type="numbering" w:default="1" w:styleId="Aucuneliste">
+  <w:style w:type="numbering" w:default="1" w:styleId="NoList">
     <w:name w:val="No List"/>
     <w:uiPriority w:val="99"/>
     <w:semiHidden/>
     <w:unhideWhenUsed/>
   </w:style>
-  <w:style w:type="character" w:customStyle="1" w:styleId="Titre1Car">
-    <w:name w:val="Titre 1 Car"/>
-    <w:basedOn w:val="Policepardfaut"/>
-    <w:link w:val="Titre1"/>
+  <w:style w:type="character" w:customStyle="1" w:styleId="Heading1Char">
+    <w:name w:val="Heading 1 Char"/>
+    <w:basedOn w:val="DefaultParagraphFont"/>
+    <w:link w:val="Heading1"/>
     <w:uiPriority w:val="9"/>
     <w:rsid w:val="006C417F"/>
     <w:rPr>
@@ -3275,10 +2946,10 @@
       <w:szCs w:val="40"/>
     </w:rPr>
   </w:style>
-  <w:style w:type="character" w:customStyle="1" w:styleId="Titre2Car">
-    <w:name w:val="Titre 2 Car"/>
-    <w:basedOn w:val="Policepardfaut"/>
-    <w:link w:val="Titre2"/>
+  <w:style w:type="character" w:customStyle="1" w:styleId="Heading2Char">
+    <w:name w:val="Heading 2 Char"/>
+    <w:basedOn w:val="DefaultParagraphFont"/>
+    <w:link w:val="Heading2"/>
     <w:uiPriority w:val="9"/>
     <w:rsid w:val="006C417F"/>
     <w:rPr>
@@ -3288,10 +2959,10 @@
       <w:szCs w:val="32"/>
     </w:rPr>
   </w:style>
-  <w:style w:type="character" w:customStyle="1" w:styleId="Titre3Car">
-    <w:name w:val="Titre 3 Car"/>
-    <w:basedOn w:val="Policepardfaut"/>
-    <w:link w:val="Titre3"/>
+  <w:style w:type="character" w:customStyle="1" w:styleId="Heading3Char">
+    <w:name w:val="Heading 3 Char"/>
+    <w:basedOn w:val="DefaultParagraphFont"/>
+    <w:link w:val="Heading3"/>
     <w:uiPriority w:val="9"/>
     <w:rsid w:val="006C417F"/>
     <w:rPr>
@@ -3301,10 +2972,10 @@
       <w:szCs w:val="28"/>
     </w:rPr>
   </w:style>
-  <w:style w:type="character" w:customStyle="1" w:styleId="Titre4Car">
-    <w:name w:val="Titre 4 Car"/>
-    <w:basedOn w:val="Policepardfaut"/>
-    <w:link w:val="Titre4"/>
+  <w:style w:type="character" w:customStyle="1" w:styleId="Heading4Char">
+    <w:name w:val="Heading 4 Char"/>
+    <w:basedOn w:val="DefaultParagraphFont"/>
+    <w:link w:val="Heading4"/>
     <w:uiPriority w:val="9"/>
     <w:rsid w:val="006C417F"/>
     <w:rPr>
@@ -3314,10 +2985,10 @@
       <w:color w:val="0F4761" w:themeColor="accent1" w:themeShade="BF"/>
     </w:rPr>
   </w:style>
-  <w:style w:type="character" w:customStyle="1" w:styleId="Titre5Car">
-    <w:name w:val="Titre 5 Car"/>
-    <w:basedOn w:val="Policepardfaut"/>
-    <w:link w:val="Titre5"/>
+  <w:style w:type="character" w:customStyle="1" w:styleId="Heading5Char">
+    <w:name w:val="Heading 5 Char"/>
+    <w:basedOn w:val="DefaultParagraphFont"/>
+    <w:link w:val="Heading5"/>
     <w:uiPriority w:val="9"/>
     <w:semiHidden/>
     <w:rsid w:val="006C417F"/>
@@ -3326,10 +2997,10 @@
       <w:color w:val="0F4761" w:themeColor="accent1" w:themeShade="BF"/>
     </w:rPr>
   </w:style>
-  <w:style w:type="character" w:customStyle="1" w:styleId="Titre6Car">
-    <w:name w:val="Titre 6 Car"/>
-    <w:basedOn w:val="Policepardfaut"/>
-    <w:link w:val="Titre6"/>
+  <w:style w:type="character" w:customStyle="1" w:styleId="Heading6Char">
+    <w:name w:val="Heading 6 Char"/>
+    <w:basedOn w:val="DefaultParagraphFont"/>
+    <w:link w:val="Heading6"/>
     <w:uiPriority w:val="9"/>
     <w:semiHidden/>
     <w:rsid w:val="006C417F"/>
@@ -3340,10 +3011,10 @@
       <w:color w:val="595959" w:themeColor="text1" w:themeTint="A6"/>
     </w:rPr>
   </w:style>
-  <w:style w:type="character" w:customStyle="1" w:styleId="Titre7Car">
-    <w:name w:val="Titre 7 Car"/>
-    <w:basedOn w:val="Policepardfaut"/>
-    <w:link w:val="Titre7"/>
+  <w:style w:type="character" w:customStyle="1" w:styleId="Heading7Char">
+    <w:name w:val="Heading 7 Char"/>
+    <w:basedOn w:val="DefaultParagraphFont"/>
+    <w:link w:val="Heading7"/>
     <w:uiPriority w:val="9"/>
     <w:semiHidden/>
     <w:rsid w:val="006C417F"/>
@@ -3352,10 +3023,10 @@
       <w:color w:val="595959" w:themeColor="text1" w:themeTint="A6"/>
     </w:rPr>
   </w:style>
-  <w:style w:type="character" w:customStyle="1" w:styleId="Titre8Car">
-    <w:name w:val="Titre 8 Car"/>
-    <w:basedOn w:val="Policepardfaut"/>
-    <w:link w:val="Titre8"/>
+  <w:style w:type="character" w:customStyle="1" w:styleId="Heading8Char">
+    <w:name w:val="Heading 8 Char"/>
+    <w:basedOn w:val="DefaultParagraphFont"/>
+    <w:link w:val="Heading8"/>
     <w:uiPriority w:val="9"/>
     <w:semiHidden/>
     <w:rsid w:val="006C417F"/>
@@ -3366,10 +3037,10 @@
       <w:color w:val="272727" w:themeColor="text1" w:themeTint="D8"/>
     </w:rPr>
   </w:style>
-  <w:style w:type="character" w:customStyle="1" w:styleId="Titre9Car">
-    <w:name w:val="Titre 9 Car"/>
-    <w:basedOn w:val="Policepardfaut"/>
-    <w:link w:val="Titre9"/>
+  <w:style w:type="character" w:customStyle="1" w:styleId="Heading9Char">
+    <w:name w:val="Heading 9 Char"/>
+    <w:basedOn w:val="DefaultParagraphFont"/>
+    <w:link w:val="Heading9"/>
     <w:uiPriority w:val="9"/>
     <w:semiHidden/>
     <w:rsid w:val="006C417F"/>
@@ -3378,11 +3049,11 @@
       <w:color w:val="272727" w:themeColor="text1" w:themeTint="D8"/>
     </w:rPr>
   </w:style>
-  <w:style w:type="paragraph" w:styleId="Titre">
+  <w:style w:type="paragraph" w:styleId="Title">
     <w:name w:val="Title"/>
     <w:basedOn w:val="Normal"/>
     <w:next w:val="Normal"/>
-    <w:link w:val="TitreCar"/>
+    <w:link w:val="TitleChar"/>
     <w:uiPriority w:val="10"/>
     <w:qFormat/>
     <w:rsid w:val="006C417F"/>
@@ -3398,10 +3069,10 @@
       <w:szCs w:val="56"/>
     </w:rPr>
   </w:style>
-  <w:style w:type="character" w:customStyle="1" w:styleId="TitreCar">
-    <w:name w:val="Titre Car"/>
-    <w:basedOn w:val="Policepardfaut"/>
-    <w:link w:val="Titre"/>
+  <w:style w:type="character" w:customStyle="1" w:styleId="TitleChar">
+    <w:name w:val="Title Char"/>
+    <w:basedOn w:val="DefaultParagraphFont"/>
+    <w:link w:val="Title"/>
     <w:uiPriority w:val="10"/>
     <w:rsid w:val="006C417F"/>
     <w:rPr>
@@ -3412,11 +3083,11 @@
       <w:szCs w:val="56"/>
     </w:rPr>
   </w:style>
-  <w:style w:type="paragraph" w:styleId="Sous-titre">
+  <w:style w:type="paragraph" w:styleId="Subtitle">
     <w:name w:val="Subtitle"/>
     <w:basedOn w:val="Normal"/>
     <w:next w:val="Normal"/>
-    <w:link w:val="Sous-titreCar"/>
+    <w:link w:val="SubtitleChar"/>
     <w:uiPriority w:val="11"/>
     <w:qFormat/>
     <w:rsid w:val="006C417F"/>
@@ -3433,10 +3104,10 @@
       <w:szCs w:val="28"/>
     </w:rPr>
   </w:style>
-  <w:style w:type="character" w:customStyle="1" w:styleId="Sous-titreCar">
-    <w:name w:val="Sous-titre Car"/>
-    <w:basedOn w:val="Policepardfaut"/>
-    <w:link w:val="Sous-titre"/>
+  <w:style w:type="character" w:customStyle="1" w:styleId="SubtitleChar">
+    <w:name w:val="Subtitle Char"/>
+    <w:basedOn w:val="DefaultParagraphFont"/>
+    <w:link w:val="Subtitle"/>
     <w:uiPriority w:val="11"/>
     <w:rsid w:val="006C417F"/>
     <w:rPr>
@@ -3447,11 +3118,11 @@
       <w:szCs w:val="28"/>
     </w:rPr>
   </w:style>
-  <w:style w:type="paragraph" w:styleId="Citation">
+  <w:style w:type="paragraph" w:styleId="Quote">
     <w:name w:val="Quote"/>
     <w:basedOn w:val="Normal"/>
     <w:next w:val="Normal"/>
-    <w:link w:val="CitationCar"/>
+    <w:link w:val="QuoteChar"/>
     <w:uiPriority w:val="29"/>
     <w:qFormat/>
     <w:rsid w:val="006C417F"/>
@@ -3465,10 +3136,10 @@
       <w:color w:val="404040" w:themeColor="text1" w:themeTint="BF"/>
     </w:rPr>
   </w:style>
-  <w:style w:type="character" w:customStyle="1" w:styleId="CitationCar">
-    <w:name w:val="Citation Car"/>
-    <w:basedOn w:val="Policepardfaut"/>
-    <w:link w:val="Citation"/>
+  <w:style w:type="character" w:customStyle="1" w:styleId="QuoteChar">
+    <w:name w:val="Quote Char"/>
+    <w:basedOn w:val="DefaultParagraphFont"/>
+    <w:link w:val="Quote"/>
     <w:uiPriority w:val="29"/>
     <w:rsid w:val="006C417F"/>
     <w:rPr>
@@ -3477,7 +3148,7 @@
       <w:color w:val="404040" w:themeColor="text1" w:themeTint="BF"/>
     </w:rPr>
   </w:style>
-  <w:style w:type="paragraph" w:styleId="Paragraphedeliste">
+  <w:style w:type="paragraph" w:styleId="ListParagraph">
     <w:name w:val="List Paragraph"/>
     <w:basedOn w:val="Normal"/>
     <w:uiPriority w:val="34"/>
@@ -3488,9 +3159,9 @@
       <w:contextualSpacing/>
     </w:pPr>
   </w:style>
-  <w:style w:type="character" w:styleId="Accentuationintense">
+  <w:style w:type="character" w:styleId="IntenseEmphasis">
     <w:name w:val="Intense Emphasis"/>
-    <w:basedOn w:val="Policepardfaut"/>
+    <w:basedOn w:val="DefaultParagraphFont"/>
     <w:uiPriority w:val="21"/>
     <w:qFormat/>
     <w:rsid w:val="006C417F"/>
@@ -3500,11 +3171,11 @@
       <w:color w:val="0F4761" w:themeColor="accent1" w:themeShade="BF"/>
     </w:rPr>
   </w:style>
-  <w:style w:type="paragraph" w:styleId="Citationintense">
+  <w:style w:type="paragraph" w:styleId="IntenseQuote">
     <w:name w:val="Intense Quote"/>
     <w:basedOn w:val="Normal"/>
     <w:next w:val="Normal"/>
-    <w:link w:val="CitationintenseCar"/>
+    <w:link w:val="IntenseQuoteChar"/>
     <w:uiPriority w:val="30"/>
     <w:qFormat/>
     <w:rsid w:val="006C417F"/>
@@ -3523,10 +3194,10 @@
       <w:color w:val="0F4761" w:themeColor="accent1" w:themeShade="BF"/>
     </w:rPr>
   </w:style>
-  <w:style w:type="character" w:customStyle="1" w:styleId="CitationintenseCar">
-    <w:name w:val="Citation intense Car"/>
-    <w:basedOn w:val="Policepardfaut"/>
-    <w:link w:val="Citationintense"/>
+  <w:style w:type="character" w:customStyle="1" w:styleId="IntenseQuoteChar">
+    <w:name w:val="Intense Quote Char"/>
+    <w:basedOn w:val="DefaultParagraphFont"/>
+    <w:link w:val="IntenseQuote"/>
     <w:uiPriority w:val="30"/>
     <w:rsid w:val="006C417F"/>
     <w:rPr>
@@ -3535,9 +3206,9 @@
       <w:color w:val="0F4761" w:themeColor="accent1" w:themeShade="BF"/>
     </w:rPr>
   </w:style>
-  <w:style w:type="character" w:styleId="Rfrenceintense">
+  <w:style w:type="character" w:styleId="IntenseReference">
     <w:name w:val="Intense Reference"/>
-    <w:basedOn w:val="Policepardfaut"/>
+    <w:basedOn w:val="DefaultParagraphFont"/>
     <w:uiPriority w:val="32"/>
     <w:qFormat/>
     <w:rsid w:val="006C417F"/>
@@ -3549,9 +3220,9 @@
       <w:spacing w:val="5"/>
     </w:rPr>
   </w:style>
-  <w:style w:type="character" w:styleId="Lienhypertexte">
+  <w:style w:type="character" w:styleId="Hyperlink">
     <w:name w:val="Hyperlink"/>
-    <w:basedOn w:val="Policepardfaut"/>
+    <w:basedOn w:val="DefaultParagraphFont"/>
     <w:uiPriority w:val="99"/>
     <w:unhideWhenUsed/>
     <w:rsid w:val="00E71138"/>
@@ -3560,9 +3231,9 @@
       <w:u w:val="single"/>
     </w:rPr>
   </w:style>
-  <w:style w:type="character" w:styleId="Mentionnonrsolue">
+  <w:style w:type="character" w:styleId="UnresolvedMention">
     <w:name w:val="Unresolved Mention"/>
-    <w:basedOn w:val="Policepardfaut"/>
+    <w:basedOn w:val="DefaultParagraphFont"/>
     <w:uiPriority w:val="99"/>
     <w:semiHidden/>
     <w:unhideWhenUsed/>
@@ -3572,9 +3243,9 @@
       <w:shd w:val="clear" w:color="auto" w:fill="E1DFDD"/>
     </w:rPr>
   </w:style>
-  <w:style w:type="character" w:styleId="Lienhypertextesuivivisit">
+  <w:style w:type="character" w:styleId="FollowedHyperlink">
     <w:name w:val="FollowedHyperlink"/>
-    <w:basedOn w:val="Policepardfaut"/>
+    <w:basedOn w:val="DefaultParagraphFont"/>
     <w:uiPriority w:val="99"/>
     <w:semiHidden/>
     <w:unhideWhenUsed/>
@@ -3584,9 +3255,9 @@
       <w:u w:val="single"/>
     </w:rPr>
   </w:style>
-  <w:style w:type="table" w:styleId="Grilledutableau">
+  <w:style w:type="table" w:styleId="TableGrid">
     <w:name w:val="Table Grid"/>
-    <w:basedOn w:val="TableauNormal"/>
+    <w:basedOn w:val="TableNormal"/>
     <w:uiPriority w:val="39"/>
     <w:rsid w:val="00F72678"/>
     <w:pPr>
@@ -3603,9 +3274,9 @@
       </w:tblBorders>
     </w:tblPr>
   </w:style>
-  <w:style w:type="paragraph" w:styleId="En-ttedetabledesmatires">
+  <w:style w:type="paragraph" w:styleId="TOCHeading">
     <w:name w:val="TOC Heading"/>
-    <w:basedOn w:val="Titre1"/>
+    <w:basedOn w:val="Heading1"/>
     <w:next w:val="Normal"/>
     <w:uiPriority w:val="39"/>
     <w:unhideWhenUsed/>
@@ -3623,7 +3294,7 @@
       <w14:ligatures w14:val="none"/>
     </w:rPr>
   </w:style>
-  <w:style w:type="paragraph" w:styleId="TM1">
+  <w:style w:type="paragraph" w:styleId="TOC1">
     <w:name w:val="toc 1"/>
     <w:basedOn w:val="Normal"/>
     <w:next w:val="Normal"/>
@@ -3635,7 +3306,7 @@
       <w:spacing w:after="100"/>
     </w:pPr>
   </w:style>
-  <w:style w:type="paragraph" w:styleId="TM2">
+  <w:style w:type="paragraph" w:styleId="TOC2">
     <w:name w:val="toc 2"/>
     <w:basedOn w:val="Normal"/>
     <w:next w:val="Normal"/>
@@ -3648,7 +3319,7 @@
       <w:ind w:left="240"/>
     </w:pPr>
   </w:style>
-  <w:style w:type="paragraph" w:styleId="TM3">
+  <w:style w:type="paragraph" w:styleId="TOC3">
     <w:name w:val="toc 3"/>
     <w:basedOn w:val="Normal"/>
     <w:next w:val="Normal"/>
@@ -3661,10 +3332,10 @@
       <w:ind w:left="480"/>
     </w:pPr>
   </w:style>
-  <w:style w:type="paragraph" w:styleId="En-tte">
+  <w:style w:type="paragraph" w:styleId="Header">
     <w:name w:val="header"/>
     <w:basedOn w:val="Normal"/>
-    <w:link w:val="En-tteCar"/>
+    <w:link w:val="HeaderChar"/>
     <w:uiPriority w:val="99"/>
     <w:unhideWhenUsed/>
     <w:rsid w:val="001938A7"/>
@@ -3676,17 +3347,17 @@
       <w:spacing w:after="0" w:line="240" w:lineRule="auto"/>
     </w:pPr>
   </w:style>
-  <w:style w:type="character" w:customStyle="1" w:styleId="En-tteCar">
-    <w:name w:val="En-tête Car"/>
-    <w:basedOn w:val="Policepardfaut"/>
-    <w:link w:val="En-tte"/>
+  <w:style w:type="character" w:customStyle="1" w:styleId="HeaderChar">
+    <w:name w:val="Header Char"/>
+    <w:basedOn w:val="DefaultParagraphFont"/>
+    <w:link w:val="Header"/>
     <w:uiPriority w:val="99"/>
     <w:rsid w:val="001938A7"/>
   </w:style>
-  <w:style w:type="paragraph" w:styleId="Pieddepage">
+  <w:style w:type="paragraph" w:styleId="Footer">
     <w:name w:val="footer"/>
     <w:basedOn w:val="Normal"/>
-    <w:link w:val="PieddepageCar"/>
+    <w:link w:val="FooterChar"/>
     <w:uiPriority w:val="99"/>
     <w:unhideWhenUsed/>
     <w:rsid w:val="001938A7"/>
@@ -3698,10 +3369,10 @@
       <w:spacing w:after="0" w:line="240" w:lineRule="auto"/>
     </w:pPr>
   </w:style>
-  <w:style w:type="character" w:customStyle="1" w:styleId="PieddepageCar">
-    <w:name w:val="Pied de page Car"/>
-    <w:basedOn w:val="Policepardfaut"/>
-    <w:link w:val="Pieddepage"/>
+  <w:style w:type="character" w:customStyle="1" w:styleId="FooterChar">
+    <w:name w:val="Footer Char"/>
+    <w:basedOn w:val="DefaultParagraphFont"/>
+    <w:link w:val="Footer"/>
     <w:uiPriority w:val="99"/>
     <w:rsid w:val="001938A7"/>
   </w:style>

</xml_diff>

<commit_message>
feat(Tests) création de deux tests pour les Robot (déplacement et tirer)
</commit_message>
<xml_diff>
--- a/doc/Rapport.docx
+++ b/doc/Rapport.docx
@@ -1729,12 +1729,28 @@
       </w:r>
     </w:p>
     <w:p>
-      <w:r>
-        <w:t>https://claude.ai/share/2bf90d2b-864b-42cc-8b37-eaf1b68bf1c2</w:t>
-      </w:r>
-    </w:p>
+      <w:hyperlink r:id="rId24" w:history="1">
+        <w:r>
+          <w:rPr>
+            <w:rStyle w:val="Hyperlink"/>
+          </w:rPr>
+          <w:t>https://claude.ai/share/2bf90d2b-864b-42cc-8b37-eaf1b68bf1c2</w:t>
+        </w:r>
+      </w:hyperlink>
+    </w:p>
+    <w:p>
+      <w:hyperlink r:id="rId25" w:history="1">
+        <w:r>
+          <w:rPr>
+            <w:rStyle w:val="Hyperlink"/>
+          </w:rPr>
+          <w:t>https://claude.ai/chat/6a7b1c99-f71e-4fc9-8b5f-c603c90ab954</w:t>
+        </w:r>
+      </w:hyperlink>
+    </w:p>
+    <w:p/>
     <w:sectPr>
-      <w:footerReference w:type="default" r:id="rId24"/>
+      <w:footerReference w:type="default" r:id="rId26"/>
       <w:pgSz w:w="11906" w:h="16838"/>
       <w:pgMar w:top="1417" w:right="1417" w:bottom="1417" w:left="1417" w:header="708" w:footer="708" w:gutter="0"/>
       <w:cols w:space="708"/>

</xml_diff>

<commit_message>
chore(rapport) commencer a ecrire le rapport sur l utilisation de l'IA
</commit_message>
<xml_diff>
--- a/doc/Rapport.docx
+++ b/doc/Rapport.docx
@@ -43,7 +43,7 @@
         <w:pStyle w:val="Heading1"/>
         <w:jc w:val="center"/>
       </w:pPr>
-      <w:bookmarkStart w:id="0" w:name="_Toc240030127"/>
+      <w:bookmarkStart w:id="0" w:name="_Toc243513762"/>
       <w:r>
         <w:t>P_OO Shoot Me Up Rapport de Proj</w:t>
       </w:r>
@@ -129,7 +129,7 @@
           <w:r>
             <w:fldChar w:fldCharType="separate"/>
           </w:r>
-          <w:hyperlink w:anchor="_Toc240030127" w:history="1">
+          <w:hyperlink w:anchor="_Toc243513762" w:history="1">
             <w:r>
               <w:rPr>
                 <w:rStyle w:val="Hyperlink"/>
@@ -156,7 +156,7 @@
                 <w:noProof/>
                 <w:webHidden/>
               </w:rPr>
-              <w:instrText xml:space="preserve"> PAGEREF _Toc240030127 \h </w:instrText>
+              <w:instrText xml:space="preserve"> PAGEREF _Toc243513762 \h </w:instrText>
             </w:r>
             <w:r>
               <w:rPr>
@@ -199,7 +199,7 @@
               <w:lang w:eastAsia="fr-CH"/>
             </w:rPr>
           </w:pPr>
-          <w:hyperlink w:anchor="_Toc240030128" w:history="1">
+          <w:hyperlink w:anchor="_Toc243513763" w:history="1">
             <w:r>
               <w:rPr>
                 <w:rStyle w:val="Hyperlink"/>
@@ -226,7 +226,7 @@
                 <w:noProof/>
                 <w:webHidden/>
               </w:rPr>
-              <w:instrText xml:space="preserve"> PAGEREF _Toc240030128 \h </w:instrText>
+              <w:instrText xml:space="preserve"> PAGEREF _Toc243513763 \h </w:instrText>
             </w:r>
             <w:r>
               <w:rPr>
@@ -269,7 +269,7 @@
               <w:lang w:eastAsia="fr-CH"/>
             </w:rPr>
           </w:pPr>
-          <w:hyperlink w:anchor="_Toc240030129" w:history="1">
+          <w:hyperlink w:anchor="_Toc243513764" w:history="1">
             <w:r>
               <w:rPr>
                 <w:rStyle w:val="Hyperlink"/>
@@ -296,7 +296,7 @@
                 <w:noProof/>
                 <w:webHidden/>
               </w:rPr>
-              <w:instrText xml:space="preserve"> PAGEREF _Toc240030129 \h </w:instrText>
+              <w:instrText xml:space="preserve"> PAGEREF _Toc243513764 \h </w:instrText>
             </w:r>
             <w:r>
               <w:rPr>
@@ -339,7 +339,7 @@
               <w:lang w:eastAsia="fr-CH"/>
             </w:rPr>
           </w:pPr>
-          <w:hyperlink w:anchor="_Toc240030130" w:history="1">
+          <w:hyperlink w:anchor="_Toc243513765" w:history="1">
             <w:r>
               <w:rPr>
                 <w:rStyle w:val="Hyperlink"/>
@@ -366,7 +366,7 @@
                 <w:noProof/>
                 <w:webHidden/>
               </w:rPr>
-              <w:instrText xml:space="preserve"> PAGEREF _Toc240030130 \h </w:instrText>
+              <w:instrText xml:space="preserve"> PAGEREF _Toc243513765 \h </w:instrText>
             </w:r>
             <w:r>
               <w:rPr>
@@ -409,7 +409,7 @@
               <w:lang w:eastAsia="fr-CH"/>
             </w:rPr>
           </w:pPr>
-          <w:hyperlink w:anchor="_Toc240030131" w:history="1">
+          <w:hyperlink w:anchor="_Toc243513766" w:history="1">
             <w:r>
               <w:rPr>
                 <w:rStyle w:val="Hyperlink"/>
@@ -436,7 +436,7 @@
                 <w:noProof/>
                 <w:webHidden/>
               </w:rPr>
-              <w:instrText xml:space="preserve"> PAGEREF _Toc240030131 \h </w:instrText>
+              <w:instrText xml:space="preserve"> PAGEREF _Toc243513766 \h </w:instrText>
             </w:r>
             <w:r>
               <w:rPr>
@@ -479,7 +479,7 @@
               <w:lang w:eastAsia="fr-CH"/>
             </w:rPr>
           </w:pPr>
-          <w:hyperlink w:anchor="_Toc240030132" w:history="1">
+          <w:hyperlink w:anchor="_Toc243513767" w:history="1">
             <w:r>
               <w:rPr>
                 <w:rStyle w:val="Hyperlink"/>
@@ -506,7 +506,77 @@
                 <w:noProof/>
                 <w:webHidden/>
               </w:rPr>
-              <w:instrText xml:space="preserve"> PAGEREF _Toc240030132 \h </w:instrText>
+              <w:instrText xml:space="preserve"> PAGEREF _Toc243513767 \h </w:instrText>
+            </w:r>
+            <w:r>
+              <w:rPr>
+                <w:noProof/>
+                <w:webHidden/>
+              </w:rPr>
+            </w:r>
+            <w:r>
+              <w:rPr>
+                <w:noProof/>
+                <w:webHidden/>
+              </w:rPr>
+              <w:fldChar w:fldCharType="separate"/>
+            </w:r>
+            <w:r>
+              <w:rPr>
+                <w:noProof/>
+                <w:webHidden/>
+              </w:rPr>
+              <w:t>7</w:t>
+            </w:r>
+            <w:r>
+              <w:rPr>
+                <w:noProof/>
+                <w:webHidden/>
+              </w:rPr>
+              <w:fldChar w:fldCharType="end"/>
+            </w:r>
+          </w:hyperlink>
+        </w:p>
+        <w:p>
+          <w:pPr>
+            <w:pStyle w:val="TOC2"/>
+            <w:tabs>
+              <w:tab w:val="right" w:leader="dot" w:pos="9062"/>
+            </w:tabs>
+            <w:rPr>
+              <w:rFonts w:eastAsiaTheme="minorEastAsia"/>
+              <w:noProof/>
+              <w:lang w:eastAsia="fr-CH"/>
+            </w:rPr>
+          </w:pPr>
+          <w:hyperlink w:anchor="_Toc243513768" w:history="1">
+            <w:r>
+              <w:rPr>
+                <w:rStyle w:val="Hyperlink"/>
+                <w:noProof/>
+              </w:rPr>
+              <w:t>Utilisation de l’IA</w:t>
+            </w:r>
+            <w:r>
+              <w:rPr>
+                <w:noProof/>
+                <w:webHidden/>
+              </w:rPr>
+              <w:tab/>
+            </w:r>
+            <w:r>
+              <w:rPr>
+                <w:noProof/>
+                <w:webHidden/>
+              </w:rPr>
+              <w:fldChar w:fldCharType="begin"/>
+            </w:r>
+            <w:r>
+              <w:rPr>
+                <w:noProof/>
+                <w:webHidden/>
+              </w:rPr>
+              <w:instrText xml:space="preserve"> PAGEREF _Toc243513768 \h </w:instrText>
             </w:r>
             <w:r>
               <w:rPr>
@@ -571,7 +641,7 @@
       <w:pPr>
         <w:pStyle w:val="Heading2"/>
       </w:pPr>
-      <w:bookmarkStart w:id="1" w:name="_Toc240030128"/>
+      <w:bookmarkStart w:id="1" w:name="_Toc243513763"/>
       <w:r>
         <w:t>Introduction</w:t>
       </w:r>
@@ -582,7 +652,7 @@
         <w:pStyle w:val="Heading3"/>
         <w:ind w:left="708"/>
       </w:pPr>
-      <w:bookmarkStart w:id="2" w:name="_Toc240030129"/>
+      <w:bookmarkStart w:id="2" w:name="_Toc243513764"/>
       <w:r>
         <w:t>Objectifs produit</w:t>
       </w:r>
@@ -660,7 +730,15 @@
         <w:t xml:space="preserve"> sur le thème d’un employé de fast-food</w:t>
       </w:r>
       <w:r>
-        <w:t xml:space="preserve"> (Wacdonald’s)</w:t>
+        <w:t xml:space="preserve"> (</w:t>
+      </w:r>
+      <w:proofErr w:type="spellStart"/>
+      <w:r>
+        <w:t>Wacdonald’s</w:t>
+      </w:r>
+      <w:proofErr w:type="spellEnd"/>
+      <w:r>
+        <w:t>)</w:t>
       </w:r>
       <w:r>
         <w:t xml:space="preserve"> devant affronter sa hiérarchie et les robots voulant le </w:t>
@@ -788,7 +866,15 @@
         <w:t>leur attaque</w:t>
       </w:r>
       <w:r>
-        <w:t xml:space="preserve"> aura un cooldown.</w:t>
+        <w:t xml:space="preserve"> aura un </w:t>
+      </w:r>
+      <w:proofErr w:type="spellStart"/>
+      <w:r>
+        <w:t>cooldown</w:t>
+      </w:r>
+      <w:proofErr w:type="spellEnd"/>
+      <w:r>
+        <w:t>.</w:t>
       </w:r>
     </w:p>
     <w:p>
@@ -819,7 +905,15 @@
         <w:ind w:left="708"/>
       </w:pPr>
       <w:r>
-        <w:t>Le joueur pourra également se cacher derrière les bornes wacdonald’s pour se protéger.</w:t>
+        <w:t xml:space="preserve">Le joueur pourra également se cacher derrière les bornes </w:t>
+      </w:r>
+      <w:proofErr w:type="spellStart"/>
+      <w:r>
+        <w:t>wacdonald’s</w:t>
+      </w:r>
+      <w:proofErr w:type="spellEnd"/>
+      <w:r>
+        <w:t xml:space="preserve"> pour se protéger.</w:t>
       </w:r>
     </w:p>
     <w:p>
@@ -842,7 +936,15 @@
         <w:t>er</w:t>
       </w:r>
       <w:r>
-        <w:t xml:space="preserve"> 1'000’000$ afin de devenir actionnaire majoritaire du fast food. Le joueur perd la partie si sa vie tombe à 0.</w:t>
+        <w:t xml:space="preserve"> 1'000’000$ afin de devenir actionnaire majoritaire du fast </w:t>
+      </w:r>
+      <w:proofErr w:type="spellStart"/>
+      <w:r>
+        <w:t>food</w:t>
+      </w:r>
+      <w:proofErr w:type="spellEnd"/>
+      <w:r>
+        <w:t>. Le joueur perd la partie si sa vie tombe à 0.</w:t>
       </w:r>
     </w:p>
     <w:p>
@@ -850,7 +952,7 @@
         <w:pStyle w:val="Heading3"/>
         <w:ind w:left="708"/>
       </w:pPr>
-      <w:bookmarkStart w:id="3" w:name="_Toc240030130"/>
+      <w:bookmarkStart w:id="3" w:name="_Toc243513765"/>
       <w:r>
         <w:t>Objectifs pédagogiques</w:t>
       </w:r>
@@ -945,7 +1047,21 @@
         <w:rPr>
           <w:lang w:val="en-US"/>
         </w:rPr>
-        <w:t xml:space="preserve"> repository Github (release, issues)</w:t>
+        <w:t xml:space="preserve"> repository </w:t>
+      </w:r>
+      <w:proofErr w:type="spellStart"/>
+      <w:r>
+        <w:rPr>
+          <w:lang w:val="en-US"/>
+        </w:rPr>
+        <w:t>Github</w:t>
+      </w:r>
+      <w:proofErr w:type="spellEnd"/>
+      <w:r>
+        <w:rPr>
+          <w:lang w:val="en-US"/>
+        </w:rPr>
+        <w:t xml:space="preserve"> (release, issues)</w:t>
       </w:r>
     </w:p>
     <w:p>
@@ -970,7 +1086,7 @@
       <w:pPr>
         <w:pStyle w:val="Heading2"/>
       </w:pPr>
-      <w:bookmarkStart w:id="4" w:name="_Toc240030131"/>
+      <w:bookmarkStart w:id="4" w:name="_Toc243513766"/>
       <w:r>
         <w:t>Analyse fonctionnelle</w:t>
       </w:r>
@@ -987,8 +1103,16 @@
           <w:rPr>
             <w:rStyle w:val="Hyperlink"/>
           </w:rPr>
-          <w:t>Projet Github</w:t>
+          <w:t xml:space="preserve">Projet </w:t>
         </w:r>
+        <w:proofErr w:type="spellStart"/>
+        <w:r>
+          <w:rPr>
+            <w:rStyle w:val="Hyperlink"/>
+          </w:rPr>
+          <w:t>Github</w:t>
+        </w:r>
+        <w:proofErr w:type="spellEnd"/>
       </w:hyperlink>
     </w:p>
     <w:p>
@@ -1005,7 +1129,25 @@
           <w:bCs/>
           <w:u w:val="single"/>
         </w:rPr>
-        <w:t>#1 — En temps que joueur, je souhaite pouvoir utiliser les touches WASD afin de pouvoir faire bouger mon joueur dans chaque direction.</w:t>
+        <w:t xml:space="preserve">#1 — En </w:t>
+      </w:r>
+      <w:proofErr w:type="spellStart"/>
+      <w:r>
+        <w:rPr>
+          <w:b/>
+          <w:bCs/>
+          <w:u w:val="single"/>
+        </w:rPr>
+        <w:t>temps</w:t>
+      </w:r>
+      <w:proofErr w:type="spellEnd"/>
+      <w:r>
+        <w:rPr>
+          <w:b/>
+          <w:bCs/>
+          <w:u w:val="single"/>
+        </w:rPr>
+        <w:t xml:space="preserve"> que joueur, je souhaite pouvoir utiliser les touches WASD afin de pouvoir faire bouger mon joueur dans chaque direction.</w:t>
       </w:r>
     </w:p>
     <w:p/>
@@ -1066,7 +1208,17 @@
     </w:p>
     <w:p>
       <w:r>
-        <w:t>• Le joueur va dans la direction correspondante temps que je maintient la touche</w:t>
+        <w:t xml:space="preserve">• Le joueur va dans la direction correspondante temps que je </w:t>
+      </w:r>
+      <w:proofErr w:type="spellStart"/>
+      <w:proofErr w:type="gramStart"/>
+      <w:r>
+        <w:t>maintient</w:t>
+      </w:r>
+      <w:proofErr w:type="spellEnd"/>
+      <w:proofErr w:type="gramEnd"/>
+      <w:r>
+        <w:t xml:space="preserve"> la touche</w:t>
       </w:r>
     </w:p>
     <w:p>
@@ -1076,7 +1228,15 @@
     </w:p>
     <w:p>
       <w:r>
-        <w:t>• Le joueur s'arrête lorsque il essaie d'aller dans les obstacles</w:t>
+        <w:t xml:space="preserve">• Le joueur s'arrête </w:t>
+      </w:r>
+      <w:proofErr w:type="gramStart"/>
+      <w:r>
+        <w:t>lorsque il</w:t>
+      </w:r>
+      <w:proofErr w:type="gramEnd"/>
+      <w:r>
+        <w:t xml:space="preserve"> essaie d'aller dans les obstacles</w:t>
       </w:r>
     </w:p>
     <w:p/>
@@ -1094,7 +1254,61 @@
           <w:bCs/>
           <w:u w:val="single"/>
         </w:rPr>
-        <w:t>#2 — En temps que joueur, je souhaite pouvoir utiliser la touche clic gauche afin de pouvoir tirer des projectile sur mes enemies.</w:t>
+        <w:t xml:space="preserve">#2 — En </w:t>
+      </w:r>
+      <w:proofErr w:type="spellStart"/>
+      <w:r>
+        <w:rPr>
+          <w:b/>
+          <w:bCs/>
+          <w:u w:val="single"/>
+        </w:rPr>
+        <w:t>temps</w:t>
+      </w:r>
+      <w:proofErr w:type="spellEnd"/>
+      <w:r>
+        <w:rPr>
+          <w:b/>
+          <w:bCs/>
+          <w:u w:val="single"/>
+        </w:rPr>
+        <w:t xml:space="preserve"> que joueur, je souhaite pouvoir utiliser la touche clic gauche afin de pouvoir tirer </w:t>
+      </w:r>
+      <w:proofErr w:type="gramStart"/>
+      <w:r>
+        <w:rPr>
+          <w:b/>
+          <w:bCs/>
+          <w:u w:val="single"/>
+        </w:rPr>
+        <w:t>des projectile</w:t>
+      </w:r>
+      <w:proofErr w:type="gramEnd"/>
+      <w:r>
+        <w:rPr>
+          <w:b/>
+          <w:bCs/>
+          <w:u w:val="single"/>
+        </w:rPr>
+        <w:t xml:space="preserve"> sur mes </w:t>
+      </w:r>
+      <w:proofErr w:type="spellStart"/>
+      <w:r>
+        <w:rPr>
+          <w:b/>
+          <w:bCs/>
+          <w:u w:val="single"/>
+        </w:rPr>
+        <w:t>enemies</w:t>
+      </w:r>
+      <w:proofErr w:type="spellEnd"/>
+      <w:r>
+        <w:rPr>
+          <w:b/>
+          <w:bCs/>
+          <w:u w:val="single"/>
+        </w:rPr>
+        <w:t>.</w:t>
       </w:r>
     </w:p>
     <w:p/>
@@ -1161,8 +1375,21 @@
     </w:p>
     <w:p>
       <w:r>
-        <w:t>• Le projectile est détruit si il rencontre un obstacle ou un ennemie</w:t>
-      </w:r>
+        <w:t xml:space="preserve">• Le projectile est détruit </w:t>
+      </w:r>
+      <w:proofErr w:type="gramStart"/>
+      <w:r>
+        <w:t>si il</w:t>
+      </w:r>
+      <w:proofErr w:type="gramEnd"/>
+      <w:r>
+        <w:t xml:space="preserve"> rencontre un obstacle ou </w:t>
+      </w:r>
+      <w:proofErr w:type="gramStart"/>
+      <w:r>
+        <w:t>un ennemie</w:t>
+      </w:r>
+      <w:proofErr w:type="gramEnd"/>
     </w:p>
     <w:p>
       <w:r>
@@ -1172,7 +1399,15 @@
     </w:p>
     <w:p>
       <w:r>
-        <w:t>• Le projectile à un cooldown de 1sec après avoir été tiré.</w:t>
+        <w:t xml:space="preserve">• Le projectile à un </w:t>
+      </w:r>
+      <w:proofErr w:type="spellStart"/>
+      <w:r>
+        <w:t>cooldown</w:t>
+      </w:r>
+      <w:proofErr w:type="spellEnd"/>
+      <w:r>
+        <w:t xml:space="preserve"> de 1sec après avoir été tiré.</w:t>
       </w:r>
     </w:p>
     <w:p/>
@@ -1190,7 +1425,25 @@
           <w:bCs/>
           <w:u w:val="single"/>
         </w:rPr>
-        <w:t>#3 — En temps que joueur, je souhaite pouvoir utiliser la touche clic droit afin de pouvoir faire des dégâts de corp à corp.</w:t>
+        <w:t xml:space="preserve">#3 — En </w:t>
+      </w:r>
+      <w:proofErr w:type="spellStart"/>
+      <w:r>
+        <w:rPr>
+          <w:b/>
+          <w:bCs/>
+          <w:u w:val="single"/>
+        </w:rPr>
+        <w:t>temps</w:t>
+      </w:r>
+      <w:proofErr w:type="spellEnd"/>
+      <w:r>
+        <w:rPr>
+          <w:b/>
+          <w:bCs/>
+          <w:u w:val="single"/>
+        </w:rPr>
+        <w:t xml:space="preserve"> que joueur, je souhaite pouvoir utiliser la touche clic droit afin de pouvoir faire des dégâts de corp à corp.</w:t>
       </w:r>
     </w:p>
     <w:p/>
@@ -1251,7 +1504,15 @@
     </w:p>
     <w:p>
       <w:r>
-        <w:t>• L'attaque de corp à corp à un cooldown de 0.2s après avoir été lancé</w:t>
+        <w:t xml:space="preserve">• L'attaque de corp à corp à un </w:t>
+      </w:r>
+      <w:proofErr w:type="spellStart"/>
+      <w:r>
+        <w:t>cooldown</w:t>
+      </w:r>
+      <w:proofErr w:type="spellEnd"/>
+      <w:r>
+        <w:t xml:space="preserve"> de 0.2s après avoir été lancé</w:t>
       </w:r>
     </w:p>
     <w:p/>
@@ -1269,7 +1530,25 @@
           <w:bCs/>
           <w:u w:val="single"/>
         </w:rPr>
-        <w:t>#4 — En temps que joueur je souhaite avoir des ennemis de type manager afin de pouvoir gagner de l'argent</w:t>
+        <w:t xml:space="preserve">#4 — En </w:t>
+      </w:r>
+      <w:proofErr w:type="spellStart"/>
+      <w:r>
+        <w:rPr>
+          <w:b/>
+          <w:bCs/>
+          <w:u w:val="single"/>
+        </w:rPr>
+        <w:t>temps</w:t>
+      </w:r>
+      <w:proofErr w:type="spellEnd"/>
+      <w:r>
+        <w:rPr>
+          <w:b/>
+          <w:bCs/>
+          <w:u w:val="single"/>
+        </w:rPr>
+        <w:t xml:space="preserve"> que joueur je souhaite avoir des ennemis de type manager afin de pouvoir gagner de l'argent</w:t>
       </w:r>
     </w:p>
     <w:p>
@@ -1329,22 +1608,70 @@
     <w:p/>
     <w:p>
       <w:r>
-        <w:t>• Un manager doit pouvoir se deplacer aléatoirement sur la carte</w:t>
-      </w:r>
-    </w:p>
-    <w:p>
-      <w:r>
-        <w:t>• Un manager doit  trouver une nouvelle destination si il bute sur un obstacle</w:t>
-      </w:r>
-    </w:p>
-    <w:p>
-      <w:r>
-        <w:t>• Un manager doit pouvoir lancer des projectile de type sac d'argent.</w:t>
-      </w:r>
-    </w:p>
-    <w:p>
-      <w:r>
-        <w:t>• Un manager prends 4 sec à recharger.</w:t>
+        <w:t xml:space="preserve">• Un manager doit pouvoir se </w:t>
+      </w:r>
+      <w:proofErr w:type="spellStart"/>
+      <w:r>
+        <w:t>deplacer</w:t>
+      </w:r>
+      <w:proofErr w:type="spellEnd"/>
+      <w:r>
+        <w:t xml:space="preserve"> aléatoirement sur la carte</w:t>
+      </w:r>
+    </w:p>
+    <w:p>
+      <w:r>
+        <w:t xml:space="preserve">• Un manager </w:t>
+      </w:r>
+      <w:proofErr w:type="gramStart"/>
+      <w:r>
+        <w:t>doit  trouver</w:t>
+      </w:r>
+      <w:proofErr w:type="gramEnd"/>
+      <w:r>
+        <w:t xml:space="preserve"> une nouvelle destination </w:t>
+      </w:r>
+      <w:proofErr w:type="gramStart"/>
+      <w:r>
+        <w:t>si il</w:t>
+      </w:r>
+      <w:proofErr w:type="gramEnd"/>
+      <w:r>
+        <w:t xml:space="preserve"> bute sur un obstacle</w:t>
+      </w:r>
+    </w:p>
+    <w:p>
+      <w:r>
+        <w:t xml:space="preserve">• Un manager doit pouvoir lancer </w:t>
+      </w:r>
+      <w:proofErr w:type="gramStart"/>
+      <w:r>
+        <w:t>des projectile</w:t>
+      </w:r>
+      <w:proofErr w:type="gramEnd"/>
+      <w:r>
+        <w:t xml:space="preserve"> de type sac d'argent.</w:t>
+      </w:r>
+    </w:p>
+    <w:p>
+      <w:r>
+        <w:t xml:space="preserve">• Un manager </w:t>
+      </w:r>
+      <w:proofErr w:type="gramStart"/>
+      <w:r>
+        <w:t>prends</w:t>
+      </w:r>
+      <w:proofErr w:type="gramEnd"/>
+      <w:r>
+        <w:t xml:space="preserve"> 4 </w:t>
+      </w:r>
+      <w:proofErr w:type="gramStart"/>
+      <w:r>
+        <w:t>sec</w:t>
+      </w:r>
+      <w:proofErr w:type="gramEnd"/>
+      <w:r>
+        <w:t xml:space="preserve"> à recharger.</w:t>
       </w:r>
     </w:p>
     <w:p>
@@ -1354,12 +1681,36 @@
     </w:p>
     <w:p>
       <w:r>
-        <w:t>• Lorsque un manager meurt, le nombre d'argent du joueur augment de 5'000$</w:t>
-      </w:r>
-    </w:p>
-    <w:p>
-      <w:r>
-        <w:t>• L'argent que fait tomber le manager est quadruplé et ses PV sont doublé quand le joueur atteint 100'000$. Il le sont à nouveaux quand il atteint 500'000$</w:t>
+        <w:t xml:space="preserve">• </w:t>
+      </w:r>
+      <w:proofErr w:type="gramStart"/>
+      <w:r>
+        <w:t>Lorsque un</w:t>
+      </w:r>
+      <w:proofErr w:type="gramEnd"/>
+      <w:r>
+        <w:t xml:space="preserve"> manager meurt, le nombre d'argent du joueur </w:t>
+      </w:r>
+      <w:proofErr w:type="spellStart"/>
+      <w:r>
+        <w:t>augment</w:t>
+      </w:r>
+      <w:proofErr w:type="spellEnd"/>
+      <w:r>
+        <w:t xml:space="preserve"> de 5'000$</w:t>
+      </w:r>
+    </w:p>
+    <w:p>
+      <w:r>
+        <w:t xml:space="preserve">• L'argent que fait tomber le manager est quadruplé et ses PV sont doublé quand le joueur atteint 100'000$. </w:t>
+      </w:r>
+      <w:proofErr w:type="gramStart"/>
+      <w:r>
+        <w:t>Il le sont</w:t>
+      </w:r>
+      <w:proofErr w:type="gramEnd"/>
+      <w:r>
+        <w:t xml:space="preserve"> à nouveaux quand il atteint 500'000$</w:t>
       </w:r>
     </w:p>
     <w:p/>
@@ -1367,7 +1718,7 @@
       <w:pPr>
         <w:pStyle w:val="Heading2"/>
       </w:pPr>
-      <w:bookmarkStart w:id="5" w:name="_Toc240030132"/>
+      <w:bookmarkStart w:id="5" w:name="_Toc243513767"/>
       <w:r>
         <w:t>Planification Initiale</w:t>
       </w:r>
@@ -1483,12 +1834,42 @@
           </w:tcPr>
           <w:p>
             <w:hyperlink r:id="rId15" w:history="1">
+              <w:proofErr w:type="gramStart"/>
               <w:r>
                 <w:rPr>
                   <w:rStyle w:val="Hyperlink"/>
                 </w:rPr>
-                <w:t>pouvoir tirer des projectile sur mes enemies</w:t>
+                <w:t>pouvoir</w:t>
               </w:r>
+              <w:proofErr w:type="gramEnd"/>
+              <w:r>
+                <w:rPr>
+                  <w:rStyle w:val="Hyperlink"/>
+                </w:rPr>
+                <w:t xml:space="preserve"> tirer </w:t>
+              </w:r>
+              <w:proofErr w:type="gramStart"/>
+              <w:r>
+                <w:rPr>
+                  <w:rStyle w:val="Hyperlink"/>
+                </w:rPr>
+                <w:t>des projectile</w:t>
+              </w:r>
+              <w:proofErr w:type="gramEnd"/>
+              <w:r>
+                <w:rPr>
+                  <w:rStyle w:val="Hyperlink"/>
+                </w:rPr>
+                <w:t xml:space="preserve"> sur mes </w:t>
+              </w:r>
+              <w:proofErr w:type="spellStart"/>
+              <w:r>
+                <w:rPr>
+                  <w:rStyle w:val="Hyperlink"/>
+                </w:rPr>
+                <w:t>enemies</w:t>
+              </w:r>
+              <w:proofErr w:type="spellEnd"/>
             </w:hyperlink>
           </w:p>
         </w:tc>
@@ -1510,11 +1891,47 @@
           </w:tcPr>
           <w:p>
             <w:hyperlink r:id="rId16" w:history="1">
+              <w:proofErr w:type="gramStart"/>
               <w:r>
                 <w:rPr>
                   <w:rStyle w:val="Hyperlink"/>
                 </w:rPr>
-                <w:t>pouvoir faire des degats au corp à corp</w:t>
+                <w:t>pouvoir</w:t>
+              </w:r>
+              <w:proofErr w:type="gramEnd"/>
+              <w:r>
+                <w:rPr>
+                  <w:rStyle w:val="Hyperlink"/>
+                </w:rPr>
+                <w:t xml:space="preserve"> faire des </w:t>
+              </w:r>
+              <w:proofErr w:type="spellStart"/>
+              <w:r>
+                <w:rPr>
+                  <w:rStyle w:val="Hyperlink"/>
+                </w:rPr>
+                <w:t>degats</w:t>
+              </w:r>
+              <w:proofErr w:type="spellEnd"/>
+              <w:r>
+                <w:rPr>
+                  <w:rStyle w:val="Hyperlink"/>
+                </w:rPr>
+                <w:t xml:space="preserve"> </w:t>
+              </w:r>
+              <w:proofErr w:type="gramStart"/>
+              <w:r>
+                <w:rPr>
+                  <w:rStyle w:val="Hyperlink"/>
+                </w:rPr>
+                <w:t>au corp</w:t>
+              </w:r>
+              <w:proofErr w:type="gramEnd"/>
+              <w:r>
+                <w:rPr>
+                  <w:rStyle w:val="Hyperlink"/>
+                </w:rPr>
+                <w:t xml:space="preserve"> à corp</w:t>
               </w:r>
             </w:hyperlink>
           </w:p>
@@ -1724,9 +2141,11 @@
       <w:pPr>
         <w:pStyle w:val="Heading2"/>
       </w:pPr>
+      <w:bookmarkStart w:id="6" w:name="_Toc243513768"/>
       <w:r>
         <w:t>Utilisation de l’IA</w:t>
       </w:r>
+      <w:bookmarkEnd w:id="6"/>
     </w:p>
     <w:p>
       <w:hyperlink r:id="rId24" w:history="1">
@@ -1748,9 +2167,20 @@
         </w:r>
       </w:hyperlink>
     </w:p>
+    <w:p>
+      <w:hyperlink r:id="rId26" w:history="1">
+        <w:r>
+          <w:rPr>
+            <w:rStyle w:val="Hyperlink"/>
+          </w:rPr>
+          <w:t>https://claude.ai/chat/0db72aac-4429-4988-9a24-8d265f9b46d8</w:t>
+        </w:r>
+      </w:hyperlink>
+    </w:p>
+    <w:p/>
     <w:p/>
     <w:sectPr>
-      <w:footerReference w:type="default" r:id="rId26"/>
+      <w:footerReference w:type="default" r:id="rId27"/>
       <w:pgSz w:w="11906" w:h="16838"/>
       <w:pgMar w:top="1417" w:right="1417" w:bottom="1417" w:left="1417" w:header="708" w:footer="708" w:gutter="0"/>
       <w:cols w:space="708"/>

</xml_diff>

<commit_message>
doc(Rapport) écriture du chapitre sur les tests
</commit_message>
<xml_diff>
--- a/doc/Rapport.docx
+++ b/doc/Rapport.docx
@@ -4,43 +4,43 @@
   <w:body>
     <w:p>
       <w:pPr>
-        <w:pStyle w:val="Heading1"/>
+        <w:pStyle w:val="Titre1"/>
         <w:jc w:val="center"/>
       </w:pPr>
     </w:p>
     <w:p>
       <w:pPr>
-        <w:pStyle w:val="Heading1"/>
+        <w:pStyle w:val="Titre1"/>
         <w:jc w:val="center"/>
       </w:pPr>
     </w:p>
     <w:p>
       <w:pPr>
-        <w:pStyle w:val="Heading1"/>
+        <w:pStyle w:val="Titre1"/>
         <w:jc w:val="center"/>
       </w:pPr>
     </w:p>
     <w:p>
       <w:pPr>
-        <w:pStyle w:val="Heading1"/>
+        <w:pStyle w:val="Titre1"/>
         <w:jc w:val="center"/>
       </w:pPr>
     </w:p>
     <w:p>
       <w:pPr>
-        <w:pStyle w:val="Heading1"/>
+        <w:pStyle w:val="Titre1"/>
         <w:jc w:val="center"/>
       </w:pPr>
     </w:p>
     <w:p>
       <w:pPr>
-        <w:pStyle w:val="Heading1"/>
+        <w:pStyle w:val="Titre1"/>
         <w:jc w:val="center"/>
       </w:pPr>
     </w:p>
     <w:p>
       <w:pPr>
-        <w:pStyle w:val="Heading1"/>
+        <w:pStyle w:val="Titre1"/>
         <w:jc w:val="center"/>
       </w:pPr>
       <w:bookmarkStart w:id="0" w:name="_Toc243513762"/>
@@ -99,7 +99,7 @@
       <w:sdtContent>
         <w:p>
           <w:pPr>
-            <w:pStyle w:val="TOCHeading"/>
+            <w:pStyle w:val="En-ttedetabledesmatires"/>
           </w:pPr>
           <w:r>
             <w:rPr>
@@ -110,7 +110,7 @@
         </w:p>
         <w:p>
           <w:pPr>
-            <w:pStyle w:val="TOC1"/>
+            <w:pStyle w:val="TM1"/>
             <w:tabs>
               <w:tab w:val="right" w:leader="dot" w:pos="9062"/>
             </w:tabs>
@@ -132,7 +132,7 @@
           <w:hyperlink w:anchor="_Toc243513762" w:history="1">
             <w:r>
               <w:rPr>
-                <w:rStyle w:val="Hyperlink"/>
+                <w:rStyle w:val="Lienhypertexte"/>
                 <w:noProof/>
               </w:rPr>
               <w:t>P_OO Shoot Me Up Rapport de Projet</w:t>
@@ -189,7 +189,7 @@
         </w:p>
         <w:p>
           <w:pPr>
-            <w:pStyle w:val="TOC2"/>
+            <w:pStyle w:val="TM2"/>
             <w:tabs>
               <w:tab w:val="right" w:leader="dot" w:pos="9062"/>
             </w:tabs>
@@ -202,7 +202,7 @@
           <w:hyperlink w:anchor="_Toc243513763" w:history="1">
             <w:r>
               <w:rPr>
-                <w:rStyle w:val="Hyperlink"/>
+                <w:rStyle w:val="Lienhypertexte"/>
                 <w:noProof/>
               </w:rPr>
               <w:t>Introduction</w:t>
@@ -259,7 +259,7 @@
         </w:p>
         <w:p>
           <w:pPr>
-            <w:pStyle w:val="TOC3"/>
+            <w:pStyle w:val="TM3"/>
             <w:tabs>
               <w:tab w:val="right" w:leader="dot" w:pos="9062"/>
             </w:tabs>
@@ -272,7 +272,7 @@
           <w:hyperlink w:anchor="_Toc243513764" w:history="1">
             <w:r>
               <w:rPr>
-                <w:rStyle w:val="Hyperlink"/>
+                <w:rStyle w:val="Lienhypertexte"/>
                 <w:noProof/>
               </w:rPr>
               <w:t>Objectifs produit</w:t>
@@ -329,7 +329,7 @@
         </w:p>
         <w:p>
           <w:pPr>
-            <w:pStyle w:val="TOC3"/>
+            <w:pStyle w:val="TM3"/>
             <w:tabs>
               <w:tab w:val="right" w:leader="dot" w:pos="9062"/>
             </w:tabs>
@@ -342,7 +342,7 @@
           <w:hyperlink w:anchor="_Toc243513765" w:history="1">
             <w:r>
               <w:rPr>
-                <w:rStyle w:val="Hyperlink"/>
+                <w:rStyle w:val="Lienhypertexte"/>
                 <w:noProof/>
               </w:rPr>
               <w:t>Objectifs pédagogiques</w:t>
@@ -399,7 +399,7 @@
         </w:p>
         <w:p>
           <w:pPr>
-            <w:pStyle w:val="TOC2"/>
+            <w:pStyle w:val="TM2"/>
             <w:tabs>
               <w:tab w:val="right" w:leader="dot" w:pos="9062"/>
             </w:tabs>
@@ -412,7 +412,7 @@
           <w:hyperlink w:anchor="_Toc243513766" w:history="1">
             <w:r>
               <w:rPr>
-                <w:rStyle w:val="Hyperlink"/>
+                <w:rStyle w:val="Lienhypertexte"/>
                 <w:noProof/>
               </w:rPr>
               <w:t>Analyse fonctionnelle</w:t>
@@ -469,7 +469,7 @@
         </w:p>
         <w:p>
           <w:pPr>
-            <w:pStyle w:val="TOC2"/>
+            <w:pStyle w:val="TM2"/>
             <w:tabs>
               <w:tab w:val="right" w:leader="dot" w:pos="9062"/>
             </w:tabs>
@@ -482,7 +482,7 @@
           <w:hyperlink w:anchor="_Toc243513767" w:history="1">
             <w:r>
               <w:rPr>
-                <w:rStyle w:val="Hyperlink"/>
+                <w:rStyle w:val="Lienhypertexte"/>
                 <w:noProof/>
               </w:rPr>
               <w:t>Planification Initiale</w:t>
@@ -539,7 +539,7 @@
         </w:p>
         <w:p>
           <w:pPr>
-            <w:pStyle w:val="TOC2"/>
+            <w:pStyle w:val="TM2"/>
             <w:tabs>
               <w:tab w:val="right" w:leader="dot" w:pos="9062"/>
             </w:tabs>
@@ -552,7 +552,7 @@
           <w:hyperlink w:anchor="_Toc243513768" w:history="1">
             <w:r>
               <w:rPr>
-                <w:rStyle w:val="Hyperlink"/>
+                <w:rStyle w:val="Lienhypertexte"/>
                 <w:noProof/>
               </w:rPr>
               <w:t>Utilisation de l’IA</w:t>
@@ -634,12 +634,12 @@
     </w:p>
     <w:p>
       <w:pPr>
-        <w:pStyle w:val="Heading2"/>
-      </w:pPr>
-    </w:p>
-    <w:p>
-      <w:pPr>
-        <w:pStyle w:val="Heading2"/>
+        <w:pStyle w:val="Titre2"/>
+      </w:pPr>
+    </w:p>
+    <w:p>
+      <w:pPr>
+        <w:pStyle w:val="Titre2"/>
       </w:pPr>
       <w:bookmarkStart w:id="1" w:name="_Toc243513763"/>
       <w:r>
@@ -649,7 +649,7 @@
     </w:p>
     <w:p>
       <w:pPr>
-        <w:pStyle w:val="Heading3"/>
+        <w:pStyle w:val="Titre3"/>
         <w:ind w:left="708"/>
       </w:pPr>
       <w:bookmarkStart w:id="2" w:name="_Toc243513764"/>
@@ -730,15 +730,7 @@
         <w:t xml:space="preserve"> sur le thème d’un employé de fast-food</w:t>
       </w:r>
       <w:r>
-        <w:t xml:space="preserve"> (</w:t>
-      </w:r>
-      <w:proofErr w:type="spellStart"/>
-      <w:r>
-        <w:t>Wacdonald’s</w:t>
-      </w:r>
-      <w:proofErr w:type="spellEnd"/>
-      <w:r>
-        <w:t>)</w:t>
+        <w:t xml:space="preserve"> (Wacdonald’s)</w:t>
       </w:r>
       <w:r>
         <w:t xml:space="preserve"> devant affronter sa hiérarchie et les robots voulant le </w:t>
@@ -752,7 +744,7 @@
     </w:p>
     <w:p>
       <w:pPr>
-        <w:pStyle w:val="Heading4"/>
+        <w:pStyle w:val="Titre4"/>
         <w:ind w:left="708"/>
       </w:pPr>
       <w:r>
@@ -866,20 +858,12 @@
         <w:t>leur attaque</w:t>
       </w:r>
       <w:r>
-        <w:t xml:space="preserve"> aura un </w:t>
-      </w:r>
-      <w:proofErr w:type="spellStart"/>
-      <w:r>
-        <w:t>cooldown</w:t>
-      </w:r>
-      <w:proofErr w:type="spellEnd"/>
-      <w:r>
-        <w:t>.</w:t>
-      </w:r>
-    </w:p>
-    <w:p>
-      <w:pPr>
-        <w:pStyle w:val="Heading4"/>
+        <w:t xml:space="preserve"> aura un cooldown.</w:t>
+      </w:r>
+    </w:p>
+    <w:p>
+      <w:pPr>
+        <w:pStyle w:val="Titre4"/>
         <w:ind w:left="708"/>
       </w:pPr>
       <w:r>
@@ -905,20 +889,12 @@
         <w:ind w:left="708"/>
       </w:pPr>
       <w:r>
-        <w:t xml:space="preserve">Le joueur pourra également se cacher derrière les bornes </w:t>
-      </w:r>
-      <w:proofErr w:type="spellStart"/>
-      <w:r>
-        <w:t>wacdonald’s</w:t>
-      </w:r>
-      <w:proofErr w:type="spellEnd"/>
-      <w:r>
-        <w:t xml:space="preserve"> pour se protéger.</w:t>
-      </w:r>
-    </w:p>
-    <w:p>
-      <w:pPr>
-        <w:pStyle w:val="Heading4"/>
+        <w:t>Le joueur pourra également se cacher derrière les bornes wacdonald’s pour se protéger.</w:t>
+      </w:r>
+    </w:p>
+    <w:p>
+      <w:pPr>
+        <w:pStyle w:val="Titre4"/>
         <w:ind w:left="708"/>
       </w:pPr>
       <w:r>
@@ -936,20 +912,12 @@
         <w:t>er</w:t>
       </w:r>
       <w:r>
-        <w:t xml:space="preserve"> 1'000’000$ afin de devenir actionnaire majoritaire du fast </w:t>
-      </w:r>
-      <w:proofErr w:type="spellStart"/>
-      <w:r>
-        <w:t>food</w:t>
-      </w:r>
-      <w:proofErr w:type="spellEnd"/>
-      <w:r>
-        <w:t>. Le joueur perd la partie si sa vie tombe à 0.</w:t>
-      </w:r>
-    </w:p>
-    <w:p>
-      <w:pPr>
-        <w:pStyle w:val="Heading3"/>
+        <w:t xml:space="preserve"> 1'000’000$ afin de devenir actionnaire majoritaire du fast food. Le joueur perd la partie si sa vie tombe à 0.</w:t>
+      </w:r>
+    </w:p>
+    <w:p>
+      <w:pPr>
+        <w:pStyle w:val="Titre3"/>
         <w:ind w:left="708"/>
       </w:pPr>
       <w:bookmarkStart w:id="3" w:name="_Toc243513765"/>
@@ -968,7 +936,7 @@
     </w:p>
     <w:p>
       <w:pPr>
-        <w:pStyle w:val="ListParagraph"/>
+        <w:pStyle w:val="Paragraphedeliste"/>
         <w:numPr>
           <w:ilvl w:val="0"/>
           <w:numId w:val="4"/>
@@ -980,7 +948,7 @@
     </w:p>
     <w:p>
       <w:pPr>
-        <w:pStyle w:val="ListParagraph"/>
+        <w:pStyle w:val="Paragraphedeliste"/>
         <w:numPr>
           <w:ilvl w:val="0"/>
           <w:numId w:val="4"/>
@@ -998,7 +966,7 @@
     </w:p>
     <w:p>
       <w:pPr>
-        <w:pStyle w:val="ListParagraph"/>
+        <w:pStyle w:val="Paragraphedeliste"/>
         <w:numPr>
           <w:ilvl w:val="0"/>
           <w:numId w:val="4"/>
@@ -1010,7 +978,7 @@
     </w:p>
     <w:p>
       <w:pPr>
-        <w:pStyle w:val="ListParagraph"/>
+        <w:pStyle w:val="Paragraphedeliste"/>
         <w:numPr>
           <w:ilvl w:val="0"/>
           <w:numId w:val="4"/>
@@ -1022,7 +990,7 @@
     </w:p>
     <w:p>
       <w:pPr>
-        <w:pStyle w:val="ListParagraph"/>
+        <w:pStyle w:val="Paragraphedeliste"/>
         <w:numPr>
           <w:ilvl w:val="0"/>
           <w:numId w:val="4"/>
@@ -1047,26 +1015,12 @@
         <w:rPr>
           <w:lang w:val="en-US"/>
         </w:rPr>
-        <w:t xml:space="preserve"> repository </w:t>
-      </w:r>
-      <w:proofErr w:type="spellStart"/>
-      <w:r>
-        <w:rPr>
-          <w:lang w:val="en-US"/>
-        </w:rPr>
-        <w:t>Github</w:t>
-      </w:r>
-      <w:proofErr w:type="spellEnd"/>
-      <w:r>
-        <w:rPr>
-          <w:lang w:val="en-US"/>
-        </w:rPr>
-        <w:t xml:space="preserve"> (release, issues)</w:t>
-      </w:r>
-    </w:p>
-    <w:p>
-      <w:pPr>
-        <w:pStyle w:val="ListParagraph"/>
+        <w:t xml:space="preserve"> repository Github (release, issues)</w:t>
+      </w:r>
+    </w:p>
+    <w:p>
+      <w:pPr>
+        <w:pStyle w:val="Paragraphedeliste"/>
         <w:numPr>
           <w:ilvl w:val="0"/>
           <w:numId w:val="4"/>
@@ -1084,7 +1038,7 @@
     </w:p>
     <w:p>
       <w:pPr>
-        <w:pStyle w:val="Heading2"/>
+        <w:pStyle w:val="Titre2"/>
       </w:pPr>
       <w:bookmarkStart w:id="4" w:name="_Toc243513766"/>
       <w:r>
@@ -1093,64 +1047,18 @@
       <w:bookmarkEnd w:id="4"/>
     </w:p>
     <w:p>
-      <w:r>
-        <w:t xml:space="preserve">La totalité des US n’ont pas pu être terminé. Voici la liste des US non-terminé : </w:t>
-      </w:r>
-    </w:p>
-    <w:p>
-      <w:hyperlink r:id="rId9" w:history="1">
-        <w:r>
-          <w:rPr>
-            <w:rStyle w:val="Hyperlink"/>
-          </w:rPr>
-          <w:t xml:space="preserve">Projet </w:t>
-        </w:r>
-        <w:proofErr w:type="spellStart"/>
-        <w:r>
-          <w:rPr>
-            <w:rStyle w:val="Hyperlink"/>
-          </w:rPr>
-          <w:t>Github</w:t>
-        </w:r>
-        <w:proofErr w:type="spellEnd"/>
-      </w:hyperlink>
-    </w:p>
-    <w:p>
-      <w:pPr>
-        <w:rPr>
-          <w:b/>
-          <w:bCs/>
-          <w:u w:val="single"/>
-        </w:rPr>
-      </w:pPr>
-      <w:r>
-        <w:rPr>
-          <w:b/>
-          <w:bCs/>
-          <w:u w:val="single"/>
-        </w:rPr>
-        <w:t xml:space="preserve">#1 — En </w:t>
-      </w:r>
-      <w:proofErr w:type="spellStart"/>
-      <w:r>
-        <w:rPr>
-          <w:b/>
-          <w:bCs/>
-          <w:u w:val="single"/>
-        </w:rPr>
-        <w:t>temps</w:t>
-      </w:r>
-      <w:proofErr w:type="spellEnd"/>
-      <w:r>
-        <w:rPr>
-          <w:b/>
-          <w:bCs/>
-          <w:u w:val="single"/>
-        </w:rPr>
-        <w:t xml:space="preserve"> que joueur, je souhaite pouvoir utiliser les touches WASD afin de pouvoir faire bouger mon joueur dans chaque direction.</w:t>
-      </w:r>
-    </w:p>
-    <w:p/>
+      <w:pPr>
+        <w:pStyle w:val="Titre3"/>
+      </w:pPr>
+      <w:r>
+        <w:t>#1 — pouvoir faire bouger mon joueur avec WASD</w:t>
+      </w:r>
+    </w:p>
+    <w:p>
+      <w:r>
+        <w:t>En tant que joueur, je veut pouvoir utiliser les touches WASD afin de pouvoir faire bouger mon joueur dans chaque direction.</w:t>
+      </w:r>
+    </w:p>
     <w:p>
       <w:r>
         <w:rPr>
@@ -1175,7 +1083,7 @@
                     </pic:cNvPicPr>
                   </pic:nvPicPr>
                   <pic:blipFill>
-                    <a:blip r:embed="rId10"/>
+                    <a:blip r:embed="rId9"/>
                     <a:srcRect/>
                     <a:stretch>
                       <a:fillRect/>
@@ -1198,6 +1106,12 @@
       </w:r>
     </w:p>
     <w:p>
+      <w:pPr>
+        <w:rPr>
+          <w:b/>
+          <w:bCs/>
+        </w:rPr>
+      </w:pPr>
       <w:r>
         <w:rPr>
           <w:b/>
@@ -1207,111 +1121,59 @@
       </w:r>
     </w:p>
     <w:p>
-      <w:r>
-        <w:t xml:space="preserve">• Le joueur va dans la direction correspondante temps que je </w:t>
-      </w:r>
-      <w:proofErr w:type="spellStart"/>
-      <w:proofErr w:type="gramStart"/>
-      <w:r>
-        <w:t>maintient</w:t>
-      </w:r>
-      <w:proofErr w:type="spellEnd"/>
-      <w:proofErr w:type="gramEnd"/>
-      <w:r>
-        <w:t xml:space="preserve"> la touche</w:t>
-      </w:r>
-    </w:p>
-    <w:p>
+      <w:pPr>
+        <w:ind w:left="708"/>
+      </w:pPr>
+      <w:r>
+        <w:t>• Le joueur va dans la direction correspondante tant que je maintient la touche</w:t>
+      </w:r>
+    </w:p>
+    <w:p>
+      <w:pPr>
+        <w:ind w:left="708"/>
+      </w:pPr>
       <w:r>
         <w:t>• Le joueur arrête d'avancer dès le moment ou le joueur arrête d'appuyer sur la touche</w:t>
       </w:r>
     </w:p>
     <w:p>
-      <w:r>
-        <w:t xml:space="preserve">• Le joueur s'arrête </w:t>
-      </w:r>
-      <w:proofErr w:type="gramStart"/>
-      <w:r>
-        <w:t>lorsque il</w:t>
-      </w:r>
-      <w:proofErr w:type="gramEnd"/>
-      <w:r>
-        <w:t xml:space="preserve"> essaie d'aller dans les obstacles</w:t>
+      <w:pPr>
+        <w:ind w:left="708"/>
+      </w:pPr>
+      <w:r>
+        <w:t>• Le joueur s'arrête lorsque il essaie d'aller dans les obstacles</w:t>
+      </w:r>
+    </w:p>
+    <w:p>
+      <w:pPr>
+        <w:ind w:left="708"/>
+      </w:pPr>
+      <w:r>
+        <w:t>• Le joueur s'arrête lorsqu'il arrive au bord de l'écran</w:t>
+      </w:r>
+    </w:p>
+    <w:p>
+      <w:pPr>
+        <w:ind w:left="708"/>
+      </w:pPr>
+      <w:r>
+        <w:t>• Si j'appuie sur deux touches, le joueurs va en diagonal</w:t>
       </w:r>
     </w:p>
     <w:p/>
     <w:p>
       <w:pPr>
-        <w:rPr>
-          <w:b/>
-          <w:bCs/>
-          <w:u w:val="single"/>
-        </w:rPr>
-      </w:pPr>
-      <w:r>
-        <w:rPr>
-          <w:b/>
-          <w:bCs/>
-          <w:u w:val="single"/>
-        </w:rPr>
-        <w:t xml:space="preserve">#2 — En </w:t>
-      </w:r>
-      <w:proofErr w:type="spellStart"/>
-      <w:r>
-        <w:rPr>
-          <w:b/>
-          <w:bCs/>
-          <w:u w:val="single"/>
-        </w:rPr>
-        <w:t>temps</w:t>
-      </w:r>
-      <w:proofErr w:type="spellEnd"/>
-      <w:r>
-        <w:rPr>
-          <w:b/>
-          <w:bCs/>
-          <w:u w:val="single"/>
-        </w:rPr>
-        <w:t xml:space="preserve"> que joueur, je souhaite pouvoir utiliser la touche clic gauche afin de pouvoir tirer </w:t>
-      </w:r>
-      <w:proofErr w:type="gramStart"/>
-      <w:r>
-        <w:rPr>
-          <w:b/>
-          <w:bCs/>
-          <w:u w:val="single"/>
-        </w:rPr>
-        <w:t>des projectile</w:t>
-      </w:r>
-      <w:proofErr w:type="gramEnd"/>
-      <w:r>
-        <w:rPr>
-          <w:b/>
-          <w:bCs/>
-          <w:u w:val="single"/>
-        </w:rPr>
-        <w:t xml:space="preserve"> sur mes </w:t>
-      </w:r>
-      <w:proofErr w:type="spellStart"/>
-      <w:r>
-        <w:rPr>
-          <w:b/>
-          <w:bCs/>
-          <w:u w:val="single"/>
-        </w:rPr>
-        <w:t>enemies</w:t>
-      </w:r>
-      <w:proofErr w:type="spellEnd"/>
-      <w:r>
-        <w:rPr>
-          <w:b/>
-          <w:bCs/>
-          <w:u w:val="single"/>
-        </w:rPr>
-        <w:t>.</w:t>
-      </w:r>
-    </w:p>
-    <w:p/>
+        <w:pStyle w:val="Titre3"/>
+      </w:pPr>
+      <w:r>
+        <w:t>#2 — pouvoir tirer des projectile sur mes enemies.</w:t>
+      </w:r>
+    </w:p>
+    <w:p>
+      <w:r>
+        <w:t>En tant que joueur, je souhaite pouvoir utiliser la touche clic gauche afin de pouvoir tirer des projectile sur mes enemies.</w:t>
+      </w:r>
+    </w:p>
     <w:p>
       <w:r>
         <w:rPr>
@@ -1322,6 +1184,99 @@
             <wp:extent cx="2419350" cy="1914525"/>
             <wp:effectExtent l="0" t="0" r="0" b="0"/>
             <wp:docPr id="2030904792" name="Image 2030904792"/>
+            <wp:cNvGraphicFramePr>
+              <a:graphicFrameLocks xmlns:a="http://schemas.openxmlformats.org/drawingml/2006/main" noChangeAspect="1"/>
+            </wp:cNvGraphicFramePr>
+            <a:graphic xmlns:a="http://schemas.openxmlformats.org/drawingml/2006/main">
+              <a:graphicData uri="http://schemas.openxmlformats.org/drawingml/2006/picture">
+                <pic:pic xmlns:pic="http://schemas.openxmlformats.org/drawingml/2006/picture">
+                  <pic:nvPicPr>
+                    <pic:cNvPr id="0" name=""/>
+                    <pic:cNvPicPr>
+                      <a:picLocks noChangeAspect="1" noChangeArrowheads="1"/>
+                    </pic:cNvPicPr>
+                  </pic:nvPicPr>
+                  <pic:blipFill>
+                    <a:blip r:embed="rId10"/>
+                    <a:srcRect/>
+                    <a:stretch>
+                      <a:fillRect/>
+                    </a:stretch>
+                  </pic:blipFill>
+                  <pic:spPr bwMode="auto">
+                    <a:xfrm>
+                      <a:off x="0" y="0"/>
+                      <a:ext cx="2419350" cy="1914525"/>
+                    </a:xfrm>
+                    <a:prstGeom prst="rect">
+                      <a:avLst/>
+                    </a:prstGeom>
+                  </pic:spPr>
+                </pic:pic>
+              </a:graphicData>
+            </a:graphic>
+          </wp:inline>
+        </w:drawing>
+      </w:r>
+    </w:p>
+    <w:p>
+      <w:r>
+        <w:rPr>
+          <w:b/>
+          <w:bCs/>
+        </w:rPr>
+        <w:t>Critère d'acceptation :</w:t>
+      </w:r>
+    </w:p>
+    <w:p>
+      <w:pPr>
+        <w:ind w:left="708"/>
+      </w:pPr>
+      <w:r>
+        <w:t>• Lorsque je fais clic gauche, un projectile burger pars en direction de ma souris.</w:t>
+      </w:r>
+    </w:p>
+    <w:p>
+      <w:pPr>
+        <w:ind w:left="708"/>
+      </w:pPr>
+      <w:r>
+        <w:lastRenderedPageBreak/>
+        <w:t>• Le projectile est détruit si il rencontre le bord de la carte</w:t>
+      </w:r>
+    </w:p>
+    <w:p>
+      <w:pPr>
+        <w:ind w:left="708"/>
+      </w:pPr>
+      <w:r>
+        <w:t>• Le projectile à un cooldown de 1sec après avoir été tiré.</w:t>
+      </w:r>
+    </w:p>
+    <w:p/>
+    <w:p>
+      <w:pPr>
+        <w:pStyle w:val="Titre3"/>
+      </w:pPr>
+      <w:r>
+        <w:t>#3 — pouvoir faire des dégâts de corp à corp.</w:t>
+      </w:r>
+    </w:p>
+    <w:p>
+      <w:r>
+        <w:t>En tant que joueur, je souhaite pouvoir utiliser la touche clic gauche afin de pouvoir tirer des projectile sur mes enemies.</w:t>
+      </w:r>
+    </w:p>
+    <w:p>
+      <w:r>
+        <w:rPr>
+          <w:noProof/>
+        </w:rPr>
+        <w:drawing>
+          <wp:inline distT="0" distB="0" distL="0" distR="0" wp14:anchorId="1DB0AFCC" wp14:editId="416C74F0">
+            <wp:extent cx="3016003" cy="2406770"/>
+            <wp:effectExtent l="0" t="0" r="0" b="0"/>
+            <wp:docPr id="779546724" name="Image 779546724"/>
             <wp:cNvGraphicFramePr>
               <a:graphicFrameLocks xmlns:a="http://schemas.openxmlformats.org/drawingml/2006/main" noChangeAspect="1"/>
             </wp:cNvGraphicFramePr>
@@ -1344,7 +1299,7 @@
                   <pic:spPr bwMode="auto">
                     <a:xfrm>
                       <a:off x="0" y="0"/>
-                      <a:ext cx="2419350" cy="1914525"/>
+                      <a:ext cx="3022793" cy="2412188"/>
                     </a:xfrm>
                     <a:prstGeom prst="rect">
                       <a:avLst/>
@@ -1357,8 +1312,6 @@
         </w:drawing>
       </w:r>
     </w:p>
-    <w:p/>
-    <w:p/>
     <w:p>
       <w:r>
         <w:rPr>
@@ -1369,94 +1322,54 @@
       </w:r>
     </w:p>
     <w:p>
+      <w:pPr>
+        <w:ind w:left="708"/>
+      </w:pPr>
       <w:r>
         <w:t>• Lorsque je fais clic gauche, un projectile burger pars en direction de ma souris.</w:t>
       </w:r>
     </w:p>
     <w:p>
-      <w:r>
-        <w:t xml:space="preserve">• Le projectile est détruit </w:t>
-      </w:r>
-      <w:proofErr w:type="gramStart"/>
-      <w:r>
-        <w:t>si il</w:t>
-      </w:r>
-      <w:proofErr w:type="gramEnd"/>
-      <w:r>
-        <w:t xml:space="preserve"> rencontre un obstacle ou </w:t>
-      </w:r>
-      <w:proofErr w:type="gramStart"/>
-      <w:r>
-        <w:t>un ennemie</w:t>
-      </w:r>
-      <w:proofErr w:type="gramEnd"/>
-    </w:p>
-    <w:p>
-      <w:r>
-        <w:lastRenderedPageBreak/>
-        <w:t>• Le projectile fait baisser les points de vie de mes ennemies de 2 points</w:t>
-      </w:r>
-    </w:p>
-    <w:p>
-      <w:r>
-        <w:t xml:space="preserve">• Le projectile à un </w:t>
-      </w:r>
-      <w:proofErr w:type="spellStart"/>
-      <w:r>
-        <w:t>cooldown</w:t>
-      </w:r>
-      <w:proofErr w:type="spellEnd"/>
-      <w:r>
-        <w:t xml:space="preserve"> de 1sec après avoir été tiré.</w:t>
+      <w:pPr>
+        <w:ind w:left="708"/>
+      </w:pPr>
+      <w:r>
+        <w:t>• Le projectile est détruit si il rencontre le bord de la carte</w:t>
+      </w:r>
+    </w:p>
+    <w:p>
+      <w:pPr>
+        <w:ind w:left="708"/>
+      </w:pPr>
+      <w:r>
+        <w:t>• Le projectile à un cooldown de 1sec après avoir été tiré.</w:t>
       </w:r>
     </w:p>
     <w:p/>
     <w:p>
       <w:pPr>
-        <w:rPr>
-          <w:b/>
-          <w:bCs/>
-          <w:u w:val="single"/>
-        </w:rPr>
-      </w:pPr>
-      <w:r>
-        <w:rPr>
-          <w:b/>
-          <w:bCs/>
-          <w:u w:val="single"/>
-        </w:rPr>
-        <w:t xml:space="preserve">#3 — En </w:t>
-      </w:r>
-      <w:proofErr w:type="spellStart"/>
-      <w:r>
-        <w:rPr>
-          <w:b/>
-          <w:bCs/>
-          <w:u w:val="single"/>
-        </w:rPr>
-        <w:t>temps</w:t>
-      </w:r>
-      <w:proofErr w:type="spellEnd"/>
-      <w:r>
-        <w:rPr>
-          <w:b/>
-          <w:bCs/>
-          <w:u w:val="single"/>
-        </w:rPr>
-        <w:t xml:space="preserve"> que joueur, je souhaite pouvoir utiliser la touche clic droit afin de pouvoir faire des dégâts de corp à corp.</w:t>
-      </w:r>
-    </w:p>
-    <w:p/>
+        <w:pStyle w:val="Titre3"/>
+      </w:pPr>
+      <w:r>
+        <w:t>#4 — En temps que joueur je souhaite avoir des ennemis de type manager afin de pouvoir gagner de l'argent</w:t>
+      </w:r>
+    </w:p>
+    <w:p>
+      <w:r>
+        <w:t>En tant que joueur je souhaite veut des ennemis de type manager afin de pouvoir gagner de l'argent</w:t>
+      </w:r>
+    </w:p>
     <w:p>
       <w:r>
         <w:rPr>
           <w:noProof/>
         </w:rPr>
+        <w:lastRenderedPageBreak/>
         <w:drawing>
-          <wp:inline distT="0" distB="0" distL="0" distR="0" wp14:anchorId="1DB0AFCC" wp14:editId="416C74F0">
-            <wp:extent cx="3016003" cy="2406770"/>
-            <wp:effectExtent l="0" t="0" r="0" b="0"/>
-            <wp:docPr id="779546724" name="Image 779546724"/>
+          <wp:inline distT="0" distB="0" distL="0" distR="0" wp14:anchorId="3D106A19" wp14:editId="6DD9E619">
+            <wp:extent cx="2016266" cy="2182483"/>
+            <wp:effectExtent l="0" t="0" r="3175" b="8890"/>
+            <wp:docPr id="1323060754" name="Image 1323060754"/>
             <wp:cNvGraphicFramePr>
               <a:graphicFrameLocks xmlns:a="http://schemas.openxmlformats.org/drawingml/2006/main" noChangeAspect="1"/>
             </wp:cNvGraphicFramePr>
@@ -1479,7 +1392,7 @@
                   <pic:spPr bwMode="auto">
                     <a:xfrm>
                       <a:off x="0" y="0"/>
-                      <a:ext cx="3022793" cy="2412188"/>
+                      <a:ext cx="2026954" cy="2194052"/>
                     </a:xfrm>
                     <a:prstGeom prst="rect">
                       <a:avLst/>
@@ -1494,73 +1407,119 @@
     </w:p>
     <w:p>
       <w:r>
-        <w:t>• Lorsque je fais clic droit, une attaque corp à corp est lancé</w:t>
-      </w:r>
-    </w:p>
-    <w:p>
-      <w:r>
-        <w:t>• Tous les ennemis dans un rayons égal à la moitié de la largeur de mon personnage prennent 3pts de dégâts</w:t>
-      </w:r>
-    </w:p>
-    <w:p>
-      <w:r>
-        <w:t xml:space="preserve">• L'attaque de corp à corp à un </w:t>
-      </w:r>
-      <w:proofErr w:type="spellStart"/>
-      <w:r>
-        <w:t>cooldown</w:t>
-      </w:r>
-      <w:proofErr w:type="spellEnd"/>
-      <w:r>
-        <w:t xml:space="preserve"> de 0.2s après avoir été lancé</w:t>
-      </w:r>
-    </w:p>
-    <w:p/>
-    <w:p>
-      <w:pPr>
         <w:rPr>
           <w:b/>
           <w:bCs/>
-          <w:u w:val="single"/>
         </w:rPr>
-      </w:pPr>
-      <w:r>
-        <w:rPr>
-          <w:b/>
-          <w:bCs/>
-          <w:u w:val="single"/>
-        </w:rPr>
-        <w:t xml:space="preserve">#4 — En </w:t>
-      </w:r>
-      <w:proofErr w:type="spellStart"/>
-      <w:r>
-        <w:rPr>
-          <w:b/>
-          <w:bCs/>
-          <w:u w:val="single"/>
-        </w:rPr>
-        <w:t>temps</w:t>
-      </w:r>
-      <w:proofErr w:type="spellEnd"/>
-      <w:r>
-        <w:rPr>
-          <w:b/>
-          <w:bCs/>
-          <w:u w:val="single"/>
-        </w:rPr>
-        <w:t xml:space="preserve"> que joueur je souhaite avoir des ennemis de type manager afin de pouvoir gagner de l'argent</w:t>
-      </w:r>
-    </w:p>
+        <w:t>Critère d'acceptation</w:t>
+      </w:r>
+    </w:p>
+    <w:p>
+      <w:pPr>
+        <w:ind w:left="708"/>
+      </w:pPr>
+      <w:r>
+        <w:t>• Un manager doit pouvoir se deplacer aléatoirement sur la carte</w:t>
+      </w:r>
+    </w:p>
+    <w:p>
+      <w:pPr>
+        <w:ind w:left="708"/>
+      </w:pPr>
+      <w:r>
+        <w:t>• Un manager ne peut pas dépasser les limites de la carte</w:t>
+      </w:r>
+    </w:p>
+    <w:p>
+      <w:pPr>
+        <w:ind w:left="708"/>
+      </w:pPr>
+      <w:r>
+        <w:t>• Un manager possède 13 PV</w:t>
+      </w:r>
+    </w:p>
+    <w:p>
+      <w:pPr>
+        <w:ind w:left="708"/>
+      </w:pPr>
+      <w:r>
+        <w:t>• Les missiles burger disparaissent si ils touchent un manager</w:t>
+      </w:r>
+    </w:p>
+    <w:p>
+      <w:pPr>
+        <w:ind w:left="708"/>
+      </w:pPr>
+      <w:r>
+        <w:t>• Un manager prend 3PV de dégat quand touché par une attaque de corp à corp</w:t>
+      </w:r>
+    </w:p>
+    <w:p>
+      <w:pPr>
+        <w:ind w:left="708"/>
+      </w:pPr>
+      <w:r>
+        <w:t>• Un manager dans un rayons égal à la moitié de la largeur du joueur lors d'une attaque de mélée sera affécté</w:t>
+      </w:r>
+    </w:p>
+    <w:p>
+      <w:pPr>
+        <w:ind w:left="708"/>
+      </w:pPr>
+      <w:r>
+        <w:t>• Un manager prend 5PV de dégat quand touché par une attaque burger</w:t>
+      </w:r>
+    </w:p>
+    <w:p>
+      <w:pPr>
+        <w:ind w:left="708"/>
+      </w:pPr>
+      <w:r>
+        <w:t>• Un manager disparait lorsque ces points de vie sont inférieur ou égal à 0</w:t>
+      </w:r>
+    </w:p>
+    <w:p>
+      <w:pPr>
+        <w:ind w:left="708"/>
+      </w:pPr>
+      <w:r>
+        <w:t>• Les manager apparaissent sur les coté de la carte</w:t>
+      </w:r>
+    </w:p>
+    <w:p>
+      <w:pPr>
+        <w:ind w:left="708"/>
+      </w:pPr>
+      <w:r>
+        <w:t>• Il doit toujours y avoir 7 manager sur la carte</w:t>
+      </w:r>
+    </w:p>
+    <w:p/>
+    <w:p>
+      <w:pPr>
+        <w:pStyle w:val="Titre3"/>
+      </w:pPr>
+      <w:r>
+        <w:t>#5 — avoir des ennemis de type robot</w:t>
+      </w:r>
+    </w:p>
+    <w:p>
+      <w:r>
+        <w:t>En temps que joueur je souhaite avoir des ennemis de type robot afin de pouvoir gagner de l'argent</w:t>
+      </w:r>
+    </w:p>
+    <w:p/>
     <w:p>
       <w:r>
         <w:rPr>
           <w:noProof/>
         </w:rPr>
+        <w:lastRenderedPageBreak/>
         <w:drawing>
-          <wp:inline distT="0" distB="0" distL="0" distR="0" wp14:anchorId="3D106A19" wp14:editId="6DD9E619">
-            <wp:extent cx="2016266" cy="2182483"/>
-            <wp:effectExtent l="0" t="0" r="3175" b="8890"/>
-            <wp:docPr id="1323060754" name="Image 1323060754"/>
+          <wp:inline distT="0" distB="0" distL="0" distR="0" wp14:anchorId="1406E5CB" wp14:editId="67AA54B7">
+            <wp:extent cx="2333625" cy="1476375"/>
+            <wp:effectExtent l="0" t="0" r="0" b="0"/>
+            <wp:docPr id="1548205560" name="Image 1548205560"/>
             <wp:cNvGraphicFramePr>
               <a:graphicFrameLocks xmlns:a="http://schemas.openxmlformats.org/drawingml/2006/main" noChangeAspect="1"/>
             </wp:cNvGraphicFramePr>
@@ -1583,7 +1542,7 @@
                   <pic:spPr bwMode="auto">
                     <a:xfrm>
                       <a:off x="0" y="0"/>
-                      <a:ext cx="2026954" cy="2194052"/>
+                      <a:ext cx="2333625" cy="1476375"/>
                     </a:xfrm>
                     <a:prstGeom prst="rect">
                       <a:avLst/>
@@ -1605,118 +1564,616 @@
         <w:t>Critère d'acceptation</w:t>
       </w:r>
     </w:p>
-    <w:p/>
-    <w:p>
-      <w:r>
-        <w:t xml:space="preserve">• Un manager doit pouvoir se </w:t>
-      </w:r>
-      <w:proofErr w:type="spellStart"/>
-      <w:r>
-        <w:t>deplacer</w:t>
-      </w:r>
-      <w:proofErr w:type="spellEnd"/>
-      <w:r>
-        <w:t xml:space="preserve"> aléatoirement sur la carte</w:t>
-      </w:r>
-    </w:p>
-    <w:p>
-      <w:r>
-        <w:t xml:space="preserve">• Un manager </w:t>
-      </w:r>
-      <w:proofErr w:type="gramStart"/>
-      <w:r>
-        <w:t>doit  trouver</w:t>
-      </w:r>
-      <w:proofErr w:type="gramEnd"/>
-      <w:r>
-        <w:t xml:space="preserve"> une nouvelle destination </w:t>
-      </w:r>
-      <w:proofErr w:type="gramStart"/>
-      <w:r>
-        <w:t>si il</w:t>
-      </w:r>
-      <w:proofErr w:type="gramEnd"/>
-      <w:r>
-        <w:t xml:space="preserve"> bute sur un obstacle</w:t>
-      </w:r>
-    </w:p>
-    <w:p>
-      <w:r>
-        <w:t xml:space="preserve">• Un manager doit pouvoir lancer </w:t>
-      </w:r>
-      <w:proofErr w:type="gramStart"/>
-      <w:r>
-        <w:t>des projectile</w:t>
-      </w:r>
-      <w:proofErr w:type="gramEnd"/>
-      <w:r>
-        <w:t xml:space="preserve"> de type sac d'argent.</w:t>
-      </w:r>
-    </w:p>
-    <w:p>
-      <w:r>
-        <w:t xml:space="preserve">• Un manager </w:t>
-      </w:r>
-      <w:proofErr w:type="gramStart"/>
-      <w:r>
-        <w:t>prends</w:t>
-      </w:r>
-      <w:proofErr w:type="gramEnd"/>
-      <w:r>
-        <w:t xml:space="preserve"> 4 </w:t>
-      </w:r>
-      <w:proofErr w:type="gramStart"/>
-      <w:r>
-        <w:t>sec</w:t>
-      </w:r>
-      <w:proofErr w:type="gramEnd"/>
-      <w:r>
-        <w:t xml:space="preserve"> à recharger.</w:t>
-      </w:r>
-    </w:p>
-    <w:p>
-      <w:r>
-        <w:t>• Un manager possède 13 PV</w:t>
-      </w:r>
-    </w:p>
-    <w:p>
-      <w:r>
-        <w:t xml:space="preserve">• </w:t>
-      </w:r>
-      <w:proofErr w:type="gramStart"/>
-      <w:r>
-        <w:t>Lorsque un</w:t>
-      </w:r>
-      <w:proofErr w:type="gramEnd"/>
-      <w:r>
-        <w:t xml:space="preserve"> manager meurt, le nombre d'argent du joueur </w:t>
-      </w:r>
-      <w:proofErr w:type="spellStart"/>
-      <w:r>
-        <w:t>augment</w:t>
-      </w:r>
-      <w:proofErr w:type="spellEnd"/>
-      <w:r>
-        <w:t xml:space="preserve"> de 5'000$</w:t>
-      </w:r>
-    </w:p>
-    <w:p>
-      <w:r>
-        <w:t xml:space="preserve">• L'argent que fait tomber le manager est quadruplé et ses PV sont doublé quand le joueur atteint 100'000$. </w:t>
-      </w:r>
-      <w:proofErr w:type="gramStart"/>
-      <w:r>
-        <w:t>Il le sont</w:t>
-      </w:r>
-      <w:proofErr w:type="gramEnd"/>
-      <w:r>
-        <w:t xml:space="preserve"> à nouveaux quand il atteint 500'000$</w:t>
-      </w:r>
-    </w:p>
-    <w:p/>
-    <w:p>
-      <w:pPr>
-        <w:pStyle w:val="Heading2"/>
+    <w:p>
+      <w:pPr>
+        <w:ind w:left="708"/>
+      </w:pPr>
+      <w:r>
+        <w:t>• Un robot se déplace sur la carte en essayant de toujours se positionner directement au dessus/dessous/à droite/ à gauche du joueur</w:t>
+      </w:r>
+    </w:p>
+    <w:p>
+      <w:pPr>
+        <w:ind w:left="708"/>
+      </w:pPr>
+      <w:r>
+        <w:t>• Un robot possède 21 PV</w:t>
+      </w:r>
+    </w:p>
+    <w:p>
+      <w:pPr>
+        <w:ind w:left="708"/>
+      </w:pPr>
+      <w:r>
+        <w:t>• Un robot de fais pas tomber d'argent</w:t>
+      </w:r>
+    </w:p>
+    <w:p>
+      <w:pPr>
+        <w:ind w:left="708"/>
+      </w:pPr>
+      <w:r>
+        <w:t>• Les robots ne commence à apparaitre que quand le joueur atteint 100'00$ (niveau 2) et leurs PV double quand il atteint 500'00$ (niveau 3).</w:t>
+      </w:r>
+    </w:p>
+    <w:p>
+      <w:pPr>
+        <w:ind w:left="708"/>
+      </w:pPr>
+      <w:r>
+        <w:t>• Les missiles burger disparaissent si ils touchent un robot</w:t>
+      </w:r>
+    </w:p>
+    <w:p>
+      <w:pPr>
+        <w:ind w:left="708"/>
+      </w:pPr>
+      <w:r>
+        <w:t>• Un robot prend 3PV de dégat quand touché par une attaque de corp à corp</w:t>
+      </w:r>
+    </w:p>
+    <w:p>
+      <w:pPr>
+        <w:ind w:left="708"/>
+      </w:pPr>
+      <w:r>
+        <w:t>• Un robot dans un rayons égal à la moitié de la largeur du joueur lors d'une attaque de mélée sera affécté</w:t>
+      </w:r>
+    </w:p>
+    <w:p>
+      <w:pPr>
+        <w:ind w:left="708"/>
+      </w:pPr>
+      <w:r>
+        <w:t>• Un robot prend 5PV de dégat quand touché par une attaque burger</w:t>
+      </w:r>
+    </w:p>
+    <w:p>
+      <w:pPr>
+        <w:ind w:left="708"/>
+      </w:pPr>
+      <w:r>
+        <w:t>• Un robot disparait lorsque ces points de vie sont inférieur ou égal à 0</w:t>
+      </w:r>
+    </w:p>
+    <w:p>
+      <w:pPr>
+        <w:ind w:left="708"/>
+      </w:pPr>
+      <w:r>
+        <w:t>• Dès que le joueur atteint le niveau 2, il doit toujours y avoir 4 robot sur la carte</w:t>
+      </w:r>
+    </w:p>
+    <w:p>
+      <w:pPr>
+        <w:pStyle w:val="Titre3"/>
+      </w:pPr>
+      <w:r>
+        <w:t>#6 — les ennemis de type robot peuvent me tirer dessus</w:t>
+      </w:r>
+    </w:p>
+    <w:p>
+      <w:r>
+        <w:t>En tant que joueur je souhaite que les ennemis de type robot puisse me tirer dessus afin d'ajouter du challenge</w:t>
+      </w:r>
+    </w:p>
+    <w:p>
+      <w:r>
+        <w:rPr>
+          <w:noProof/>
+        </w:rPr>
+        <w:drawing>
+          <wp:inline distT="0" distB="0" distL="0" distR="0" wp14:anchorId="6905FE09" wp14:editId="25EF986E">
+            <wp:extent cx="2133600" cy="371475"/>
+            <wp:effectExtent l="0" t="0" r="0" b="0"/>
+            <wp:docPr id="655815184" name="Image 655815184"/>
+            <wp:cNvGraphicFramePr>
+              <a:graphicFrameLocks xmlns:a="http://schemas.openxmlformats.org/drawingml/2006/main" noChangeAspect="1"/>
+            </wp:cNvGraphicFramePr>
+            <a:graphic xmlns:a="http://schemas.openxmlformats.org/drawingml/2006/main">
+              <a:graphicData uri="http://schemas.openxmlformats.org/drawingml/2006/picture">
+                <pic:pic xmlns:pic="http://schemas.openxmlformats.org/drawingml/2006/picture">
+                  <pic:nvPicPr>
+                    <pic:cNvPr id="0" name=""/>
+                    <pic:cNvPicPr>
+                      <a:picLocks noChangeAspect="1" noChangeArrowheads="1"/>
+                    </pic:cNvPicPr>
+                  </pic:nvPicPr>
+                  <pic:blipFill>
+                    <a:blip r:embed="rId14"/>
+                    <a:srcRect/>
+                    <a:stretch>
+                      <a:fillRect/>
+                    </a:stretch>
+                  </pic:blipFill>
+                  <pic:spPr bwMode="auto">
+                    <a:xfrm>
+                      <a:off x="0" y="0"/>
+                      <a:ext cx="2133600" cy="371475"/>
+                    </a:xfrm>
+                    <a:prstGeom prst="rect">
+                      <a:avLst/>
+                    </a:prstGeom>
+                  </pic:spPr>
+                </pic:pic>
+              </a:graphicData>
+            </a:graphic>
+          </wp:inline>
+        </w:drawing>
+      </w:r>
+    </w:p>
+    <w:p>
+      <w:r>
+        <w:rPr>
+          <w:b/>
+          <w:bCs/>
+        </w:rPr>
+        <w:t>Critère d'acceptation</w:t>
+      </w:r>
+    </w:p>
+    <w:p>
+      <w:pPr>
+        <w:ind w:left="708"/>
+      </w:pPr>
+      <w:r>
+        <w:t>• Un faisceau est tiré par un ennemi de type Robot</w:t>
+      </w:r>
+    </w:p>
+    <w:p>
+      <w:pPr>
+        <w:ind w:left="708"/>
+      </w:pPr>
+      <w:r>
+        <w:t>• Les faisceaux ne peuvent aller que dans les quatre direction cardinal (pas de diagonal)</w:t>
+      </w:r>
+    </w:p>
+    <w:p>
+      <w:pPr>
+        <w:ind w:left="708"/>
+      </w:pPr>
+      <w:r>
+        <w:t>• Les faisceaux vont dans la direction que le joueur avait quand le robot à commencer son animation de tire.</w:t>
+      </w:r>
+    </w:p>
+    <w:p>
+      <w:pPr>
+        <w:ind w:left="708"/>
+      </w:pPr>
+      <w:r>
+        <w:lastRenderedPageBreak/>
+        <w:t>• Les faisceaux font 25PV de dégats au joueur peut importe le niveau du robot qui les a tiré.</w:t>
+      </w:r>
+    </w:p>
+    <w:p>
+      <w:pPr>
+        <w:ind w:left="708"/>
+      </w:pPr>
+      <w:r>
+        <w:t>• Les faisceaux disparaissent si ils touchent un obstacle.</w:t>
+      </w:r>
+    </w:p>
+    <w:p>
+      <w:pPr>
+        <w:ind w:left="708"/>
+      </w:pPr>
+      <w:r>
+        <w:t>• Un robot prends 3 sec à lancer une attaque faisceau lorsqu'il est en position. Il ne peut plus bouger pendant cette période</w:t>
+      </w:r>
+    </w:p>
+    <w:p>
+      <w:pPr>
+        <w:pStyle w:val="Titre3"/>
+      </w:pPr>
+      <w:r>
+        <w:t>#7 — les ennemis de type manager peuvent me tirer dessus</w:t>
+      </w:r>
+    </w:p>
+    <w:p>
+      <w:r>
+        <w:t>En tant que joueur je veut que les ennemis de type manager puisse me tirer dessus afin d'ajouter du challenge</w:t>
+      </w:r>
+    </w:p>
+    <w:p>
+      <w:r>
+        <w:rPr>
+          <w:noProof/>
+        </w:rPr>
+        <w:drawing>
+          <wp:inline distT="0" distB="0" distL="0" distR="0" wp14:anchorId="00239742" wp14:editId="706E743F">
+            <wp:extent cx="723900" cy="723900"/>
+            <wp:effectExtent l="0" t="0" r="0" b="0"/>
+            <wp:docPr id="993089475" name="Image 993089475"/>
+            <wp:cNvGraphicFramePr>
+              <a:graphicFrameLocks xmlns:a="http://schemas.openxmlformats.org/drawingml/2006/main" noChangeAspect="1"/>
+            </wp:cNvGraphicFramePr>
+            <a:graphic xmlns:a="http://schemas.openxmlformats.org/drawingml/2006/main">
+              <a:graphicData uri="http://schemas.openxmlformats.org/drawingml/2006/picture">
+                <pic:pic xmlns:pic="http://schemas.openxmlformats.org/drawingml/2006/picture">
+                  <pic:nvPicPr>
+                    <pic:cNvPr id="0" name=""/>
+                    <pic:cNvPicPr>
+                      <a:picLocks noChangeAspect="1" noChangeArrowheads="1"/>
+                    </pic:cNvPicPr>
+                  </pic:nvPicPr>
+                  <pic:blipFill>
+                    <a:blip r:embed="rId15"/>
+                    <a:srcRect/>
+                    <a:stretch>
+                      <a:fillRect/>
+                    </a:stretch>
+                  </pic:blipFill>
+                  <pic:spPr bwMode="auto">
+                    <a:xfrm>
+                      <a:off x="0" y="0"/>
+                      <a:ext cx="723900" cy="723900"/>
+                    </a:xfrm>
+                    <a:prstGeom prst="rect">
+                      <a:avLst/>
+                    </a:prstGeom>
+                  </pic:spPr>
+                </pic:pic>
+              </a:graphicData>
+            </a:graphic>
+          </wp:inline>
+        </w:drawing>
+      </w:r>
+    </w:p>
+    <w:p>
+      <w:r>
+        <w:rPr>
+          <w:b/>
+          <w:bCs/>
+        </w:rPr>
+        <w:t>Critère d'acceptation</w:t>
+      </w:r>
+    </w:p>
+    <w:p>
+      <w:pPr>
+        <w:ind w:left="708"/>
+      </w:pPr>
+      <w:r>
+        <w:t>• Un sac doit être lancé par un ennemi de type manager</w:t>
+      </w:r>
+    </w:p>
+    <w:p>
+      <w:pPr>
+        <w:ind w:left="708"/>
+      </w:pPr>
+      <w:r>
+        <w:t>• Les sacs vont en directions de la position que le joueur avait quand le sacs à été lancé.</w:t>
+      </w:r>
+    </w:p>
+    <w:p>
+      <w:pPr>
+        <w:ind w:left="708"/>
+      </w:pPr>
+      <w:r>
+        <w:t>• Le sacs ne change pas de direction</w:t>
+      </w:r>
+    </w:p>
+    <w:p>
+      <w:pPr>
+        <w:ind w:left="708"/>
+      </w:pPr>
+      <w:r>
+        <w:t>• Le sac fait 10PV de dégat si il à été lancé par un ennemis manager de niveau 1, 15 PV si c'est un manager de niveau 2 et 20PV si c'est un manager de niveau 3.</w:t>
+      </w:r>
+    </w:p>
+    <w:p>
+      <w:pPr>
+        <w:ind w:left="708"/>
+      </w:pPr>
+      <w:r>
+        <w:t>• Un sac doit prendre 4 sec à être recharger par un ennemi de type manager</w:t>
+      </w:r>
+    </w:p>
+    <w:p>
+      <w:pPr>
+        <w:pStyle w:val="Titre3"/>
+      </w:pPr>
+      <w:r>
+        <w:t>#8 — avoir une barre de vie</w:t>
+      </w:r>
+    </w:p>
+    <w:p>
+      <w:r>
+        <w:t>En tant que joueur je souhaite avoir une barre de vie afin de pouvoir perdre la partie</w:t>
+      </w:r>
+    </w:p>
+    <w:p>
+      <w:r>
+        <w:rPr>
+          <w:noProof/>
+        </w:rPr>
+        <w:drawing>
+          <wp:inline distT="0" distB="0" distL="0" distR="0" wp14:anchorId="1F57BB37" wp14:editId="7E5E47CB">
+            <wp:extent cx="3525625" cy="2792295"/>
+            <wp:effectExtent l="0" t="0" r="0" b="8255"/>
+            <wp:docPr id="755883950" name="Image 755883950"/>
+            <wp:cNvGraphicFramePr>
+              <a:graphicFrameLocks xmlns:a="http://schemas.openxmlformats.org/drawingml/2006/main" noChangeAspect="1"/>
+            </wp:cNvGraphicFramePr>
+            <a:graphic xmlns:a="http://schemas.openxmlformats.org/drawingml/2006/main">
+              <a:graphicData uri="http://schemas.openxmlformats.org/drawingml/2006/picture">
+                <pic:pic xmlns:pic="http://schemas.openxmlformats.org/drawingml/2006/picture">
+                  <pic:nvPicPr>
+                    <pic:cNvPr id="0" name=""/>
+                    <pic:cNvPicPr>
+                      <a:picLocks noChangeAspect="1" noChangeArrowheads="1"/>
+                    </pic:cNvPicPr>
+                  </pic:nvPicPr>
+                  <pic:blipFill>
+                    <a:blip r:embed="rId16"/>
+                    <a:srcRect/>
+                    <a:stretch>
+                      <a:fillRect/>
+                    </a:stretch>
+                  </pic:blipFill>
+                  <pic:spPr bwMode="auto">
+                    <a:xfrm>
+                      <a:off x="0" y="0"/>
+                      <a:ext cx="3546533" cy="2808854"/>
+                    </a:xfrm>
+                    <a:prstGeom prst="rect">
+                      <a:avLst/>
+                    </a:prstGeom>
+                  </pic:spPr>
+                </pic:pic>
+              </a:graphicData>
+            </a:graphic>
+          </wp:inline>
+        </w:drawing>
+      </w:r>
+    </w:p>
+    <w:p>
+      <w:r>
+        <w:rPr>
+          <w:b/>
+          <w:bCs/>
+        </w:rPr>
+        <w:lastRenderedPageBreak/>
+        <w:t>Critère d'acceptation</w:t>
+      </w:r>
+    </w:p>
+    <w:p>
+      <w:pPr>
+        <w:ind w:left="708"/>
+      </w:pPr>
+      <w:r>
+        <w:t>• Lorsque le nombre de point de vie atteint 0, l'écran de mort s'affiche</w:t>
+      </w:r>
+    </w:p>
+    <w:p>
+      <w:pPr>
+        <w:ind w:left="708"/>
+      </w:pPr>
+      <w:r>
+        <w:t>• La barre de vie est de 100/100 au démarrage</w:t>
+      </w:r>
+    </w:p>
+    <w:p>
+      <w:pPr>
+        <w:ind w:left="708"/>
+      </w:pPr>
+      <w:r>
+        <w:t>• La barre de vie se situt en bas à gauche</w:t>
+      </w:r>
+    </w:p>
+    <w:p>
+      <w:pPr>
+        <w:pStyle w:val="Titre3"/>
+      </w:pPr>
+      <w:r>
+        <w:t>#9 — avoir une barre d'argent</w:t>
+      </w:r>
+    </w:p>
+    <w:p>
+      <w:r>
+        <w:t>En tant que joueur je souhaite avoir une barre d'argent afin de pouvoir gagner la partie</w:t>
+      </w:r>
+    </w:p>
+    <w:p>
+      <w:r>
+        <w:rPr>
+          <w:noProof/>
+        </w:rPr>
+        <w:drawing>
+          <wp:inline distT="0" distB="0" distL="0" distR="0" wp14:anchorId="5C12AE9B" wp14:editId="53C1698B">
+            <wp:extent cx="4762500" cy="3771900"/>
+            <wp:effectExtent l="0" t="0" r="0" b="0"/>
+            <wp:docPr id="1039864228" name="Image 1039864228"/>
+            <wp:cNvGraphicFramePr>
+              <a:graphicFrameLocks xmlns:a="http://schemas.openxmlformats.org/drawingml/2006/main" noChangeAspect="1"/>
+            </wp:cNvGraphicFramePr>
+            <a:graphic xmlns:a="http://schemas.openxmlformats.org/drawingml/2006/main">
+              <a:graphicData uri="http://schemas.openxmlformats.org/drawingml/2006/picture">
+                <pic:pic xmlns:pic="http://schemas.openxmlformats.org/drawingml/2006/picture">
+                  <pic:nvPicPr>
+                    <pic:cNvPr id="0" name=""/>
+                    <pic:cNvPicPr>
+                      <a:picLocks noChangeAspect="1" noChangeArrowheads="1"/>
+                    </pic:cNvPicPr>
+                  </pic:nvPicPr>
+                  <pic:blipFill>
+                    <a:blip r:embed="rId16"/>
+                    <a:srcRect/>
+                    <a:stretch>
+                      <a:fillRect/>
+                    </a:stretch>
+                  </pic:blipFill>
+                  <pic:spPr bwMode="auto">
+                    <a:xfrm>
+                      <a:off x="0" y="0"/>
+                      <a:ext cx="4762500" cy="3771900"/>
+                    </a:xfrm>
+                    <a:prstGeom prst="rect">
+                      <a:avLst/>
+                    </a:prstGeom>
+                  </pic:spPr>
+                </pic:pic>
+              </a:graphicData>
+            </a:graphic>
+          </wp:inline>
+        </w:drawing>
+      </w:r>
+    </w:p>
+    <w:p>
+      <w:r>
+        <w:rPr>
+          <w:b/>
+          <w:bCs/>
+        </w:rPr>
+        <w:t>Critère d'acceptation</w:t>
+      </w:r>
+    </w:p>
+    <w:p>
+      <w:pPr>
+        <w:ind w:left="708"/>
+      </w:pPr>
+      <w:r>
+        <w:t>• Lorsque la barre d'argent atteint 1'000'000, l'écran de réussite s'affiche.</w:t>
+      </w:r>
+    </w:p>
+    <w:p>
+      <w:pPr>
+        <w:ind w:left="708"/>
+      </w:pPr>
+      <w:r>
+        <w:t>• Lorsque un manager meurt, le nombre d'argent du joueur augment de 5'000$</w:t>
+      </w:r>
+    </w:p>
+    <w:p>
+      <w:pPr>
+        <w:ind w:left="708"/>
+      </w:pPr>
+      <w:r>
+        <w:t>• L'argent que fait tomber le manager est quadruplé et ses PV sont doublé quand le joueur atteint 100'000$ (manager de niveau 2). Il le sont à nouveaux quand il atteint 500'000$ (manager de niveau 3).</w:t>
+      </w:r>
+    </w:p>
+    <w:p>
+      <w:pPr>
+        <w:pStyle w:val="Titre3"/>
+      </w:pPr>
+      <w:r>
+        <w:t>#10 — avoir des obstacles afin de pouvoir me protéger des projectiles ennemies.</w:t>
+      </w:r>
+    </w:p>
+    <w:p>
+      <w:pPr>
+        <w:rPr>
+          <w:noProof/>
+        </w:rPr>
+      </w:pPr>
+      <w:r>
+        <w:t>En tant que joueur je veut avoir des obstacles afin de pouvoir me protéger des projectiles ennemies.</w:t>
+      </w:r>
+    </w:p>
+    <w:p>
+      <w:r>
+        <w:rPr>
+          <w:noProof/>
+        </w:rPr>
+        <w:lastRenderedPageBreak/>
+        <w:drawing>
+          <wp:inline distT="0" distB="0" distL="0" distR="0" wp14:anchorId="72A2447E" wp14:editId="562A8198">
+            <wp:extent cx="904875" cy="1866265"/>
+            <wp:effectExtent l="0" t="0" r="9525" b="635"/>
+            <wp:docPr id="417185230" name="Image 1"/>
+            <wp:cNvGraphicFramePr>
+              <a:graphicFrameLocks xmlns:a="http://schemas.openxmlformats.org/drawingml/2006/main" noChangeAspect="1"/>
+            </wp:cNvGraphicFramePr>
+            <a:graphic xmlns:a="http://schemas.openxmlformats.org/drawingml/2006/main">
+              <a:graphicData uri="http://schemas.openxmlformats.org/drawingml/2006/picture">
+                <pic:pic xmlns:pic="http://schemas.openxmlformats.org/drawingml/2006/picture">
+                  <pic:nvPicPr>
+                    <pic:cNvPr id="0" name="Picture 1"/>
+                    <pic:cNvPicPr>
+                      <a:picLocks noChangeAspect="1" noChangeArrowheads="1"/>
+                    </pic:cNvPicPr>
+                  </pic:nvPicPr>
+                  <pic:blipFill>
+                    <a:blip r:embed="rId17">
+                      <a:extLst>
+                        <a:ext uri="{28A0092B-C50C-407E-A947-70E740481C1C}">
+                          <a14:useLocalDpi xmlns:a14="http://schemas.microsoft.com/office/drawing/2010/main" val="0"/>
+                        </a:ext>
+                      </a:extLst>
+                    </a:blip>
+                    <a:srcRect/>
+                    <a:stretch>
+                      <a:fillRect/>
+                    </a:stretch>
+                  </pic:blipFill>
+                  <pic:spPr bwMode="auto">
+                    <a:xfrm>
+                      <a:off x="0" y="0"/>
+                      <a:ext cx="904875" cy="1866265"/>
+                    </a:xfrm>
+                    <a:prstGeom prst="rect">
+                      <a:avLst/>
+                    </a:prstGeom>
+                    <a:noFill/>
+                    <a:ln>
+                      <a:noFill/>
+                    </a:ln>
+                  </pic:spPr>
+                </pic:pic>
+              </a:graphicData>
+            </a:graphic>
+          </wp:inline>
+        </w:drawing>
+      </w:r>
+    </w:p>
+    <w:p>
+      <w:pPr>
+        <w:rPr>
+          <w:b/>
+          <w:bCs/>
+        </w:rPr>
+      </w:pPr>
+      <w:r>
+        <w:rPr>
+          <w:b/>
+          <w:bCs/>
+        </w:rPr>
+        <w:t>Critère d'acceptation</w:t>
+      </w:r>
+    </w:p>
+    <w:p>
+      <w:pPr>
+        <w:ind w:left="708"/>
+      </w:pPr>
+      <w:r>
+        <w:t>• L'obstacle est indesctuctible</w:t>
+      </w:r>
+    </w:p>
+    <w:p>
+      <w:pPr>
+        <w:ind w:left="708"/>
+      </w:pPr>
+      <w:r>
+        <w:t>• Les ennemis et les projectils ne peuvent pas passer à travers les obstacles</w:t>
+      </w:r>
+    </w:p>
+    <w:p>
+      <w:pPr>
+        <w:ind w:left="708"/>
+      </w:pPr>
+      <w:r>
+        <w:t>• Les missiles burger et les faisceaux disparaissent si ils touchent un obstacle</w:t>
+      </w:r>
+    </w:p>
+    <w:p>
+      <w:pPr>
+        <w:ind w:left="708"/>
+      </w:pPr>
+      <w:r>
+        <w:t>• Un robot ou un manager doit trouver une nouvelle destination si il bute sur un obstacle</w:t>
+      </w:r>
+    </w:p>
+    <w:p>
+      <w:pPr>
+        <w:pStyle w:val="Titre2"/>
       </w:pPr>
       <w:bookmarkStart w:id="5" w:name="_Toc243513767"/>
       <w:r>
@@ -1726,7 +2183,7 @@
     </w:p>
     <w:tbl>
       <w:tblPr>
-        <w:tblStyle w:val="TableGrid"/>
+        <w:tblStyle w:val="Grilledutableau"/>
         <w:tblW w:w="0" w:type="auto"/>
         <w:tblLook w:val="04A0" w:firstRow="1" w:lastRow="0" w:firstColumn="1" w:lastColumn="0" w:noHBand="0" w:noVBand="1"/>
       </w:tblPr>
@@ -1806,10 +2263,10 @@
             <w:tcW w:w="6940" w:type="dxa"/>
           </w:tcPr>
           <w:p>
-            <w:hyperlink r:id="rId14" w:history="1">
+            <w:hyperlink r:id="rId18" w:history="1">
               <w:r>
                 <w:rPr>
-                  <w:rStyle w:val="Hyperlink"/>
+                  <w:rStyle w:val="Lienhypertexte"/>
                 </w:rPr>
                 <w:t>Ajout du mouvement WASD</w:t>
               </w:r>
@@ -1833,105 +2290,12 @@
             <w:tcW w:w="6940" w:type="dxa"/>
           </w:tcPr>
           <w:p>
-            <w:hyperlink r:id="rId15" w:history="1">
-              <w:proofErr w:type="gramStart"/>
+            <w:hyperlink r:id="rId19" w:history="1">
               <w:r>
                 <w:rPr>
-                  <w:rStyle w:val="Hyperlink"/>
+                  <w:rStyle w:val="Lienhypertexte"/>
                 </w:rPr>
-                <w:t>pouvoir</w:t>
-              </w:r>
-              <w:proofErr w:type="gramEnd"/>
-              <w:r>
-                <w:rPr>
-                  <w:rStyle w:val="Hyperlink"/>
-                </w:rPr>
-                <w:t xml:space="preserve"> tirer </w:t>
-              </w:r>
-              <w:proofErr w:type="gramStart"/>
-              <w:r>
-                <w:rPr>
-                  <w:rStyle w:val="Hyperlink"/>
-                </w:rPr>
-                <w:t>des projectile</w:t>
-              </w:r>
-              <w:proofErr w:type="gramEnd"/>
-              <w:r>
-                <w:rPr>
-                  <w:rStyle w:val="Hyperlink"/>
-                </w:rPr>
-                <w:t xml:space="preserve"> sur mes </w:t>
-              </w:r>
-              <w:proofErr w:type="spellStart"/>
-              <w:r>
-                <w:rPr>
-                  <w:rStyle w:val="Hyperlink"/>
-                </w:rPr>
-                <w:t>enemies</w:t>
-              </w:r>
-              <w:proofErr w:type="spellEnd"/>
-            </w:hyperlink>
-          </w:p>
-        </w:tc>
-      </w:tr>
-      <w:tr>
-        <w:tc>
-          <w:tcPr>
-            <w:tcW w:w="2122" w:type="dxa"/>
-          </w:tcPr>
-          <w:p>
-            <w:r>
-              <w:t>25.09.2026</w:t>
-            </w:r>
-          </w:p>
-        </w:tc>
-        <w:tc>
-          <w:tcPr>
-            <w:tcW w:w="6940" w:type="dxa"/>
-          </w:tcPr>
-          <w:p>
-            <w:hyperlink r:id="rId16" w:history="1">
-              <w:proofErr w:type="gramStart"/>
-              <w:r>
-                <w:rPr>
-                  <w:rStyle w:val="Hyperlink"/>
-                </w:rPr>
-                <w:t>pouvoir</w:t>
-              </w:r>
-              <w:proofErr w:type="gramEnd"/>
-              <w:r>
-                <w:rPr>
-                  <w:rStyle w:val="Hyperlink"/>
-                </w:rPr>
-                <w:t xml:space="preserve"> faire des </w:t>
-              </w:r>
-              <w:proofErr w:type="spellStart"/>
-              <w:r>
-                <w:rPr>
-                  <w:rStyle w:val="Hyperlink"/>
-                </w:rPr>
-                <w:t>degats</w:t>
-              </w:r>
-              <w:proofErr w:type="spellEnd"/>
-              <w:r>
-                <w:rPr>
-                  <w:rStyle w:val="Hyperlink"/>
-                </w:rPr>
-                <w:t xml:space="preserve"> </w:t>
-              </w:r>
-              <w:proofErr w:type="gramStart"/>
-              <w:r>
-                <w:rPr>
-                  <w:rStyle w:val="Hyperlink"/>
-                </w:rPr>
-                <w:t>au corp</w:t>
-              </w:r>
-              <w:proofErr w:type="gramEnd"/>
-              <w:r>
-                <w:rPr>
-                  <w:rStyle w:val="Hyperlink"/>
-                </w:rPr>
-                <w:t xml:space="preserve"> à corp</w:t>
+                <w:t>pouvoir tirer des projectile sur mes enemies</w:t>
               </w:r>
             </w:hyperlink>
           </w:p>
@@ -1953,10 +2317,37 @@
             <w:tcW w:w="6940" w:type="dxa"/>
           </w:tcPr>
           <w:p>
-            <w:hyperlink r:id="rId17" w:history="1">
+            <w:hyperlink r:id="rId20" w:history="1">
               <w:r>
                 <w:rPr>
-                  <w:rStyle w:val="Hyperlink"/>
+                  <w:rStyle w:val="Lienhypertexte"/>
+                </w:rPr>
+                <w:t>pouvoir faire des degats au corp à corp</w:t>
+              </w:r>
+            </w:hyperlink>
+          </w:p>
+        </w:tc>
+      </w:tr>
+      <w:tr>
+        <w:tc>
+          <w:tcPr>
+            <w:tcW w:w="2122" w:type="dxa"/>
+          </w:tcPr>
+          <w:p>
+            <w:r>
+              <w:t>25.09.2026</w:t>
+            </w:r>
+          </w:p>
+        </w:tc>
+        <w:tc>
+          <w:tcPr>
+            <w:tcW w:w="6940" w:type="dxa"/>
+          </w:tcPr>
+          <w:p>
+            <w:hyperlink r:id="rId21" w:history="1">
+              <w:r>
+                <w:rPr>
+                  <w:rStyle w:val="Lienhypertexte"/>
                 </w:rPr>
                 <w:t>Ajouter un compteur de PV</w:t>
               </w:r>
@@ -1980,10 +2371,10 @@
             <w:tcW w:w="6940" w:type="dxa"/>
           </w:tcPr>
           <w:p>
-            <w:hyperlink r:id="rId18" w:history="1">
+            <w:hyperlink r:id="rId22" w:history="1">
               <w:r>
                 <w:rPr>
-                  <w:rStyle w:val="Hyperlink"/>
+                  <w:rStyle w:val="Lienhypertexte"/>
                 </w:rPr>
                 <w:t>Ajouter un compteur d’argent</w:t>
               </w:r>
@@ -2007,10 +2398,10 @@
             <w:tcW w:w="6940" w:type="dxa"/>
           </w:tcPr>
           <w:p>
-            <w:hyperlink r:id="rId19" w:history="1">
+            <w:hyperlink r:id="rId23" w:history="1">
               <w:r>
                 <w:rPr>
-                  <w:rStyle w:val="Hyperlink"/>
+                  <w:rStyle w:val="Lienhypertexte"/>
                 </w:rPr>
                 <w:t>Créer des ennemies de type manager</w:t>
               </w:r>
@@ -2034,10 +2425,10 @@
             <w:tcW w:w="6940" w:type="dxa"/>
           </w:tcPr>
           <w:p>
-            <w:hyperlink r:id="rId20" w:history="1">
+            <w:hyperlink r:id="rId24" w:history="1">
               <w:r>
                 <w:rPr>
-                  <w:rStyle w:val="Hyperlink"/>
+                  <w:rStyle w:val="Lienhypertexte"/>
                 </w:rPr>
                 <w:t>Créer les projectiles des managers</w:t>
               </w:r>
@@ -2064,10 +2455,10 @@
             <w:tcW w:w="6940" w:type="dxa"/>
           </w:tcPr>
           <w:p>
-            <w:hyperlink r:id="rId21" w:history="1">
+            <w:hyperlink r:id="rId25" w:history="1">
               <w:r>
                 <w:rPr>
-                  <w:rStyle w:val="Hyperlink"/>
+                  <w:rStyle w:val="Lienhypertexte"/>
                 </w:rPr>
                 <w:t>Créer des ennemies de type robot</w:t>
               </w:r>
@@ -2094,10 +2485,10 @@
             <w:tcW w:w="6940" w:type="dxa"/>
           </w:tcPr>
           <w:p>
-            <w:hyperlink r:id="rId22" w:history="1">
+            <w:hyperlink r:id="rId26" w:history="1">
               <w:r>
                 <w:rPr>
-                  <w:rStyle w:val="Hyperlink"/>
+                  <w:rStyle w:val="Lienhypertexte"/>
                 </w:rPr>
                 <w:t>Créer les projectiles des robots</w:t>
               </w:r>
@@ -2124,10 +2515,10 @@
             <w:tcW w:w="6940" w:type="dxa"/>
           </w:tcPr>
           <w:p>
-            <w:hyperlink r:id="rId23" w:history="1">
+            <w:hyperlink r:id="rId27" w:history="1">
               <w:r>
                 <w:rPr>
-                  <w:rStyle w:val="Hyperlink"/>
+                  <w:rStyle w:val="Lienhypertexte"/>
                 </w:rPr>
                 <w:t>Créer les obstacles</w:t>
               </w:r>
@@ -2139,7 +2530,435 @@
     <w:p/>
     <w:p>
       <w:pPr>
-        <w:pStyle w:val="Heading2"/>
+        <w:pStyle w:val="Titre2"/>
+      </w:pPr>
+      <w:r>
+        <w:t>Rapport de tests</w:t>
+      </w:r>
+    </w:p>
+    <w:p>
+      <w:r>
+        <w:t xml:space="preserve">Voici une explication des différents tests existant dans mon projet : </w:t>
+      </w:r>
+    </w:p>
+    <w:p>
+      <w:pPr>
+        <w:pStyle w:val="Titre3"/>
+      </w:pPr>
+      <w:r>
+        <w:t>HelpersTest</w:t>
+      </w:r>
+    </w:p>
+    <w:p>
+      <w:r>
+        <w:t>Cette classe contient deux tests :</w:t>
+      </w:r>
+    </w:p>
+    <w:p>
+      <w:pPr>
+        <w:ind w:left="708"/>
+      </w:pPr>
+      <w:r>
+        <w:rPr>
+          <w:rStyle w:val="Titre4Car"/>
+        </w:rPr>
+        <w:t>TestDisance</w:t>
+      </w:r>
+      <w:r>
+        <w:rPr>
+          <w:b/>
+          <w:bCs/>
+        </w:rPr>
+        <w:t xml:space="preserve"> : </w:t>
+      </w:r>
+      <w:r>
+        <w:t>Vérifie que le helper « </w:t>
+      </w:r>
+      <w:r>
+        <w:t>MathHelper.Distance</w:t>
+      </w:r>
+      <w:r>
+        <w:t xml:space="preserve"> » fonctionne en lui donnant deux points ayant </w:t>
+      </w:r>
+      <w:r>
+        <w:t>des</w:t>
+      </w:r>
+      <w:r>
+        <w:t xml:space="preserve"> coordonnées chacune et en la comparant avec la valeur qu’elle devrait avoir. Le premier point vaut (0,0) et le second à les </w:t>
+      </w:r>
+      <w:r>
+        <w:lastRenderedPageBreak/>
+        <w:t>coordonné (3,4) avec un simple théorème de Pythagore on calcul que leur distance doit être de 5 et on compare ça avec la sortie du helpers.</w:t>
+      </w:r>
+    </w:p>
+    <w:p>
+      <w:pPr>
+        <w:ind w:left="708"/>
+      </w:pPr>
+      <w:r>
+        <w:rPr>
+          <w:rStyle w:val="Titre4Car"/>
+        </w:rPr>
+        <w:t>TestAreTouching</w:t>
+      </w:r>
+      <w:r>
+        <w:rPr>
+          <w:b/>
+          <w:bCs/>
+        </w:rPr>
+        <w:t xml:space="preserve"> : </w:t>
+      </w:r>
+      <w:r>
+        <w:t>Vérifie que le helpers « </w:t>
+      </w:r>
+      <w:r>
+        <w:t>MathHelper.AreTouching</w:t>
+      </w:r>
+      <w:r>
+        <w:t xml:space="preserve"> » fonctionne en lui donnant deux </w:t>
+      </w:r>
+      <w:r>
+        <w:t xml:space="preserve">rectangles </w:t>
+      </w:r>
+      <w:r>
+        <w:t xml:space="preserve">ayant chacun </w:t>
+      </w:r>
+      <w:r>
+        <w:t>des</w:t>
+      </w:r>
+      <w:r>
+        <w:t xml:space="preserve"> coordonnées, une largeur et une hauteur. On regarde ensuite si le helper arrive à correctement prédire que les rectangles se touchent.</w:t>
+      </w:r>
+      <w:r>
+        <w:t xml:space="preserve"> Le premier rectangle a une position (0,0), une hauteur et une largeur de 15 et le deuxième à la position (15,15) ainsi qu’une hauteur et une largeur de 20. Le test doit ensuite regarder que le helper voit bien que ses points se touchent.</w:t>
+      </w:r>
+    </w:p>
+    <w:p>
+      <w:pPr>
+        <w:pStyle w:val="Titre3"/>
+      </w:pPr>
+      <w:r>
+        <w:t>ManagerTests</w:t>
+      </w:r>
+    </w:p>
+    <w:p>
+      <w:r>
+        <w:t xml:space="preserve">Cette classe contient deux tests et utilise une methode </w:t>
+      </w:r>
+      <w:r>
+        <w:t>Setup</w:t>
+      </w:r>
+      <w:r>
+        <w:t xml:space="preserve"> lancé par </w:t>
+      </w:r>
+      <w:r>
+        <w:t>[TestInitialize]</w:t>
+      </w:r>
+      <w:r>
+        <w:t xml:space="preserve"> afin de réinitialiser </w:t>
+      </w:r>
+      <w:r>
+        <w:t>le champ</w:t>
+      </w:r>
+      <w:r>
+        <w:t xml:space="preserve"> de batail entre les </w:t>
+      </w:r>
+      <w:r>
+        <w:t>tests :</w:t>
+      </w:r>
+    </w:p>
+    <w:p>
+      <w:pPr>
+        <w:ind w:left="708"/>
+      </w:pPr>
+      <w:r>
+        <w:rPr>
+          <w:rStyle w:val="Titre4Car"/>
+        </w:rPr>
+        <w:t>ManagerFires</w:t>
+      </w:r>
+      <w:r>
+        <w:rPr>
+          <w:b/>
+          <w:bCs/>
+        </w:rPr>
+        <w:t xml:space="preserve"> : </w:t>
+      </w:r>
+      <w:r>
+        <w:t>Cette méthode instancie un manager</w:t>
+      </w:r>
+      <w:r>
+        <w:t xml:space="preserve"> ainsi qu’un champ de bataille. Elle supprime ensuite tout les obstacles présent dans le champs de bataille. Puis</w:t>
+      </w:r>
+      <w:r>
+        <w:t xml:space="preserve"> </w:t>
+      </w:r>
+      <w:r>
+        <w:t xml:space="preserve">elle </w:t>
+      </w:r>
+      <w:r>
+        <w:t xml:space="preserve">attend le nombre de frame que le Manager prend à charger avant de vérifier si une attaque de type sac d’argent a été ajouté dans </w:t>
+      </w:r>
+      <w:r>
+        <w:t>le champ</w:t>
+      </w:r>
+      <w:r>
+        <w:t xml:space="preserve"> de bataille.</w:t>
+      </w:r>
+    </w:p>
+    <w:p>
+      <w:pPr>
+        <w:ind w:left="708"/>
+      </w:pPr>
+      <w:r>
+        <w:rPr>
+          <w:rStyle w:val="Titre4Car"/>
+        </w:rPr>
+        <w:t>ManagerMoves</w:t>
+      </w:r>
+      <w:r>
+        <w:rPr>
+          <w:b/>
+          <w:bCs/>
+        </w:rPr>
+        <w:t> :</w:t>
+      </w:r>
+      <w:r>
+        <w:rPr>
+          <w:b/>
+          <w:bCs/>
+        </w:rPr>
+        <w:t xml:space="preserve"> </w:t>
+      </w:r>
+      <w:r>
+        <w:t>Cette méthode instancie un manager puis attend deux frames. Il regarde ensuite si le Manager à changer de position.</w:t>
+      </w:r>
+    </w:p>
+    <w:p>
+      <w:pPr>
+        <w:pStyle w:val="Titre3"/>
+      </w:pPr>
+      <w:r>
+        <w:t>PlayerTests</w:t>
+      </w:r>
+    </w:p>
+    <w:p>
+      <w:r>
+        <w:t xml:space="preserve">Cette classe contient </w:t>
+      </w:r>
+      <w:r>
+        <w:t>7</w:t>
+      </w:r>
+      <w:r>
+        <w:t xml:space="preserve"> tests et utilise une methode </w:t>
+      </w:r>
+      <w:r>
+        <w:t>Setup</w:t>
+      </w:r>
+      <w:r>
+        <w:t xml:space="preserve"> lancé par </w:t>
+      </w:r>
+      <w:r>
+        <w:t>[TestInitialize]</w:t>
+      </w:r>
+      <w:r>
+        <w:t xml:space="preserve"> afin de réinitialiser le champ de batail entre les tests :</w:t>
+      </w:r>
+    </w:p>
+    <w:p>
+      <w:pPr>
+        <w:ind w:left="708"/>
+      </w:pPr>
+      <w:r>
+        <w:rPr>
+          <w:rStyle w:val="Titre4Car"/>
+        </w:rPr>
+        <w:t>PlayerBurgerAttack</w:t>
+      </w:r>
+      <w:r>
+        <w:t xml:space="preserve">: Cette méthode </w:t>
+      </w:r>
+      <w:r>
+        <w:t>créer un joueur puis simule un clic gauche. Elle regarde ensuite le nombre de balle présente dans le champ de bataille.</w:t>
+      </w:r>
+    </w:p>
+    <w:p>
+      <w:pPr>
+        <w:ind w:left="708"/>
+      </w:pPr>
+      <w:r>
+        <w:rPr>
+          <w:rStyle w:val="Titre4Car"/>
+        </w:rPr>
+        <w:t>PlayerMeleeAtack</w:t>
+      </w:r>
+      <w:r>
+        <w:t xml:space="preserve"> : Cette méthode créer un joueur puis attends une frame le temps que le cooldown de départ passe puis simule un clic droit. Elle laisse encore </w:t>
+      </w:r>
+      <w:r>
+        <w:t>une frame</w:t>
+      </w:r>
+      <w:r>
+        <w:t xml:space="preserve"> passer puis elle regarde si le joueur est en mode Melee ou non.</w:t>
+      </w:r>
+    </w:p>
+    <w:p>
+      <w:pPr>
+        <w:ind w:left="708"/>
+      </w:pPr>
+      <w:r>
+        <w:rPr>
+          <w:rStyle w:val="Titre4Car"/>
+        </w:rPr>
+        <w:t>PlayerGoUp/PlayerGoDown/PlayerGoLeft/PlayerGoRight</w:t>
+      </w:r>
+      <w:r>
+        <w:t xml:space="preserve"> : Ces quatres méthodes </w:t>
+      </w:r>
+      <w:r>
+        <w:t>i</w:t>
+      </w:r>
+      <w:r>
+        <w:t>nstancie toutes un joueur puis simule le pressage de la touche pour aller dans leur direction respective (WASD). Elle laisse toutes une frame passer avant de regarder si la position du joueur à changer de manière égal à sa vitesse et dans la bonne direction.</w:t>
+      </w:r>
+    </w:p>
+    <w:p>
+      <w:pPr>
+        <w:ind w:left="708"/>
+      </w:pPr>
+      <w:r>
+        <w:rPr>
+          <w:rStyle w:val="Titre4Car"/>
+        </w:rPr>
+        <w:t>PlayerCollisionWithObstacle</w:t>
+      </w:r>
+      <w:r>
+        <w:t xml:space="preserve"> : Cette méthode créer un joueur puis ajoute un obstacle dans le champ de bataille juste en face du joueur. Elle simule ensuite le fait de cliquer sur « W » pour avancer vers l’obstacle puis regarde si la position du </w:t>
+      </w:r>
+      <w:r>
+        <w:lastRenderedPageBreak/>
+        <w:t>joueur à changer. Le but est de voir si le collision fonctionne. Si oui, le joueur ne changera pas de positio</w:t>
+      </w:r>
+      <w:r>
+        <w:t>n.</w:t>
+      </w:r>
+    </w:p>
+    <w:p>
+      <w:pPr>
+        <w:pStyle w:val="Titre3"/>
+      </w:pPr>
+      <w:r>
+        <w:t>RobotTests</w:t>
+      </w:r>
+    </w:p>
+    <w:p>
+      <w:r>
+        <w:t xml:space="preserve">Cette classe contient </w:t>
+      </w:r>
+      <w:r>
+        <w:t>deux</w:t>
+      </w:r>
+      <w:r>
+        <w:t xml:space="preserve"> tests et utilise une methode </w:t>
+      </w:r>
+      <w:r>
+        <w:t>Setup</w:t>
+      </w:r>
+      <w:r>
+        <w:t xml:space="preserve"> lancé par </w:t>
+      </w:r>
+      <w:r>
+        <w:t>[TestInitialize]</w:t>
+      </w:r>
+      <w:r>
+        <w:t xml:space="preserve"> afin de réinitialiser le champ de batail entre les tests :</w:t>
+      </w:r>
+    </w:p>
+    <w:p>
+      <w:pPr>
+        <w:ind w:left="708"/>
+      </w:pPr>
+      <w:r>
+        <w:rPr>
+          <w:rStyle w:val="Titre4Car"/>
+        </w:rPr>
+        <w:t>RobotFires</w:t>
+      </w:r>
+      <w:r>
+        <w:t xml:space="preserve"> : </w:t>
+      </w:r>
+      <w:r>
+        <w:t xml:space="preserve">Cette méthode instancie un nouveau champ de bataille puis un nouveau Robot. Elle supprime ensuite </w:t>
+      </w:r>
+      <w:r>
+        <w:t>tous les obstacles</w:t>
+      </w:r>
+      <w:r>
+        <w:t xml:space="preserve"> du champ de bataille et attend que le Robot se mette en position et tire.</w:t>
+      </w:r>
+      <w:r>
+        <w:t xml:space="preserve"> Si le robot prend plus de temps à tirer que la taille de la map, alors c’est que le test ne fonctionne pas. Puis on regarde combien de tir sont présent dans le champ de batail pour valider ou non le test.</w:t>
+      </w:r>
+    </w:p>
+    <w:p>
+      <w:pPr>
+        <w:ind w:left="708"/>
+      </w:pPr>
+      <w:r>
+        <w:rPr>
+          <w:rStyle w:val="Titre4Car"/>
+        </w:rPr>
+        <w:t>RobotMoves </w:t>
+      </w:r>
+      <w:r>
+        <w:t>:</w:t>
+      </w:r>
+      <w:r>
+        <w:t xml:space="preserve"> Cette méthode instancie un nouveau champ de bataille puis un nouveau robot et supprime aussi tous les obstacles. Il laisse ensuite une frame passé puis regarde si la position du Robot à changé.</w:t>
+      </w:r>
+    </w:p>
+    <w:p>
+      <w:pPr>
+        <w:pStyle w:val="Titre3"/>
+      </w:pPr>
+      <w:r>
+        <w:t>MSTestSettings</w:t>
+      </w:r>
+    </w:p>
+    <w:p>
+      <w:r>
+        <w:t xml:space="preserve">J’ai du modifié le fichier </w:t>
+      </w:r>
+      <w:r>
+        <w:t>MSTestSettings</w:t>
+      </w:r>
+      <w:r>
+        <w:t xml:space="preserve">.cs et changer la première ligne en </w:t>
+      </w:r>
+      <w:r>
+        <w:t>[assembly: DoNotParallelize]</w:t>
+      </w:r>
+      <w:r>
+        <w:t>. Cela était nécessaire car le champ de batail est une ressource partagé entre tous les tests ce qui amènerais autrement des tests à écrire dans la classe « </w:t>
+      </w:r>
+      <w:r>
+        <w:t>BattleMap</w:t>
+      </w:r>
+      <w:r>
+        <w:t> » au moment ou un autre test allait le lire. J’ai donc du désactiver le parallélisme.</w:t>
+      </w:r>
+    </w:p>
+    <w:p>
+      <w:pPr>
+        <w:pStyle w:val="Titre2"/>
+      </w:pPr>
+      <w:r>
+        <w:t>Conception et diagramme de classe</w:t>
+      </w:r>
+    </w:p>
+    <w:p>
+      <w:pPr>
+        <w:pStyle w:val="Titre2"/>
       </w:pPr>
       <w:bookmarkStart w:id="6" w:name="_Toc243513768"/>
       <w:r>
@@ -2148,39 +2967,63 @@
       <w:bookmarkEnd w:id="6"/>
     </w:p>
     <w:p>
-      <w:hyperlink r:id="rId24" w:history="1">
+      <w:hyperlink r:id="rId28" w:history="1">
         <w:r>
           <w:rPr>
-            <w:rStyle w:val="Hyperlink"/>
+            <w:rStyle w:val="Lienhypertexte"/>
           </w:rPr>
           <w:t>https://claude.ai/share/2bf90d2b-864b-42cc-8b37-eaf1b68bf1c2</w:t>
         </w:r>
       </w:hyperlink>
     </w:p>
     <w:p>
-      <w:hyperlink r:id="rId25" w:history="1">
+      <w:hyperlink r:id="rId29" w:history="1">
         <w:r>
           <w:rPr>
-            <w:rStyle w:val="Hyperlink"/>
+            <w:rStyle w:val="Lienhypertexte"/>
           </w:rPr>
-          <w:t>https://claude.ai/chat/6a7b1c99-f71e-4fc9-8b5f-c603c90ab954</w:t>
+          <w:t>https://claude.ai/share/811b5089-de97-4356-8ea7-5ff4a40ace65</w:t>
         </w:r>
       </w:hyperlink>
     </w:p>
     <w:p>
-      <w:hyperlink r:id="rId26" w:history="1">
+      <w:hyperlink r:id="rId30" w:history="1">
         <w:r>
           <w:rPr>
-            <w:rStyle w:val="Hyperlink"/>
+            <w:rStyle w:val="Lienhypertexte"/>
           </w:rPr>
-          <w:t>https://claude.ai/chat/0db72aac-4429-4988-9a24-8d265f9b46d8</w:t>
+          <w:t>https://claude.ai/share/b1e4f4ad-725a-4019-8b77-c83d20ff485d</w:t>
         </w:r>
       </w:hyperlink>
+    </w:p>
+    <w:p>
+      <w:pPr>
+        <w:pStyle w:val="Titre2"/>
+      </w:pPr>
+      <w:r>
+        <w:t>Bilan du déroulement du projet</w:t>
+      </w:r>
+    </w:p>
+    <w:p>
+      <w:pPr>
+        <w:pStyle w:val="Titre2"/>
+      </w:pPr>
+      <w:r>
+        <w:t>Bilan produit</w:t>
+      </w:r>
+    </w:p>
+    <w:p>
+      <w:pPr>
+        <w:pStyle w:val="Titre2"/>
+      </w:pPr>
+      <w:r>
+        <w:t>Conclusion</w:t>
+      </w:r>
     </w:p>
     <w:p/>
     <w:p/>
     <w:sectPr>
-      <w:footerReference w:type="default" r:id="rId27"/>
+      <w:footerReference w:type="default" r:id="rId31"/>
       <w:pgSz w:w="11906" w:h="16838"/>
       <w:pgMar w:top="1417" w:right="1417" w:bottom="1417" w:left="1417" w:header="708" w:footer="708" w:gutter="0"/>
       <w:cols w:space="708"/>
@@ -2228,7 +3071,7 @@
     <w:sdtContent>
       <w:p>
         <w:pPr>
-          <w:pStyle w:val="Footer"/>
+          <w:pStyle w:val="Pieddepage"/>
           <w:jc w:val="right"/>
           <w:rPr>
             <w:lang w:val="en-US"/>
@@ -2260,7 +3103,7 @@
   </w:sdt>
   <w:p>
     <w:pPr>
-      <w:pStyle w:val="Footer"/>
+      <w:pStyle w:val="Pieddepage"/>
       <w:rPr>
         <w:lang w:val="en-US"/>
       </w:rPr>
@@ -3155,12 +3998,13 @@
   <w:style w:type="paragraph" w:default="1" w:styleId="Normal">
     <w:name w:val="Normal"/>
     <w:qFormat/>
+    <w:rsid w:val="00983A50"/>
   </w:style>
-  <w:style w:type="paragraph" w:styleId="Heading1">
+  <w:style w:type="paragraph" w:styleId="Titre1">
     <w:name w:val="heading 1"/>
     <w:basedOn w:val="Normal"/>
     <w:next w:val="Normal"/>
-    <w:link w:val="Heading1Char"/>
+    <w:link w:val="Titre1Car"/>
     <w:uiPriority w:val="9"/>
     <w:qFormat/>
     <w:rsid w:val="006C417F"/>
@@ -3177,11 +4021,11 @@
       <w:szCs w:val="40"/>
     </w:rPr>
   </w:style>
-  <w:style w:type="paragraph" w:styleId="Heading2">
+  <w:style w:type="paragraph" w:styleId="Titre2">
     <w:name w:val="heading 2"/>
     <w:basedOn w:val="Normal"/>
     <w:next w:val="Normal"/>
-    <w:link w:val="Heading2Char"/>
+    <w:link w:val="Titre2Car"/>
     <w:uiPriority w:val="9"/>
     <w:unhideWhenUsed/>
     <w:qFormat/>
@@ -3199,11 +4043,11 @@
       <w:szCs w:val="32"/>
     </w:rPr>
   </w:style>
-  <w:style w:type="paragraph" w:styleId="Heading3">
+  <w:style w:type="paragraph" w:styleId="Titre3">
     <w:name w:val="heading 3"/>
     <w:basedOn w:val="Normal"/>
     <w:next w:val="Normal"/>
-    <w:link w:val="Heading3Char"/>
+    <w:link w:val="Titre3Car"/>
     <w:uiPriority w:val="9"/>
     <w:unhideWhenUsed/>
     <w:qFormat/>
@@ -3221,11 +4065,11 @@
       <w:szCs w:val="28"/>
     </w:rPr>
   </w:style>
-  <w:style w:type="paragraph" w:styleId="Heading4">
+  <w:style w:type="paragraph" w:styleId="Titre4">
     <w:name w:val="heading 4"/>
     <w:basedOn w:val="Normal"/>
     <w:next w:val="Normal"/>
-    <w:link w:val="Heading4Char"/>
+    <w:link w:val="Titre4Car"/>
     <w:uiPriority w:val="9"/>
     <w:unhideWhenUsed/>
     <w:qFormat/>
@@ -3243,11 +4087,11 @@
       <w:color w:val="0F4761" w:themeColor="accent1" w:themeShade="BF"/>
     </w:rPr>
   </w:style>
-  <w:style w:type="paragraph" w:styleId="Heading5">
+  <w:style w:type="paragraph" w:styleId="Titre5">
     <w:name w:val="heading 5"/>
     <w:basedOn w:val="Normal"/>
     <w:next w:val="Normal"/>
-    <w:link w:val="Heading5Char"/>
+    <w:link w:val="Titre5Car"/>
     <w:uiPriority w:val="9"/>
     <w:semiHidden/>
     <w:unhideWhenUsed/>
@@ -3264,11 +4108,11 @@
       <w:color w:val="0F4761" w:themeColor="accent1" w:themeShade="BF"/>
     </w:rPr>
   </w:style>
-  <w:style w:type="paragraph" w:styleId="Heading6">
+  <w:style w:type="paragraph" w:styleId="Titre6">
     <w:name w:val="heading 6"/>
     <w:basedOn w:val="Normal"/>
     <w:next w:val="Normal"/>
-    <w:link w:val="Heading6Char"/>
+    <w:link w:val="Titre6Car"/>
     <w:uiPriority w:val="9"/>
     <w:semiHidden/>
     <w:unhideWhenUsed/>
@@ -3287,11 +4131,11 @@
       <w:color w:val="595959" w:themeColor="text1" w:themeTint="A6"/>
     </w:rPr>
   </w:style>
-  <w:style w:type="paragraph" w:styleId="Heading7">
+  <w:style w:type="paragraph" w:styleId="Titre7">
     <w:name w:val="heading 7"/>
     <w:basedOn w:val="Normal"/>
     <w:next w:val="Normal"/>
-    <w:link w:val="Heading7Char"/>
+    <w:link w:val="Titre7Car"/>
     <w:uiPriority w:val="9"/>
     <w:semiHidden/>
     <w:unhideWhenUsed/>
@@ -3308,11 +4152,11 @@
       <w:color w:val="595959" w:themeColor="text1" w:themeTint="A6"/>
     </w:rPr>
   </w:style>
-  <w:style w:type="paragraph" w:styleId="Heading8">
+  <w:style w:type="paragraph" w:styleId="Titre8">
     <w:name w:val="heading 8"/>
     <w:basedOn w:val="Normal"/>
     <w:next w:val="Normal"/>
-    <w:link w:val="Heading8Char"/>
+    <w:link w:val="Titre8Car"/>
     <w:uiPriority w:val="9"/>
     <w:semiHidden/>
     <w:unhideWhenUsed/>
@@ -3331,11 +4175,11 @@
       <w:color w:val="272727" w:themeColor="text1" w:themeTint="D8"/>
     </w:rPr>
   </w:style>
-  <w:style w:type="paragraph" w:styleId="Heading9">
+  <w:style w:type="paragraph" w:styleId="Titre9">
     <w:name w:val="heading 9"/>
     <w:basedOn w:val="Normal"/>
     <w:next w:val="Normal"/>
-    <w:link w:val="Heading9Char"/>
+    <w:link w:val="Titre9Car"/>
     <w:uiPriority w:val="9"/>
     <w:semiHidden/>
     <w:unhideWhenUsed/>
@@ -3352,13 +4196,12 @@
       <w:color w:val="272727" w:themeColor="text1" w:themeTint="D8"/>
     </w:rPr>
   </w:style>
-  <w:style w:type="character" w:default="1" w:styleId="DefaultParagraphFont">
+  <w:style w:type="character" w:default="1" w:styleId="Policepardfaut">
     <w:name w:val="Default Paragraph Font"/>
     <w:uiPriority w:val="1"/>
-    <w:semiHidden/>
     <w:unhideWhenUsed/>
   </w:style>
-  <w:style w:type="table" w:default="1" w:styleId="TableNormal">
+  <w:style w:type="table" w:default="1" w:styleId="TableauNormal">
     <w:name w:val="Normal Table"/>
     <w:uiPriority w:val="99"/>
     <w:semiHidden/>
@@ -3373,16 +4216,16 @@
       </w:tblCellMar>
     </w:tblPr>
   </w:style>
-  <w:style w:type="numbering" w:default="1" w:styleId="NoList">
+  <w:style w:type="numbering" w:default="1" w:styleId="Aucuneliste">
     <w:name w:val="No List"/>
     <w:uiPriority w:val="99"/>
     <w:semiHidden/>
     <w:unhideWhenUsed/>
   </w:style>
-  <w:style w:type="character" w:customStyle="1" w:styleId="Heading1Char">
-    <w:name w:val="Heading 1 Char"/>
-    <w:basedOn w:val="DefaultParagraphFont"/>
-    <w:link w:val="Heading1"/>
+  <w:style w:type="character" w:customStyle="1" w:styleId="Titre1Car">
+    <w:name w:val="Titre 1 Car"/>
+    <w:basedOn w:val="Policepardfaut"/>
+    <w:link w:val="Titre1"/>
     <w:uiPriority w:val="9"/>
     <w:rsid w:val="006C417F"/>
     <w:rPr>
@@ -3392,10 +4235,10 @@
       <w:szCs w:val="40"/>
     </w:rPr>
   </w:style>
-  <w:style w:type="character" w:customStyle="1" w:styleId="Heading2Char">
-    <w:name w:val="Heading 2 Char"/>
-    <w:basedOn w:val="DefaultParagraphFont"/>
-    <w:link w:val="Heading2"/>
+  <w:style w:type="character" w:customStyle="1" w:styleId="Titre2Car">
+    <w:name w:val="Titre 2 Car"/>
+    <w:basedOn w:val="Policepardfaut"/>
+    <w:link w:val="Titre2"/>
     <w:uiPriority w:val="9"/>
     <w:rsid w:val="006C417F"/>
     <w:rPr>
@@ -3405,10 +4248,10 @@
       <w:szCs w:val="32"/>
     </w:rPr>
   </w:style>
-  <w:style w:type="character" w:customStyle="1" w:styleId="Heading3Char">
-    <w:name w:val="Heading 3 Char"/>
-    <w:basedOn w:val="DefaultParagraphFont"/>
-    <w:link w:val="Heading3"/>
+  <w:style w:type="character" w:customStyle="1" w:styleId="Titre3Car">
+    <w:name w:val="Titre 3 Car"/>
+    <w:basedOn w:val="Policepardfaut"/>
+    <w:link w:val="Titre3"/>
     <w:uiPriority w:val="9"/>
     <w:rsid w:val="006C417F"/>
     <w:rPr>
@@ -3418,10 +4261,10 @@
       <w:szCs w:val="28"/>
     </w:rPr>
   </w:style>
-  <w:style w:type="character" w:customStyle="1" w:styleId="Heading4Char">
-    <w:name w:val="Heading 4 Char"/>
-    <w:basedOn w:val="DefaultParagraphFont"/>
-    <w:link w:val="Heading4"/>
+  <w:style w:type="character" w:customStyle="1" w:styleId="Titre4Car">
+    <w:name w:val="Titre 4 Car"/>
+    <w:basedOn w:val="Policepardfaut"/>
+    <w:link w:val="Titre4"/>
     <w:uiPriority w:val="9"/>
     <w:rsid w:val="006C417F"/>
     <w:rPr>
@@ -3431,10 +4274,10 @@
       <w:color w:val="0F4761" w:themeColor="accent1" w:themeShade="BF"/>
     </w:rPr>
   </w:style>
-  <w:style w:type="character" w:customStyle="1" w:styleId="Heading5Char">
-    <w:name w:val="Heading 5 Char"/>
-    <w:basedOn w:val="DefaultParagraphFont"/>
-    <w:link w:val="Heading5"/>
+  <w:style w:type="character" w:customStyle="1" w:styleId="Titre5Car">
+    <w:name w:val="Titre 5 Car"/>
+    <w:basedOn w:val="Policepardfaut"/>
+    <w:link w:val="Titre5"/>
     <w:uiPriority w:val="9"/>
     <w:semiHidden/>
     <w:rsid w:val="006C417F"/>
@@ -3443,10 +4286,10 @@
       <w:color w:val="0F4761" w:themeColor="accent1" w:themeShade="BF"/>
     </w:rPr>
   </w:style>
-  <w:style w:type="character" w:customStyle="1" w:styleId="Heading6Char">
-    <w:name w:val="Heading 6 Char"/>
-    <w:basedOn w:val="DefaultParagraphFont"/>
-    <w:link w:val="Heading6"/>
+  <w:style w:type="character" w:customStyle="1" w:styleId="Titre6Car">
+    <w:name w:val="Titre 6 Car"/>
+    <w:basedOn w:val="Policepardfaut"/>
+    <w:link w:val="Titre6"/>
     <w:uiPriority w:val="9"/>
     <w:semiHidden/>
     <w:rsid w:val="006C417F"/>
@@ -3457,10 +4300,10 @@
       <w:color w:val="595959" w:themeColor="text1" w:themeTint="A6"/>
     </w:rPr>
   </w:style>
-  <w:style w:type="character" w:customStyle="1" w:styleId="Heading7Char">
-    <w:name w:val="Heading 7 Char"/>
-    <w:basedOn w:val="DefaultParagraphFont"/>
-    <w:link w:val="Heading7"/>
+  <w:style w:type="character" w:customStyle="1" w:styleId="Titre7Car">
+    <w:name w:val="Titre 7 Car"/>
+    <w:basedOn w:val="Policepardfaut"/>
+    <w:link w:val="Titre7"/>
     <w:uiPriority w:val="9"/>
     <w:semiHidden/>
     <w:rsid w:val="006C417F"/>
@@ -3469,10 +4312,10 @@
       <w:color w:val="595959" w:themeColor="text1" w:themeTint="A6"/>
     </w:rPr>
   </w:style>
-  <w:style w:type="character" w:customStyle="1" w:styleId="Heading8Char">
-    <w:name w:val="Heading 8 Char"/>
-    <w:basedOn w:val="DefaultParagraphFont"/>
-    <w:link w:val="Heading8"/>
+  <w:style w:type="character" w:customStyle="1" w:styleId="Titre8Car">
+    <w:name w:val="Titre 8 Car"/>
+    <w:basedOn w:val="Policepardfaut"/>
+    <w:link w:val="Titre8"/>
     <w:uiPriority w:val="9"/>
     <w:semiHidden/>
     <w:rsid w:val="006C417F"/>
@@ -3483,10 +4326,10 @@
       <w:color w:val="272727" w:themeColor="text1" w:themeTint="D8"/>
     </w:rPr>
   </w:style>
-  <w:style w:type="character" w:customStyle="1" w:styleId="Heading9Char">
-    <w:name w:val="Heading 9 Char"/>
-    <w:basedOn w:val="DefaultParagraphFont"/>
-    <w:link w:val="Heading9"/>
+  <w:style w:type="character" w:customStyle="1" w:styleId="Titre9Car">
+    <w:name w:val="Titre 9 Car"/>
+    <w:basedOn w:val="Policepardfaut"/>
+    <w:link w:val="Titre9"/>
     <w:uiPriority w:val="9"/>
     <w:semiHidden/>
     <w:rsid w:val="006C417F"/>
@@ -3495,11 +4338,11 @@
       <w:color w:val="272727" w:themeColor="text1" w:themeTint="D8"/>
     </w:rPr>
   </w:style>
-  <w:style w:type="paragraph" w:styleId="Title">
+  <w:style w:type="paragraph" w:styleId="Titre">
     <w:name w:val="Title"/>
     <w:basedOn w:val="Normal"/>
     <w:next w:val="Normal"/>
-    <w:link w:val="TitleChar"/>
+    <w:link w:val="TitreCar"/>
     <w:uiPriority w:val="10"/>
     <w:qFormat/>
     <w:rsid w:val="006C417F"/>
@@ -3515,10 +4358,10 @@
       <w:szCs w:val="56"/>
     </w:rPr>
   </w:style>
-  <w:style w:type="character" w:customStyle="1" w:styleId="TitleChar">
-    <w:name w:val="Title Char"/>
-    <w:basedOn w:val="DefaultParagraphFont"/>
-    <w:link w:val="Title"/>
+  <w:style w:type="character" w:customStyle="1" w:styleId="TitreCar">
+    <w:name w:val="Titre Car"/>
+    <w:basedOn w:val="Policepardfaut"/>
+    <w:link w:val="Titre"/>
     <w:uiPriority w:val="10"/>
     <w:rsid w:val="006C417F"/>
     <w:rPr>
@@ -3529,11 +4372,11 @@
       <w:szCs w:val="56"/>
     </w:rPr>
   </w:style>
-  <w:style w:type="paragraph" w:styleId="Subtitle">
+  <w:style w:type="paragraph" w:styleId="Sous-titre">
     <w:name w:val="Subtitle"/>
     <w:basedOn w:val="Normal"/>
     <w:next w:val="Normal"/>
-    <w:link w:val="SubtitleChar"/>
+    <w:link w:val="Sous-titreCar"/>
     <w:uiPriority w:val="11"/>
     <w:qFormat/>
     <w:rsid w:val="006C417F"/>
@@ -3550,10 +4393,10 @@
       <w:szCs w:val="28"/>
     </w:rPr>
   </w:style>
-  <w:style w:type="character" w:customStyle="1" w:styleId="SubtitleChar">
-    <w:name w:val="Subtitle Char"/>
-    <w:basedOn w:val="DefaultParagraphFont"/>
-    <w:link w:val="Subtitle"/>
+  <w:style w:type="character" w:customStyle="1" w:styleId="Sous-titreCar">
+    <w:name w:val="Sous-titre Car"/>
+    <w:basedOn w:val="Policepardfaut"/>
+    <w:link w:val="Sous-titre"/>
     <w:uiPriority w:val="11"/>
     <w:rsid w:val="006C417F"/>
     <w:rPr>
@@ -3564,11 +4407,11 @@
       <w:szCs w:val="28"/>
     </w:rPr>
   </w:style>
-  <w:style w:type="paragraph" w:styleId="Quote">
+  <w:style w:type="paragraph" w:styleId="Citation">
     <w:name w:val="Quote"/>
     <w:basedOn w:val="Normal"/>
     <w:next w:val="Normal"/>
-    <w:link w:val="QuoteChar"/>
+    <w:link w:val="CitationCar"/>
     <w:uiPriority w:val="29"/>
     <w:qFormat/>
     <w:rsid w:val="006C417F"/>
@@ -3582,10 +4425,10 @@
       <w:color w:val="404040" w:themeColor="text1" w:themeTint="BF"/>
     </w:rPr>
   </w:style>
-  <w:style w:type="character" w:customStyle="1" w:styleId="QuoteChar">
-    <w:name w:val="Quote Char"/>
-    <w:basedOn w:val="DefaultParagraphFont"/>
-    <w:link w:val="Quote"/>
+  <w:style w:type="character" w:customStyle="1" w:styleId="CitationCar">
+    <w:name w:val="Citation Car"/>
+    <w:basedOn w:val="Policepardfaut"/>
+    <w:link w:val="Citation"/>
     <w:uiPriority w:val="29"/>
     <w:rsid w:val="006C417F"/>
     <w:rPr>
@@ -3594,7 +4437,7 @@
       <w:color w:val="404040" w:themeColor="text1" w:themeTint="BF"/>
     </w:rPr>
   </w:style>
-  <w:style w:type="paragraph" w:styleId="ListParagraph">
+  <w:style w:type="paragraph" w:styleId="Paragraphedeliste">
     <w:name w:val="List Paragraph"/>
     <w:basedOn w:val="Normal"/>
     <w:uiPriority w:val="34"/>
@@ -3605,9 +4448,9 @@
       <w:contextualSpacing/>
     </w:pPr>
   </w:style>
-  <w:style w:type="character" w:styleId="IntenseEmphasis">
+  <w:style w:type="character" w:styleId="Accentuationintense">
     <w:name w:val="Intense Emphasis"/>
-    <w:basedOn w:val="DefaultParagraphFont"/>
+    <w:basedOn w:val="Policepardfaut"/>
     <w:uiPriority w:val="21"/>
     <w:qFormat/>
     <w:rsid w:val="006C417F"/>
@@ -3617,11 +4460,11 @@
       <w:color w:val="0F4761" w:themeColor="accent1" w:themeShade="BF"/>
     </w:rPr>
   </w:style>
-  <w:style w:type="paragraph" w:styleId="IntenseQuote">
+  <w:style w:type="paragraph" w:styleId="Citationintense">
     <w:name w:val="Intense Quote"/>
     <w:basedOn w:val="Normal"/>
     <w:next w:val="Normal"/>
-    <w:link w:val="IntenseQuoteChar"/>
+    <w:link w:val="CitationintenseCar"/>
     <w:uiPriority w:val="30"/>
     <w:qFormat/>
     <w:rsid w:val="006C417F"/>
@@ -3640,10 +4483,10 @@
       <w:color w:val="0F4761" w:themeColor="accent1" w:themeShade="BF"/>
     </w:rPr>
   </w:style>
-  <w:style w:type="character" w:customStyle="1" w:styleId="IntenseQuoteChar">
-    <w:name w:val="Intense Quote Char"/>
-    <w:basedOn w:val="DefaultParagraphFont"/>
-    <w:link w:val="IntenseQuote"/>
+  <w:style w:type="character" w:customStyle="1" w:styleId="CitationintenseCar">
+    <w:name w:val="Citation intense Car"/>
+    <w:basedOn w:val="Policepardfaut"/>
+    <w:link w:val="Citationintense"/>
     <w:uiPriority w:val="30"/>
     <w:rsid w:val="006C417F"/>
     <w:rPr>
@@ -3652,9 +4495,9 @@
       <w:color w:val="0F4761" w:themeColor="accent1" w:themeShade="BF"/>
     </w:rPr>
   </w:style>
-  <w:style w:type="character" w:styleId="IntenseReference">
+  <w:style w:type="character" w:styleId="Rfrenceintense">
     <w:name w:val="Intense Reference"/>
-    <w:basedOn w:val="DefaultParagraphFont"/>
+    <w:basedOn w:val="Policepardfaut"/>
     <w:uiPriority w:val="32"/>
     <w:qFormat/>
     <w:rsid w:val="006C417F"/>
@@ -3666,9 +4509,9 @@
       <w:spacing w:val="5"/>
     </w:rPr>
   </w:style>
-  <w:style w:type="character" w:styleId="Hyperlink">
+  <w:style w:type="character" w:styleId="Lienhypertexte">
     <w:name w:val="Hyperlink"/>
-    <w:basedOn w:val="DefaultParagraphFont"/>
+    <w:basedOn w:val="Policepardfaut"/>
     <w:uiPriority w:val="99"/>
     <w:unhideWhenUsed/>
     <w:rsid w:val="00E71138"/>
@@ -3677,9 +4520,9 @@
       <w:u w:val="single"/>
     </w:rPr>
   </w:style>
-  <w:style w:type="character" w:styleId="UnresolvedMention">
+  <w:style w:type="character" w:styleId="Mentionnonrsolue">
     <w:name w:val="Unresolved Mention"/>
-    <w:basedOn w:val="DefaultParagraphFont"/>
+    <w:basedOn w:val="Policepardfaut"/>
     <w:uiPriority w:val="99"/>
     <w:semiHidden/>
     <w:unhideWhenUsed/>
@@ -3689,9 +4532,9 @@
       <w:shd w:val="clear" w:color="auto" w:fill="E1DFDD"/>
     </w:rPr>
   </w:style>
-  <w:style w:type="character" w:styleId="FollowedHyperlink">
+  <w:style w:type="character" w:styleId="Lienhypertextesuivivisit">
     <w:name w:val="FollowedHyperlink"/>
-    <w:basedOn w:val="DefaultParagraphFont"/>
+    <w:basedOn w:val="Policepardfaut"/>
     <w:uiPriority w:val="99"/>
     <w:semiHidden/>
     <w:unhideWhenUsed/>
@@ -3701,9 +4544,9 @@
       <w:u w:val="single"/>
     </w:rPr>
   </w:style>
-  <w:style w:type="table" w:styleId="TableGrid">
+  <w:style w:type="table" w:styleId="Grilledutableau">
     <w:name w:val="Table Grid"/>
-    <w:basedOn w:val="TableNormal"/>
+    <w:basedOn w:val="TableauNormal"/>
     <w:uiPriority w:val="39"/>
     <w:rsid w:val="00F72678"/>
     <w:pPr>
@@ -3720,9 +4563,9 @@
       </w:tblBorders>
     </w:tblPr>
   </w:style>
-  <w:style w:type="paragraph" w:styleId="TOCHeading">
+  <w:style w:type="paragraph" w:styleId="En-ttedetabledesmatires">
     <w:name w:val="TOC Heading"/>
-    <w:basedOn w:val="Heading1"/>
+    <w:basedOn w:val="Titre1"/>
     <w:next w:val="Normal"/>
     <w:uiPriority w:val="39"/>
     <w:unhideWhenUsed/>
@@ -3740,7 +4583,7 @@
       <w14:ligatures w14:val="none"/>
     </w:rPr>
   </w:style>
-  <w:style w:type="paragraph" w:styleId="TOC1">
+  <w:style w:type="paragraph" w:styleId="TM1">
     <w:name w:val="toc 1"/>
     <w:basedOn w:val="Normal"/>
     <w:next w:val="Normal"/>
@@ -3752,7 +4595,7 @@
       <w:spacing w:after="100"/>
     </w:pPr>
   </w:style>
-  <w:style w:type="paragraph" w:styleId="TOC2">
+  <w:style w:type="paragraph" w:styleId="TM2">
     <w:name w:val="toc 2"/>
     <w:basedOn w:val="Normal"/>
     <w:next w:val="Normal"/>
@@ -3765,7 +4608,7 @@
       <w:ind w:left="240"/>
     </w:pPr>
   </w:style>
-  <w:style w:type="paragraph" w:styleId="TOC3">
+  <w:style w:type="paragraph" w:styleId="TM3">
     <w:name w:val="toc 3"/>
     <w:basedOn w:val="Normal"/>
     <w:next w:val="Normal"/>
@@ -3778,10 +4621,10 @@
       <w:ind w:left="480"/>
     </w:pPr>
   </w:style>
-  <w:style w:type="paragraph" w:styleId="Header">
+  <w:style w:type="paragraph" w:styleId="En-tte">
     <w:name w:val="header"/>
     <w:basedOn w:val="Normal"/>
-    <w:link w:val="HeaderChar"/>
+    <w:link w:val="En-tteCar"/>
     <w:uiPriority w:val="99"/>
     <w:unhideWhenUsed/>
     <w:rsid w:val="001938A7"/>
@@ -3793,17 +4636,17 @@
       <w:spacing w:after="0" w:line="240" w:lineRule="auto"/>
     </w:pPr>
   </w:style>
-  <w:style w:type="character" w:customStyle="1" w:styleId="HeaderChar">
-    <w:name w:val="Header Char"/>
-    <w:basedOn w:val="DefaultParagraphFont"/>
-    <w:link w:val="Header"/>
+  <w:style w:type="character" w:customStyle="1" w:styleId="En-tteCar">
+    <w:name w:val="En-tête Car"/>
+    <w:basedOn w:val="Policepardfaut"/>
+    <w:link w:val="En-tte"/>
     <w:uiPriority w:val="99"/>
     <w:rsid w:val="001938A7"/>
   </w:style>
-  <w:style w:type="paragraph" w:styleId="Footer">
+  <w:style w:type="paragraph" w:styleId="Pieddepage">
     <w:name w:val="footer"/>
     <w:basedOn w:val="Normal"/>
-    <w:link w:val="FooterChar"/>
+    <w:link w:val="PieddepageCar"/>
     <w:uiPriority w:val="99"/>
     <w:unhideWhenUsed/>
     <w:rsid w:val="001938A7"/>
@@ -3815,10 +4658,10 @@
       <w:spacing w:after="0" w:line="240" w:lineRule="auto"/>
     </w:pPr>
   </w:style>
-  <w:style w:type="character" w:customStyle="1" w:styleId="FooterChar">
-    <w:name w:val="Footer Char"/>
-    <w:basedOn w:val="DefaultParagraphFont"/>
-    <w:link w:val="Footer"/>
+  <w:style w:type="character" w:customStyle="1" w:styleId="PieddepageCar">
+    <w:name w:val="Pied de page Car"/>
+    <w:basedOn w:val="Policepardfaut"/>
+    <w:link w:val="Pieddepage"/>
     <w:uiPriority w:val="99"/>
     <w:rsid w:val="001938A7"/>
   </w:style>

</xml_diff>

<commit_message>
doc(diagramme de classe) création du diagramme de classe
</commit_message>
<xml_diff>
--- a/doc/Rapport.docx
+++ b/doc/Rapport.docx
@@ -4,43 +4,43 @@
   <w:body>
     <w:p>
       <w:pPr>
-        <w:pStyle w:val="Titre1"/>
+        <w:pStyle w:val="Heading1"/>
         <w:jc w:val="center"/>
       </w:pPr>
     </w:p>
     <w:p>
       <w:pPr>
-        <w:pStyle w:val="Titre1"/>
+        <w:pStyle w:val="Heading1"/>
         <w:jc w:val="center"/>
       </w:pPr>
     </w:p>
     <w:p>
       <w:pPr>
-        <w:pStyle w:val="Titre1"/>
+        <w:pStyle w:val="Heading1"/>
         <w:jc w:val="center"/>
       </w:pPr>
     </w:p>
     <w:p>
       <w:pPr>
-        <w:pStyle w:val="Titre1"/>
+        <w:pStyle w:val="Heading1"/>
         <w:jc w:val="center"/>
       </w:pPr>
     </w:p>
     <w:p>
       <w:pPr>
-        <w:pStyle w:val="Titre1"/>
+        <w:pStyle w:val="Heading1"/>
         <w:jc w:val="center"/>
       </w:pPr>
     </w:p>
     <w:p>
       <w:pPr>
-        <w:pStyle w:val="Titre1"/>
+        <w:pStyle w:val="Heading1"/>
         <w:jc w:val="center"/>
       </w:pPr>
     </w:p>
     <w:p>
       <w:pPr>
-        <w:pStyle w:val="Titre1"/>
+        <w:pStyle w:val="Heading1"/>
         <w:jc w:val="center"/>
       </w:pPr>
       <w:bookmarkStart w:id="0" w:name="_Toc243513762"/>
@@ -99,7 +99,7 @@
       <w:sdtContent>
         <w:p>
           <w:pPr>
-            <w:pStyle w:val="En-ttedetabledesmatires"/>
+            <w:pStyle w:val="TOCHeading"/>
           </w:pPr>
           <w:r>
             <w:rPr>
@@ -110,7 +110,7 @@
         </w:p>
         <w:p>
           <w:pPr>
-            <w:pStyle w:val="TM1"/>
+            <w:pStyle w:val="TOC1"/>
             <w:tabs>
               <w:tab w:val="right" w:leader="dot" w:pos="9062"/>
             </w:tabs>
@@ -132,7 +132,7 @@
           <w:hyperlink w:anchor="_Toc243513762" w:history="1">
             <w:r>
               <w:rPr>
-                <w:rStyle w:val="Lienhypertexte"/>
+                <w:rStyle w:val="Hyperlink"/>
                 <w:noProof/>
               </w:rPr>
               <w:t>P_OO Shoot Me Up Rapport de Projet</w:t>
@@ -189,7 +189,7 @@
         </w:p>
         <w:p>
           <w:pPr>
-            <w:pStyle w:val="TM2"/>
+            <w:pStyle w:val="TOC2"/>
             <w:tabs>
               <w:tab w:val="right" w:leader="dot" w:pos="9062"/>
             </w:tabs>
@@ -202,7 +202,7 @@
           <w:hyperlink w:anchor="_Toc243513763" w:history="1">
             <w:r>
               <w:rPr>
-                <w:rStyle w:val="Lienhypertexte"/>
+                <w:rStyle w:val="Hyperlink"/>
                 <w:noProof/>
               </w:rPr>
               <w:t>Introduction</w:t>
@@ -259,7 +259,7 @@
         </w:p>
         <w:p>
           <w:pPr>
-            <w:pStyle w:val="TM3"/>
+            <w:pStyle w:val="TOC3"/>
             <w:tabs>
               <w:tab w:val="right" w:leader="dot" w:pos="9062"/>
             </w:tabs>
@@ -272,7 +272,7 @@
           <w:hyperlink w:anchor="_Toc243513764" w:history="1">
             <w:r>
               <w:rPr>
-                <w:rStyle w:val="Lienhypertexte"/>
+                <w:rStyle w:val="Hyperlink"/>
                 <w:noProof/>
               </w:rPr>
               <w:t>Objectifs produit</w:t>
@@ -329,7 +329,7 @@
         </w:p>
         <w:p>
           <w:pPr>
-            <w:pStyle w:val="TM3"/>
+            <w:pStyle w:val="TOC3"/>
             <w:tabs>
               <w:tab w:val="right" w:leader="dot" w:pos="9062"/>
             </w:tabs>
@@ -342,7 +342,7 @@
           <w:hyperlink w:anchor="_Toc243513765" w:history="1">
             <w:r>
               <w:rPr>
-                <w:rStyle w:val="Lienhypertexte"/>
+                <w:rStyle w:val="Hyperlink"/>
                 <w:noProof/>
               </w:rPr>
               <w:t>Objectifs pédagogiques</w:t>
@@ -399,7 +399,7 @@
         </w:p>
         <w:p>
           <w:pPr>
-            <w:pStyle w:val="TM2"/>
+            <w:pStyle w:val="TOC2"/>
             <w:tabs>
               <w:tab w:val="right" w:leader="dot" w:pos="9062"/>
             </w:tabs>
@@ -412,7 +412,7 @@
           <w:hyperlink w:anchor="_Toc243513766" w:history="1">
             <w:r>
               <w:rPr>
-                <w:rStyle w:val="Lienhypertexte"/>
+                <w:rStyle w:val="Hyperlink"/>
                 <w:noProof/>
               </w:rPr>
               <w:t>Analyse fonctionnelle</w:t>
@@ -469,7 +469,7 @@
         </w:p>
         <w:p>
           <w:pPr>
-            <w:pStyle w:val="TM2"/>
+            <w:pStyle w:val="TOC2"/>
             <w:tabs>
               <w:tab w:val="right" w:leader="dot" w:pos="9062"/>
             </w:tabs>
@@ -482,7 +482,7 @@
           <w:hyperlink w:anchor="_Toc243513767" w:history="1">
             <w:r>
               <w:rPr>
-                <w:rStyle w:val="Lienhypertexte"/>
+                <w:rStyle w:val="Hyperlink"/>
                 <w:noProof/>
               </w:rPr>
               <w:t>Planification Initiale</w:t>
@@ -539,7 +539,7 @@
         </w:p>
         <w:p>
           <w:pPr>
-            <w:pStyle w:val="TM2"/>
+            <w:pStyle w:val="TOC2"/>
             <w:tabs>
               <w:tab w:val="right" w:leader="dot" w:pos="9062"/>
             </w:tabs>
@@ -552,7 +552,7 @@
           <w:hyperlink w:anchor="_Toc243513768" w:history="1">
             <w:r>
               <w:rPr>
-                <w:rStyle w:val="Lienhypertexte"/>
+                <w:rStyle w:val="Hyperlink"/>
                 <w:noProof/>
               </w:rPr>
               <w:t>Utilisation de l’IA</w:t>
@@ -634,12 +634,12 @@
     </w:p>
     <w:p>
       <w:pPr>
-        <w:pStyle w:val="Titre2"/>
-      </w:pPr>
-    </w:p>
-    <w:p>
-      <w:pPr>
-        <w:pStyle w:val="Titre2"/>
+        <w:pStyle w:val="Heading2"/>
+      </w:pPr>
+    </w:p>
+    <w:p>
+      <w:pPr>
+        <w:pStyle w:val="Heading2"/>
       </w:pPr>
       <w:bookmarkStart w:id="1" w:name="_Toc243513763"/>
       <w:r>
@@ -649,7 +649,7 @@
     </w:p>
     <w:p>
       <w:pPr>
-        <w:pStyle w:val="Titre3"/>
+        <w:pStyle w:val="Heading3"/>
         <w:ind w:left="708"/>
       </w:pPr>
       <w:bookmarkStart w:id="2" w:name="_Toc243513764"/>
@@ -730,7 +730,15 @@
         <w:t xml:space="preserve"> sur le thème d’un employé de fast-food</w:t>
       </w:r>
       <w:r>
-        <w:t xml:space="preserve"> (Wacdonald’s)</w:t>
+        <w:t xml:space="preserve"> (</w:t>
+      </w:r>
+      <w:proofErr w:type="spellStart"/>
+      <w:r>
+        <w:t>Wacdonald’s</w:t>
+      </w:r>
+      <w:proofErr w:type="spellEnd"/>
+      <w:r>
+        <w:t>)</w:t>
       </w:r>
       <w:r>
         <w:t xml:space="preserve"> devant affronter sa hiérarchie et les robots voulant le </w:t>
@@ -744,7 +752,7 @@
     </w:p>
     <w:p>
       <w:pPr>
-        <w:pStyle w:val="Titre4"/>
+        <w:pStyle w:val="Heading4"/>
         <w:ind w:left="708"/>
       </w:pPr>
       <w:r>
@@ -858,12 +866,20 @@
         <w:t>leur attaque</w:t>
       </w:r>
       <w:r>
-        <w:t xml:space="preserve"> aura un cooldown.</w:t>
-      </w:r>
-    </w:p>
-    <w:p>
-      <w:pPr>
-        <w:pStyle w:val="Titre4"/>
+        <w:t xml:space="preserve"> aura un </w:t>
+      </w:r>
+      <w:proofErr w:type="spellStart"/>
+      <w:r>
+        <w:t>cooldown</w:t>
+      </w:r>
+      <w:proofErr w:type="spellEnd"/>
+      <w:r>
+        <w:t>.</w:t>
+      </w:r>
+    </w:p>
+    <w:p>
+      <w:pPr>
+        <w:pStyle w:val="Heading4"/>
         <w:ind w:left="708"/>
       </w:pPr>
       <w:r>
@@ -889,12 +905,20 @@
         <w:ind w:left="708"/>
       </w:pPr>
       <w:r>
-        <w:t>Le joueur pourra également se cacher derrière les bornes wacdonald’s pour se protéger.</w:t>
-      </w:r>
-    </w:p>
-    <w:p>
-      <w:pPr>
-        <w:pStyle w:val="Titre4"/>
+        <w:t xml:space="preserve">Le joueur pourra également se cacher derrière les bornes </w:t>
+      </w:r>
+      <w:proofErr w:type="spellStart"/>
+      <w:r>
+        <w:t>wacdonald’s</w:t>
+      </w:r>
+      <w:proofErr w:type="spellEnd"/>
+      <w:r>
+        <w:t xml:space="preserve"> pour se protéger.</w:t>
+      </w:r>
+    </w:p>
+    <w:p>
+      <w:pPr>
+        <w:pStyle w:val="Heading4"/>
         <w:ind w:left="708"/>
       </w:pPr>
       <w:r>
@@ -912,12 +936,20 @@
         <w:t>er</w:t>
       </w:r>
       <w:r>
-        <w:t xml:space="preserve"> 1'000’000$ afin de devenir actionnaire majoritaire du fast food. Le joueur perd la partie si sa vie tombe à 0.</w:t>
-      </w:r>
-    </w:p>
-    <w:p>
-      <w:pPr>
-        <w:pStyle w:val="Titre3"/>
+        <w:t xml:space="preserve"> 1'000’000$ afin de devenir actionnaire majoritaire du fast </w:t>
+      </w:r>
+      <w:proofErr w:type="spellStart"/>
+      <w:r>
+        <w:t>food</w:t>
+      </w:r>
+      <w:proofErr w:type="spellEnd"/>
+      <w:r>
+        <w:t>. Le joueur perd la partie si sa vie tombe à 0.</w:t>
+      </w:r>
+    </w:p>
+    <w:p>
+      <w:pPr>
+        <w:pStyle w:val="Heading3"/>
         <w:ind w:left="708"/>
       </w:pPr>
       <w:bookmarkStart w:id="3" w:name="_Toc243513765"/>
@@ -936,7 +968,7 @@
     </w:p>
     <w:p>
       <w:pPr>
-        <w:pStyle w:val="Paragraphedeliste"/>
+        <w:pStyle w:val="ListParagraph"/>
         <w:numPr>
           <w:ilvl w:val="0"/>
           <w:numId w:val="4"/>
@@ -948,7 +980,7 @@
     </w:p>
     <w:p>
       <w:pPr>
-        <w:pStyle w:val="Paragraphedeliste"/>
+        <w:pStyle w:val="ListParagraph"/>
         <w:numPr>
           <w:ilvl w:val="0"/>
           <w:numId w:val="4"/>
@@ -966,7 +998,7 @@
     </w:p>
     <w:p>
       <w:pPr>
-        <w:pStyle w:val="Paragraphedeliste"/>
+        <w:pStyle w:val="ListParagraph"/>
         <w:numPr>
           <w:ilvl w:val="0"/>
           <w:numId w:val="4"/>
@@ -978,7 +1010,7 @@
     </w:p>
     <w:p>
       <w:pPr>
-        <w:pStyle w:val="Paragraphedeliste"/>
+        <w:pStyle w:val="ListParagraph"/>
         <w:numPr>
           <w:ilvl w:val="0"/>
           <w:numId w:val="4"/>
@@ -990,7 +1022,7 @@
     </w:p>
     <w:p>
       <w:pPr>
-        <w:pStyle w:val="Paragraphedeliste"/>
+        <w:pStyle w:val="ListParagraph"/>
         <w:numPr>
           <w:ilvl w:val="0"/>
           <w:numId w:val="4"/>
@@ -1015,12 +1047,26 @@
         <w:rPr>
           <w:lang w:val="en-US"/>
         </w:rPr>
-        <w:t xml:space="preserve"> repository Github (release, issues)</w:t>
-      </w:r>
-    </w:p>
-    <w:p>
-      <w:pPr>
-        <w:pStyle w:val="Paragraphedeliste"/>
+        <w:t xml:space="preserve"> repository </w:t>
+      </w:r>
+      <w:proofErr w:type="spellStart"/>
+      <w:r>
+        <w:rPr>
+          <w:lang w:val="en-US"/>
+        </w:rPr>
+        <w:t>Github</w:t>
+      </w:r>
+      <w:proofErr w:type="spellEnd"/>
+      <w:r>
+        <w:rPr>
+          <w:lang w:val="en-US"/>
+        </w:rPr>
+        <w:t xml:space="preserve"> (release, issues)</w:t>
+      </w:r>
+    </w:p>
+    <w:p>
+      <w:pPr>
+        <w:pStyle w:val="ListParagraph"/>
         <w:numPr>
           <w:ilvl w:val="0"/>
           <w:numId w:val="4"/>
@@ -1038,7 +1084,7 @@
     </w:p>
     <w:p>
       <w:pPr>
-        <w:pStyle w:val="Titre2"/>
+        <w:pStyle w:val="Heading2"/>
       </w:pPr>
       <w:bookmarkStart w:id="4" w:name="_Toc243513766"/>
       <w:r>
@@ -1048,7 +1094,7 @@
     </w:p>
     <w:p>
       <w:pPr>
-        <w:pStyle w:val="Titre3"/>
+        <w:pStyle w:val="Heading3"/>
       </w:pPr>
       <w:r>
         <w:t>#1 — pouvoir faire bouger mon joueur avec WASD</w:t>
@@ -1056,7 +1102,17 @@
     </w:p>
     <w:p>
       <w:r>
-        <w:t>En tant que joueur, je veut pouvoir utiliser les touches WASD afin de pouvoir faire bouger mon joueur dans chaque direction.</w:t>
+        <w:t xml:space="preserve">En tant que joueur, je </w:t>
+      </w:r>
+      <w:proofErr w:type="spellStart"/>
+      <w:proofErr w:type="gramStart"/>
+      <w:r>
+        <w:t>veut</w:t>
+      </w:r>
+      <w:proofErr w:type="spellEnd"/>
+      <w:proofErr w:type="gramEnd"/>
+      <w:r>
+        <w:t xml:space="preserve"> pouvoir utiliser les touches WASD afin de pouvoir faire bouger mon joueur dans chaque direction.</w:t>
       </w:r>
     </w:p>
     <w:p>
@@ -1125,7 +1181,17 @@
         <w:ind w:left="708"/>
       </w:pPr>
       <w:r>
-        <w:t>• Le joueur va dans la direction correspondante tant que je maintient la touche</w:t>
+        <w:t xml:space="preserve">• Le joueur va dans la direction correspondante tant que je </w:t>
+      </w:r>
+      <w:proofErr w:type="spellStart"/>
+      <w:proofErr w:type="gramStart"/>
+      <w:r>
+        <w:t>maintient</w:t>
+      </w:r>
+      <w:proofErr w:type="spellEnd"/>
+      <w:proofErr w:type="gramEnd"/>
+      <w:r>
+        <w:t xml:space="preserve"> la touche</w:t>
       </w:r>
     </w:p>
     <w:p>
@@ -1141,7 +1207,15 @@
         <w:ind w:left="708"/>
       </w:pPr>
       <w:r>
-        <w:t>• Le joueur s'arrête lorsque il essaie d'aller dans les obstacles</w:t>
+        <w:t xml:space="preserve">• Le joueur s'arrête </w:t>
+      </w:r>
+      <w:proofErr w:type="gramStart"/>
+      <w:r>
+        <w:t>lorsque il</w:t>
+      </w:r>
+      <w:proofErr w:type="gramEnd"/>
+      <w:r>
+        <w:t xml:space="preserve"> essaie d'aller dans les obstacles</w:t>
       </w:r>
     </w:p>
     <w:p>
@@ -1157,21 +1231,61 @@
         <w:ind w:left="708"/>
       </w:pPr>
       <w:r>
-        <w:t>• Si j'appuie sur deux touches, le joueurs va en diagonal</w:t>
+        <w:t xml:space="preserve">• Si j'appuie sur deux touches, </w:t>
+      </w:r>
+      <w:proofErr w:type="gramStart"/>
+      <w:r>
+        <w:t>le joueurs</w:t>
+      </w:r>
+      <w:proofErr w:type="gramEnd"/>
+      <w:r>
+        <w:t xml:space="preserve"> va en diagonal</w:t>
       </w:r>
     </w:p>
     <w:p/>
     <w:p>
       <w:pPr>
-        <w:pStyle w:val="Titre3"/>
-      </w:pPr>
-      <w:r>
-        <w:t>#2 — pouvoir tirer des projectile sur mes enemies.</w:t>
-      </w:r>
-    </w:p>
-    <w:p>
-      <w:r>
-        <w:t>En tant que joueur, je souhaite pouvoir utiliser la touche clic gauche afin de pouvoir tirer des projectile sur mes enemies.</w:t>
+        <w:pStyle w:val="Heading3"/>
+      </w:pPr>
+      <w:r>
+        <w:t xml:space="preserve">#2 — pouvoir tirer </w:t>
+      </w:r>
+      <w:proofErr w:type="gramStart"/>
+      <w:r>
+        <w:t>des projectile</w:t>
+      </w:r>
+      <w:proofErr w:type="gramEnd"/>
+      <w:r>
+        <w:t xml:space="preserve"> sur mes </w:t>
+      </w:r>
+      <w:proofErr w:type="spellStart"/>
+      <w:r>
+        <w:t>enemies</w:t>
+      </w:r>
+      <w:proofErr w:type="spellEnd"/>
+      <w:r>
+        <w:t>.</w:t>
+      </w:r>
+    </w:p>
+    <w:p>
+      <w:r>
+        <w:t xml:space="preserve">En tant que joueur, je souhaite pouvoir utiliser la touche clic gauche afin de pouvoir tirer </w:t>
+      </w:r>
+      <w:proofErr w:type="gramStart"/>
+      <w:r>
+        <w:t>des projectile</w:t>
+      </w:r>
+      <w:proofErr w:type="gramEnd"/>
+      <w:r>
+        <w:t xml:space="preserve"> sur mes </w:t>
+      </w:r>
+      <w:proofErr w:type="spellStart"/>
+      <w:r>
+        <w:t>enemies</w:t>
+      </w:r>
+      <w:proofErr w:type="spellEnd"/>
+      <w:r>
+        <w:t>.</w:t>
       </w:r>
     </w:p>
     <w:p>
@@ -1242,21 +1356,37 @@
       </w:pPr>
       <w:r>
         <w:lastRenderedPageBreak/>
-        <w:t>• Le projectile est détruit si il rencontre le bord de la carte</w:t>
-      </w:r>
-    </w:p>
-    <w:p>
-      <w:pPr>
-        <w:ind w:left="708"/>
-      </w:pPr>
-      <w:r>
-        <w:t>• Le projectile à un cooldown de 1sec après avoir été tiré.</w:t>
+        <w:t xml:space="preserve">• Le projectile est détruit </w:t>
+      </w:r>
+      <w:proofErr w:type="gramStart"/>
+      <w:r>
+        <w:t>si il</w:t>
+      </w:r>
+      <w:proofErr w:type="gramEnd"/>
+      <w:r>
+        <w:t xml:space="preserve"> rencontre le bord de la carte</w:t>
+      </w:r>
+    </w:p>
+    <w:p>
+      <w:pPr>
+        <w:ind w:left="708"/>
+      </w:pPr>
+      <w:r>
+        <w:t xml:space="preserve">• Le projectile à un </w:t>
+      </w:r>
+      <w:proofErr w:type="spellStart"/>
+      <w:r>
+        <w:t>cooldown</w:t>
+      </w:r>
+      <w:proofErr w:type="spellEnd"/>
+      <w:r>
+        <w:t xml:space="preserve"> de 1sec après avoir été tiré.</w:t>
       </w:r>
     </w:p>
     <w:p/>
     <w:p>
       <w:pPr>
-        <w:pStyle w:val="Titre3"/>
+        <w:pStyle w:val="Heading3"/>
       </w:pPr>
       <w:r>
         <w:t>#3 — pouvoir faire des dégâts de corp à corp.</w:t>
@@ -1264,7 +1394,23 @@
     </w:p>
     <w:p>
       <w:r>
-        <w:t>En tant que joueur, je souhaite pouvoir utiliser la touche clic gauche afin de pouvoir tirer des projectile sur mes enemies.</w:t>
+        <w:t xml:space="preserve">En tant que joueur, je souhaite pouvoir utiliser la touche clic gauche afin de pouvoir tirer </w:t>
+      </w:r>
+      <w:proofErr w:type="gramStart"/>
+      <w:r>
+        <w:t>des projectile</w:t>
+      </w:r>
+      <w:proofErr w:type="gramEnd"/>
+      <w:r>
+        <w:t xml:space="preserve"> sur mes </w:t>
+      </w:r>
+      <w:proofErr w:type="spellStart"/>
+      <w:r>
+        <w:t>enemies</w:t>
+      </w:r>
+      <w:proofErr w:type="spellEnd"/>
+      <w:r>
+        <w:t>.</w:t>
       </w:r>
     </w:p>
     <w:p>
@@ -1334,24 +1480,48 @@
         <w:ind w:left="708"/>
       </w:pPr>
       <w:r>
-        <w:t>• Le projectile est détruit si il rencontre le bord de la carte</w:t>
-      </w:r>
-    </w:p>
-    <w:p>
-      <w:pPr>
-        <w:ind w:left="708"/>
-      </w:pPr>
-      <w:r>
-        <w:t>• Le projectile à un cooldown de 1sec après avoir été tiré.</w:t>
+        <w:t xml:space="preserve">• Le projectile est détruit </w:t>
+      </w:r>
+      <w:proofErr w:type="gramStart"/>
+      <w:r>
+        <w:t>si il</w:t>
+      </w:r>
+      <w:proofErr w:type="gramEnd"/>
+      <w:r>
+        <w:t xml:space="preserve"> rencontre le bord de la carte</w:t>
+      </w:r>
+    </w:p>
+    <w:p>
+      <w:pPr>
+        <w:ind w:left="708"/>
+      </w:pPr>
+      <w:r>
+        <w:t xml:space="preserve">• Le projectile à un </w:t>
+      </w:r>
+      <w:proofErr w:type="spellStart"/>
+      <w:r>
+        <w:t>cooldown</w:t>
+      </w:r>
+      <w:proofErr w:type="spellEnd"/>
+      <w:r>
+        <w:t xml:space="preserve"> de 1sec après avoir été tiré.</w:t>
       </w:r>
     </w:p>
     <w:p/>
     <w:p>
       <w:pPr>
-        <w:pStyle w:val="Titre3"/>
-      </w:pPr>
-      <w:r>
-        <w:t>#4 — En temps que joueur je souhaite avoir des ennemis de type manager afin de pouvoir gagner de l'argent</w:t>
+        <w:pStyle w:val="Heading3"/>
+      </w:pPr>
+      <w:r>
+        <w:t xml:space="preserve">#4 — En </w:t>
+      </w:r>
+      <w:proofErr w:type="spellStart"/>
+      <w:r>
+        <w:t>temps</w:t>
+      </w:r>
+      <w:proofErr w:type="spellEnd"/>
+      <w:r>
+        <w:t xml:space="preserve"> que joueur je souhaite avoir des ennemis de type manager afin de pouvoir gagner de l'argent</w:t>
       </w:r>
     </w:p>
     <w:p>
@@ -1419,7 +1589,15 @@
         <w:ind w:left="708"/>
       </w:pPr>
       <w:r>
-        <w:t>• Un manager doit pouvoir se deplacer aléatoirement sur la carte</w:t>
+        <w:t xml:space="preserve">• Un manager doit pouvoir se </w:t>
+      </w:r>
+      <w:proofErr w:type="spellStart"/>
+      <w:r>
+        <w:t>deplacer</w:t>
+      </w:r>
+      <w:proofErr w:type="spellEnd"/>
+      <w:r>
+        <w:t xml:space="preserve"> aléatoirement sur la carte</w:t>
       </w:r>
     </w:p>
     <w:p>
@@ -1443,39 +1621,84 @@
         <w:ind w:left="708"/>
       </w:pPr>
       <w:r>
-        <w:t>• Les missiles burger disparaissent si ils touchent un manager</w:t>
-      </w:r>
-    </w:p>
-    <w:p>
-      <w:pPr>
-        <w:ind w:left="708"/>
-      </w:pPr>
-      <w:r>
-        <w:t>• Un manager prend 3PV de dégat quand touché par une attaque de corp à corp</w:t>
-      </w:r>
-    </w:p>
-    <w:p>
-      <w:pPr>
-        <w:ind w:left="708"/>
-      </w:pPr>
-      <w:r>
-        <w:t>• Un manager dans un rayons égal à la moitié de la largeur du joueur lors d'une attaque de mélée sera affécté</w:t>
-      </w:r>
-    </w:p>
-    <w:p>
-      <w:pPr>
-        <w:ind w:left="708"/>
-      </w:pPr>
-      <w:r>
-        <w:t>• Un manager prend 5PV de dégat quand touché par une attaque burger</w:t>
-      </w:r>
-    </w:p>
-    <w:p>
-      <w:pPr>
-        <w:ind w:left="708"/>
-      </w:pPr>
-      <w:r>
-        <w:t>• Un manager disparait lorsque ces points de vie sont inférieur ou égal à 0</w:t>
+        <w:t xml:space="preserve">• Les missiles burger disparaissent </w:t>
+      </w:r>
+      <w:proofErr w:type="gramStart"/>
+      <w:r>
+        <w:t>si ils</w:t>
+      </w:r>
+      <w:proofErr w:type="gramEnd"/>
+      <w:r>
+        <w:t xml:space="preserve"> touchent un manager</w:t>
+      </w:r>
+    </w:p>
+    <w:p>
+      <w:pPr>
+        <w:ind w:left="708"/>
+      </w:pPr>
+      <w:r>
+        <w:t xml:space="preserve">• Un manager prend 3PV de </w:t>
+      </w:r>
+      <w:proofErr w:type="spellStart"/>
+      <w:r>
+        <w:t>dégat</w:t>
+      </w:r>
+      <w:proofErr w:type="spellEnd"/>
+      <w:r>
+        <w:t xml:space="preserve"> quand touché par une attaque de corp à corp</w:t>
+      </w:r>
+    </w:p>
+    <w:p>
+      <w:pPr>
+        <w:ind w:left="708"/>
+      </w:pPr>
+      <w:r>
+        <w:t xml:space="preserve">• Un manager dans un rayons égal à la moitié de la largeur du joueur lors d'une attaque de </w:t>
+      </w:r>
+      <w:proofErr w:type="spellStart"/>
+      <w:r>
+        <w:t>mélée</w:t>
+      </w:r>
+      <w:proofErr w:type="spellEnd"/>
+      <w:r>
+        <w:t xml:space="preserve"> sera </w:t>
+      </w:r>
+      <w:proofErr w:type="spellStart"/>
+      <w:r>
+        <w:t>affécté</w:t>
+      </w:r>
+      <w:proofErr w:type="spellEnd"/>
+    </w:p>
+    <w:p>
+      <w:pPr>
+        <w:ind w:left="708"/>
+      </w:pPr>
+      <w:r>
+        <w:t xml:space="preserve">• Un manager prend 5PV de </w:t>
+      </w:r>
+      <w:proofErr w:type="spellStart"/>
+      <w:r>
+        <w:t>dégat</w:t>
+      </w:r>
+      <w:proofErr w:type="spellEnd"/>
+      <w:r>
+        <w:t xml:space="preserve"> quand touché par une attaque burger</w:t>
+      </w:r>
+    </w:p>
+    <w:p>
+      <w:pPr>
+        <w:ind w:left="708"/>
+      </w:pPr>
+      <w:r>
+        <w:t xml:space="preserve">• Un manager disparait lorsque ces points de vie sont </w:t>
+      </w:r>
+      <w:proofErr w:type="gramStart"/>
+      <w:r>
+        <w:t>inférieur ou égal</w:t>
+      </w:r>
+      <w:proofErr w:type="gramEnd"/>
+      <w:r>
+        <w:t xml:space="preserve"> à 0</w:t>
       </w:r>
     </w:p>
     <w:p>
@@ -1491,13 +1714,21 @@
         <w:ind w:left="708"/>
       </w:pPr>
       <w:r>
-        <w:t>• Il doit toujours y avoir 7 manager sur la carte</w:t>
+        <w:t xml:space="preserve">• Il doit toujours y avoir 7 </w:t>
+      </w:r>
+      <w:proofErr w:type="gramStart"/>
+      <w:r>
+        <w:t>manager</w:t>
+      </w:r>
+      <w:proofErr w:type="gramEnd"/>
+      <w:r>
+        <w:t xml:space="preserve"> sur la carte</w:t>
       </w:r>
     </w:p>
     <w:p/>
     <w:p>
       <w:pPr>
-        <w:pStyle w:val="Titre3"/>
+        <w:pStyle w:val="Heading3"/>
       </w:pPr>
       <w:r>
         <w:t>#5 — avoir des ennemis de type robot</w:t>
@@ -1505,7 +1736,15 @@
     </w:p>
     <w:p>
       <w:r>
-        <w:t>En temps que joueur je souhaite avoir des ennemis de type robot afin de pouvoir gagner de l'argent</w:t>
+        <w:t xml:space="preserve">En </w:t>
+      </w:r>
+      <w:proofErr w:type="spellStart"/>
+      <w:r>
+        <w:t>temps</w:t>
+      </w:r>
+      <w:proofErr w:type="spellEnd"/>
+      <w:r>
+        <w:t xml:space="preserve"> que joueur je souhaite avoir des ennemis de type robot afin de pouvoir gagner de l'argent</w:t>
       </w:r>
     </w:p>
     <w:p/>
@@ -1569,7 +1808,15 @@
         <w:ind w:left="708"/>
       </w:pPr>
       <w:r>
-        <w:t>• Un robot se déplace sur la carte en essayant de toujours se positionner directement au dessus/dessous/à droite/ à gauche du joueur</w:t>
+        <w:t xml:space="preserve">• Un robot se déplace sur la carte en essayant de toujours se positionner directement </w:t>
+      </w:r>
+      <w:proofErr w:type="spellStart"/>
+      <w:r>
+        <w:t>au dessus</w:t>
+      </w:r>
+      <w:proofErr w:type="spellEnd"/>
+      <w:r>
+        <w:t>/dessous/à droite/ à gauche du joueur</w:t>
       </w:r>
     </w:p>
     <w:p>
@@ -1601,52 +1848,105 @@
         <w:ind w:left="708"/>
       </w:pPr>
       <w:r>
-        <w:t>• Les missiles burger disparaissent si ils touchent un robot</w:t>
-      </w:r>
-    </w:p>
-    <w:p>
-      <w:pPr>
-        <w:ind w:left="708"/>
-      </w:pPr>
-      <w:r>
-        <w:t>• Un robot prend 3PV de dégat quand touché par une attaque de corp à corp</w:t>
-      </w:r>
-    </w:p>
-    <w:p>
-      <w:pPr>
-        <w:ind w:left="708"/>
-      </w:pPr>
-      <w:r>
-        <w:t>• Un robot dans un rayons égal à la moitié de la largeur du joueur lors d'une attaque de mélée sera affécté</w:t>
-      </w:r>
-    </w:p>
-    <w:p>
-      <w:pPr>
-        <w:ind w:left="708"/>
-      </w:pPr>
-      <w:r>
-        <w:t>• Un robot prend 5PV de dégat quand touché par une attaque burger</w:t>
-      </w:r>
-    </w:p>
-    <w:p>
-      <w:pPr>
-        <w:ind w:left="708"/>
-      </w:pPr>
-      <w:r>
-        <w:t>• Un robot disparait lorsque ces points de vie sont inférieur ou égal à 0</w:t>
-      </w:r>
-    </w:p>
-    <w:p>
-      <w:pPr>
-        <w:ind w:left="708"/>
-      </w:pPr>
-      <w:r>
-        <w:t>• Dès que le joueur atteint le niveau 2, il doit toujours y avoir 4 robot sur la carte</w:t>
-      </w:r>
-    </w:p>
-    <w:p>
-      <w:pPr>
-        <w:pStyle w:val="Titre3"/>
+        <w:t xml:space="preserve">• Les missiles burger disparaissent </w:t>
+      </w:r>
+      <w:proofErr w:type="gramStart"/>
+      <w:r>
+        <w:t>si ils</w:t>
+      </w:r>
+      <w:proofErr w:type="gramEnd"/>
+      <w:r>
+        <w:t xml:space="preserve"> touchent un robot</w:t>
+      </w:r>
+    </w:p>
+    <w:p>
+      <w:pPr>
+        <w:ind w:left="708"/>
+      </w:pPr>
+      <w:r>
+        <w:t xml:space="preserve">• Un robot prend 3PV de </w:t>
+      </w:r>
+      <w:proofErr w:type="spellStart"/>
+      <w:r>
+        <w:t>dégat</w:t>
+      </w:r>
+      <w:proofErr w:type="spellEnd"/>
+      <w:r>
+        <w:t xml:space="preserve"> quand touché par une attaque de corp à corp</w:t>
+      </w:r>
+    </w:p>
+    <w:p>
+      <w:pPr>
+        <w:ind w:left="708"/>
+      </w:pPr>
+      <w:r>
+        <w:t xml:space="preserve">• Un robot dans un rayons égal à la moitié de la largeur du joueur lors d'une attaque de </w:t>
+      </w:r>
+      <w:proofErr w:type="spellStart"/>
+      <w:r>
+        <w:t>mélée</w:t>
+      </w:r>
+      <w:proofErr w:type="spellEnd"/>
+      <w:r>
+        <w:t xml:space="preserve"> sera </w:t>
+      </w:r>
+      <w:proofErr w:type="spellStart"/>
+      <w:r>
+        <w:t>affécté</w:t>
+      </w:r>
+      <w:proofErr w:type="spellEnd"/>
+    </w:p>
+    <w:p>
+      <w:pPr>
+        <w:ind w:left="708"/>
+      </w:pPr>
+      <w:r>
+        <w:t xml:space="preserve">• Un robot prend 5PV de </w:t>
+      </w:r>
+      <w:proofErr w:type="spellStart"/>
+      <w:r>
+        <w:t>dégat</w:t>
+      </w:r>
+      <w:proofErr w:type="spellEnd"/>
+      <w:r>
+        <w:t xml:space="preserve"> quand touché par une attaque burger</w:t>
+      </w:r>
+    </w:p>
+    <w:p>
+      <w:pPr>
+        <w:ind w:left="708"/>
+      </w:pPr>
+      <w:r>
+        <w:t xml:space="preserve">• Un robot disparait lorsque ces points de vie sont </w:t>
+      </w:r>
+      <w:proofErr w:type="gramStart"/>
+      <w:r>
+        <w:t>inférieur ou égal</w:t>
+      </w:r>
+      <w:proofErr w:type="gramEnd"/>
+      <w:r>
+        <w:t xml:space="preserve"> à 0</w:t>
+      </w:r>
+    </w:p>
+    <w:p>
+      <w:pPr>
+        <w:ind w:left="708"/>
+      </w:pPr>
+      <w:r>
+        <w:t xml:space="preserve">• Dès que le joueur atteint le niveau 2, il doit toujours y avoir 4 </w:t>
+      </w:r>
+      <w:proofErr w:type="gramStart"/>
+      <w:r>
+        <w:t>robot</w:t>
+      </w:r>
+      <w:proofErr w:type="gramEnd"/>
+      <w:r>
+        <w:t xml:space="preserve"> sur la carte</w:t>
+      </w:r>
+    </w:p>
+    <w:p>
+      <w:pPr>
+        <w:pStyle w:val="Heading3"/>
       </w:pPr>
       <w:r>
         <w:t>#6 — les ennemis de type robot peuvent me tirer dessus</w:t>
@@ -1654,8 +1954,13 @@
     </w:p>
     <w:p>
       <w:r>
-        <w:t>En tant que joueur je souhaite que les ennemis de type robot puisse me tirer dessus afin d'ajouter du challenge</w:t>
-      </w:r>
+        <w:t xml:space="preserve">En tant que joueur je souhaite que les ennemis de type robot puisse me tirer dessus afin d'ajouter du </w:t>
+      </w:r>
+      <w:proofErr w:type="gramStart"/>
+      <w:r>
+        <w:t>challenge</w:t>
+      </w:r>
+      <w:proofErr w:type="gramEnd"/>
     </w:p>
     <w:p>
       <w:r>
@@ -1741,28 +2046,84 @@
       </w:pPr>
       <w:r>
         <w:lastRenderedPageBreak/>
-        <w:t>• Les faisceaux font 25PV de dégats au joueur peut importe le niveau du robot qui les a tiré.</w:t>
-      </w:r>
-    </w:p>
-    <w:p>
-      <w:pPr>
-        <w:ind w:left="708"/>
-      </w:pPr>
-      <w:r>
-        <w:t>• Les faisceaux disparaissent si ils touchent un obstacle.</w:t>
-      </w:r>
-    </w:p>
-    <w:p>
-      <w:pPr>
-        <w:ind w:left="708"/>
-      </w:pPr>
-      <w:r>
-        <w:t>• Un robot prends 3 sec à lancer une attaque faisceau lorsqu'il est en position. Il ne peut plus bouger pendant cette période</w:t>
-      </w:r>
-    </w:p>
-    <w:p>
-      <w:pPr>
-        <w:pStyle w:val="Titre3"/>
+        <w:t xml:space="preserve">• Les faisceaux font 25PV de </w:t>
+      </w:r>
+      <w:proofErr w:type="spellStart"/>
+      <w:r>
+        <w:t>dégats</w:t>
+      </w:r>
+      <w:proofErr w:type="spellEnd"/>
+      <w:r>
+        <w:t xml:space="preserve"> au joueur </w:t>
+      </w:r>
+      <w:proofErr w:type="spellStart"/>
+      <w:r>
+        <w:t>peut</w:t>
+      </w:r>
+      <w:proofErr w:type="spellEnd"/>
+      <w:r>
+        <w:t xml:space="preserve"> </w:t>
+      </w:r>
+      <w:proofErr w:type="spellStart"/>
+      <w:r>
+        <w:t>importe</w:t>
+      </w:r>
+      <w:proofErr w:type="spellEnd"/>
+      <w:r>
+        <w:t xml:space="preserve"> le niveau du robot qui les a </w:t>
+      </w:r>
+      <w:proofErr w:type="gramStart"/>
+      <w:r>
+        <w:t>tiré</w:t>
+      </w:r>
+      <w:proofErr w:type="gramEnd"/>
+      <w:r>
+        <w:t>.</w:t>
+      </w:r>
+    </w:p>
+    <w:p>
+      <w:pPr>
+        <w:ind w:left="708"/>
+      </w:pPr>
+      <w:r>
+        <w:t xml:space="preserve">• Les faisceaux disparaissent </w:t>
+      </w:r>
+      <w:proofErr w:type="gramStart"/>
+      <w:r>
+        <w:t>si ils</w:t>
+      </w:r>
+      <w:proofErr w:type="gramEnd"/>
+      <w:r>
+        <w:t xml:space="preserve"> touchent un obstacle.</w:t>
+      </w:r>
+    </w:p>
+    <w:p>
+      <w:pPr>
+        <w:ind w:left="708"/>
+      </w:pPr>
+      <w:r>
+        <w:t xml:space="preserve">• Un robot </w:t>
+      </w:r>
+      <w:proofErr w:type="gramStart"/>
+      <w:r>
+        <w:t>prends</w:t>
+      </w:r>
+      <w:proofErr w:type="gramEnd"/>
+      <w:r>
+        <w:t xml:space="preserve"> 3 </w:t>
+      </w:r>
+      <w:proofErr w:type="gramStart"/>
+      <w:r>
+        <w:t>sec</w:t>
+      </w:r>
+      <w:proofErr w:type="gramEnd"/>
+      <w:r>
+        <w:t xml:space="preserve"> à lancer une attaque faisceau lorsqu'il est en position. Il ne peut plus bouger pendant cette période</w:t>
+      </w:r>
+    </w:p>
+    <w:p>
+      <w:pPr>
+        <w:pStyle w:val="Heading3"/>
       </w:pPr>
       <w:r>
         <w:t>#7 — les ennemis de type manager peuvent me tirer dessus</w:t>
@@ -1770,8 +2131,21 @@
     </w:p>
     <w:p>
       <w:r>
-        <w:t>En tant que joueur je veut que les ennemis de type manager puisse me tirer dessus afin d'ajouter du challenge</w:t>
-      </w:r>
+        <w:t xml:space="preserve">En tant que joueur je </w:t>
+      </w:r>
+      <w:proofErr w:type="spellStart"/>
+      <w:r>
+        <w:t>veut</w:t>
+      </w:r>
+      <w:proofErr w:type="spellEnd"/>
+      <w:r>
+        <w:t xml:space="preserve"> que les ennemis de type manager puisse me tirer dessus afin d'ajouter du </w:t>
+      </w:r>
+      <w:proofErr w:type="gramStart"/>
+      <w:r>
+        <w:t>challenge</w:t>
+      </w:r>
+      <w:proofErr w:type="gramEnd"/>
     </w:p>
     <w:p>
       <w:r>
@@ -1840,7 +2214,23 @@
         <w:ind w:left="708"/>
       </w:pPr>
       <w:r>
-        <w:t>• Les sacs vont en directions de la position que le joueur avait quand le sacs à été lancé.</w:t>
+        <w:t xml:space="preserve">• Les sacs vont en directions de la position que le joueur avait quand </w:t>
+      </w:r>
+      <w:proofErr w:type="gramStart"/>
+      <w:r>
+        <w:t>le sacs</w:t>
+      </w:r>
+      <w:proofErr w:type="gramEnd"/>
+      <w:r>
+        <w:t xml:space="preserve"> </w:t>
+      </w:r>
+      <w:proofErr w:type="spellStart"/>
+      <w:r>
+        <w:t>à</w:t>
+      </w:r>
+      <w:proofErr w:type="spellEnd"/>
+      <w:r>
+        <w:t xml:space="preserve"> été lancé.</w:t>
       </w:r>
     </w:p>
     <w:p>
@@ -1856,20 +2246,52 @@
         <w:ind w:left="708"/>
       </w:pPr>
       <w:r>
-        <w:t>• Le sac fait 10PV de dégat si il à été lancé par un ennemis manager de niveau 1, 15 PV si c'est un manager de niveau 2 et 20PV si c'est un manager de niveau 3.</w:t>
-      </w:r>
-    </w:p>
-    <w:p>
-      <w:pPr>
-        <w:ind w:left="708"/>
-      </w:pPr>
-      <w:r>
-        <w:t>• Un sac doit prendre 4 sec à être recharger par un ennemi de type manager</w:t>
-      </w:r>
-    </w:p>
-    <w:p>
-      <w:pPr>
-        <w:pStyle w:val="Titre3"/>
+        <w:t xml:space="preserve">• Le sac fait 10PV de </w:t>
+      </w:r>
+      <w:proofErr w:type="spellStart"/>
+      <w:r>
+        <w:t>dégat</w:t>
+      </w:r>
+      <w:proofErr w:type="spellEnd"/>
+      <w:r>
+        <w:t xml:space="preserve"> </w:t>
+      </w:r>
+      <w:proofErr w:type="gramStart"/>
+      <w:r>
+        <w:t>si il</w:t>
+      </w:r>
+      <w:proofErr w:type="gramEnd"/>
+      <w:r>
+        <w:t xml:space="preserve"> </w:t>
+      </w:r>
+      <w:proofErr w:type="spellStart"/>
+      <w:r>
+        <w:t>à</w:t>
+      </w:r>
+      <w:proofErr w:type="spellEnd"/>
+      <w:r>
+        <w:t xml:space="preserve"> été lancé par un ennemis manager de niveau 1, 15 PV si c'est un manager de niveau 2 et 20PV si c'est un manager de niveau 3.</w:t>
+      </w:r>
+    </w:p>
+    <w:p>
+      <w:pPr>
+        <w:ind w:left="708"/>
+      </w:pPr>
+      <w:r>
+        <w:t xml:space="preserve">• Un sac doit prendre 4 </w:t>
+      </w:r>
+      <w:proofErr w:type="gramStart"/>
+      <w:r>
+        <w:t>sec</w:t>
+      </w:r>
+      <w:proofErr w:type="gramEnd"/>
+      <w:r>
+        <w:t xml:space="preserve"> à être recharger par un ennemi de type manager</w:t>
+      </w:r>
+    </w:p>
+    <w:p>
+      <w:pPr>
+        <w:pStyle w:val="Heading3"/>
       </w:pPr>
       <w:r>
         <w:t>#8 — avoir une barre de vie</w:t>
@@ -1956,12 +2378,20 @@
         <w:ind w:left="708"/>
       </w:pPr>
       <w:r>
-        <w:t>• La barre de vie se situt en bas à gauche</w:t>
-      </w:r>
-    </w:p>
-    <w:p>
-      <w:pPr>
-        <w:pStyle w:val="Titre3"/>
+        <w:t xml:space="preserve">• La barre de vie se </w:t>
+      </w:r>
+      <w:proofErr w:type="spellStart"/>
+      <w:r>
+        <w:t>situt</w:t>
+      </w:r>
+      <w:proofErr w:type="spellEnd"/>
+      <w:r>
+        <w:t xml:space="preserve"> en bas à gauche</w:t>
+      </w:r>
+    </w:p>
+    <w:p>
+      <w:pPr>
+        <w:pStyle w:val="Heading3"/>
       </w:pPr>
       <w:r>
         <w:t>#9 — avoir une barre d'argent</w:t>
@@ -2039,23 +2469,55 @@
         <w:ind w:left="708"/>
       </w:pPr>
       <w:r>
-        <w:t>• Lorsque un manager meurt, le nombre d'argent du joueur augment de 5'000$</w:t>
-      </w:r>
-    </w:p>
-    <w:p>
-      <w:pPr>
-        <w:ind w:left="708"/>
-      </w:pPr>
-      <w:r>
-        <w:t>• L'argent que fait tomber le manager est quadruplé et ses PV sont doublé quand le joueur atteint 100'000$ (manager de niveau 2). Il le sont à nouveaux quand il atteint 500'000$ (manager de niveau 3).</w:t>
-      </w:r>
-    </w:p>
-    <w:p>
-      <w:pPr>
-        <w:pStyle w:val="Titre3"/>
-      </w:pPr>
-      <w:r>
-        <w:t>#10 — avoir des obstacles afin de pouvoir me protéger des projectiles ennemies.</w:t>
+        <w:t xml:space="preserve">• </w:t>
+      </w:r>
+      <w:proofErr w:type="gramStart"/>
+      <w:r>
+        <w:t>Lorsque un</w:t>
+      </w:r>
+      <w:proofErr w:type="gramEnd"/>
+      <w:r>
+        <w:t xml:space="preserve"> manager meurt, le nombre d'argent du joueur </w:t>
+      </w:r>
+      <w:proofErr w:type="spellStart"/>
+      <w:r>
+        <w:t>augment</w:t>
+      </w:r>
+      <w:proofErr w:type="spellEnd"/>
+      <w:r>
+        <w:t xml:space="preserve"> de 5'000$</w:t>
+      </w:r>
+    </w:p>
+    <w:p>
+      <w:pPr>
+        <w:ind w:left="708"/>
+      </w:pPr>
+      <w:r>
+        <w:t xml:space="preserve">• L'argent que fait tomber le manager est quadruplé et ses PV sont doublé quand le joueur atteint 100'000$ (manager de niveau 2). </w:t>
+      </w:r>
+      <w:proofErr w:type="gramStart"/>
+      <w:r>
+        <w:t>Il le sont</w:t>
+      </w:r>
+      <w:proofErr w:type="gramEnd"/>
+      <w:r>
+        <w:t xml:space="preserve"> à nouveaux quand il atteint 500'000$ (manager de niveau 3).</w:t>
+      </w:r>
+    </w:p>
+    <w:p>
+      <w:pPr>
+        <w:pStyle w:val="Heading3"/>
+      </w:pPr>
+      <w:r>
+        <w:t xml:space="preserve">#10 — avoir des obstacles afin de pouvoir me protéger </w:t>
+      </w:r>
+      <w:proofErr w:type="gramStart"/>
+      <w:r>
+        <w:t>des projectiles ennemies</w:t>
+      </w:r>
+      <w:proofErr w:type="gramEnd"/>
+      <w:r>
+        <w:t>.</w:t>
       </w:r>
     </w:p>
     <w:p>
@@ -2065,7 +2527,23 @@
         </w:rPr>
       </w:pPr>
       <w:r>
-        <w:t>En tant que joueur je veut avoir des obstacles afin de pouvoir me protéger des projectiles ennemies.</w:t>
+        <w:t xml:space="preserve">En tant que joueur je </w:t>
+      </w:r>
+      <w:proofErr w:type="spellStart"/>
+      <w:r>
+        <w:t>veut</w:t>
+      </w:r>
+      <w:proofErr w:type="spellEnd"/>
+      <w:r>
+        <w:t xml:space="preserve"> avoir des obstacles afin de pouvoir me protéger </w:t>
+      </w:r>
+      <w:proofErr w:type="gramStart"/>
+      <w:r>
+        <w:t>des projectiles ennemies</w:t>
+      </w:r>
+      <w:proofErr w:type="gramEnd"/>
+      <w:r>
+        <w:t>.</w:t>
       </w:r>
     </w:p>
     <w:p>
@@ -2144,36 +2622,65 @@
         <w:ind w:left="708"/>
       </w:pPr>
       <w:r>
-        <w:t>• L'obstacle est indesctuctible</w:t>
-      </w:r>
-    </w:p>
-    <w:p>
-      <w:pPr>
-        <w:ind w:left="708"/>
-      </w:pPr>
-      <w:r>
-        <w:t>• Les ennemis et les projectils ne peuvent pas passer à travers les obstacles</w:t>
-      </w:r>
-    </w:p>
-    <w:p>
-      <w:pPr>
-        <w:ind w:left="708"/>
-      </w:pPr>
-      <w:r>
-        <w:t>• Les missiles burger et les faisceaux disparaissent si ils touchent un obstacle</w:t>
-      </w:r>
-    </w:p>
-    <w:p>
-      <w:pPr>
-        <w:ind w:left="708"/>
-      </w:pPr>
-      <w:r>
-        <w:t>• Un robot ou un manager doit trouver une nouvelle destination si il bute sur un obstacle</w:t>
-      </w:r>
-    </w:p>
-    <w:p>
-      <w:pPr>
-        <w:pStyle w:val="Titre2"/>
+        <w:t xml:space="preserve">• L'obstacle est </w:t>
+      </w:r>
+      <w:proofErr w:type="spellStart"/>
+      <w:r>
+        <w:t>indesctuctible</w:t>
+      </w:r>
+      <w:proofErr w:type="spellEnd"/>
+    </w:p>
+    <w:p>
+      <w:pPr>
+        <w:ind w:left="708"/>
+      </w:pPr>
+      <w:r>
+        <w:t xml:space="preserve">• Les ennemis et les </w:t>
+      </w:r>
+      <w:proofErr w:type="spellStart"/>
+      <w:r>
+        <w:t>projectils</w:t>
+      </w:r>
+      <w:proofErr w:type="spellEnd"/>
+      <w:r>
+        <w:t xml:space="preserve"> ne peuvent pas passer à travers les obstacles</w:t>
+      </w:r>
+    </w:p>
+    <w:p>
+      <w:pPr>
+        <w:ind w:left="708"/>
+      </w:pPr>
+      <w:r>
+        <w:t xml:space="preserve">• Les missiles burger et les faisceaux disparaissent </w:t>
+      </w:r>
+      <w:proofErr w:type="gramStart"/>
+      <w:r>
+        <w:t>si ils</w:t>
+      </w:r>
+      <w:proofErr w:type="gramEnd"/>
+      <w:r>
+        <w:t xml:space="preserve"> touchent un obstacle</w:t>
+      </w:r>
+    </w:p>
+    <w:p>
+      <w:pPr>
+        <w:ind w:left="708"/>
+      </w:pPr>
+      <w:r>
+        <w:t xml:space="preserve">• Un robot ou un manager doit trouver une nouvelle destination </w:t>
+      </w:r>
+      <w:proofErr w:type="gramStart"/>
+      <w:r>
+        <w:t>si il</w:t>
+      </w:r>
+      <w:proofErr w:type="gramEnd"/>
+      <w:r>
+        <w:t xml:space="preserve"> bute sur un obstacle</w:t>
+      </w:r>
+    </w:p>
+    <w:p>
+      <w:pPr>
+        <w:pStyle w:val="Heading2"/>
       </w:pPr>
       <w:bookmarkStart w:id="5" w:name="_Toc243513767"/>
       <w:r>
@@ -2183,7 +2690,7 @@
     </w:p>
     <w:tbl>
       <w:tblPr>
-        <w:tblStyle w:val="Grilledutableau"/>
+        <w:tblStyle w:val="TableGrid"/>
         <w:tblW w:w="0" w:type="auto"/>
         <w:tblLook w:val="04A0" w:firstRow="1" w:lastRow="0" w:firstColumn="1" w:lastColumn="0" w:noHBand="0" w:noVBand="1"/>
       </w:tblPr>
@@ -2266,7 +2773,7 @@
             <w:hyperlink r:id="rId18" w:history="1">
               <w:r>
                 <w:rPr>
-                  <w:rStyle w:val="Lienhypertexte"/>
+                  <w:rStyle w:val="Hyperlink"/>
                 </w:rPr>
                 <w:t>Ajout du mouvement WASD</w:t>
               </w:r>
@@ -2291,11 +2798,104 @@
           </w:tcPr>
           <w:p>
             <w:hyperlink r:id="rId19" w:history="1">
+              <w:proofErr w:type="gramStart"/>
               <w:r>
                 <w:rPr>
-                  <w:rStyle w:val="Lienhypertexte"/>
+                  <w:rStyle w:val="Hyperlink"/>
                 </w:rPr>
-                <w:t>pouvoir tirer des projectile sur mes enemies</w:t>
+                <w:t>pouvoir</w:t>
+              </w:r>
+              <w:proofErr w:type="gramEnd"/>
+              <w:r>
+                <w:rPr>
+                  <w:rStyle w:val="Hyperlink"/>
+                </w:rPr>
+                <w:t xml:space="preserve"> tirer </w:t>
+              </w:r>
+              <w:proofErr w:type="gramStart"/>
+              <w:r>
+                <w:rPr>
+                  <w:rStyle w:val="Hyperlink"/>
+                </w:rPr>
+                <w:t>des projectile</w:t>
+              </w:r>
+              <w:proofErr w:type="gramEnd"/>
+              <w:r>
+                <w:rPr>
+                  <w:rStyle w:val="Hyperlink"/>
+                </w:rPr>
+                <w:t xml:space="preserve"> sur mes </w:t>
+              </w:r>
+              <w:proofErr w:type="spellStart"/>
+              <w:r>
+                <w:rPr>
+                  <w:rStyle w:val="Hyperlink"/>
+                </w:rPr>
+                <w:t>enemies</w:t>
+              </w:r>
+              <w:proofErr w:type="spellEnd"/>
+            </w:hyperlink>
+          </w:p>
+        </w:tc>
+      </w:tr>
+      <w:tr>
+        <w:tc>
+          <w:tcPr>
+            <w:tcW w:w="2122" w:type="dxa"/>
+          </w:tcPr>
+          <w:p>
+            <w:r>
+              <w:t>25.09.2026</w:t>
+            </w:r>
+          </w:p>
+        </w:tc>
+        <w:tc>
+          <w:tcPr>
+            <w:tcW w:w="6940" w:type="dxa"/>
+          </w:tcPr>
+          <w:p>
+            <w:hyperlink r:id="rId20" w:history="1">
+              <w:proofErr w:type="gramStart"/>
+              <w:r>
+                <w:rPr>
+                  <w:rStyle w:val="Hyperlink"/>
+                </w:rPr>
+                <w:t>pouvoir</w:t>
+              </w:r>
+              <w:proofErr w:type="gramEnd"/>
+              <w:r>
+                <w:rPr>
+                  <w:rStyle w:val="Hyperlink"/>
+                </w:rPr>
+                <w:t xml:space="preserve"> faire des </w:t>
+              </w:r>
+              <w:proofErr w:type="spellStart"/>
+              <w:r>
+                <w:rPr>
+                  <w:rStyle w:val="Hyperlink"/>
+                </w:rPr>
+                <w:t>degats</w:t>
+              </w:r>
+              <w:proofErr w:type="spellEnd"/>
+              <w:r>
+                <w:rPr>
+                  <w:rStyle w:val="Hyperlink"/>
+                </w:rPr>
+                <w:t xml:space="preserve"> </w:t>
+              </w:r>
+              <w:proofErr w:type="gramStart"/>
+              <w:r>
+                <w:rPr>
+                  <w:rStyle w:val="Hyperlink"/>
+                </w:rPr>
+                <w:t>au corp</w:t>
+              </w:r>
+              <w:proofErr w:type="gramEnd"/>
+              <w:r>
+                <w:rPr>
+                  <w:rStyle w:val="Hyperlink"/>
+                </w:rPr>
+                <w:t xml:space="preserve"> à corp</w:t>
               </w:r>
             </w:hyperlink>
           </w:p>
@@ -2317,37 +2917,10 @@
             <w:tcW w:w="6940" w:type="dxa"/>
           </w:tcPr>
           <w:p>
-            <w:hyperlink r:id="rId20" w:history="1">
-              <w:r>
-                <w:rPr>
-                  <w:rStyle w:val="Lienhypertexte"/>
-                </w:rPr>
-                <w:t>pouvoir faire des degats au corp à corp</w:t>
-              </w:r>
-            </w:hyperlink>
-          </w:p>
-        </w:tc>
-      </w:tr>
-      <w:tr>
-        <w:tc>
-          <w:tcPr>
-            <w:tcW w:w="2122" w:type="dxa"/>
-          </w:tcPr>
-          <w:p>
-            <w:r>
-              <w:t>25.09.2026</w:t>
-            </w:r>
-          </w:p>
-        </w:tc>
-        <w:tc>
-          <w:tcPr>
-            <w:tcW w:w="6940" w:type="dxa"/>
-          </w:tcPr>
-          <w:p>
             <w:hyperlink r:id="rId21" w:history="1">
               <w:r>
                 <w:rPr>
-                  <w:rStyle w:val="Lienhypertexte"/>
+                  <w:rStyle w:val="Hyperlink"/>
                 </w:rPr>
                 <w:t>Ajouter un compteur de PV</w:t>
               </w:r>
@@ -2374,7 +2947,7 @@
             <w:hyperlink r:id="rId22" w:history="1">
               <w:r>
                 <w:rPr>
-                  <w:rStyle w:val="Lienhypertexte"/>
+                  <w:rStyle w:val="Hyperlink"/>
                 </w:rPr>
                 <w:t>Ajouter un compteur d’argent</w:t>
               </w:r>
@@ -2401,7 +2974,7 @@
             <w:hyperlink r:id="rId23" w:history="1">
               <w:r>
                 <w:rPr>
-                  <w:rStyle w:val="Lienhypertexte"/>
+                  <w:rStyle w:val="Hyperlink"/>
                 </w:rPr>
                 <w:t>Créer des ennemies de type manager</w:t>
               </w:r>
@@ -2428,7 +3001,7 @@
             <w:hyperlink r:id="rId24" w:history="1">
               <w:r>
                 <w:rPr>
-                  <w:rStyle w:val="Lienhypertexte"/>
+                  <w:rStyle w:val="Hyperlink"/>
                 </w:rPr>
                 <w:t>Créer les projectiles des managers</w:t>
               </w:r>
@@ -2458,7 +3031,7 @@
             <w:hyperlink r:id="rId25" w:history="1">
               <w:r>
                 <w:rPr>
-                  <w:rStyle w:val="Lienhypertexte"/>
+                  <w:rStyle w:val="Hyperlink"/>
                 </w:rPr>
                 <w:t>Créer des ennemies de type robot</w:t>
               </w:r>
@@ -2488,7 +3061,7 @@
             <w:hyperlink r:id="rId26" w:history="1">
               <w:r>
                 <w:rPr>
-                  <w:rStyle w:val="Lienhypertexte"/>
+                  <w:rStyle w:val="Hyperlink"/>
                 </w:rPr>
                 <w:t>Créer les projectiles des robots</w:t>
               </w:r>
@@ -2518,7 +3091,7 @@
             <w:hyperlink r:id="rId27" w:history="1">
               <w:r>
                 <w:rPr>
-                  <w:rStyle w:val="Lienhypertexte"/>
+                  <w:rStyle w:val="Hyperlink"/>
                 </w:rPr>
                 <w:t>Créer les obstacles</w:t>
               </w:r>
@@ -2530,7 +3103,7 @@
     <w:p/>
     <w:p>
       <w:pPr>
-        <w:pStyle w:val="Titre2"/>
+        <w:pStyle w:val="Heading2"/>
       </w:pPr>
       <w:r>
         <w:t>Rapport de tests</w:t>
@@ -2543,11 +3116,13 @@
     </w:p>
     <w:p>
       <w:pPr>
-        <w:pStyle w:val="Titre3"/>
-      </w:pPr>
+        <w:pStyle w:val="Heading3"/>
+      </w:pPr>
+      <w:proofErr w:type="spellStart"/>
       <w:r>
         <w:t>HelpersTest</w:t>
       </w:r>
+      <w:proofErr w:type="spellEnd"/>
     </w:p>
     <w:p>
       <w:r>
@@ -2558,12 +3133,14 @@
       <w:pPr>
         <w:ind w:left="708"/>
       </w:pPr>
+      <w:proofErr w:type="spellStart"/>
       <w:r>
         <w:rPr>
-          <w:rStyle w:val="Titre4Car"/>
+          <w:rStyle w:val="Heading4Char"/>
         </w:rPr>
         <w:t>TestDisance</w:t>
       </w:r>
+      <w:proofErr w:type="spellEnd"/>
       <w:r>
         <w:rPr>
           <w:b/>
@@ -2574,9 +3151,11 @@
       <w:r>
         <w:t>Vérifie que le helper « </w:t>
       </w:r>
+      <w:proofErr w:type="spellStart"/>
       <w:r>
         <w:t>MathHelper.Distance</w:t>
       </w:r>
+      <w:proofErr w:type="spellEnd"/>
       <w:r>
         <w:t xml:space="preserve"> » fonctionne en lui donnant deux points ayant </w:t>
       </w:r>
@@ -2595,12 +3174,14 @@
       <w:pPr>
         <w:ind w:left="708"/>
       </w:pPr>
+      <w:proofErr w:type="spellStart"/>
       <w:r>
         <w:rPr>
-          <w:rStyle w:val="Titre4Car"/>
+          <w:rStyle w:val="Heading4Char"/>
         </w:rPr>
         <w:t>TestAreTouching</w:t>
       </w:r>
+      <w:proofErr w:type="spellEnd"/>
       <w:r>
         <w:rPr>
           <w:b/>
@@ -2611,17 +3192,13 @@
       <w:r>
         <w:t>Vérifie que le helpers « </w:t>
       </w:r>
+      <w:proofErr w:type="spellStart"/>
       <w:r>
         <w:t>MathHelper.AreTouching</w:t>
       </w:r>
-      <w:r>
-        <w:t xml:space="preserve"> » fonctionne en lui donnant deux </w:t>
-      </w:r>
-      <w:r>
-        <w:t xml:space="preserve">rectangles </w:t>
-      </w:r>
-      <w:r>
-        <w:t xml:space="preserve">ayant chacun </w:t>
+      <w:proofErr w:type="spellEnd"/>
+      <w:r>
+        <w:t xml:space="preserve"> » fonctionne en lui donnant deux rectangles ayant chacun </w:t>
       </w:r>
       <w:r>
         <w:t>des</w:t>
@@ -2635,15 +3212,25 @@
     </w:p>
     <w:p>
       <w:pPr>
-        <w:pStyle w:val="Titre3"/>
-      </w:pPr>
+        <w:pStyle w:val="Heading3"/>
+      </w:pPr>
+      <w:proofErr w:type="spellStart"/>
       <w:r>
         <w:t>ManagerTests</w:t>
       </w:r>
-    </w:p>
-    <w:p>
-      <w:r>
-        <w:t xml:space="preserve">Cette classe contient deux tests et utilise une methode </w:t>
+      <w:proofErr w:type="spellEnd"/>
+    </w:p>
+    <w:p>
+      <w:r>
+        <w:t xml:space="preserve">Cette classe contient deux tests et utilise une </w:t>
+      </w:r>
+      <w:proofErr w:type="spellStart"/>
+      <w:r>
+        <w:t>methode</w:t>
+      </w:r>
+      <w:proofErr w:type="spellEnd"/>
+      <w:r>
+        <w:t xml:space="preserve"> </w:t>
       </w:r>
       <w:r>
         <w:t>Setup</w:t>
@@ -2652,7 +3239,15 @@
         <w:t xml:space="preserve"> lancé par </w:t>
       </w:r>
       <w:r>
-        <w:t>[TestInitialize]</w:t>
+        <w:t>[</w:t>
+      </w:r>
+      <w:proofErr w:type="spellStart"/>
+      <w:r>
+        <w:t>TestInitialize</w:t>
+      </w:r>
+      <w:proofErr w:type="spellEnd"/>
+      <w:r>
+        <w:t>]</w:t>
       </w:r>
       <w:r>
         <w:t xml:space="preserve"> afin de réinitialiser </w:t>
@@ -2671,12 +3266,14 @@
       <w:pPr>
         <w:ind w:left="708"/>
       </w:pPr>
+      <w:proofErr w:type="spellStart"/>
       <w:r>
         <w:rPr>
-          <w:rStyle w:val="Titre4Car"/>
+          <w:rStyle w:val="Heading4Char"/>
         </w:rPr>
         <w:t>ManagerFires</w:t>
       </w:r>
+      <w:proofErr w:type="spellEnd"/>
       <w:r>
         <w:rPr>
           <w:b/>
@@ -2688,7 +3285,28 @@
         <w:t>Cette méthode instancie un manager</w:t>
       </w:r>
       <w:r>
-        <w:t xml:space="preserve"> ainsi qu’un champ de bataille. Elle supprime ensuite tout les obstacles présent dans le champs de bataille. Puis</w:t>
+        <w:t xml:space="preserve"> ainsi qu’un champ de bataille. Elle supprime ensuite </w:t>
+      </w:r>
+      <w:proofErr w:type="spellStart"/>
+      <w:proofErr w:type="gramStart"/>
+      <w:r>
+        <w:t>tout</w:t>
+      </w:r>
+      <w:proofErr w:type="spellEnd"/>
+      <w:r>
+        <w:t xml:space="preserve"> les obstacles présent</w:t>
+      </w:r>
+      <w:proofErr w:type="gramEnd"/>
+      <w:r>
+        <w:t xml:space="preserve"> dans </w:t>
+      </w:r>
+      <w:proofErr w:type="gramStart"/>
+      <w:r>
+        <w:t>le champs</w:t>
+      </w:r>
+      <w:proofErr w:type="gramEnd"/>
+      <w:r>
+        <w:t xml:space="preserve"> de bataille. Puis</w:t>
       </w:r>
       <w:r>
         <w:t xml:space="preserve"> </w:t>
@@ -2710,12 +3328,14 @@
       <w:pPr>
         <w:ind w:left="708"/>
       </w:pPr>
+      <w:proofErr w:type="spellStart"/>
       <w:r>
         <w:rPr>
-          <w:rStyle w:val="Titre4Car"/>
+          <w:rStyle w:val="Heading4Char"/>
         </w:rPr>
         <w:t>ManagerMoves</w:t>
       </w:r>
+      <w:proofErr w:type="spellEnd"/>
       <w:r>
         <w:rPr>
           <w:b/>
@@ -2736,21 +3356,25 @@
     </w:p>
     <w:p>
       <w:pPr>
-        <w:pStyle w:val="Titre3"/>
-      </w:pPr>
+        <w:pStyle w:val="Heading3"/>
+      </w:pPr>
+      <w:proofErr w:type="spellStart"/>
       <w:r>
         <w:t>PlayerTests</w:t>
       </w:r>
-    </w:p>
-    <w:p>
-      <w:r>
-        <w:t xml:space="preserve">Cette classe contient </w:t>
-      </w:r>
-      <w:r>
-        <w:t>7</w:t>
-      </w:r>
-      <w:r>
-        <w:t xml:space="preserve"> tests et utilise une methode </w:t>
+      <w:proofErr w:type="spellEnd"/>
+    </w:p>
+    <w:p>
+      <w:r>
+        <w:t xml:space="preserve">Cette classe contient 7 tests et utilise une </w:t>
+      </w:r>
+      <w:proofErr w:type="spellStart"/>
+      <w:r>
+        <w:t>methode</w:t>
+      </w:r>
+      <w:proofErr w:type="spellEnd"/>
+      <w:r>
+        <w:t xml:space="preserve"> </w:t>
       </w:r>
       <w:r>
         <w:t>Setup</w:t>
@@ -2759,7 +3383,15 @@
         <w:t xml:space="preserve"> lancé par </w:t>
       </w:r>
       <w:r>
-        <w:t>[TestInitialize]</w:t>
+        <w:t>[</w:t>
+      </w:r>
+      <w:proofErr w:type="spellStart"/>
+      <w:r>
+        <w:t>TestInitialize</w:t>
+      </w:r>
+      <w:proofErr w:type="spellEnd"/>
+      <w:r>
+        <w:t>]</w:t>
       </w:r>
       <w:r>
         <w:t xml:space="preserve"> afin de réinitialiser le champ de batail entre les tests :</w:t>
@@ -2769,14 +3401,21 @@
       <w:pPr>
         <w:ind w:left="708"/>
       </w:pPr>
+      <w:proofErr w:type="spellStart"/>
+      <w:proofErr w:type="gramStart"/>
       <w:r>
         <w:rPr>
-          <w:rStyle w:val="Titre4Car"/>
+          <w:rStyle w:val="Heading4Char"/>
         </w:rPr>
         <w:t>PlayerBurgerAttack</w:t>
       </w:r>
-      <w:r>
-        <w:t xml:space="preserve">: Cette méthode </w:t>
+      <w:proofErr w:type="spellEnd"/>
+      <w:r>
+        <w:t>:</w:t>
+      </w:r>
+      <w:proofErr w:type="gramEnd"/>
+      <w:r>
+        <w:t xml:space="preserve"> Cette méthode </w:t>
       </w:r>
       <w:r>
         <w:t>créer un joueur puis simule un clic gauche. Elle regarde ensuite le nombre de balle présente dans le champ de bataille.</w:t>
@@ -2786,58 +3425,156 @@
       <w:pPr>
         <w:ind w:left="708"/>
       </w:pPr>
+      <w:proofErr w:type="spellStart"/>
       <w:r>
         <w:rPr>
-          <w:rStyle w:val="Titre4Car"/>
+          <w:rStyle w:val="Heading4Char"/>
         </w:rPr>
         <w:t>PlayerMeleeAtack</w:t>
       </w:r>
-      <w:r>
-        <w:t xml:space="preserve"> : Cette méthode créer un joueur puis attends une frame le temps que le cooldown de départ passe puis simule un clic droit. Elle laisse encore </w:t>
-      </w:r>
+      <w:proofErr w:type="spellEnd"/>
+      <w:r>
+        <w:t xml:space="preserve"> : Cette méthode créer un joueur puis attends une frame le temps que le </w:t>
+      </w:r>
+      <w:proofErr w:type="spellStart"/>
+      <w:r>
+        <w:t>cooldown</w:t>
+      </w:r>
+      <w:proofErr w:type="spellEnd"/>
+      <w:r>
+        <w:t xml:space="preserve"> de départ passe puis simule un clic droit. Elle laisse encore </w:t>
+      </w:r>
+      <w:proofErr w:type="gramStart"/>
       <w:r>
         <w:t>une frame</w:t>
       </w:r>
-      <w:r>
-        <w:t xml:space="preserve"> passer puis elle regarde si le joueur est en mode Melee ou non.</w:t>
-      </w:r>
-    </w:p>
-    <w:p>
-      <w:pPr>
-        <w:ind w:left="708"/>
-      </w:pPr>
+      <w:proofErr w:type="gramEnd"/>
+      <w:r>
+        <w:t xml:space="preserve"> passer puis elle regarde si le joueur est en mode </w:t>
+      </w:r>
+      <w:proofErr w:type="spellStart"/>
+      <w:r>
+        <w:t>Melee</w:t>
+      </w:r>
+      <w:proofErr w:type="spellEnd"/>
+      <w:r>
+        <w:t xml:space="preserve"> ou non.</w:t>
+      </w:r>
+    </w:p>
+    <w:p>
+      <w:pPr>
+        <w:ind w:left="708"/>
+      </w:pPr>
+      <w:proofErr w:type="spellStart"/>
       <w:r>
         <w:rPr>
-          <w:rStyle w:val="Titre4Car"/>
+          <w:rStyle w:val="Heading4Char"/>
         </w:rPr>
-        <w:t>PlayerGoUp/PlayerGoDown/PlayerGoLeft/PlayerGoRight</w:t>
-      </w:r>
-      <w:r>
-        <w:t xml:space="preserve"> : Ces quatres méthodes </w:t>
+        <w:t>PlayerGoUp</w:t>
+      </w:r>
+      <w:proofErr w:type="spellEnd"/>
+      <w:r>
+        <w:rPr>
+          <w:rStyle w:val="Heading4Char"/>
+        </w:rPr>
+        <w:t>/</w:t>
+      </w:r>
+      <w:proofErr w:type="spellStart"/>
+      <w:r>
+        <w:rPr>
+          <w:rStyle w:val="Heading4Char"/>
+        </w:rPr>
+        <w:t>PlayerGoDown</w:t>
+      </w:r>
+      <w:proofErr w:type="spellEnd"/>
+      <w:r>
+        <w:rPr>
+          <w:rStyle w:val="Heading4Char"/>
+        </w:rPr>
+        <w:t>/</w:t>
+      </w:r>
+      <w:proofErr w:type="spellStart"/>
+      <w:r>
+        <w:rPr>
+          <w:rStyle w:val="Heading4Char"/>
+        </w:rPr>
+        <w:t>PlayerGoLeft</w:t>
+      </w:r>
+      <w:proofErr w:type="spellEnd"/>
+      <w:r>
+        <w:rPr>
+          <w:rStyle w:val="Heading4Char"/>
+        </w:rPr>
+        <w:t>/</w:t>
+      </w:r>
+      <w:proofErr w:type="spellStart"/>
+      <w:r>
+        <w:rPr>
+          <w:rStyle w:val="Heading4Char"/>
+        </w:rPr>
+        <w:t>PlayerGoRight</w:t>
+      </w:r>
+      <w:proofErr w:type="spellEnd"/>
+      <w:r>
+        <w:t xml:space="preserve"> : Ces </w:t>
+      </w:r>
+      <w:proofErr w:type="spellStart"/>
+      <w:r>
+        <w:t>quatres</w:t>
+      </w:r>
+      <w:proofErr w:type="spellEnd"/>
+      <w:r>
+        <w:t xml:space="preserve"> méthodes </w:t>
       </w:r>
       <w:r>
         <w:t>i</w:t>
       </w:r>
       <w:r>
-        <w:t>nstancie toutes un joueur puis simule le pressage de la touche pour aller dans leur direction respective (WASD). Elle laisse toutes une frame passer avant de regarder si la position du joueur à changer de manière égal à sa vitesse et dans la bonne direction.</w:t>
-      </w:r>
-    </w:p>
-    <w:p>
-      <w:pPr>
-        <w:ind w:left="708"/>
-      </w:pPr>
+        <w:t xml:space="preserve">nstancie toutes un joueur puis simule le pressage de la touche pour aller dans leur direction respective (WASD). Elle laisse toutes </w:t>
+      </w:r>
+      <w:proofErr w:type="gramStart"/>
+      <w:r>
+        <w:t>une frame</w:t>
+      </w:r>
+      <w:proofErr w:type="gramEnd"/>
+      <w:r>
+        <w:t xml:space="preserve"> passer avant de regarder si la position du joueur à changer de </w:t>
+      </w:r>
+      <w:proofErr w:type="gramStart"/>
+      <w:r>
+        <w:t>manière égal</w:t>
+      </w:r>
+      <w:proofErr w:type="gramEnd"/>
+      <w:r>
+        <w:t xml:space="preserve"> à sa vitesse et dans la bonne direction.</w:t>
+      </w:r>
+    </w:p>
+    <w:p>
+      <w:pPr>
+        <w:ind w:left="708"/>
+      </w:pPr>
+      <w:proofErr w:type="spellStart"/>
       <w:r>
         <w:rPr>
-          <w:rStyle w:val="Titre4Car"/>
+          <w:rStyle w:val="Heading4Char"/>
         </w:rPr>
         <w:t>PlayerCollisionWithObstacle</w:t>
       </w:r>
+      <w:proofErr w:type="spellEnd"/>
       <w:r>
         <w:t xml:space="preserve"> : Cette méthode créer un joueur puis ajoute un obstacle dans le champ de bataille juste en face du joueur. Elle simule ensuite le fait de cliquer sur « W » pour avancer vers l’obstacle puis regarde si la position du </w:t>
       </w:r>
       <w:r>
         <w:lastRenderedPageBreak/>
-        <w:t>joueur à changer. Le but est de voir si le collision fonctionne. Si oui, le joueur ne changera pas de positio</w:t>
+        <w:t xml:space="preserve">joueur à changer. Le but est de voir si </w:t>
+      </w:r>
+      <w:proofErr w:type="gramStart"/>
+      <w:r>
+        <w:t>le collision</w:t>
+      </w:r>
+      <w:proofErr w:type="gramEnd"/>
+      <w:r>
+        <w:t xml:space="preserve"> fonctionne. Si oui, le joueur ne changera pas de positio</w:t>
       </w:r>
       <w:r>
         <w:t>n.</w:t>
@@ -2845,21 +3582,25 @@
     </w:p>
     <w:p>
       <w:pPr>
-        <w:pStyle w:val="Titre3"/>
-      </w:pPr>
+        <w:pStyle w:val="Heading3"/>
+      </w:pPr>
+      <w:proofErr w:type="spellStart"/>
       <w:r>
         <w:t>RobotTests</w:t>
       </w:r>
-    </w:p>
-    <w:p>
-      <w:r>
-        <w:t xml:space="preserve">Cette classe contient </w:t>
-      </w:r>
-      <w:r>
-        <w:t>deux</w:t>
-      </w:r>
-      <w:r>
-        <w:t xml:space="preserve"> tests et utilise une methode </w:t>
+      <w:proofErr w:type="spellEnd"/>
+    </w:p>
+    <w:p>
+      <w:r>
+        <w:t xml:space="preserve">Cette classe contient deux tests et utilise une </w:t>
+      </w:r>
+      <w:proofErr w:type="spellStart"/>
+      <w:r>
+        <w:t>methode</w:t>
+      </w:r>
+      <w:proofErr w:type="spellEnd"/>
+      <w:r>
+        <w:t xml:space="preserve"> </w:t>
       </w:r>
       <w:r>
         <w:t>Setup</w:t>
@@ -2868,7 +3609,15 @@
         <w:t xml:space="preserve"> lancé par </w:t>
       </w:r>
       <w:r>
-        <w:t>[TestInitialize]</w:t>
+        <w:t>[</w:t>
+      </w:r>
+      <w:proofErr w:type="spellStart"/>
+      <w:r>
+        <w:t>TestInitialize</w:t>
+      </w:r>
+      <w:proofErr w:type="spellEnd"/>
+      <w:r>
+        <w:t>]</w:t>
       </w:r>
       <w:r>
         <w:t xml:space="preserve"> afin de réinitialiser le champ de batail entre les tests :</w:t>
@@ -2878,12 +3627,14 @@
       <w:pPr>
         <w:ind w:left="708"/>
       </w:pPr>
+      <w:proofErr w:type="spellStart"/>
       <w:r>
         <w:rPr>
-          <w:rStyle w:val="Titre4Car"/>
+          <w:rStyle w:val="Heading4Char"/>
         </w:rPr>
         <w:t>RobotFires</w:t>
       </w:r>
+      <w:proofErr w:type="spellEnd"/>
       <w:r>
         <w:t xml:space="preserve"> : </w:t>
       </w:r>
@@ -2897,68 +3648,210 @@
         <w:t xml:space="preserve"> du champ de bataille et attend que le Robot se mette en position et tire.</w:t>
       </w:r>
       <w:r>
-        <w:t xml:space="preserve"> Si le robot prend plus de temps à tirer que la taille de la map, alors c’est que le test ne fonctionne pas. Puis on regarde combien de tir sont présent dans le champ de batail pour valider ou non le test.</w:t>
-      </w:r>
-    </w:p>
-    <w:p>
-      <w:pPr>
-        <w:ind w:left="708"/>
-      </w:pPr>
+        <w:t xml:space="preserve"> Si le robot prend plus de temps à tirer que la taille de la </w:t>
+      </w:r>
+      <w:proofErr w:type="spellStart"/>
+      <w:r>
+        <w:t>map</w:t>
+      </w:r>
+      <w:proofErr w:type="spellEnd"/>
+      <w:r>
+        <w:t>, alors c’est que le test ne fonctionne pas. Puis on regarde combien de tir sont présent dans le champ de batail pour valider ou non le test.</w:t>
+      </w:r>
+    </w:p>
+    <w:p>
+      <w:pPr>
+        <w:ind w:left="708"/>
+      </w:pPr>
+      <w:proofErr w:type="spellStart"/>
       <w:r>
         <w:rPr>
-          <w:rStyle w:val="Titre4Car"/>
+          <w:rStyle w:val="Heading4Char"/>
         </w:rPr>
-        <w:t>RobotMoves </w:t>
+        <w:t>RobotMoves</w:t>
+      </w:r>
+      <w:proofErr w:type="spellEnd"/>
+      <w:r>
+        <w:rPr>
+          <w:rStyle w:val="Heading4Char"/>
+        </w:rPr>
+        <w:t> </w:t>
       </w:r>
       <w:r>
         <w:t>:</w:t>
       </w:r>
       <w:r>
-        <w:t xml:space="preserve"> Cette méthode instancie un nouveau champ de bataille puis un nouveau robot et supprime aussi tous les obstacles. Il laisse ensuite une frame passé puis regarde si la position du Robot à changé.</w:t>
-      </w:r>
-    </w:p>
-    <w:p>
-      <w:pPr>
-        <w:pStyle w:val="Titre3"/>
-      </w:pPr>
+        <w:t xml:space="preserve"> Cette méthode instancie un nouveau champ de bataille puis un nouveau robot et supprime aussi tous les obstacles. Il laisse ensuite </w:t>
+      </w:r>
+      <w:proofErr w:type="gramStart"/>
+      <w:r>
+        <w:t>une frame</w:t>
+      </w:r>
+      <w:proofErr w:type="gramEnd"/>
+      <w:r>
+        <w:t xml:space="preserve"> passé puis regarde si la position du Robot </w:t>
+      </w:r>
+      <w:proofErr w:type="spellStart"/>
+      <w:r>
+        <w:t>à</w:t>
+      </w:r>
+      <w:proofErr w:type="spellEnd"/>
+      <w:r>
+        <w:t xml:space="preserve"> </w:t>
+      </w:r>
+      <w:proofErr w:type="spellStart"/>
+      <w:r>
+        <w:t>changé</w:t>
+      </w:r>
+      <w:proofErr w:type="spellEnd"/>
+      <w:r>
+        <w:t>.</w:t>
+      </w:r>
+    </w:p>
+    <w:p>
+      <w:pPr>
+        <w:pStyle w:val="Heading3"/>
+      </w:pPr>
+      <w:proofErr w:type="spellStart"/>
       <w:r>
         <w:t>MSTestSettings</w:t>
       </w:r>
-    </w:p>
-    <w:p>
-      <w:r>
-        <w:t xml:space="preserve">J’ai du modifié le fichier </w:t>
-      </w:r>
+      <w:proofErr w:type="spellEnd"/>
+    </w:p>
+    <w:p>
+      <w:r>
+        <w:t xml:space="preserve">J’ai </w:t>
+      </w:r>
+      <w:proofErr w:type="spellStart"/>
+      <w:r>
+        <w:t>du</w:t>
+      </w:r>
+      <w:proofErr w:type="spellEnd"/>
+      <w:r>
+        <w:t xml:space="preserve"> modifié le fichier </w:t>
+      </w:r>
+      <w:proofErr w:type="spellStart"/>
       <w:r>
         <w:t>MSTestSettings</w:t>
       </w:r>
       <w:r>
-        <w:t xml:space="preserve">.cs et changer la première ligne en </w:t>
-      </w:r>
-      <w:r>
-        <w:t>[assembly: DoNotParallelize]</w:t>
-      </w:r>
-      <w:r>
-        <w:t>. Cela était nécessaire car le champ de batail est une ressource partagé entre tous les tests ce qui amènerais autrement des tests à écrire dans la classe « </w:t>
-      </w:r>
+        <w:t>.cs</w:t>
+      </w:r>
+      <w:proofErr w:type="spellEnd"/>
+      <w:r>
+        <w:t xml:space="preserve"> et changer la première ligne en </w:t>
+      </w:r>
+      <w:r>
+        <w:t>[</w:t>
+      </w:r>
+      <w:proofErr w:type="spellStart"/>
+      <w:proofErr w:type="gramStart"/>
+      <w:r>
+        <w:t>assembly</w:t>
+      </w:r>
+      <w:proofErr w:type="spellEnd"/>
+      <w:r>
+        <w:t>:</w:t>
+      </w:r>
+      <w:proofErr w:type="gramEnd"/>
+      <w:r>
+        <w:t xml:space="preserve"> DoNotParallelize]</w:t>
+      </w:r>
+      <w:r>
+        <w:t xml:space="preserve">. Cela était nécessaire car le champ de batail est </w:t>
+      </w:r>
+      <w:proofErr w:type="gramStart"/>
+      <w:r>
+        <w:t>une ressource partagé</w:t>
+      </w:r>
+      <w:proofErr w:type="gramEnd"/>
+      <w:r>
+        <w:t xml:space="preserve"> entre tous les tests ce qui amènerais autrement des tests à écrire dans la classe « </w:t>
+      </w:r>
+      <w:proofErr w:type="spellStart"/>
       <w:r>
         <w:t>BattleMap</w:t>
       </w:r>
-      <w:r>
-        <w:t> » au moment ou un autre test allait le lire. J’ai donc du désactiver le parallélisme.</w:t>
-      </w:r>
-    </w:p>
-    <w:p>
-      <w:pPr>
-        <w:pStyle w:val="Titre2"/>
-      </w:pPr>
-      <w:r>
+      <w:proofErr w:type="spellEnd"/>
+      <w:r>
+        <w:t xml:space="preserve"> » au moment ou un autre test allait le lire. J’ai donc </w:t>
+      </w:r>
+      <w:proofErr w:type="gramStart"/>
+      <w:r>
+        <w:t>du</w:t>
+      </w:r>
+      <w:proofErr w:type="gramEnd"/>
+      <w:r>
+        <w:t xml:space="preserve"> désactiver le parallélisme.</w:t>
+      </w:r>
+    </w:p>
+    <w:p>
+      <w:pPr>
+        <w:pStyle w:val="Heading2"/>
+      </w:pPr>
+      <w:r>
+        <w:lastRenderedPageBreak/>
         <w:t>Conception et diagramme de classe</w:t>
       </w:r>
     </w:p>
     <w:p>
-      <w:pPr>
-        <w:pStyle w:val="Titre2"/>
+      <w:r>
+        <w:rPr>
+          <w:noProof/>
+        </w:rPr>
+        <w:drawing>
+          <wp:inline distT="0" distB="0" distL="0" distR="0" wp14:anchorId="337998C7" wp14:editId="591B09EE">
+            <wp:extent cx="5754370" cy="7195185"/>
+            <wp:effectExtent l="0" t="0" r="0" b="5715"/>
+            <wp:docPr id="1160258829" name="Picture 1"/>
+            <wp:cNvGraphicFramePr>
+              <a:graphicFrameLocks xmlns:a="http://schemas.openxmlformats.org/drawingml/2006/main" noChangeAspect="1"/>
+            </wp:cNvGraphicFramePr>
+            <a:graphic xmlns:a="http://schemas.openxmlformats.org/drawingml/2006/main">
+              <a:graphicData uri="http://schemas.openxmlformats.org/drawingml/2006/picture">
+                <pic:pic xmlns:pic="http://schemas.openxmlformats.org/drawingml/2006/picture">
+                  <pic:nvPicPr>
+                    <pic:cNvPr id="0" name="Picture 1"/>
+                    <pic:cNvPicPr>
+                      <a:picLocks noChangeAspect="1" noChangeArrowheads="1"/>
+                    </pic:cNvPicPr>
+                  </pic:nvPicPr>
+                  <pic:blipFill>
+                    <a:blip r:embed="rId28">
+                      <a:extLst>
+                        <a:ext uri="{28A0092B-C50C-407E-A947-70E740481C1C}">
+                          <a14:useLocalDpi xmlns:a14="http://schemas.microsoft.com/office/drawing/2010/main" val="0"/>
+                        </a:ext>
+                      </a:extLst>
+                    </a:blip>
+                    <a:srcRect/>
+                    <a:stretch>
+                      <a:fillRect/>
+                    </a:stretch>
+                  </pic:blipFill>
+                  <pic:spPr bwMode="auto">
+                    <a:xfrm>
+                      <a:off x="0" y="0"/>
+                      <a:ext cx="5754370" cy="7195185"/>
+                    </a:xfrm>
+                    <a:prstGeom prst="rect">
+                      <a:avLst/>
+                    </a:prstGeom>
+                    <a:noFill/>
+                    <a:ln>
+                      <a:noFill/>
+                    </a:ln>
+                  </pic:spPr>
+                </pic:pic>
+              </a:graphicData>
+            </a:graphic>
+          </wp:inline>
+        </w:drawing>
+      </w:r>
+    </w:p>
+    <w:p>
+      <w:pPr>
+        <w:pStyle w:val="Heading2"/>
       </w:pPr>
       <w:bookmarkStart w:id="6" w:name="_Toc243513768"/>
       <w:r>
@@ -2967,30 +3860,30 @@
       <w:bookmarkEnd w:id="6"/>
     </w:p>
     <w:p>
-      <w:hyperlink r:id="rId28" w:history="1">
+      <w:hyperlink r:id="rId29" w:history="1">
         <w:r>
           <w:rPr>
-            <w:rStyle w:val="Lienhypertexte"/>
+            <w:rStyle w:val="Hyperlink"/>
           </w:rPr>
           <w:t>https://claude.ai/share/2bf90d2b-864b-42cc-8b37-eaf1b68bf1c2</w:t>
         </w:r>
       </w:hyperlink>
     </w:p>
     <w:p>
-      <w:hyperlink r:id="rId29" w:history="1">
+      <w:hyperlink r:id="rId30" w:history="1">
         <w:r>
           <w:rPr>
-            <w:rStyle w:val="Lienhypertexte"/>
+            <w:rStyle w:val="Hyperlink"/>
           </w:rPr>
           <w:t>https://claude.ai/share/811b5089-de97-4356-8ea7-5ff4a40ace65</w:t>
         </w:r>
       </w:hyperlink>
     </w:p>
     <w:p>
-      <w:hyperlink r:id="rId30" w:history="1">
+      <w:hyperlink r:id="rId31" w:history="1">
         <w:r>
           <w:rPr>
-            <w:rStyle w:val="Lienhypertexte"/>
+            <w:rStyle w:val="Hyperlink"/>
           </w:rPr>
           <w:t>https://claude.ai/share/b1e4f4ad-725a-4019-8b77-c83d20ff485d</w:t>
         </w:r>
@@ -2998,15 +3891,16 @@
     </w:p>
     <w:p>
       <w:pPr>
-        <w:pStyle w:val="Titre2"/>
-      </w:pPr>
-      <w:r>
+        <w:pStyle w:val="Heading2"/>
+      </w:pPr>
+      <w:r>
+        <w:lastRenderedPageBreak/>
         <w:t>Bilan du déroulement du projet</w:t>
       </w:r>
     </w:p>
     <w:p>
       <w:pPr>
-        <w:pStyle w:val="Titre2"/>
+        <w:pStyle w:val="Heading2"/>
       </w:pPr>
       <w:r>
         <w:t>Bilan produit</w:t>
@@ -3014,7 +3908,7 @@
     </w:p>
     <w:p>
       <w:pPr>
-        <w:pStyle w:val="Titre2"/>
+        <w:pStyle w:val="Heading2"/>
       </w:pPr>
       <w:r>
         <w:t>Conclusion</w:t>
@@ -3023,7 +3917,7 @@
     <w:p/>
     <w:p/>
     <w:sectPr>
-      <w:footerReference w:type="default" r:id="rId31"/>
+      <w:footerReference w:type="default" r:id="rId32"/>
       <w:pgSz w:w="11906" w:h="16838"/>
       <w:pgMar w:top="1417" w:right="1417" w:bottom="1417" w:left="1417" w:header="708" w:footer="708" w:gutter="0"/>
       <w:cols w:space="708"/>
@@ -3071,7 +3965,7 @@
     <w:sdtContent>
       <w:p>
         <w:pPr>
-          <w:pStyle w:val="Pieddepage"/>
+          <w:pStyle w:val="Footer"/>
           <w:jc w:val="right"/>
           <w:rPr>
             <w:lang w:val="en-US"/>
@@ -3103,7 +3997,7 @@
   </w:sdt>
   <w:p>
     <w:pPr>
-      <w:pStyle w:val="Pieddepage"/>
+      <w:pStyle w:val="Footer"/>
       <w:rPr>
         <w:lang w:val="en-US"/>
       </w:rPr>
@@ -4000,11 +4894,11 @@
     <w:qFormat/>
     <w:rsid w:val="00983A50"/>
   </w:style>
-  <w:style w:type="paragraph" w:styleId="Titre1">
+  <w:style w:type="paragraph" w:styleId="Heading1">
     <w:name w:val="heading 1"/>
     <w:basedOn w:val="Normal"/>
     <w:next w:val="Normal"/>
-    <w:link w:val="Titre1Car"/>
+    <w:link w:val="Heading1Char"/>
     <w:uiPriority w:val="9"/>
     <w:qFormat/>
     <w:rsid w:val="006C417F"/>
@@ -4021,11 +4915,11 @@
       <w:szCs w:val="40"/>
     </w:rPr>
   </w:style>
-  <w:style w:type="paragraph" w:styleId="Titre2">
+  <w:style w:type="paragraph" w:styleId="Heading2">
     <w:name w:val="heading 2"/>
     <w:basedOn w:val="Normal"/>
     <w:next w:val="Normal"/>
-    <w:link w:val="Titre2Car"/>
+    <w:link w:val="Heading2Char"/>
     <w:uiPriority w:val="9"/>
     <w:unhideWhenUsed/>
     <w:qFormat/>
@@ -4043,11 +4937,11 @@
       <w:szCs w:val="32"/>
     </w:rPr>
   </w:style>
-  <w:style w:type="paragraph" w:styleId="Titre3">
+  <w:style w:type="paragraph" w:styleId="Heading3">
     <w:name w:val="heading 3"/>
     <w:basedOn w:val="Normal"/>
     <w:next w:val="Normal"/>
-    <w:link w:val="Titre3Car"/>
+    <w:link w:val="Heading3Char"/>
     <w:uiPriority w:val="9"/>
     <w:unhideWhenUsed/>
     <w:qFormat/>
@@ -4065,11 +4959,11 @@
       <w:szCs w:val="28"/>
     </w:rPr>
   </w:style>
-  <w:style w:type="paragraph" w:styleId="Titre4">
+  <w:style w:type="paragraph" w:styleId="Heading4">
     <w:name w:val="heading 4"/>
     <w:basedOn w:val="Normal"/>
     <w:next w:val="Normal"/>
-    <w:link w:val="Titre4Car"/>
+    <w:link w:val="Heading4Char"/>
     <w:uiPriority w:val="9"/>
     <w:unhideWhenUsed/>
     <w:qFormat/>
@@ -4087,11 +4981,11 @@
       <w:color w:val="0F4761" w:themeColor="accent1" w:themeShade="BF"/>
     </w:rPr>
   </w:style>
-  <w:style w:type="paragraph" w:styleId="Titre5">
+  <w:style w:type="paragraph" w:styleId="Heading5">
     <w:name w:val="heading 5"/>
     <w:basedOn w:val="Normal"/>
     <w:next w:val="Normal"/>
-    <w:link w:val="Titre5Car"/>
+    <w:link w:val="Heading5Char"/>
     <w:uiPriority w:val="9"/>
     <w:semiHidden/>
     <w:unhideWhenUsed/>
@@ -4108,11 +5002,11 @@
       <w:color w:val="0F4761" w:themeColor="accent1" w:themeShade="BF"/>
     </w:rPr>
   </w:style>
-  <w:style w:type="paragraph" w:styleId="Titre6">
+  <w:style w:type="paragraph" w:styleId="Heading6">
     <w:name w:val="heading 6"/>
     <w:basedOn w:val="Normal"/>
     <w:next w:val="Normal"/>
-    <w:link w:val="Titre6Car"/>
+    <w:link w:val="Heading6Char"/>
     <w:uiPriority w:val="9"/>
     <w:semiHidden/>
     <w:unhideWhenUsed/>
@@ -4131,11 +5025,11 @@
       <w:color w:val="595959" w:themeColor="text1" w:themeTint="A6"/>
     </w:rPr>
   </w:style>
-  <w:style w:type="paragraph" w:styleId="Titre7">
+  <w:style w:type="paragraph" w:styleId="Heading7">
     <w:name w:val="heading 7"/>
     <w:basedOn w:val="Normal"/>
     <w:next w:val="Normal"/>
-    <w:link w:val="Titre7Car"/>
+    <w:link w:val="Heading7Char"/>
     <w:uiPriority w:val="9"/>
     <w:semiHidden/>
     <w:unhideWhenUsed/>
@@ -4152,11 +5046,11 @@
       <w:color w:val="595959" w:themeColor="text1" w:themeTint="A6"/>
     </w:rPr>
   </w:style>
-  <w:style w:type="paragraph" w:styleId="Titre8">
+  <w:style w:type="paragraph" w:styleId="Heading8">
     <w:name w:val="heading 8"/>
     <w:basedOn w:val="Normal"/>
     <w:next w:val="Normal"/>
-    <w:link w:val="Titre8Car"/>
+    <w:link w:val="Heading8Char"/>
     <w:uiPriority w:val="9"/>
     <w:semiHidden/>
     <w:unhideWhenUsed/>
@@ -4175,11 +5069,11 @@
       <w:color w:val="272727" w:themeColor="text1" w:themeTint="D8"/>
     </w:rPr>
   </w:style>
-  <w:style w:type="paragraph" w:styleId="Titre9">
+  <w:style w:type="paragraph" w:styleId="Heading9">
     <w:name w:val="heading 9"/>
     <w:basedOn w:val="Normal"/>
     <w:next w:val="Normal"/>
-    <w:link w:val="Titre9Car"/>
+    <w:link w:val="Heading9Char"/>
     <w:uiPriority w:val="9"/>
     <w:semiHidden/>
     <w:unhideWhenUsed/>
@@ -4196,12 +5090,13 @@
       <w:color w:val="272727" w:themeColor="text1" w:themeTint="D8"/>
     </w:rPr>
   </w:style>
-  <w:style w:type="character" w:default="1" w:styleId="Policepardfaut">
+  <w:style w:type="character" w:default="1" w:styleId="DefaultParagraphFont">
     <w:name w:val="Default Paragraph Font"/>
     <w:uiPriority w:val="1"/>
+    <w:semiHidden/>
     <w:unhideWhenUsed/>
   </w:style>
-  <w:style w:type="table" w:default="1" w:styleId="TableauNormal">
+  <w:style w:type="table" w:default="1" w:styleId="TableNormal">
     <w:name w:val="Normal Table"/>
     <w:uiPriority w:val="99"/>
     <w:semiHidden/>
@@ -4216,16 +5111,16 @@
       </w:tblCellMar>
     </w:tblPr>
   </w:style>
-  <w:style w:type="numbering" w:default="1" w:styleId="Aucuneliste">
+  <w:style w:type="numbering" w:default="1" w:styleId="NoList">
     <w:name w:val="No List"/>
     <w:uiPriority w:val="99"/>
     <w:semiHidden/>
     <w:unhideWhenUsed/>
   </w:style>
-  <w:style w:type="character" w:customStyle="1" w:styleId="Titre1Car">
-    <w:name w:val="Titre 1 Car"/>
-    <w:basedOn w:val="Policepardfaut"/>
-    <w:link w:val="Titre1"/>
+  <w:style w:type="character" w:customStyle="1" w:styleId="Heading1Char">
+    <w:name w:val="Heading 1 Char"/>
+    <w:basedOn w:val="DefaultParagraphFont"/>
+    <w:link w:val="Heading1"/>
     <w:uiPriority w:val="9"/>
     <w:rsid w:val="006C417F"/>
     <w:rPr>
@@ -4235,10 +5130,10 @@
       <w:szCs w:val="40"/>
     </w:rPr>
   </w:style>
-  <w:style w:type="character" w:customStyle="1" w:styleId="Titre2Car">
-    <w:name w:val="Titre 2 Car"/>
-    <w:basedOn w:val="Policepardfaut"/>
-    <w:link w:val="Titre2"/>
+  <w:style w:type="character" w:customStyle="1" w:styleId="Heading2Char">
+    <w:name w:val="Heading 2 Char"/>
+    <w:basedOn w:val="DefaultParagraphFont"/>
+    <w:link w:val="Heading2"/>
     <w:uiPriority w:val="9"/>
     <w:rsid w:val="006C417F"/>
     <w:rPr>
@@ -4248,10 +5143,10 @@
       <w:szCs w:val="32"/>
     </w:rPr>
   </w:style>
-  <w:style w:type="character" w:customStyle="1" w:styleId="Titre3Car">
-    <w:name w:val="Titre 3 Car"/>
-    <w:basedOn w:val="Policepardfaut"/>
-    <w:link w:val="Titre3"/>
+  <w:style w:type="character" w:customStyle="1" w:styleId="Heading3Char">
+    <w:name w:val="Heading 3 Char"/>
+    <w:basedOn w:val="DefaultParagraphFont"/>
+    <w:link w:val="Heading3"/>
     <w:uiPriority w:val="9"/>
     <w:rsid w:val="006C417F"/>
     <w:rPr>
@@ -4261,10 +5156,10 @@
       <w:szCs w:val="28"/>
     </w:rPr>
   </w:style>
-  <w:style w:type="character" w:customStyle="1" w:styleId="Titre4Car">
-    <w:name w:val="Titre 4 Car"/>
-    <w:basedOn w:val="Policepardfaut"/>
-    <w:link w:val="Titre4"/>
+  <w:style w:type="character" w:customStyle="1" w:styleId="Heading4Char">
+    <w:name w:val="Heading 4 Char"/>
+    <w:basedOn w:val="DefaultParagraphFont"/>
+    <w:link w:val="Heading4"/>
     <w:uiPriority w:val="9"/>
     <w:rsid w:val="006C417F"/>
     <w:rPr>
@@ -4274,10 +5169,10 @@
       <w:color w:val="0F4761" w:themeColor="accent1" w:themeShade="BF"/>
     </w:rPr>
   </w:style>
-  <w:style w:type="character" w:customStyle="1" w:styleId="Titre5Car">
-    <w:name w:val="Titre 5 Car"/>
-    <w:basedOn w:val="Policepardfaut"/>
-    <w:link w:val="Titre5"/>
+  <w:style w:type="character" w:customStyle="1" w:styleId="Heading5Char">
+    <w:name w:val="Heading 5 Char"/>
+    <w:basedOn w:val="DefaultParagraphFont"/>
+    <w:link w:val="Heading5"/>
     <w:uiPriority w:val="9"/>
     <w:semiHidden/>
     <w:rsid w:val="006C417F"/>
@@ -4286,10 +5181,10 @@
       <w:color w:val="0F4761" w:themeColor="accent1" w:themeShade="BF"/>
     </w:rPr>
   </w:style>
-  <w:style w:type="character" w:customStyle="1" w:styleId="Titre6Car">
-    <w:name w:val="Titre 6 Car"/>
-    <w:basedOn w:val="Policepardfaut"/>
-    <w:link w:val="Titre6"/>
+  <w:style w:type="character" w:customStyle="1" w:styleId="Heading6Char">
+    <w:name w:val="Heading 6 Char"/>
+    <w:basedOn w:val="DefaultParagraphFont"/>
+    <w:link w:val="Heading6"/>
     <w:uiPriority w:val="9"/>
     <w:semiHidden/>
     <w:rsid w:val="006C417F"/>
@@ -4300,10 +5195,10 @@
       <w:color w:val="595959" w:themeColor="text1" w:themeTint="A6"/>
     </w:rPr>
   </w:style>
-  <w:style w:type="character" w:customStyle="1" w:styleId="Titre7Car">
-    <w:name w:val="Titre 7 Car"/>
-    <w:basedOn w:val="Policepardfaut"/>
-    <w:link w:val="Titre7"/>
+  <w:style w:type="character" w:customStyle="1" w:styleId="Heading7Char">
+    <w:name w:val="Heading 7 Char"/>
+    <w:basedOn w:val="DefaultParagraphFont"/>
+    <w:link w:val="Heading7"/>
     <w:uiPriority w:val="9"/>
     <w:semiHidden/>
     <w:rsid w:val="006C417F"/>
@@ -4312,10 +5207,10 @@
       <w:color w:val="595959" w:themeColor="text1" w:themeTint="A6"/>
     </w:rPr>
   </w:style>
-  <w:style w:type="character" w:customStyle="1" w:styleId="Titre8Car">
-    <w:name w:val="Titre 8 Car"/>
-    <w:basedOn w:val="Policepardfaut"/>
-    <w:link w:val="Titre8"/>
+  <w:style w:type="character" w:customStyle="1" w:styleId="Heading8Char">
+    <w:name w:val="Heading 8 Char"/>
+    <w:basedOn w:val="DefaultParagraphFont"/>
+    <w:link w:val="Heading8"/>
     <w:uiPriority w:val="9"/>
     <w:semiHidden/>
     <w:rsid w:val="006C417F"/>
@@ -4326,10 +5221,10 @@
       <w:color w:val="272727" w:themeColor="text1" w:themeTint="D8"/>
     </w:rPr>
   </w:style>
-  <w:style w:type="character" w:customStyle="1" w:styleId="Titre9Car">
-    <w:name w:val="Titre 9 Car"/>
-    <w:basedOn w:val="Policepardfaut"/>
-    <w:link w:val="Titre9"/>
+  <w:style w:type="character" w:customStyle="1" w:styleId="Heading9Char">
+    <w:name w:val="Heading 9 Char"/>
+    <w:basedOn w:val="DefaultParagraphFont"/>
+    <w:link w:val="Heading9"/>
     <w:uiPriority w:val="9"/>
     <w:semiHidden/>
     <w:rsid w:val="006C417F"/>
@@ -4338,11 +5233,11 @@
       <w:color w:val="272727" w:themeColor="text1" w:themeTint="D8"/>
     </w:rPr>
   </w:style>
-  <w:style w:type="paragraph" w:styleId="Titre">
+  <w:style w:type="paragraph" w:styleId="Title">
     <w:name w:val="Title"/>
     <w:basedOn w:val="Normal"/>
     <w:next w:val="Normal"/>
-    <w:link w:val="TitreCar"/>
+    <w:link w:val="TitleChar"/>
     <w:uiPriority w:val="10"/>
     <w:qFormat/>
     <w:rsid w:val="006C417F"/>
@@ -4358,10 +5253,10 @@
       <w:szCs w:val="56"/>
     </w:rPr>
   </w:style>
-  <w:style w:type="character" w:customStyle="1" w:styleId="TitreCar">
-    <w:name w:val="Titre Car"/>
-    <w:basedOn w:val="Policepardfaut"/>
-    <w:link w:val="Titre"/>
+  <w:style w:type="character" w:customStyle="1" w:styleId="TitleChar">
+    <w:name w:val="Title Char"/>
+    <w:basedOn w:val="DefaultParagraphFont"/>
+    <w:link w:val="Title"/>
     <w:uiPriority w:val="10"/>
     <w:rsid w:val="006C417F"/>
     <w:rPr>
@@ -4372,11 +5267,11 @@
       <w:szCs w:val="56"/>
     </w:rPr>
   </w:style>
-  <w:style w:type="paragraph" w:styleId="Sous-titre">
+  <w:style w:type="paragraph" w:styleId="Subtitle">
     <w:name w:val="Subtitle"/>
     <w:basedOn w:val="Normal"/>
     <w:next w:val="Normal"/>
-    <w:link w:val="Sous-titreCar"/>
+    <w:link w:val="SubtitleChar"/>
     <w:uiPriority w:val="11"/>
     <w:qFormat/>
     <w:rsid w:val="006C417F"/>
@@ -4393,10 +5288,10 @@
       <w:szCs w:val="28"/>
     </w:rPr>
   </w:style>
-  <w:style w:type="character" w:customStyle="1" w:styleId="Sous-titreCar">
-    <w:name w:val="Sous-titre Car"/>
-    <w:basedOn w:val="Policepardfaut"/>
-    <w:link w:val="Sous-titre"/>
+  <w:style w:type="character" w:customStyle="1" w:styleId="SubtitleChar">
+    <w:name w:val="Subtitle Char"/>
+    <w:basedOn w:val="DefaultParagraphFont"/>
+    <w:link w:val="Subtitle"/>
     <w:uiPriority w:val="11"/>
     <w:rsid w:val="006C417F"/>
     <w:rPr>
@@ -4407,11 +5302,11 @@
       <w:szCs w:val="28"/>
     </w:rPr>
   </w:style>
-  <w:style w:type="paragraph" w:styleId="Citation">
+  <w:style w:type="paragraph" w:styleId="Quote">
     <w:name w:val="Quote"/>
     <w:basedOn w:val="Normal"/>
     <w:next w:val="Normal"/>
-    <w:link w:val="CitationCar"/>
+    <w:link w:val="QuoteChar"/>
     <w:uiPriority w:val="29"/>
     <w:qFormat/>
     <w:rsid w:val="006C417F"/>
@@ -4425,10 +5320,10 @@
       <w:color w:val="404040" w:themeColor="text1" w:themeTint="BF"/>
     </w:rPr>
   </w:style>
-  <w:style w:type="character" w:customStyle="1" w:styleId="CitationCar">
-    <w:name w:val="Citation Car"/>
-    <w:basedOn w:val="Policepardfaut"/>
-    <w:link w:val="Citation"/>
+  <w:style w:type="character" w:customStyle="1" w:styleId="QuoteChar">
+    <w:name w:val="Quote Char"/>
+    <w:basedOn w:val="DefaultParagraphFont"/>
+    <w:link w:val="Quote"/>
     <w:uiPriority w:val="29"/>
     <w:rsid w:val="006C417F"/>
     <w:rPr>
@@ -4437,7 +5332,7 @@
       <w:color w:val="404040" w:themeColor="text1" w:themeTint="BF"/>
     </w:rPr>
   </w:style>
-  <w:style w:type="paragraph" w:styleId="Paragraphedeliste">
+  <w:style w:type="paragraph" w:styleId="ListParagraph">
     <w:name w:val="List Paragraph"/>
     <w:basedOn w:val="Normal"/>
     <w:uiPriority w:val="34"/>
@@ -4448,9 +5343,9 @@
       <w:contextualSpacing/>
     </w:pPr>
   </w:style>
-  <w:style w:type="character" w:styleId="Accentuationintense">
+  <w:style w:type="character" w:styleId="IntenseEmphasis">
     <w:name w:val="Intense Emphasis"/>
-    <w:basedOn w:val="Policepardfaut"/>
+    <w:basedOn w:val="DefaultParagraphFont"/>
     <w:uiPriority w:val="21"/>
     <w:qFormat/>
     <w:rsid w:val="006C417F"/>
@@ -4460,11 +5355,11 @@
       <w:color w:val="0F4761" w:themeColor="accent1" w:themeShade="BF"/>
     </w:rPr>
   </w:style>
-  <w:style w:type="paragraph" w:styleId="Citationintense">
+  <w:style w:type="paragraph" w:styleId="IntenseQuote">
     <w:name w:val="Intense Quote"/>
     <w:basedOn w:val="Normal"/>
     <w:next w:val="Normal"/>
-    <w:link w:val="CitationintenseCar"/>
+    <w:link w:val="IntenseQuoteChar"/>
     <w:uiPriority w:val="30"/>
     <w:qFormat/>
     <w:rsid w:val="006C417F"/>
@@ -4483,10 +5378,10 @@
       <w:color w:val="0F4761" w:themeColor="accent1" w:themeShade="BF"/>
     </w:rPr>
   </w:style>
-  <w:style w:type="character" w:customStyle="1" w:styleId="CitationintenseCar">
-    <w:name w:val="Citation intense Car"/>
-    <w:basedOn w:val="Policepardfaut"/>
-    <w:link w:val="Citationintense"/>
+  <w:style w:type="character" w:customStyle="1" w:styleId="IntenseQuoteChar">
+    <w:name w:val="Intense Quote Char"/>
+    <w:basedOn w:val="DefaultParagraphFont"/>
+    <w:link w:val="IntenseQuote"/>
     <w:uiPriority w:val="30"/>
     <w:rsid w:val="006C417F"/>
     <w:rPr>
@@ -4495,9 +5390,9 @@
       <w:color w:val="0F4761" w:themeColor="accent1" w:themeShade="BF"/>
     </w:rPr>
   </w:style>
-  <w:style w:type="character" w:styleId="Rfrenceintense">
+  <w:style w:type="character" w:styleId="IntenseReference">
     <w:name w:val="Intense Reference"/>
-    <w:basedOn w:val="Policepardfaut"/>
+    <w:basedOn w:val="DefaultParagraphFont"/>
     <w:uiPriority w:val="32"/>
     <w:qFormat/>
     <w:rsid w:val="006C417F"/>
@@ -4509,9 +5404,9 @@
       <w:spacing w:val="5"/>
     </w:rPr>
   </w:style>
-  <w:style w:type="character" w:styleId="Lienhypertexte">
+  <w:style w:type="character" w:styleId="Hyperlink">
     <w:name w:val="Hyperlink"/>
-    <w:basedOn w:val="Policepardfaut"/>
+    <w:basedOn w:val="DefaultParagraphFont"/>
     <w:uiPriority w:val="99"/>
     <w:unhideWhenUsed/>
     <w:rsid w:val="00E71138"/>
@@ -4520,9 +5415,9 @@
       <w:u w:val="single"/>
     </w:rPr>
   </w:style>
-  <w:style w:type="character" w:styleId="Mentionnonrsolue">
+  <w:style w:type="character" w:styleId="UnresolvedMention">
     <w:name w:val="Unresolved Mention"/>
-    <w:basedOn w:val="Policepardfaut"/>
+    <w:basedOn w:val="DefaultParagraphFont"/>
     <w:uiPriority w:val="99"/>
     <w:semiHidden/>
     <w:unhideWhenUsed/>
@@ -4532,9 +5427,9 @@
       <w:shd w:val="clear" w:color="auto" w:fill="E1DFDD"/>
     </w:rPr>
   </w:style>
-  <w:style w:type="character" w:styleId="Lienhypertextesuivivisit">
+  <w:style w:type="character" w:styleId="FollowedHyperlink">
     <w:name w:val="FollowedHyperlink"/>
-    <w:basedOn w:val="Policepardfaut"/>
+    <w:basedOn w:val="DefaultParagraphFont"/>
     <w:uiPriority w:val="99"/>
     <w:semiHidden/>
     <w:unhideWhenUsed/>
@@ -4544,9 +5439,9 @@
       <w:u w:val="single"/>
     </w:rPr>
   </w:style>
-  <w:style w:type="table" w:styleId="Grilledutableau">
+  <w:style w:type="table" w:styleId="TableGrid">
     <w:name w:val="Table Grid"/>
-    <w:basedOn w:val="TableauNormal"/>
+    <w:basedOn w:val="TableNormal"/>
     <w:uiPriority w:val="39"/>
     <w:rsid w:val="00F72678"/>
     <w:pPr>
@@ -4563,9 +5458,9 @@
       </w:tblBorders>
     </w:tblPr>
   </w:style>
-  <w:style w:type="paragraph" w:styleId="En-ttedetabledesmatires">
+  <w:style w:type="paragraph" w:styleId="TOCHeading">
     <w:name w:val="TOC Heading"/>
-    <w:basedOn w:val="Titre1"/>
+    <w:basedOn w:val="Heading1"/>
     <w:next w:val="Normal"/>
     <w:uiPriority w:val="39"/>
     <w:unhideWhenUsed/>
@@ -4583,7 +5478,7 @@
       <w14:ligatures w14:val="none"/>
     </w:rPr>
   </w:style>
-  <w:style w:type="paragraph" w:styleId="TM1">
+  <w:style w:type="paragraph" w:styleId="TOC1">
     <w:name w:val="toc 1"/>
     <w:basedOn w:val="Normal"/>
     <w:next w:val="Normal"/>
@@ -4595,7 +5490,7 @@
       <w:spacing w:after="100"/>
     </w:pPr>
   </w:style>
-  <w:style w:type="paragraph" w:styleId="TM2">
+  <w:style w:type="paragraph" w:styleId="TOC2">
     <w:name w:val="toc 2"/>
     <w:basedOn w:val="Normal"/>
     <w:next w:val="Normal"/>
@@ -4608,7 +5503,7 @@
       <w:ind w:left="240"/>
     </w:pPr>
   </w:style>
-  <w:style w:type="paragraph" w:styleId="TM3">
+  <w:style w:type="paragraph" w:styleId="TOC3">
     <w:name w:val="toc 3"/>
     <w:basedOn w:val="Normal"/>
     <w:next w:val="Normal"/>
@@ -4621,10 +5516,10 @@
       <w:ind w:left="480"/>
     </w:pPr>
   </w:style>
-  <w:style w:type="paragraph" w:styleId="En-tte">
+  <w:style w:type="paragraph" w:styleId="Header">
     <w:name w:val="header"/>
     <w:basedOn w:val="Normal"/>
-    <w:link w:val="En-tteCar"/>
+    <w:link w:val="HeaderChar"/>
     <w:uiPriority w:val="99"/>
     <w:unhideWhenUsed/>
     <w:rsid w:val="001938A7"/>
@@ -4636,17 +5531,17 @@
       <w:spacing w:after="0" w:line="240" w:lineRule="auto"/>
     </w:pPr>
   </w:style>
-  <w:style w:type="character" w:customStyle="1" w:styleId="En-tteCar">
-    <w:name w:val="En-tête Car"/>
-    <w:basedOn w:val="Policepardfaut"/>
-    <w:link w:val="En-tte"/>
+  <w:style w:type="character" w:customStyle="1" w:styleId="HeaderChar">
+    <w:name w:val="Header Char"/>
+    <w:basedOn w:val="DefaultParagraphFont"/>
+    <w:link w:val="Header"/>
     <w:uiPriority w:val="99"/>
     <w:rsid w:val="001938A7"/>
   </w:style>
-  <w:style w:type="paragraph" w:styleId="Pieddepage">
+  <w:style w:type="paragraph" w:styleId="Footer">
     <w:name w:val="footer"/>
     <w:basedOn w:val="Normal"/>
-    <w:link w:val="PieddepageCar"/>
+    <w:link w:val="FooterChar"/>
     <w:uiPriority w:val="99"/>
     <w:unhideWhenUsed/>
     <w:rsid w:val="001938A7"/>
@@ -4658,10 +5553,10 @@
       <w:spacing w:after="0" w:line="240" w:lineRule="auto"/>
     </w:pPr>
   </w:style>
-  <w:style w:type="character" w:customStyle="1" w:styleId="PieddepageCar">
-    <w:name w:val="Pied de page Car"/>
-    <w:basedOn w:val="Policepardfaut"/>
-    <w:link w:val="Pieddepage"/>
+  <w:style w:type="character" w:customStyle="1" w:styleId="FooterChar">
+    <w:name w:val="Footer Char"/>
+    <w:basedOn w:val="DefaultParagraphFont"/>
+    <w:link w:val="Footer"/>
     <w:uiPriority w:val="99"/>
     <w:rsid w:val="001938A7"/>
   </w:style>

</xml_diff>

<commit_message>
doc(rapport) avancé dans le diagramme de classe
</commit_message>
<xml_diff>
--- a/doc/Rapport.docx
+++ b/doc/Rapport.docx
@@ -4,43 +4,43 @@
   <w:body>
     <w:p>
       <w:pPr>
-        <w:pStyle w:val="Heading1"/>
+        <w:pStyle w:val="Titre1"/>
         <w:jc w:val="center"/>
       </w:pPr>
     </w:p>
     <w:p>
       <w:pPr>
-        <w:pStyle w:val="Heading1"/>
+        <w:pStyle w:val="Titre1"/>
         <w:jc w:val="center"/>
       </w:pPr>
     </w:p>
     <w:p>
       <w:pPr>
-        <w:pStyle w:val="Heading1"/>
+        <w:pStyle w:val="Titre1"/>
         <w:jc w:val="center"/>
       </w:pPr>
     </w:p>
     <w:p>
       <w:pPr>
-        <w:pStyle w:val="Heading1"/>
+        <w:pStyle w:val="Titre1"/>
         <w:jc w:val="center"/>
       </w:pPr>
     </w:p>
     <w:p>
       <w:pPr>
-        <w:pStyle w:val="Heading1"/>
+        <w:pStyle w:val="Titre1"/>
         <w:jc w:val="center"/>
       </w:pPr>
     </w:p>
     <w:p>
       <w:pPr>
-        <w:pStyle w:val="Heading1"/>
+        <w:pStyle w:val="Titre1"/>
         <w:jc w:val="center"/>
       </w:pPr>
     </w:p>
     <w:p>
       <w:pPr>
-        <w:pStyle w:val="Heading1"/>
+        <w:pStyle w:val="Titre1"/>
         <w:jc w:val="center"/>
       </w:pPr>
       <w:bookmarkStart w:id="0" w:name="_Toc243513762"/>
@@ -99,7 +99,7 @@
       <w:sdtContent>
         <w:p>
           <w:pPr>
-            <w:pStyle w:val="TOCHeading"/>
+            <w:pStyle w:val="En-ttedetabledesmatires"/>
           </w:pPr>
           <w:r>
             <w:rPr>
@@ -110,7 +110,7 @@
         </w:p>
         <w:p>
           <w:pPr>
-            <w:pStyle w:val="TOC1"/>
+            <w:pStyle w:val="TM1"/>
             <w:tabs>
               <w:tab w:val="right" w:leader="dot" w:pos="9062"/>
             </w:tabs>
@@ -132,7 +132,7 @@
           <w:hyperlink w:anchor="_Toc243513762" w:history="1">
             <w:r>
               <w:rPr>
-                <w:rStyle w:val="Hyperlink"/>
+                <w:rStyle w:val="Lienhypertexte"/>
                 <w:noProof/>
               </w:rPr>
               <w:t>P_OO Shoot Me Up Rapport de Projet</w:t>
@@ -189,7 +189,7 @@
         </w:p>
         <w:p>
           <w:pPr>
-            <w:pStyle w:val="TOC2"/>
+            <w:pStyle w:val="TM2"/>
             <w:tabs>
               <w:tab w:val="right" w:leader="dot" w:pos="9062"/>
             </w:tabs>
@@ -202,7 +202,7 @@
           <w:hyperlink w:anchor="_Toc243513763" w:history="1">
             <w:r>
               <w:rPr>
-                <w:rStyle w:val="Hyperlink"/>
+                <w:rStyle w:val="Lienhypertexte"/>
                 <w:noProof/>
               </w:rPr>
               <w:t>Introduction</w:t>
@@ -259,7 +259,7 @@
         </w:p>
         <w:p>
           <w:pPr>
-            <w:pStyle w:val="TOC3"/>
+            <w:pStyle w:val="TM3"/>
             <w:tabs>
               <w:tab w:val="right" w:leader="dot" w:pos="9062"/>
             </w:tabs>
@@ -272,7 +272,7 @@
           <w:hyperlink w:anchor="_Toc243513764" w:history="1">
             <w:r>
               <w:rPr>
-                <w:rStyle w:val="Hyperlink"/>
+                <w:rStyle w:val="Lienhypertexte"/>
                 <w:noProof/>
               </w:rPr>
               <w:t>Objectifs produit</w:t>
@@ -329,7 +329,7 @@
         </w:p>
         <w:p>
           <w:pPr>
-            <w:pStyle w:val="TOC3"/>
+            <w:pStyle w:val="TM3"/>
             <w:tabs>
               <w:tab w:val="right" w:leader="dot" w:pos="9062"/>
             </w:tabs>
@@ -342,7 +342,7 @@
           <w:hyperlink w:anchor="_Toc243513765" w:history="1">
             <w:r>
               <w:rPr>
-                <w:rStyle w:val="Hyperlink"/>
+                <w:rStyle w:val="Lienhypertexte"/>
                 <w:noProof/>
               </w:rPr>
               <w:t>Objectifs pédagogiques</w:t>
@@ -399,7 +399,7 @@
         </w:p>
         <w:p>
           <w:pPr>
-            <w:pStyle w:val="TOC2"/>
+            <w:pStyle w:val="TM2"/>
             <w:tabs>
               <w:tab w:val="right" w:leader="dot" w:pos="9062"/>
             </w:tabs>
@@ -412,7 +412,7 @@
           <w:hyperlink w:anchor="_Toc243513766" w:history="1">
             <w:r>
               <w:rPr>
-                <w:rStyle w:val="Hyperlink"/>
+                <w:rStyle w:val="Lienhypertexte"/>
                 <w:noProof/>
               </w:rPr>
               <w:t>Analyse fonctionnelle</w:t>
@@ -469,7 +469,7 @@
         </w:p>
         <w:p>
           <w:pPr>
-            <w:pStyle w:val="TOC2"/>
+            <w:pStyle w:val="TM2"/>
             <w:tabs>
               <w:tab w:val="right" w:leader="dot" w:pos="9062"/>
             </w:tabs>
@@ -482,7 +482,7 @@
           <w:hyperlink w:anchor="_Toc243513767" w:history="1">
             <w:r>
               <w:rPr>
-                <w:rStyle w:val="Hyperlink"/>
+                <w:rStyle w:val="Lienhypertexte"/>
                 <w:noProof/>
               </w:rPr>
               <w:t>Planification Initiale</w:t>
@@ -539,7 +539,7 @@
         </w:p>
         <w:p>
           <w:pPr>
-            <w:pStyle w:val="TOC2"/>
+            <w:pStyle w:val="TM2"/>
             <w:tabs>
               <w:tab w:val="right" w:leader="dot" w:pos="9062"/>
             </w:tabs>
@@ -552,7 +552,7 @@
           <w:hyperlink w:anchor="_Toc243513768" w:history="1">
             <w:r>
               <w:rPr>
-                <w:rStyle w:val="Hyperlink"/>
+                <w:rStyle w:val="Lienhypertexte"/>
                 <w:noProof/>
               </w:rPr>
               <w:t>Utilisation de l’IA</w:t>
@@ -634,12 +634,12 @@
     </w:p>
     <w:p>
       <w:pPr>
-        <w:pStyle w:val="Heading2"/>
-      </w:pPr>
-    </w:p>
-    <w:p>
-      <w:pPr>
-        <w:pStyle w:val="Heading2"/>
+        <w:pStyle w:val="Titre2"/>
+      </w:pPr>
+    </w:p>
+    <w:p>
+      <w:pPr>
+        <w:pStyle w:val="Titre2"/>
       </w:pPr>
       <w:bookmarkStart w:id="1" w:name="_Toc243513763"/>
       <w:r>
@@ -649,7 +649,7 @@
     </w:p>
     <w:p>
       <w:pPr>
-        <w:pStyle w:val="Heading3"/>
+        <w:pStyle w:val="Titre3"/>
         <w:ind w:left="708"/>
       </w:pPr>
       <w:bookmarkStart w:id="2" w:name="_Toc243513764"/>
@@ -752,7 +752,7 @@
     </w:p>
     <w:p>
       <w:pPr>
-        <w:pStyle w:val="Heading4"/>
+        <w:pStyle w:val="Titre4"/>
         <w:ind w:left="708"/>
       </w:pPr>
       <w:r>
@@ -879,7 +879,7 @@
     </w:p>
     <w:p>
       <w:pPr>
-        <w:pStyle w:val="Heading4"/>
+        <w:pStyle w:val="Titre4"/>
         <w:ind w:left="708"/>
       </w:pPr>
       <w:r>
@@ -918,7 +918,7 @@
     </w:p>
     <w:p>
       <w:pPr>
-        <w:pStyle w:val="Heading4"/>
+        <w:pStyle w:val="Titre4"/>
         <w:ind w:left="708"/>
       </w:pPr>
       <w:r>
@@ -949,7 +949,7 @@
     </w:p>
     <w:p>
       <w:pPr>
-        <w:pStyle w:val="Heading3"/>
+        <w:pStyle w:val="Titre3"/>
         <w:ind w:left="708"/>
       </w:pPr>
       <w:bookmarkStart w:id="3" w:name="_Toc243513765"/>
@@ -968,7 +968,7 @@
     </w:p>
     <w:p>
       <w:pPr>
-        <w:pStyle w:val="ListParagraph"/>
+        <w:pStyle w:val="Paragraphedeliste"/>
         <w:numPr>
           <w:ilvl w:val="0"/>
           <w:numId w:val="4"/>
@@ -980,7 +980,7 @@
     </w:p>
     <w:p>
       <w:pPr>
-        <w:pStyle w:val="ListParagraph"/>
+        <w:pStyle w:val="Paragraphedeliste"/>
         <w:numPr>
           <w:ilvl w:val="0"/>
           <w:numId w:val="4"/>
@@ -998,7 +998,7 @@
     </w:p>
     <w:p>
       <w:pPr>
-        <w:pStyle w:val="ListParagraph"/>
+        <w:pStyle w:val="Paragraphedeliste"/>
         <w:numPr>
           <w:ilvl w:val="0"/>
           <w:numId w:val="4"/>
@@ -1010,7 +1010,7 @@
     </w:p>
     <w:p>
       <w:pPr>
-        <w:pStyle w:val="ListParagraph"/>
+        <w:pStyle w:val="Paragraphedeliste"/>
         <w:numPr>
           <w:ilvl w:val="0"/>
           <w:numId w:val="4"/>
@@ -1022,7 +1022,7 @@
     </w:p>
     <w:p>
       <w:pPr>
-        <w:pStyle w:val="ListParagraph"/>
+        <w:pStyle w:val="Paragraphedeliste"/>
         <w:numPr>
           <w:ilvl w:val="0"/>
           <w:numId w:val="4"/>
@@ -1066,7 +1066,7 @@
     </w:p>
     <w:p>
       <w:pPr>
-        <w:pStyle w:val="ListParagraph"/>
+        <w:pStyle w:val="Paragraphedeliste"/>
         <w:numPr>
           <w:ilvl w:val="0"/>
           <w:numId w:val="4"/>
@@ -1084,7 +1084,7 @@
     </w:p>
     <w:p>
       <w:pPr>
-        <w:pStyle w:val="Heading2"/>
+        <w:pStyle w:val="Titre2"/>
       </w:pPr>
       <w:bookmarkStart w:id="4" w:name="_Toc243513766"/>
       <w:r>
@@ -1094,7 +1094,7 @@
     </w:p>
     <w:p>
       <w:pPr>
-        <w:pStyle w:val="Heading3"/>
+        <w:pStyle w:val="Titre3"/>
       </w:pPr>
       <w:r>
         <w:t>#1 — pouvoir faire bouger mon joueur avec WASD</w:t>
@@ -1245,7 +1245,7 @@
     <w:p/>
     <w:p>
       <w:pPr>
-        <w:pStyle w:val="Heading3"/>
+        <w:pStyle w:val="Titre3"/>
       </w:pPr>
       <w:r>
         <w:t xml:space="preserve">#2 — pouvoir tirer </w:t>
@@ -1386,7 +1386,7 @@
     <w:p/>
     <w:p>
       <w:pPr>
-        <w:pStyle w:val="Heading3"/>
+        <w:pStyle w:val="Titre3"/>
       </w:pPr>
       <w:r>
         <w:t>#3 — pouvoir faire des dégâts de corp à corp.</w:t>
@@ -1510,7 +1510,7 @@
     <w:p/>
     <w:p>
       <w:pPr>
-        <w:pStyle w:val="Heading3"/>
+        <w:pStyle w:val="Titre3"/>
       </w:pPr>
       <w:r>
         <w:t xml:space="preserve">#4 — En </w:t>
@@ -1728,7 +1728,7 @@
     <w:p/>
     <w:p>
       <w:pPr>
-        <w:pStyle w:val="Heading3"/>
+        <w:pStyle w:val="Titre3"/>
       </w:pPr>
       <w:r>
         <w:t>#5 — avoir des ennemis de type robot</w:t>
@@ -1946,7 +1946,7 @@
     </w:p>
     <w:p>
       <w:pPr>
-        <w:pStyle w:val="Heading3"/>
+        <w:pStyle w:val="Titre3"/>
       </w:pPr>
       <w:r>
         <w:t>#6 — les ennemis de type robot peuvent me tirer dessus</w:t>
@@ -2123,7 +2123,7 @@
     </w:p>
     <w:p>
       <w:pPr>
-        <w:pStyle w:val="Heading3"/>
+        <w:pStyle w:val="Titre3"/>
       </w:pPr>
       <w:r>
         <w:t>#7 — les ennemis de type manager peuvent me tirer dessus</w:t>
@@ -2291,7 +2291,7 @@
     </w:p>
     <w:p>
       <w:pPr>
-        <w:pStyle w:val="Heading3"/>
+        <w:pStyle w:val="Titre3"/>
       </w:pPr>
       <w:r>
         <w:t>#8 — avoir une barre de vie</w:t>
@@ -2391,7 +2391,7 @@
     </w:p>
     <w:p>
       <w:pPr>
-        <w:pStyle w:val="Heading3"/>
+        <w:pStyle w:val="Titre3"/>
       </w:pPr>
       <w:r>
         <w:t>#9 — avoir une barre d'argent</w:t>
@@ -2506,7 +2506,7 @@
     </w:p>
     <w:p>
       <w:pPr>
-        <w:pStyle w:val="Heading3"/>
+        <w:pStyle w:val="Titre3"/>
       </w:pPr>
       <w:r>
         <w:t xml:space="preserve">#10 — avoir des obstacles afin de pouvoir me protéger </w:t>
@@ -2680,7 +2680,7 @@
     </w:p>
     <w:p>
       <w:pPr>
-        <w:pStyle w:val="Heading2"/>
+        <w:pStyle w:val="Titre2"/>
       </w:pPr>
       <w:bookmarkStart w:id="5" w:name="_Toc243513767"/>
       <w:r>
@@ -2690,7 +2690,7 @@
     </w:p>
     <w:tbl>
       <w:tblPr>
-        <w:tblStyle w:val="TableGrid"/>
+        <w:tblStyle w:val="Grilledutableau"/>
         <w:tblW w:w="0" w:type="auto"/>
         <w:tblLook w:val="04A0" w:firstRow="1" w:lastRow="0" w:firstColumn="1" w:lastColumn="0" w:noHBand="0" w:noVBand="1"/>
       </w:tblPr>
@@ -2773,7 +2773,7 @@
             <w:hyperlink r:id="rId18" w:history="1">
               <w:r>
                 <w:rPr>
-                  <w:rStyle w:val="Hyperlink"/>
+                  <w:rStyle w:val="Lienhypertexte"/>
                 </w:rPr>
                 <w:t>Ajout du mouvement WASD</w:t>
               </w:r>
@@ -2801,35 +2801,35 @@
               <w:proofErr w:type="gramStart"/>
               <w:r>
                 <w:rPr>
-                  <w:rStyle w:val="Hyperlink"/>
+                  <w:rStyle w:val="Lienhypertexte"/>
                 </w:rPr>
                 <w:t>pouvoir</w:t>
               </w:r>
               <w:proofErr w:type="gramEnd"/>
               <w:r>
                 <w:rPr>
-                  <w:rStyle w:val="Hyperlink"/>
+                  <w:rStyle w:val="Lienhypertexte"/>
                 </w:rPr>
                 <w:t xml:space="preserve"> tirer </w:t>
               </w:r>
               <w:proofErr w:type="gramStart"/>
               <w:r>
                 <w:rPr>
-                  <w:rStyle w:val="Hyperlink"/>
+                  <w:rStyle w:val="Lienhypertexte"/>
                 </w:rPr>
                 <w:t>des projectile</w:t>
               </w:r>
               <w:proofErr w:type="gramEnd"/>
               <w:r>
                 <w:rPr>
-                  <w:rStyle w:val="Hyperlink"/>
+                  <w:rStyle w:val="Lienhypertexte"/>
                 </w:rPr>
                 <w:t xml:space="preserve"> sur mes </w:t>
               </w:r>
               <w:proofErr w:type="spellStart"/>
               <w:r>
                 <w:rPr>
-                  <w:rStyle w:val="Hyperlink"/>
+                  <w:rStyle w:val="Lienhypertexte"/>
                 </w:rPr>
                 <w:t>enemies</w:t>
               </w:r>
@@ -2858,42 +2858,42 @@
               <w:proofErr w:type="gramStart"/>
               <w:r>
                 <w:rPr>
-                  <w:rStyle w:val="Hyperlink"/>
+                  <w:rStyle w:val="Lienhypertexte"/>
                 </w:rPr>
                 <w:t>pouvoir</w:t>
               </w:r>
               <w:proofErr w:type="gramEnd"/>
               <w:r>
                 <w:rPr>
-                  <w:rStyle w:val="Hyperlink"/>
+                  <w:rStyle w:val="Lienhypertexte"/>
                 </w:rPr>
                 <w:t xml:space="preserve"> faire des </w:t>
               </w:r>
               <w:proofErr w:type="spellStart"/>
               <w:r>
                 <w:rPr>
-                  <w:rStyle w:val="Hyperlink"/>
+                  <w:rStyle w:val="Lienhypertexte"/>
                 </w:rPr>
                 <w:t>degats</w:t>
               </w:r>
               <w:proofErr w:type="spellEnd"/>
               <w:r>
                 <w:rPr>
-                  <w:rStyle w:val="Hyperlink"/>
+                  <w:rStyle w:val="Lienhypertexte"/>
                 </w:rPr>
                 <w:t xml:space="preserve"> </w:t>
               </w:r>
               <w:proofErr w:type="gramStart"/>
               <w:r>
                 <w:rPr>
-                  <w:rStyle w:val="Hyperlink"/>
+                  <w:rStyle w:val="Lienhypertexte"/>
                 </w:rPr>
                 <w:t>au corp</w:t>
               </w:r>
               <w:proofErr w:type="gramEnd"/>
               <w:r>
                 <w:rPr>
-                  <w:rStyle w:val="Hyperlink"/>
+                  <w:rStyle w:val="Lienhypertexte"/>
                 </w:rPr>
                 <w:t xml:space="preserve"> à corp</w:t>
               </w:r>
@@ -2920,7 +2920,7 @@
             <w:hyperlink r:id="rId21" w:history="1">
               <w:r>
                 <w:rPr>
-                  <w:rStyle w:val="Hyperlink"/>
+                  <w:rStyle w:val="Lienhypertexte"/>
                 </w:rPr>
                 <w:t>Ajouter un compteur de PV</w:t>
               </w:r>
@@ -2947,7 +2947,7 @@
             <w:hyperlink r:id="rId22" w:history="1">
               <w:r>
                 <w:rPr>
-                  <w:rStyle w:val="Hyperlink"/>
+                  <w:rStyle w:val="Lienhypertexte"/>
                 </w:rPr>
                 <w:t>Ajouter un compteur d’argent</w:t>
               </w:r>
@@ -2974,7 +2974,7 @@
             <w:hyperlink r:id="rId23" w:history="1">
               <w:r>
                 <w:rPr>
-                  <w:rStyle w:val="Hyperlink"/>
+                  <w:rStyle w:val="Lienhypertexte"/>
                 </w:rPr>
                 <w:t>Créer des ennemies de type manager</w:t>
               </w:r>
@@ -3001,7 +3001,7 @@
             <w:hyperlink r:id="rId24" w:history="1">
               <w:r>
                 <w:rPr>
-                  <w:rStyle w:val="Hyperlink"/>
+                  <w:rStyle w:val="Lienhypertexte"/>
                 </w:rPr>
                 <w:t>Créer les projectiles des managers</w:t>
               </w:r>
@@ -3031,7 +3031,7 @@
             <w:hyperlink r:id="rId25" w:history="1">
               <w:r>
                 <w:rPr>
-                  <w:rStyle w:val="Hyperlink"/>
+                  <w:rStyle w:val="Lienhypertexte"/>
                 </w:rPr>
                 <w:t>Créer des ennemies de type robot</w:t>
               </w:r>
@@ -3061,7 +3061,7 @@
             <w:hyperlink r:id="rId26" w:history="1">
               <w:r>
                 <w:rPr>
-                  <w:rStyle w:val="Hyperlink"/>
+                  <w:rStyle w:val="Lienhypertexte"/>
                 </w:rPr>
                 <w:t>Créer les projectiles des robots</w:t>
               </w:r>
@@ -3091,7 +3091,7 @@
             <w:hyperlink r:id="rId27" w:history="1">
               <w:r>
                 <w:rPr>
-                  <w:rStyle w:val="Hyperlink"/>
+                  <w:rStyle w:val="Lienhypertexte"/>
                 </w:rPr>
                 <w:t>Créer les obstacles</w:t>
               </w:r>
@@ -3103,7 +3103,7 @@
     <w:p/>
     <w:p>
       <w:pPr>
-        <w:pStyle w:val="Heading2"/>
+        <w:pStyle w:val="Titre2"/>
       </w:pPr>
       <w:r>
         <w:t>Rapport de tests</w:t>
@@ -3116,7 +3116,7 @@
     </w:p>
     <w:p>
       <w:pPr>
-        <w:pStyle w:val="Heading3"/>
+        <w:pStyle w:val="Titre3"/>
       </w:pPr>
       <w:proofErr w:type="spellStart"/>
       <w:r>
@@ -3136,9 +3136,21 @@
       <w:proofErr w:type="spellStart"/>
       <w:r>
         <w:rPr>
-          <w:rStyle w:val="Heading4Char"/>
+          <w:rStyle w:val="Titre4Car"/>
         </w:rPr>
-        <w:t>TestDisance</w:t>
+        <w:t>TestDis</w:t>
+      </w:r>
+      <w:r>
+        <w:rPr>
+          <w:rStyle w:val="Titre4Car"/>
+        </w:rPr>
+        <w:t>t</w:t>
+      </w:r>
+      <w:r>
+        <w:rPr>
+          <w:rStyle w:val="Titre4Car"/>
+        </w:rPr>
+        <w:t>ance</w:t>
       </w:r>
       <w:proofErr w:type="spellEnd"/>
       <w:r>
@@ -3177,7 +3189,7 @@
       <w:proofErr w:type="spellStart"/>
       <w:r>
         <w:rPr>
-          <w:rStyle w:val="Heading4Char"/>
+          <w:rStyle w:val="Titre4Car"/>
         </w:rPr>
         <w:t>TestAreTouching</w:t>
       </w:r>
@@ -3212,7 +3224,7 @@
     </w:p>
     <w:p>
       <w:pPr>
-        <w:pStyle w:val="Heading3"/>
+        <w:pStyle w:val="Titre3"/>
       </w:pPr>
       <w:proofErr w:type="spellStart"/>
       <w:r>
@@ -3269,7 +3281,7 @@
       <w:proofErr w:type="spellStart"/>
       <w:r>
         <w:rPr>
-          <w:rStyle w:val="Heading4Char"/>
+          <w:rStyle w:val="Titre4Car"/>
         </w:rPr>
         <w:t>ManagerFires</w:t>
       </w:r>
@@ -3331,7 +3343,7 @@
       <w:proofErr w:type="spellStart"/>
       <w:r>
         <w:rPr>
-          <w:rStyle w:val="Heading4Char"/>
+          <w:rStyle w:val="Titre4Car"/>
         </w:rPr>
         <w:t>ManagerMoves</w:t>
       </w:r>
@@ -3356,7 +3368,7 @@
     </w:p>
     <w:p>
       <w:pPr>
-        <w:pStyle w:val="Heading3"/>
+        <w:pStyle w:val="Titre3"/>
       </w:pPr>
       <w:proofErr w:type="spellStart"/>
       <w:r>
@@ -3405,7 +3417,7 @@
       <w:proofErr w:type="gramStart"/>
       <w:r>
         <w:rPr>
-          <w:rStyle w:val="Heading4Char"/>
+          <w:rStyle w:val="Titre4Car"/>
         </w:rPr>
         <w:t>PlayerBurgerAttack</w:t>
       </w:r>
@@ -3428,7 +3440,7 @@
       <w:proofErr w:type="spellStart"/>
       <w:r>
         <w:rPr>
-          <w:rStyle w:val="Heading4Char"/>
+          <w:rStyle w:val="Titre4Car"/>
         </w:rPr>
         <w:t>PlayerMeleeAtack</w:t>
       </w:r>
@@ -3468,49 +3480,49 @@
       <w:proofErr w:type="spellStart"/>
       <w:r>
         <w:rPr>
-          <w:rStyle w:val="Heading4Char"/>
+          <w:rStyle w:val="Titre4Car"/>
         </w:rPr>
         <w:t>PlayerGoUp</w:t>
       </w:r>
       <w:proofErr w:type="spellEnd"/>
       <w:r>
         <w:rPr>
-          <w:rStyle w:val="Heading4Char"/>
+          <w:rStyle w:val="Titre4Car"/>
         </w:rPr>
         <w:t>/</w:t>
       </w:r>
       <w:proofErr w:type="spellStart"/>
       <w:r>
         <w:rPr>
-          <w:rStyle w:val="Heading4Char"/>
+          <w:rStyle w:val="Titre4Car"/>
         </w:rPr>
         <w:t>PlayerGoDown</w:t>
       </w:r>
       <w:proofErr w:type="spellEnd"/>
       <w:r>
         <w:rPr>
-          <w:rStyle w:val="Heading4Char"/>
+          <w:rStyle w:val="Titre4Car"/>
         </w:rPr>
         <w:t>/</w:t>
       </w:r>
       <w:proofErr w:type="spellStart"/>
       <w:r>
         <w:rPr>
-          <w:rStyle w:val="Heading4Char"/>
+          <w:rStyle w:val="Titre4Car"/>
         </w:rPr>
         <w:t>PlayerGoLeft</w:t>
       </w:r>
       <w:proofErr w:type="spellEnd"/>
       <w:r>
         <w:rPr>
-          <w:rStyle w:val="Heading4Char"/>
+          <w:rStyle w:val="Titre4Car"/>
         </w:rPr>
         <w:t>/</w:t>
       </w:r>
       <w:proofErr w:type="spellStart"/>
       <w:r>
         <w:rPr>
-          <w:rStyle w:val="Heading4Char"/>
+          <w:rStyle w:val="Titre4Car"/>
         </w:rPr>
         <w:t>PlayerGoRight</w:t>
       </w:r>
@@ -3556,7 +3568,7 @@
       <w:proofErr w:type="spellStart"/>
       <w:r>
         <w:rPr>
-          <w:rStyle w:val="Heading4Char"/>
+          <w:rStyle w:val="Titre4Car"/>
         </w:rPr>
         <w:t>PlayerCollisionWithObstacle</w:t>
       </w:r>
@@ -3582,7 +3594,7 @@
     </w:p>
     <w:p>
       <w:pPr>
-        <w:pStyle w:val="Heading3"/>
+        <w:pStyle w:val="Titre3"/>
       </w:pPr>
       <w:proofErr w:type="spellStart"/>
       <w:r>
@@ -3630,7 +3642,7 @@
       <w:proofErr w:type="spellStart"/>
       <w:r>
         <w:rPr>
-          <w:rStyle w:val="Heading4Char"/>
+          <w:rStyle w:val="Titre4Car"/>
         </w:rPr>
         <w:t>RobotFires</w:t>
       </w:r>
@@ -3666,14 +3678,14 @@
       <w:proofErr w:type="spellStart"/>
       <w:r>
         <w:rPr>
-          <w:rStyle w:val="Heading4Char"/>
+          <w:rStyle w:val="Titre4Car"/>
         </w:rPr>
         <w:t>RobotMoves</w:t>
       </w:r>
       <w:proofErr w:type="spellEnd"/>
       <w:r>
         <w:rPr>
-          <w:rStyle w:val="Heading4Char"/>
+          <w:rStyle w:val="Titre4Car"/>
         </w:rPr>
         <w:t> </w:t>
       </w:r>
@@ -3710,7 +3722,7 @@
     </w:p>
     <w:p>
       <w:pPr>
-        <w:pStyle w:val="Heading3"/>
+        <w:pStyle w:val="Titre3"/>
       </w:pPr>
       <w:proofErr w:type="spellStart"/>
       <w:r>
@@ -3787,7 +3799,7 @@
     </w:p>
     <w:p>
       <w:pPr>
-        <w:pStyle w:val="Heading2"/>
+        <w:pStyle w:val="Titre2"/>
       </w:pPr>
       <w:r>
         <w:lastRenderedPageBreak/>
@@ -3800,10 +3812,10 @@
           <w:noProof/>
         </w:rPr>
         <w:drawing>
-          <wp:inline distT="0" distB="0" distL="0" distR="0" wp14:anchorId="337998C7" wp14:editId="591B09EE">
-            <wp:extent cx="5754370" cy="7195185"/>
-            <wp:effectExtent l="0" t="0" r="0" b="5715"/>
-            <wp:docPr id="1160258829" name="Picture 1"/>
+          <wp:inline distT="0" distB="0" distL="0" distR="0" wp14:anchorId="340C49EB" wp14:editId="37B28431">
+            <wp:extent cx="5755005" cy="7192010"/>
+            <wp:effectExtent l="0" t="0" r="0" b="8890"/>
+            <wp:docPr id="357911936" name="Image 1"/>
             <wp:cNvGraphicFramePr>
               <a:graphicFrameLocks xmlns:a="http://schemas.openxmlformats.org/drawingml/2006/main" noChangeAspect="1"/>
             </wp:cNvGraphicFramePr>
@@ -3832,7 +3844,7 @@
                   <pic:spPr bwMode="auto">
                     <a:xfrm>
                       <a:off x="0" y="0"/>
-                      <a:ext cx="5754370" cy="7195185"/>
+                      <a:ext cx="5755005" cy="7192010"/>
                     </a:xfrm>
                     <a:prstGeom prst="rect">
                       <a:avLst/>
@@ -3851,7 +3863,592 @@
     </w:p>
     <w:p>
       <w:pPr>
-        <w:pStyle w:val="Heading2"/>
+        <w:pStyle w:val="Titre3"/>
+      </w:pPr>
+      <w:r>
+        <w:t>Explications</w:t>
+      </w:r>
+    </w:p>
+    <w:p>
+      <w:pPr>
+        <w:pStyle w:val="Titre4"/>
+      </w:pPr>
+      <w:proofErr w:type="spellStart"/>
+      <w:r>
+        <w:t>BattleMap</w:t>
+      </w:r>
+      <w:proofErr w:type="spellEnd"/>
+    </w:p>
+    <w:p>
+      <w:pPr>
+        <w:ind w:left="708"/>
+      </w:pPr>
+      <w:r>
+        <w:t xml:space="preserve">Dans le programme, la première classe à être instancié est le </w:t>
+      </w:r>
+      <w:proofErr w:type="spellStart"/>
+      <w:r>
+        <w:t>BattleMap</w:t>
+      </w:r>
+      <w:proofErr w:type="spellEnd"/>
+      <w:r>
+        <w:t>. Il à comme argument le joueur.</w:t>
+      </w:r>
+      <w:r>
+        <w:t xml:space="preserve"> </w:t>
+      </w:r>
+      <w:proofErr w:type="spellStart"/>
+      <w:r>
+        <w:t>BattleMap</w:t>
+      </w:r>
+      <w:proofErr w:type="spellEnd"/>
+      <w:r>
+        <w:t xml:space="preserve"> met </w:t>
+      </w:r>
+      <w:r>
+        <w:t>tous les autres objets</w:t>
+      </w:r>
+      <w:r>
+        <w:t xml:space="preserve"> à jour via Update en appelant le « Update » de chaque objet puis il les fait afficher en </w:t>
+      </w:r>
+      <w:r>
+        <w:lastRenderedPageBreak/>
+        <w:t>appelant le « Render » de chaque</w:t>
+      </w:r>
+      <w:r>
+        <w:t xml:space="preserve"> </w:t>
+      </w:r>
+      <w:r>
+        <w:t>objet</w:t>
+      </w:r>
+      <w:r>
+        <w:t xml:space="preserve"> (Update et Render sont appelé par </w:t>
+      </w:r>
+      <w:proofErr w:type="spellStart"/>
+      <w:r>
+        <w:t>NewFrame</w:t>
+      </w:r>
+      <w:proofErr w:type="spellEnd"/>
+      <w:r>
+        <w:t>).</w:t>
+      </w:r>
+      <w:r>
+        <w:t xml:space="preserve"> Il </w:t>
+      </w:r>
+      <w:proofErr w:type="spellStart"/>
+      <w:r>
+        <w:t>detecte</w:t>
+      </w:r>
+      <w:proofErr w:type="spellEnd"/>
+      <w:r>
+        <w:t xml:space="preserve"> aussi les touche de clavier et </w:t>
+      </w:r>
+      <w:r>
+        <w:t>les stockent</w:t>
+      </w:r>
+      <w:r>
+        <w:t xml:space="preserve"> dans une liste</w:t>
+      </w:r>
+      <w:r>
+        <w:t xml:space="preserve"> présente sur le joueur</w:t>
+      </w:r>
+      <w:r>
+        <w:t xml:space="preserve"> et </w:t>
+      </w:r>
+      <w:r>
+        <w:t xml:space="preserve">lui </w:t>
+      </w:r>
+      <w:r>
+        <w:t>transmet</w:t>
+      </w:r>
+      <w:r>
+        <w:t xml:space="preserve"> également</w:t>
+      </w:r>
+      <w:r>
+        <w:t xml:space="preserve"> </w:t>
+      </w:r>
+      <w:r>
+        <w:t>les touches</w:t>
+      </w:r>
+      <w:r>
+        <w:t xml:space="preserve"> de</w:t>
+      </w:r>
+      <w:r>
+        <w:t xml:space="preserve"> la</w:t>
+      </w:r>
+      <w:r>
+        <w:t xml:space="preserve"> souri</w:t>
+      </w:r>
+      <w:r>
+        <w:t>s</w:t>
+      </w:r>
+      <w:r>
+        <w:t xml:space="preserve">. </w:t>
+      </w:r>
+    </w:p>
+    <w:p>
+      <w:pPr>
+        <w:pStyle w:val="Titre4"/>
+      </w:pPr>
+      <w:r>
+        <w:t xml:space="preserve">Joueur et </w:t>
+      </w:r>
+      <w:proofErr w:type="spellStart"/>
+      <w:r>
+        <w:t>ProjectileBurger</w:t>
+      </w:r>
+      <w:proofErr w:type="spellEnd"/>
+    </w:p>
+    <w:p>
+      <w:pPr>
+        <w:ind w:left="708"/>
+      </w:pPr>
+      <w:r>
+        <w:t>U</w:t>
+      </w:r>
+      <w:r>
+        <w:t>ne fois le Joueur instancié</w:t>
+      </w:r>
+      <w:r>
+        <w:t>.</w:t>
+      </w:r>
+      <w:r>
+        <w:t xml:space="preserve"> </w:t>
+      </w:r>
+      <w:r>
+        <w:t>Il</w:t>
+      </w:r>
+      <w:r>
+        <w:t xml:space="preserve"> </w:t>
+      </w:r>
+      <w:r>
+        <w:t>peut se</w:t>
+      </w:r>
+      <w:r>
+        <w:t xml:space="preserve"> déplace</w:t>
+      </w:r>
+      <w:r>
+        <w:t>r</w:t>
+      </w:r>
+      <w:r>
+        <w:t xml:space="preserve"> </w:t>
+      </w:r>
+      <w:r>
+        <w:t xml:space="preserve">grâce à sa liste de touche et </w:t>
+      </w:r>
+      <w:proofErr w:type="spellStart"/>
+      <w:r>
+        <w:t>bûte</w:t>
+      </w:r>
+      <w:proofErr w:type="spellEnd"/>
+      <w:r>
+        <w:t xml:space="preserve"> sur les bords de la </w:t>
+      </w:r>
+      <w:proofErr w:type="spellStart"/>
+      <w:r>
+        <w:t>map</w:t>
+      </w:r>
+      <w:proofErr w:type="spellEnd"/>
+      <w:r>
+        <w:t xml:space="preserve"> (</w:t>
+      </w:r>
+      <w:proofErr w:type="spellStart"/>
+      <w:r>
+        <w:t>BattleMap</w:t>
+      </w:r>
+      <w:proofErr w:type="spellEnd"/>
+      <w:r>
+        <w:t xml:space="preserve"> stocke ses dimensions) ou les objets de type Obstacle. Il</w:t>
+      </w:r>
+      <w:r>
+        <w:t xml:space="preserve"> peut aussi </w:t>
+      </w:r>
+      <w:r>
+        <w:t xml:space="preserve">se mettre </w:t>
+      </w:r>
+      <w:r>
+        <w:t xml:space="preserve">en mode </w:t>
+      </w:r>
+      <w:r>
+        <w:t>mêlée</w:t>
+      </w:r>
+      <w:r>
+        <w:t xml:space="preserve"> quand il reçoit </w:t>
+      </w:r>
+      <w:r>
+        <w:t>un clic souri</w:t>
+      </w:r>
+      <w:r>
+        <w:t>.</w:t>
+      </w:r>
+      <w:r>
+        <w:t xml:space="preserve"> Il a également une santé qui baisse </w:t>
+      </w:r>
+      <w:r>
+        <w:t>lorsqu’il</w:t>
+      </w:r>
+      <w:r>
+        <w:t xml:space="preserve"> touche un objet de type Faisceau ou </w:t>
+      </w:r>
+      <w:proofErr w:type="spellStart"/>
+      <w:r>
+        <w:t>MoneyBag</w:t>
+      </w:r>
+      <w:proofErr w:type="spellEnd"/>
+      <w:r>
+        <w:t xml:space="preserve"> et une somme d’argent qui augmente </w:t>
+      </w:r>
+      <w:r>
+        <w:t>lorsqu’un</w:t>
+      </w:r>
+      <w:r>
+        <w:t xml:space="preserve"> objet de type Manager meurt.</w:t>
+      </w:r>
+      <w:r>
+        <w:t xml:space="preserve"> </w:t>
+      </w:r>
+    </w:p>
+    <w:p>
+      <w:pPr>
+        <w:ind w:left="708"/>
+      </w:pPr>
+      <w:r>
+        <w:t>Le</w:t>
+      </w:r>
+      <w:r>
+        <w:t xml:space="preserve"> joueur peut instancier des projectiles Burger lorsqu’il reçoit un clic souri qui sont ensuite gérer par </w:t>
+      </w:r>
+      <w:proofErr w:type="spellStart"/>
+      <w:r>
+        <w:t>BattleMap</w:t>
+      </w:r>
+      <w:proofErr w:type="spellEnd"/>
+      <w:r>
+        <w:t xml:space="preserve"> en les stockant dans la liste </w:t>
+      </w:r>
+      <w:proofErr w:type="spellStart"/>
+      <w:r>
+        <w:t>allBurgers</w:t>
+      </w:r>
+      <w:proofErr w:type="spellEnd"/>
+      <w:r>
+        <w:t xml:space="preserve">. Les burgers peuvent se déplacer sur la </w:t>
+      </w:r>
+      <w:proofErr w:type="spellStart"/>
+      <w:r>
+        <w:t>map</w:t>
+      </w:r>
+      <w:proofErr w:type="spellEnd"/>
+    </w:p>
+    <w:p>
+      <w:pPr>
+        <w:ind w:left="708"/>
+      </w:pPr>
+      <w:r>
+        <w:t>Les attaque mêlée et Burger ont tout les deux un temps de rechargement.</w:t>
+      </w:r>
+    </w:p>
+    <w:p>
+      <w:proofErr w:type="spellStart"/>
+      <w:r>
+        <w:t>Ba</w:t>
+      </w:r>
+      <w:r>
+        <w:t>ttl</w:t>
+      </w:r>
+      <w:r>
+        <w:t>eM</w:t>
+      </w:r>
+      <w:r>
+        <w:t>ap</w:t>
+      </w:r>
+      <w:proofErr w:type="spellEnd"/>
+      <w:r>
+        <w:t xml:space="preserve"> de son côté instancie plusieurs listes d’éléments dont plusieurs Obstacle, plusieurs Manager et plusieurs Robot. Chaque liste à un nombre max d’élément gérer par leur constante respective.</w:t>
+      </w:r>
+    </w:p>
+    <w:p>
+      <w:pPr>
+        <w:pStyle w:val="Titre4"/>
+      </w:pPr>
+      <w:r>
+        <w:t xml:space="preserve">Manager et </w:t>
+      </w:r>
+      <w:proofErr w:type="spellStart"/>
+      <w:r>
+        <w:t>MoneyBag</w:t>
+      </w:r>
+      <w:proofErr w:type="spellEnd"/>
+    </w:p>
+    <w:p>
+      <w:pPr>
+        <w:ind w:left="708"/>
+      </w:pPr>
+      <w:r>
+        <w:t>Les Managers</w:t>
+      </w:r>
+      <w:r>
+        <w:t xml:space="preserve"> se déplace aléatoirement sur la </w:t>
+      </w:r>
+      <w:proofErr w:type="spellStart"/>
+      <w:r>
+        <w:t>map</w:t>
+      </w:r>
+      <w:proofErr w:type="spellEnd"/>
+      <w:r>
+        <w:t xml:space="preserve"> en trouvant une nouvelle destination lorsqu’il butte sur un mur ou arrive à leur destination. </w:t>
+      </w:r>
+      <w:r>
+        <w:t>Ils ont également une santé qui baisse quand ils sont trop proche d’un joueur en mode mêlée (La distance max est stockée dans le joueur). Il possède également un « </w:t>
+      </w:r>
+      <w:proofErr w:type="spellStart"/>
+      <w:r>
+        <w:t>loot</w:t>
+      </w:r>
+      <w:proofErr w:type="spellEnd"/>
+      <w:r>
+        <w:t xml:space="preserve"> » qui correspond à l’argent </w:t>
+      </w:r>
+      <w:r>
+        <w:t>qu’ils font</w:t>
+      </w:r>
+      <w:r>
+        <w:t xml:space="preserve"> </w:t>
+      </w:r>
+      <w:r>
+        <w:t>tomber</w:t>
+      </w:r>
+      <w:r>
+        <w:t xml:space="preserve"> à leur mort.</w:t>
+      </w:r>
+      <w:r>
+        <w:t xml:space="preserve"> </w:t>
+      </w:r>
+      <w:r>
+        <w:t xml:space="preserve">Ils peuvent également être de niveau différent. Lesquels dépend de l’argent du joueur. Le </w:t>
+      </w:r>
+      <w:proofErr w:type="spellStart"/>
+      <w:r>
+        <w:t>threshold</w:t>
+      </w:r>
+      <w:proofErr w:type="spellEnd"/>
+      <w:r>
+        <w:t xml:space="preserve"> est définis par </w:t>
+      </w:r>
+      <w:proofErr w:type="spellStart"/>
+      <w:r>
+        <w:t>BattleMap</w:t>
+      </w:r>
+      <w:proofErr w:type="spellEnd"/>
+      <w:r>
+        <w:t>.</w:t>
+      </w:r>
+    </w:p>
+    <w:p>
+      <w:pPr>
+        <w:ind w:left="708"/>
+      </w:pPr>
+      <w:r>
+        <w:t xml:space="preserve">Ils peuvent instancier des éléments de type </w:t>
+      </w:r>
+      <w:r>
+        <w:t>« Sac d’argent »</w:t>
+      </w:r>
+      <w:r>
+        <w:t xml:space="preserve"> chaque certain temps (FIRE_RATE).</w:t>
+      </w:r>
+      <w:r>
+        <w:t xml:space="preserve"> </w:t>
+      </w:r>
+      <w:r>
+        <w:t>Les sacs</w:t>
+      </w:r>
+      <w:r>
+        <w:t xml:space="preserve"> sont ensuite </w:t>
+      </w:r>
+      <w:r>
+        <w:t>placés</w:t>
+      </w:r>
+      <w:r>
+        <w:t xml:space="preserve"> dans leur liste dans </w:t>
+      </w:r>
+      <w:proofErr w:type="spellStart"/>
+      <w:r>
+        <w:t>BattleMap</w:t>
+      </w:r>
+      <w:proofErr w:type="spellEnd"/>
+      <w:r>
+        <w:t xml:space="preserve">. Les sacs d’argent vont en direction que le joueur avait lorsqu’ils </w:t>
+      </w:r>
+      <w:r>
+        <w:t>ont</w:t>
+      </w:r>
+      <w:r>
+        <w:t xml:space="preserve"> été </w:t>
+      </w:r>
+      <w:r>
+        <w:t>instanciés</w:t>
+      </w:r>
+      <w:r>
+        <w:t>.</w:t>
+      </w:r>
+      <w:r>
+        <w:t xml:space="preserve"> Ils se détruise lorsqu’il arrive au bord de la </w:t>
+      </w:r>
+      <w:proofErr w:type="spellStart"/>
+      <w:r>
+        <w:t>map</w:t>
+      </w:r>
+      <w:proofErr w:type="spellEnd"/>
+      <w:r>
+        <w:t>,</w:t>
+      </w:r>
+      <w:r>
+        <w:t xml:space="preserve"> qu’ils butent sur un obstacle</w:t>
+      </w:r>
+      <w:r>
+        <w:t xml:space="preserve"> ou qu’il touche le joueur.</w:t>
+      </w:r>
+    </w:p>
+    <w:p>
+      <w:pPr>
+        <w:pStyle w:val="Titre4"/>
+      </w:pPr>
+      <w:r>
+        <w:t>Robot et Faisceau</w:t>
+      </w:r>
+    </w:p>
+    <w:p>
+      <w:pPr>
+        <w:ind w:left="708"/>
+      </w:pPr>
+      <w:r>
+        <w:t xml:space="preserve">Les </w:t>
+      </w:r>
+      <w:r>
+        <w:t>Robot</w:t>
+      </w:r>
+      <w:r>
+        <w:t xml:space="preserve"> se déplace sur la </w:t>
+      </w:r>
+      <w:proofErr w:type="spellStart"/>
+      <w:r>
+        <w:t>map</w:t>
+      </w:r>
+      <w:proofErr w:type="spellEnd"/>
+      <w:r>
+        <w:t xml:space="preserve"> en trouvant une nouvelle</w:t>
+      </w:r>
+      <w:r>
+        <w:t xml:space="preserve"> destination qui doit toujours être directement au-dessus/dessous/droite/gauche du joueur. </w:t>
+      </w:r>
+      <w:r>
+        <w:t xml:space="preserve">Il trouve un nouveau point ou aller </w:t>
+      </w:r>
+      <w:proofErr w:type="gramStart"/>
+      <w:r>
+        <w:t>si ils</w:t>
+      </w:r>
+      <w:proofErr w:type="gramEnd"/>
+      <w:r>
+        <w:t xml:space="preserve"> butent sur un obstacle</w:t>
+      </w:r>
+      <w:r>
+        <w:t>.</w:t>
+      </w:r>
+      <w:r>
+        <w:t xml:space="preserve"> Ils ont également une santé qui baisse quand ils sont trop proche d’un joueur en mode mêlée (La distance max est stockée dans le joueur).</w:t>
+      </w:r>
+      <w:r>
+        <w:t xml:space="preserve"> Ils peuvent également être de niveau </w:t>
+      </w:r>
+      <w:r>
+        <w:lastRenderedPageBreak/>
+        <w:t xml:space="preserve">différent. Lesquels dépend de l’argent du joueur. Le </w:t>
+      </w:r>
+      <w:proofErr w:type="spellStart"/>
+      <w:r>
+        <w:t>threshold</w:t>
+      </w:r>
+      <w:proofErr w:type="spellEnd"/>
+      <w:r>
+        <w:t xml:space="preserve"> est définis par </w:t>
+      </w:r>
+      <w:proofErr w:type="spellStart"/>
+      <w:r>
+        <w:t>BattleMap</w:t>
+      </w:r>
+      <w:proofErr w:type="spellEnd"/>
+      <w:r>
+        <w:t xml:space="preserve">. </w:t>
+      </w:r>
+    </w:p>
+    <w:p>
+      <w:pPr>
+        <w:ind w:left="708"/>
+      </w:pPr>
+      <w:r>
+        <w:t xml:space="preserve">Ils peuvent instancier des éléments de type « </w:t>
+      </w:r>
+      <w:r>
+        <w:t>Faisceau</w:t>
+      </w:r>
+      <w:r>
+        <w:t xml:space="preserve"> » chaque certain temps (FIRE_RATE). Les </w:t>
+      </w:r>
+      <w:r>
+        <w:t>faisceaux</w:t>
+      </w:r>
+      <w:r>
+        <w:t xml:space="preserve"> sont ensuite placés dans leur liste dans </w:t>
+      </w:r>
+      <w:proofErr w:type="spellStart"/>
+      <w:r>
+        <w:t>BattleMap</w:t>
+      </w:r>
+      <w:proofErr w:type="spellEnd"/>
+      <w:r>
+        <w:t xml:space="preserve">. </w:t>
+      </w:r>
+      <w:r>
+        <w:t>Les faisceaux</w:t>
+      </w:r>
+      <w:r>
+        <w:t xml:space="preserve"> ne peuvent aller que dans </w:t>
+      </w:r>
+      <w:r>
+        <w:t>les directions orthogonales</w:t>
+      </w:r>
+      <w:r>
+        <w:t xml:space="preserve"> ils ont donc une direction</w:t>
+      </w:r>
+      <w:r>
+        <w:t xml:space="preserve">. Ils se détruise lorsqu’il arrive au bord de la </w:t>
+      </w:r>
+      <w:proofErr w:type="spellStart"/>
+      <w:r>
+        <w:t>map</w:t>
+      </w:r>
+      <w:proofErr w:type="spellEnd"/>
+      <w:r>
+        <w:t>,</w:t>
+      </w:r>
+      <w:r>
+        <w:t xml:space="preserve"> qu’ils butent sur un obstacle</w:t>
+      </w:r>
+      <w:r>
+        <w:t xml:space="preserve"> ou qu’il touche le joueur.</w:t>
+      </w:r>
+    </w:p>
+    <w:p>
+      <w:pPr>
+        <w:ind w:left="708"/>
+      </w:pPr>
+    </w:p>
+    <w:p/>
+    <w:p>
+      <w:pPr>
+        <w:pStyle w:val="Titre2"/>
       </w:pPr>
       <w:bookmarkStart w:id="6" w:name="_Toc243513768"/>
       <w:r>
@@ -3863,7 +4460,7 @@
       <w:hyperlink r:id="rId29" w:history="1">
         <w:r>
           <w:rPr>
-            <w:rStyle w:val="Hyperlink"/>
+            <w:rStyle w:val="Lienhypertexte"/>
           </w:rPr>
           <w:t>https://claude.ai/share/2bf90d2b-864b-42cc-8b37-eaf1b68bf1c2</w:t>
         </w:r>
@@ -3873,7 +4470,7 @@
       <w:hyperlink r:id="rId30" w:history="1">
         <w:r>
           <w:rPr>
-            <w:rStyle w:val="Hyperlink"/>
+            <w:rStyle w:val="Lienhypertexte"/>
           </w:rPr>
           <w:t>https://claude.ai/share/811b5089-de97-4356-8ea7-5ff4a40ace65</w:t>
         </w:r>
@@ -3883,24 +4480,33 @@
       <w:hyperlink r:id="rId31" w:history="1">
         <w:r>
           <w:rPr>
-            <w:rStyle w:val="Hyperlink"/>
+            <w:rStyle w:val="Lienhypertexte"/>
           </w:rPr>
           <w:t>https://claude.ai/share/b1e4f4ad-725a-4019-8b77-c83d20ff485d</w:t>
         </w:r>
       </w:hyperlink>
     </w:p>
     <w:p>
-      <w:pPr>
-        <w:pStyle w:val="Heading2"/>
-      </w:pPr>
-      <w:r>
-        <w:lastRenderedPageBreak/>
+      <w:hyperlink r:id="rId32" w:tgtFrame="_blank" w:tooltip="https://claude.ai/share/10e2149d-0df4-480c-a93a-7e6df141afcd" w:history="1">
+        <w:r>
+          <w:rPr>
+            <w:rStyle w:val="Lienhypertexte"/>
+          </w:rPr>
+          <w:t>https://claude.ai/share/10e2149d-0df4-480c-a93a-7e6df141afcd</w:t>
+        </w:r>
+      </w:hyperlink>
+    </w:p>
+    <w:p>
+      <w:pPr>
+        <w:pStyle w:val="Titre2"/>
+      </w:pPr>
+      <w:r>
         <w:t>Bilan du déroulement du projet</w:t>
       </w:r>
     </w:p>
     <w:p>
       <w:pPr>
-        <w:pStyle w:val="Heading2"/>
+        <w:pStyle w:val="Titre2"/>
       </w:pPr>
       <w:r>
         <w:t>Bilan produit</w:t>
@@ -3908,7 +4514,7 @@
     </w:p>
     <w:p>
       <w:pPr>
-        <w:pStyle w:val="Heading2"/>
+        <w:pStyle w:val="Titre2"/>
       </w:pPr>
       <w:r>
         <w:t>Conclusion</w:t>
@@ -3917,7 +4523,7 @@
     <w:p/>
     <w:p/>
     <w:sectPr>
-      <w:footerReference w:type="default" r:id="rId32"/>
+      <w:footerReference w:type="default" r:id="rId33"/>
       <w:pgSz w:w="11906" w:h="16838"/>
       <w:pgMar w:top="1417" w:right="1417" w:bottom="1417" w:left="1417" w:header="708" w:footer="708" w:gutter="0"/>
       <w:cols w:space="708"/>
@@ -3965,7 +4571,7 @@
     <w:sdtContent>
       <w:p>
         <w:pPr>
-          <w:pStyle w:val="Footer"/>
+          <w:pStyle w:val="Pieddepage"/>
           <w:jc w:val="right"/>
           <w:rPr>
             <w:lang w:val="en-US"/>
@@ -3997,7 +4603,7 @@
   </w:sdt>
   <w:p>
     <w:pPr>
-      <w:pStyle w:val="Footer"/>
+      <w:pStyle w:val="Pieddepage"/>
       <w:rPr>
         <w:lang w:val="en-US"/>
       </w:rPr>
@@ -4894,11 +5500,11 @@
     <w:qFormat/>
     <w:rsid w:val="00983A50"/>
   </w:style>
-  <w:style w:type="paragraph" w:styleId="Heading1">
+  <w:style w:type="paragraph" w:styleId="Titre1">
     <w:name w:val="heading 1"/>
     <w:basedOn w:val="Normal"/>
     <w:next w:val="Normal"/>
-    <w:link w:val="Heading1Char"/>
+    <w:link w:val="Titre1Car"/>
     <w:uiPriority w:val="9"/>
     <w:qFormat/>
     <w:rsid w:val="006C417F"/>
@@ -4915,11 +5521,11 @@
       <w:szCs w:val="40"/>
     </w:rPr>
   </w:style>
-  <w:style w:type="paragraph" w:styleId="Heading2">
+  <w:style w:type="paragraph" w:styleId="Titre2">
     <w:name w:val="heading 2"/>
     <w:basedOn w:val="Normal"/>
     <w:next w:val="Normal"/>
-    <w:link w:val="Heading2Char"/>
+    <w:link w:val="Titre2Car"/>
     <w:uiPriority w:val="9"/>
     <w:unhideWhenUsed/>
     <w:qFormat/>
@@ -4937,11 +5543,11 @@
       <w:szCs w:val="32"/>
     </w:rPr>
   </w:style>
-  <w:style w:type="paragraph" w:styleId="Heading3">
+  <w:style w:type="paragraph" w:styleId="Titre3">
     <w:name w:val="heading 3"/>
     <w:basedOn w:val="Normal"/>
     <w:next w:val="Normal"/>
-    <w:link w:val="Heading3Char"/>
+    <w:link w:val="Titre3Car"/>
     <w:uiPriority w:val="9"/>
     <w:unhideWhenUsed/>
     <w:qFormat/>
@@ -4959,11 +5565,11 @@
       <w:szCs w:val="28"/>
     </w:rPr>
   </w:style>
-  <w:style w:type="paragraph" w:styleId="Heading4">
+  <w:style w:type="paragraph" w:styleId="Titre4">
     <w:name w:val="heading 4"/>
     <w:basedOn w:val="Normal"/>
     <w:next w:val="Normal"/>
-    <w:link w:val="Heading4Char"/>
+    <w:link w:val="Titre4Car"/>
     <w:uiPriority w:val="9"/>
     <w:unhideWhenUsed/>
     <w:qFormat/>
@@ -4981,11 +5587,11 @@
       <w:color w:val="0F4761" w:themeColor="accent1" w:themeShade="BF"/>
     </w:rPr>
   </w:style>
-  <w:style w:type="paragraph" w:styleId="Heading5">
+  <w:style w:type="paragraph" w:styleId="Titre5">
     <w:name w:val="heading 5"/>
     <w:basedOn w:val="Normal"/>
     <w:next w:val="Normal"/>
-    <w:link w:val="Heading5Char"/>
+    <w:link w:val="Titre5Car"/>
     <w:uiPriority w:val="9"/>
     <w:semiHidden/>
     <w:unhideWhenUsed/>
@@ -5002,11 +5608,11 @@
       <w:color w:val="0F4761" w:themeColor="accent1" w:themeShade="BF"/>
     </w:rPr>
   </w:style>
-  <w:style w:type="paragraph" w:styleId="Heading6">
+  <w:style w:type="paragraph" w:styleId="Titre6">
     <w:name w:val="heading 6"/>
     <w:basedOn w:val="Normal"/>
     <w:next w:val="Normal"/>
-    <w:link w:val="Heading6Char"/>
+    <w:link w:val="Titre6Car"/>
     <w:uiPriority w:val="9"/>
     <w:semiHidden/>
     <w:unhideWhenUsed/>
@@ -5025,11 +5631,11 @@
       <w:color w:val="595959" w:themeColor="text1" w:themeTint="A6"/>
     </w:rPr>
   </w:style>
-  <w:style w:type="paragraph" w:styleId="Heading7">
+  <w:style w:type="paragraph" w:styleId="Titre7">
     <w:name w:val="heading 7"/>
     <w:basedOn w:val="Normal"/>
     <w:next w:val="Normal"/>
-    <w:link w:val="Heading7Char"/>
+    <w:link w:val="Titre7Car"/>
     <w:uiPriority w:val="9"/>
     <w:semiHidden/>
     <w:unhideWhenUsed/>
@@ -5046,11 +5652,11 @@
       <w:color w:val="595959" w:themeColor="text1" w:themeTint="A6"/>
     </w:rPr>
   </w:style>
-  <w:style w:type="paragraph" w:styleId="Heading8">
+  <w:style w:type="paragraph" w:styleId="Titre8">
     <w:name w:val="heading 8"/>
     <w:basedOn w:val="Normal"/>
     <w:next w:val="Normal"/>
-    <w:link w:val="Heading8Char"/>
+    <w:link w:val="Titre8Car"/>
     <w:uiPriority w:val="9"/>
     <w:semiHidden/>
     <w:unhideWhenUsed/>
@@ -5069,11 +5675,11 @@
       <w:color w:val="272727" w:themeColor="text1" w:themeTint="D8"/>
     </w:rPr>
   </w:style>
-  <w:style w:type="paragraph" w:styleId="Heading9">
+  <w:style w:type="paragraph" w:styleId="Titre9">
     <w:name w:val="heading 9"/>
     <w:basedOn w:val="Normal"/>
     <w:next w:val="Normal"/>
-    <w:link w:val="Heading9Char"/>
+    <w:link w:val="Titre9Car"/>
     <w:uiPriority w:val="9"/>
     <w:semiHidden/>
     <w:unhideWhenUsed/>
@@ -5090,13 +5696,12 @@
       <w:color w:val="272727" w:themeColor="text1" w:themeTint="D8"/>
     </w:rPr>
   </w:style>
-  <w:style w:type="character" w:default="1" w:styleId="DefaultParagraphFont">
+  <w:style w:type="character" w:default="1" w:styleId="Policepardfaut">
     <w:name w:val="Default Paragraph Font"/>
     <w:uiPriority w:val="1"/>
-    <w:semiHidden/>
     <w:unhideWhenUsed/>
   </w:style>
-  <w:style w:type="table" w:default="1" w:styleId="TableNormal">
+  <w:style w:type="table" w:default="1" w:styleId="TableauNormal">
     <w:name w:val="Normal Table"/>
     <w:uiPriority w:val="99"/>
     <w:semiHidden/>
@@ -5111,16 +5716,16 @@
       </w:tblCellMar>
     </w:tblPr>
   </w:style>
-  <w:style w:type="numbering" w:default="1" w:styleId="NoList">
+  <w:style w:type="numbering" w:default="1" w:styleId="Aucuneliste">
     <w:name w:val="No List"/>
     <w:uiPriority w:val="99"/>
     <w:semiHidden/>
     <w:unhideWhenUsed/>
   </w:style>
-  <w:style w:type="character" w:customStyle="1" w:styleId="Heading1Char">
-    <w:name w:val="Heading 1 Char"/>
-    <w:basedOn w:val="DefaultParagraphFont"/>
-    <w:link w:val="Heading1"/>
+  <w:style w:type="character" w:customStyle="1" w:styleId="Titre1Car">
+    <w:name w:val="Titre 1 Car"/>
+    <w:basedOn w:val="Policepardfaut"/>
+    <w:link w:val="Titre1"/>
     <w:uiPriority w:val="9"/>
     <w:rsid w:val="006C417F"/>
     <w:rPr>
@@ -5130,10 +5735,10 @@
       <w:szCs w:val="40"/>
     </w:rPr>
   </w:style>
-  <w:style w:type="character" w:customStyle="1" w:styleId="Heading2Char">
-    <w:name w:val="Heading 2 Char"/>
-    <w:basedOn w:val="DefaultParagraphFont"/>
-    <w:link w:val="Heading2"/>
+  <w:style w:type="character" w:customStyle="1" w:styleId="Titre2Car">
+    <w:name w:val="Titre 2 Car"/>
+    <w:basedOn w:val="Policepardfaut"/>
+    <w:link w:val="Titre2"/>
     <w:uiPriority w:val="9"/>
     <w:rsid w:val="006C417F"/>
     <w:rPr>
@@ -5143,10 +5748,10 @@
       <w:szCs w:val="32"/>
     </w:rPr>
   </w:style>
-  <w:style w:type="character" w:customStyle="1" w:styleId="Heading3Char">
-    <w:name w:val="Heading 3 Char"/>
-    <w:basedOn w:val="DefaultParagraphFont"/>
-    <w:link w:val="Heading3"/>
+  <w:style w:type="character" w:customStyle="1" w:styleId="Titre3Car">
+    <w:name w:val="Titre 3 Car"/>
+    <w:basedOn w:val="Policepardfaut"/>
+    <w:link w:val="Titre3"/>
     <w:uiPriority w:val="9"/>
     <w:rsid w:val="006C417F"/>
     <w:rPr>
@@ -5156,10 +5761,10 @@
       <w:szCs w:val="28"/>
     </w:rPr>
   </w:style>
-  <w:style w:type="character" w:customStyle="1" w:styleId="Heading4Char">
-    <w:name w:val="Heading 4 Char"/>
-    <w:basedOn w:val="DefaultParagraphFont"/>
-    <w:link w:val="Heading4"/>
+  <w:style w:type="character" w:customStyle="1" w:styleId="Titre4Car">
+    <w:name w:val="Titre 4 Car"/>
+    <w:basedOn w:val="Policepardfaut"/>
+    <w:link w:val="Titre4"/>
     <w:uiPriority w:val="9"/>
     <w:rsid w:val="006C417F"/>
     <w:rPr>
@@ -5169,10 +5774,10 @@
       <w:color w:val="0F4761" w:themeColor="accent1" w:themeShade="BF"/>
     </w:rPr>
   </w:style>
-  <w:style w:type="character" w:customStyle="1" w:styleId="Heading5Char">
-    <w:name w:val="Heading 5 Char"/>
-    <w:basedOn w:val="DefaultParagraphFont"/>
-    <w:link w:val="Heading5"/>
+  <w:style w:type="character" w:customStyle="1" w:styleId="Titre5Car">
+    <w:name w:val="Titre 5 Car"/>
+    <w:basedOn w:val="Policepardfaut"/>
+    <w:link w:val="Titre5"/>
     <w:uiPriority w:val="9"/>
     <w:semiHidden/>
     <w:rsid w:val="006C417F"/>
@@ -5181,10 +5786,10 @@
       <w:color w:val="0F4761" w:themeColor="accent1" w:themeShade="BF"/>
     </w:rPr>
   </w:style>
-  <w:style w:type="character" w:customStyle="1" w:styleId="Heading6Char">
-    <w:name w:val="Heading 6 Char"/>
-    <w:basedOn w:val="DefaultParagraphFont"/>
-    <w:link w:val="Heading6"/>
+  <w:style w:type="character" w:customStyle="1" w:styleId="Titre6Car">
+    <w:name w:val="Titre 6 Car"/>
+    <w:basedOn w:val="Policepardfaut"/>
+    <w:link w:val="Titre6"/>
     <w:uiPriority w:val="9"/>
     <w:semiHidden/>
     <w:rsid w:val="006C417F"/>
@@ -5195,10 +5800,10 @@
       <w:color w:val="595959" w:themeColor="text1" w:themeTint="A6"/>
     </w:rPr>
   </w:style>
-  <w:style w:type="character" w:customStyle="1" w:styleId="Heading7Char">
-    <w:name w:val="Heading 7 Char"/>
-    <w:basedOn w:val="DefaultParagraphFont"/>
-    <w:link w:val="Heading7"/>
+  <w:style w:type="character" w:customStyle="1" w:styleId="Titre7Car">
+    <w:name w:val="Titre 7 Car"/>
+    <w:basedOn w:val="Policepardfaut"/>
+    <w:link w:val="Titre7"/>
     <w:uiPriority w:val="9"/>
     <w:semiHidden/>
     <w:rsid w:val="006C417F"/>
@@ -5207,10 +5812,10 @@
       <w:color w:val="595959" w:themeColor="text1" w:themeTint="A6"/>
     </w:rPr>
   </w:style>
-  <w:style w:type="character" w:customStyle="1" w:styleId="Heading8Char">
-    <w:name w:val="Heading 8 Char"/>
-    <w:basedOn w:val="DefaultParagraphFont"/>
-    <w:link w:val="Heading8"/>
+  <w:style w:type="character" w:customStyle="1" w:styleId="Titre8Car">
+    <w:name w:val="Titre 8 Car"/>
+    <w:basedOn w:val="Policepardfaut"/>
+    <w:link w:val="Titre8"/>
     <w:uiPriority w:val="9"/>
     <w:semiHidden/>
     <w:rsid w:val="006C417F"/>
@@ -5221,10 +5826,10 @@
       <w:color w:val="272727" w:themeColor="text1" w:themeTint="D8"/>
     </w:rPr>
   </w:style>
-  <w:style w:type="character" w:customStyle="1" w:styleId="Heading9Char">
-    <w:name w:val="Heading 9 Char"/>
-    <w:basedOn w:val="DefaultParagraphFont"/>
-    <w:link w:val="Heading9"/>
+  <w:style w:type="character" w:customStyle="1" w:styleId="Titre9Car">
+    <w:name w:val="Titre 9 Car"/>
+    <w:basedOn w:val="Policepardfaut"/>
+    <w:link w:val="Titre9"/>
     <w:uiPriority w:val="9"/>
     <w:semiHidden/>
     <w:rsid w:val="006C417F"/>
@@ -5233,11 +5838,11 @@
       <w:color w:val="272727" w:themeColor="text1" w:themeTint="D8"/>
     </w:rPr>
   </w:style>
-  <w:style w:type="paragraph" w:styleId="Title">
+  <w:style w:type="paragraph" w:styleId="Titre">
     <w:name w:val="Title"/>
     <w:basedOn w:val="Normal"/>
     <w:next w:val="Normal"/>
-    <w:link w:val="TitleChar"/>
+    <w:link w:val="TitreCar"/>
     <w:uiPriority w:val="10"/>
     <w:qFormat/>
     <w:rsid w:val="006C417F"/>
@@ -5253,10 +5858,10 @@
       <w:szCs w:val="56"/>
     </w:rPr>
   </w:style>
-  <w:style w:type="character" w:customStyle="1" w:styleId="TitleChar">
-    <w:name w:val="Title Char"/>
-    <w:basedOn w:val="DefaultParagraphFont"/>
-    <w:link w:val="Title"/>
+  <w:style w:type="character" w:customStyle="1" w:styleId="TitreCar">
+    <w:name w:val="Titre Car"/>
+    <w:basedOn w:val="Policepardfaut"/>
+    <w:link w:val="Titre"/>
     <w:uiPriority w:val="10"/>
     <w:rsid w:val="006C417F"/>
     <w:rPr>
@@ -5267,11 +5872,11 @@
       <w:szCs w:val="56"/>
     </w:rPr>
   </w:style>
-  <w:style w:type="paragraph" w:styleId="Subtitle">
+  <w:style w:type="paragraph" w:styleId="Sous-titre">
     <w:name w:val="Subtitle"/>
     <w:basedOn w:val="Normal"/>
     <w:next w:val="Normal"/>
-    <w:link w:val="SubtitleChar"/>
+    <w:link w:val="Sous-titreCar"/>
     <w:uiPriority w:val="11"/>
     <w:qFormat/>
     <w:rsid w:val="006C417F"/>
@@ -5288,10 +5893,10 @@
       <w:szCs w:val="28"/>
     </w:rPr>
   </w:style>
-  <w:style w:type="character" w:customStyle="1" w:styleId="SubtitleChar">
-    <w:name w:val="Subtitle Char"/>
-    <w:basedOn w:val="DefaultParagraphFont"/>
-    <w:link w:val="Subtitle"/>
+  <w:style w:type="character" w:customStyle="1" w:styleId="Sous-titreCar">
+    <w:name w:val="Sous-titre Car"/>
+    <w:basedOn w:val="Policepardfaut"/>
+    <w:link w:val="Sous-titre"/>
     <w:uiPriority w:val="11"/>
     <w:rsid w:val="006C417F"/>
     <w:rPr>
@@ -5302,11 +5907,11 @@
       <w:szCs w:val="28"/>
     </w:rPr>
   </w:style>
-  <w:style w:type="paragraph" w:styleId="Quote">
+  <w:style w:type="paragraph" w:styleId="Citation">
     <w:name w:val="Quote"/>
     <w:basedOn w:val="Normal"/>
     <w:next w:val="Normal"/>
-    <w:link w:val="QuoteChar"/>
+    <w:link w:val="CitationCar"/>
     <w:uiPriority w:val="29"/>
     <w:qFormat/>
     <w:rsid w:val="006C417F"/>
@@ -5320,10 +5925,10 @@
       <w:color w:val="404040" w:themeColor="text1" w:themeTint="BF"/>
     </w:rPr>
   </w:style>
-  <w:style w:type="character" w:customStyle="1" w:styleId="QuoteChar">
-    <w:name w:val="Quote Char"/>
-    <w:basedOn w:val="DefaultParagraphFont"/>
-    <w:link w:val="Quote"/>
+  <w:style w:type="character" w:customStyle="1" w:styleId="CitationCar">
+    <w:name w:val="Citation Car"/>
+    <w:basedOn w:val="Policepardfaut"/>
+    <w:link w:val="Citation"/>
     <w:uiPriority w:val="29"/>
     <w:rsid w:val="006C417F"/>
     <w:rPr>
@@ -5332,7 +5937,7 @@
       <w:color w:val="404040" w:themeColor="text1" w:themeTint="BF"/>
     </w:rPr>
   </w:style>
-  <w:style w:type="paragraph" w:styleId="ListParagraph">
+  <w:style w:type="paragraph" w:styleId="Paragraphedeliste">
     <w:name w:val="List Paragraph"/>
     <w:basedOn w:val="Normal"/>
     <w:uiPriority w:val="34"/>
@@ -5343,9 +5948,9 @@
       <w:contextualSpacing/>
     </w:pPr>
   </w:style>
-  <w:style w:type="character" w:styleId="IntenseEmphasis">
+  <w:style w:type="character" w:styleId="Accentuationintense">
     <w:name w:val="Intense Emphasis"/>
-    <w:basedOn w:val="DefaultParagraphFont"/>
+    <w:basedOn w:val="Policepardfaut"/>
     <w:uiPriority w:val="21"/>
     <w:qFormat/>
     <w:rsid w:val="006C417F"/>
@@ -5355,11 +5960,11 @@
       <w:color w:val="0F4761" w:themeColor="accent1" w:themeShade="BF"/>
     </w:rPr>
   </w:style>
-  <w:style w:type="paragraph" w:styleId="IntenseQuote">
+  <w:style w:type="paragraph" w:styleId="Citationintense">
     <w:name w:val="Intense Quote"/>
     <w:basedOn w:val="Normal"/>
     <w:next w:val="Normal"/>
-    <w:link w:val="IntenseQuoteChar"/>
+    <w:link w:val="CitationintenseCar"/>
     <w:uiPriority w:val="30"/>
     <w:qFormat/>
     <w:rsid w:val="006C417F"/>
@@ -5378,10 +5983,10 @@
       <w:color w:val="0F4761" w:themeColor="accent1" w:themeShade="BF"/>
     </w:rPr>
   </w:style>
-  <w:style w:type="character" w:customStyle="1" w:styleId="IntenseQuoteChar">
-    <w:name w:val="Intense Quote Char"/>
-    <w:basedOn w:val="DefaultParagraphFont"/>
-    <w:link w:val="IntenseQuote"/>
+  <w:style w:type="character" w:customStyle="1" w:styleId="CitationintenseCar">
+    <w:name w:val="Citation intense Car"/>
+    <w:basedOn w:val="Policepardfaut"/>
+    <w:link w:val="Citationintense"/>
     <w:uiPriority w:val="30"/>
     <w:rsid w:val="006C417F"/>
     <w:rPr>
@@ -5390,9 +5995,9 @@
       <w:color w:val="0F4761" w:themeColor="accent1" w:themeShade="BF"/>
     </w:rPr>
   </w:style>
-  <w:style w:type="character" w:styleId="IntenseReference">
+  <w:style w:type="character" w:styleId="Rfrenceintense">
     <w:name w:val="Intense Reference"/>
-    <w:basedOn w:val="DefaultParagraphFont"/>
+    <w:basedOn w:val="Policepardfaut"/>
     <w:uiPriority w:val="32"/>
     <w:qFormat/>
     <w:rsid w:val="006C417F"/>
@@ -5404,9 +6009,9 @@
       <w:spacing w:val="5"/>
     </w:rPr>
   </w:style>
-  <w:style w:type="character" w:styleId="Hyperlink">
+  <w:style w:type="character" w:styleId="Lienhypertexte">
     <w:name w:val="Hyperlink"/>
-    <w:basedOn w:val="DefaultParagraphFont"/>
+    <w:basedOn w:val="Policepardfaut"/>
     <w:uiPriority w:val="99"/>
     <w:unhideWhenUsed/>
     <w:rsid w:val="00E71138"/>
@@ -5415,9 +6020,9 @@
       <w:u w:val="single"/>
     </w:rPr>
   </w:style>
-  <w:style w:type="character" w:styleId="UnresolvedMention">
+  <w:style w:type="character" w:styleId="Mentionnonrsolue">
     <w:name w:val="Unresolved Mention"/>
-    <w:basedOn w:val="DefaultParagraphFont"/>
+    <w:basedOn w:val="Policepardfaut"/>
     <w:uiPriority w:val="99"/>
     <w:semiHidden/>
     <w:unhideWhenUsed/>
@@ -5427,9 +6032,9 @@
       <w:shd w:val="clear" w:color="auto" w:fill="E1DFDD"/>
     </w:rPr>
   </w:style>
-  <w:style w:type="character" w:styleId="FollowedHyperlink">
+  <w:style w:type="character" w:styleId="Lienhypertextesuivivisit">
     <w:name w:val="FollowedHyperlink"/>
-    <w:basedOn w:val="DefaultParagraphFont"/>
+    <w:basedOn w:val="Policepardfaut"/>
     <w:uiPriority w:val="99"/>
     <w:semiHidden/>
     <w:unhideWhenUsed/>
@@ -5439,9 +6044,9 @@
       <w:u w:val="single"/>
     </w:rPr>
   </w:style>
-  <w:style w:type="table" w:styleId="TableGrid">
+  <w:style w:type="table" w:styleId="Grilledutableau">
     <w:name w:val="Table Grid"/>
-    <w:basedOn w:val="TableNormal"/>
+    <w:basedOn w:val="TableauNormal"/>
     <w:uiPriority w:val="39"/>
     <w:rsid w:val="00F72678"/>
     <w:pPr>
@@ -5458,9 +6063,9 @@
       </w:tblBorders>
     </w:tblPr>
   </w:style>
-  <w:style w:type="paragraph" w:styleId="TOCHeading">
+  <w:style w:type="paragraph" w:styleId="En-ttedetabledesmatires">
     <w:name w:val="TOC Heading"/>
-    <w:basedOn w:val="Heading1"/>
+    <w:basedOn w:val="Titre1"/>
     <w:next w:val="Normal"/>
     <w:uiPriority w:val="39"/>
     <w:unhideWhenUsed/>
@@ -5478,7 +6083,7 @@
       <w14:ligatures w14:val="none"/>
     </w:rPr>
   </w:style>
-  <w:style w:type="paragraph" w:styleId="TOC1">
+  <w:style w:type="paragraph" w:styleId="TM1">
     <w:name w:val="toc 1"/>
     <w:basedOn w:val="Normal"/>
     <w:next w:val="Normal"/>
@@ -5490,7 +6095,7 @@
       <w:spacing w:after="100"/>
     </w:pPr>
   </w:style>
-  <w:style w:type="paragraph" w:styleId="TOC2">
+  <w:style w:type="paragraph" w:styleId="TM2">
     <w:name w:val="toc 2"/>
     <w:basedOn w:val="Normal"/>
     <w:next w:val="Normal"/>
@@ -5503,7 +6108,7 @@
       <w:ind w:left="240"/>
     </w:pPr>
   </w:style>
-  <w:style w:type="paragraph" w:styleId="TOC3">
+  <w:style w:type="paragraph" w:styleId="TM3">
     <w:name w:val="toc 3"/>
     <w:basedOn w:val="Normal"/>
     <w:next w:val="Normal"/>
@@ -5516,10 +6121,10 @@
       <w:ind w:left="480"/>
     </w:pPr>
   </w:style>
-  <w:style w:type="paragraph" w:styleId="Header">
+  <w:style w:type="paragraph" w:styleId="En-tte">
     <w:name w:val="header"/>
     <w:basedOn w:val="Normal"/>
-    <w:link w:val="HeaderChar"/>
+    <w:link w:val="En-tteCar"/>
     <w:uiPriority w:val="99"/>
     <w:unhideWhenUsed/>
     <w:rsid w:val="001938A7"/>
@@ -5531,17 +6136,17 @@
       <w:spacing w:after="0" w:line="240" w:lineRule="auto"/>
     </w:pPr>
   </w:style>
-  <w:style w:type="character" w:customStyle="1" w:styleId="HeaderChar">
-    <w:name w:val="Header Char"/>
-    <w:basedOn w:val="DefaultParagraphFont"/>
-    <w:link w:val="Header"/>
+  <w:style w:type="character" w:customStyle="1" w:styleId="En-tteCar">
+    <w:name w:val="En-tête Car"/>
+    <w:basedOn w:val="Policepardfaut"/>
+    <w:link w:val="En-tte"/>
     <w:uiPriority w:val="99"/>
     <w:rsid w:val="001938A7"/>
   </w:style>
-  <w:style w:type="paragraph" w:styleId="Footer">
+  <w:style w:type="paragraph" w:styleId="Pieddepage">
     <w:name w:val="footer"/>
     <w:basedOn w:val="Normal"/>
-    <w:link w:val="FooterChar"/>
+    <w:link w:val="PieddepageCar"/>
     <w:uiPriority w:val="99"/>
     <w:unhideWhenUsed/>
     <w:rsid w:val="001938A7"/>
@@ -5553,10 +6158,10 @@
       <w:spacing w:after="0" w:line="240" w:lineRule="auto"/>
     </w:pPr>
   </w:style>
-  <w:style w:type="character" w:customStyle="1" w:styleId="FooterChar">
-    <w:name w:val="Footer Char"/>
-    <w:basedOn w:val="DefaultParagraphFont"/>
-    <w:link w:val="Footer"/>
+  <w:style w:type="character" w:customStyle="1" w:styleId="PieddepageCar">
+    <w:name w:val="Pied de page Car"/>
+    <w:basedOn w:val="Policepardfaut"/>
+    <w:link w:val="Pieddepage"/>
     <w:uiPriority w:val="99"/>
     <w:rsid w:val="001938A7"/>
   </w:style>

</xml_diff>

<commit_message>
doc(rapport) compléter le rapport
</commit_message>
<xml_diff>
--- a/doc/Rapport.docx
+++ b/doc/Rapport.docx
@@ -2222,7 +2222,15 @@
         <w:t xml:space="preserve"> sur le thème d’un employé de fast-food</w:t>
       </w:r>
       <w:r>
-        <w:t xml:space="preserve"> (Wacdonald’s)</w:t>
+        <w:t xml:space="preserve"> (</w:t>
+      </w:r>
+      <w:proofErr w:type="spellStart"/>
+      <w:r>
+        <w:t>Wacdonald’s</w:t>
+      </w:r>
+      <w:proofErr w:type="spellEnd"/>
+      <w:r>
+        <w:t>)</w:t>
       </w:r>
       <w:r>
         <w:t xml:space="preserve"> devant affronter sa hiérarchie et les robots voulant le </w:t>
@@ -2257,7 +2265,13 @@
         <w:t>s</w:t>
       </w:r>
       <w:r>
-        <w:t xml:space="preserve"> de type humain. Ils attaqueront en lançant des sacs d’argent </w:t>
+        <w:t xml:space="preserve"> de type </w:t>
+      </w:r>
+      <w:r>
+        <w:t>manager</w:t>
+      </w:r>
+      <w:r>
+        <w:t xml:space="preserve">. Ils attaqueront en lançant des sacs d’argent </w:t>
       </w:r>
       <w:r>
         <w:t>en direction du</w:t>
@@ -2272,7 +2286,7 @@
         <w:t xml:space="preserve">. </w:t>
       </w:r>
       <w:r>
-        <w:t>Plus le joueur avancera dans le jeu plus ces ennemis deviendront puissant (indiqué par le nombre de symbole $ sur leur T-shirt)</w:t>
+        <w:t>Plus le joueur avancera dans le jeu plus ces ennemis deviendront puissant</w:t>
       </w:r>
       <w:r>
         <w:t xml:space="preserve">, ils auront </w:t>
@@ -2350,7 +2364,15 @@
         <w:t>leur attaque</w:t>
       </w:r>
       <w:r>
-        <w:t xml:space="preserve"> aura un cooldown.</w:t>
+        <w:t xml:space="preserve"> aura un </w:t>
+      </w:r>
+      <w:proofErr w:type="spellStart"/>
+      <w:r>
+        <w:t>cooldown</w:t>
+      </w:r>
+      <w:proofErr w:type="spellEnd"/>
+      <w:r>
+        <w:t>.</w:t>
       </w:r>
     </w:p>
     <w:p>
@@ -2381,7 +2403,15 @@
         <w:ind w:left="708"/>
       </w:pPr>
       <w:r>
-        <w:t>Le joueur pourra également se cacher derrière les bornes wacdonald’s pour se protéger.</w:t>
+        <w:t xml:space="preserve">Le joueur pourra également se cacher derrière les bornes </w:t>
+      </w:r>
+      <w:proofErr w:type="spellStart"/>
+      <w:r>
+        <w:t>wacdonald’s</w:t>
+      </w:r>
+      <w:proofErr w:type="spellEnd"/>
+      <w:r>
+        <w:t xml:space="preserve"> pour se protéger.</w:t>
       </w:r>
     </w:p>
     <w:p>
@@ -2404,7 +2434,15 @@
         <w:t>er</w:t>
       </w:r>
       <w:r>
-        <w:t xml:space="preserve"> 1'000’000$ afin de devenir actionnaire majoritaire du fast food. Le joueur perd la partie si sa vie tombe à 0.</w:t>
+        <w:t xml:space="preserve"> 1'000’000$ afin de devenir actionnaire majoritaire du fast </w:t>
+      </w:r>
+      <w:proofErr w:type="spellStart"/>
+      <w:r>
+        <w:t>food</w:t>
+      </w:r>
+      <w:proofErr w:type="spellEnd"/>
+      <w:r>
+        <w:t>. Le joueur perd la partie si sa vie tombe à 0.</w:t>
       </w:r>
     </w:p>
     <w:p>
@@ -2507,7 +2545,21 @@
         <w:rPr>
           <w:lang w:val="en-US"/>
         </w:rPr>
-        <w:t xml:space="preserve"> repository Github (release, issues)</w:t>
+        <w:t xml:space="preserve"> repository </w:t>
+      </w:r>
+      <w:proofErr w:type="spellStart"/>
+      <w:r>
+        <w:rPr>
+          <w:lang w:val="en-US"/>
+        </w:rPr>
+        <w:t>Github</w:t>
+      </w:r>
+      <w:proofErr w:type="spellEnd"/>
+      <w:r>
+        <w:rPr>
+          <w:lang w:val="en-US"/>
+        </w:rPr>
+        <w:t xml:space="preserve"> (release, issues)</w:t>
       </w:r>
     </w:p>
     <w:p>
@@ -2550,7 +2602,17 @@
     </w:p>
     <w:p>
       <w:r>
-        <w:t>En tant que joueur, je veut pouvoir utiliser les touches WASD afin de pouvoir faire bouger mon joueur dans chaque direction.</w:t>
+        <w:t xml:space="preserve">En tant que joueur, je </w:t>
+      </w:r>
+      <w:proofErr w:type="spellStart"/>
+      <w:proofErr w:type="gramStart"/>
+      <w:r>
+        <w:t>veut</w:t>
+      </w:r>
+      <w:proofErr w:type="spellEnd"/>
+      <w:proofErr w:type="gramEnd"/>
+      <w:r>
+        <w:t xml:space="preserve"> pouvoir utiliser les touches WASD afin de pouvoir faire bouger mon joueur dans chaque direction.</w:t>
       </w:r>
     </w:p>
     <w:p>
@@ -2619,7 +2681,17 @@
         <w:ind w:left="708"/>
       </w:pPr>
       <w:r>
-        <w:t>• Le joueur va dans la direction correspondante tant que je maintient la touche</w:t>
+        <w:t xml:space="preserve">• Le joueur va dans la direction correspondante tant que je </w:t>
+      </w:r>
+      <w:proofErr w:type="spellStart"/>
+      <w:proofErr w:type="gramStart"/>
+      <w:r>
+        <w:t>maintient</w:t>
+      </w:r>
+      <w:proofErr w:type="spellEnd"/>
+      <w:proofErr w:type="gramEnd"/>
+      <w:r>
+        <w:t xml:space="preserve"> la touche</w:t>
       </w:r>
     </w:p>
     <w:p>
@@ -2635,7 +2707,15 @@
         <w:ind w:left="708"/>
       </w:pPr>
       <w:r>
-        <w:t>• Le joueur s'arrête lorsque il essaie d'aller dans les obstacles</w:t>
+        <w:t xml:space="preserve">• Le joueur s'arrête </w:t>
+      </w:r>
+      <w:proofErr w:type="gramStart"/>
+      <w:r>
+        <w:t>lorsque il</w:t>
+      </w:r>
+      <w:proofErr w:type="gramEnd"/>
+      <w:r>
+        <w:t xml:space="preserve"> essaie d'aller dans les obstacles</w:t>
       </w:r>
     </w:p>
     <w:p>
@@ -2651,7 +2731,15 @@
         <w:ind w:left="708"/>
       </w:pPr>
       <w:r>
-        <w:t>• Si j'appuie sur deux touches, le joueurs va en diagonal</w:t>
+        <w:t xml:space="preserve">• Si j'appuie sur deux touches, </w:t>
+      </w:r>
+      <w:proofErr w:type="gramStart"/>
+      <w:r>
+        <w:t>le joueurs</w:t>
+      </w:r>
+      <w:proofErr w:type="gramEnd"/>
+      <w:r>
+        <w:t xml:space="preserve"> va en diagonal</w:t>
       </w:r>
     </w:p>
     <w:p/>
@@ -2661,13 +2749,45 @@
       </w:pPr>
       <w:bookmarkStart w:id="6" w:name="_Toc244258329"/>
       <w:r>
-        <w:t>#2 — pouvoir tirer des projectile sur mes enemies.</w:t>
+        <w:t xml:space="preserve">#2 — pouvoir tirer </w:t>
+      </w:r>
+      <w:proofErr w:type="gramStart"/>
+      <w:r>
+        <w:t>des projectile</w:t>
+      </w:r>
+      <w:proofErr w:type="gramEnd"/>
+      <w:r>
+        <w:t xml:space="preserve"> sur mes </w:t>
+      </w:r>
+      <w:proofErr w:type="spellStart"/>
+      <w:r>
+        <w:t>enemies</w:t>
+      </w:r>
+      <w:proofErr w:type="spellEnd"/>
+      <w:r>
+        <w:t>.</w:t>
       </w:r>
       <w:bookmarkEnd w:id="6"/>
     </w:p>
     <w:p>
       <w:r>
-        <w:t>En tant que joueur, je souhaite pouvoir utiliser la touche clic gauche afin de pouvoir tirer des projectile sur mes enemies.</w:t>
+        <w:t xml:space="preserve">En tant que joueur, je souhaite pouvoir utiliser la touche clic gauche afin de pouvoir tirer </w:t>
+      </w:r>
+      <w:proofErr w:type="gramStart"/>
+      <w:r>
+        <w:t>des projectile</w:t>
+      </w:r>
+      <w:proofErr w:type="gramEnd"/>
+      <w:r>
+        <w:t xml:space="preserve"> sur mes </w:t>
+      </w:r>
+      <w:proofErr w:type="spellStart"/>
+      <w:r>
+        <w:t>enemies</w:t>
+      </w:r>
+      <w:proofErr w:type="spellEnd"/>
+      <w:r>
+        <w:t>.</w:t>
       </w:r>
     </w:p>
     <w:p>
@@ -2738,7 +2858,15 @@
       </w:pPr>
       <w:r>
         <w:lastRenderedPageBreak/>
-        <w:t>• Le projectile est détruit si il rencontre le bord de la carte</w:t>
+        <w:t xml:space="preserve">• Le projectile est détruit </w:t>
+      </w:r>
+      <w:proofErr w:type="gramStart"/>
+      <w:r>
+        <w:t>si il</w:t>
+      </w:r>
+      <w:proofErr w:type="gramEnd"/>
+      <w:r>
+        <w:t xml:space="preserve"> rencontre le bord de la carte</w:t>
       </w:r>
     </w:p>
     <w:p>
@@ -2746,7 +2874,15 @@
         <w:ind w:left="708"/>
       </w:pPr>
       <w:r>
-        <w:t>• Le projectile à un cooldown de 1sec après avoir été tiré.</w:t>
+        <w:t xml:space="preserve">• Le projectile à un </w:t>
+      </w:r>
+      <w:proofErr w:type="spellStart"/>
+      <w:r>
+        <w:t>cooldown</w:t>
+      </w:r>
+      <w:proofErr w:type="spellEnd"/>
+      <w:r>
+        <w:t xml:space="preserve"> de 1sec après avoir été tiré.</w:t>
       </w:r>
     </w:p>
     <w:p/>
@@ -2762,7 +2898,23 @@
     </w:p>
     <w:p>
       <w:r>
-        <w:t>En tant que joueur, je souhaite pouvoir utiliser la touche clic gauche afin de pouvoir tirer des projectile sur mes enemies.</w:t>
+        <w:t xml:space="preserve">En tant que joueur, je souhaite pouvoir utiliser la touche clic gauche afin de pouvoir tirer </w:t>
+      </w:r>
+      <w:proofErr w:type="gramStart"/>
+      <w:r>
+        <w:t>des projectile</w:t>
+      </w:r>
+      <w:proofErr w:type="gramEnd"/>
+      <w:r>
+        <w:t xml:space="preserve"> sur mes </w:t>
+      </w:r>
+      <w:proofErr w:type="spellStart"/>
+      <w:r>
+        <w:t>enemies</w:t>
+      </w:r>
+      <w:proofErr w:type="spellEnd"/>
+      <w:r>
+        <w:t>.</w:t>
       </w:r>
     </w:p>
     <w:p>
@@ -2832,7 +2984,15 @@
         <w:ind w:left="708"/>
       </w:pPr>
       <w:r>
-        <w:t>• Le projectile est détruit si il rencontre le bord de la carte</w:t>
+        <w:t xml:space="preserve">• Le projectile est détruit </w:t>
+      </w:r>
+      <w:proofErr w:type="gramStart"/>
+      <w:r>
+        <w:t>si il</w:t>
+      </w:r>
+      <w:proofErr w:type="gramEnd"/>
+      <w:r>
+        <w:t xml:space="preserve"> rencontre le bord de la carte</w:t>
       </w:r>
     </w:p>
     <w:p>
@@ -2840,7 +3000,15 @@
         <w:ind w:left="708"/>
       </w:pPr>
       <w:r>
-        <w:t>• Le projectile à un cooldown de 1sec après avoir été tiré.</w:t>
+        <w:t xml:space="preserve">• Le projectile à un </w:t>
+      </w:r>
+      <w:proofErr w:type="spellStart"/>
+      <w:r>
+        <w:t>cooldown</w:t>
+      </w:r>
+      <w:proofErr w:type="spellEnd"/>
+      <w:r>
+        <w:t xml:space="preserve"> de 1sec après avoir été tiré.</w:t>
       </w:r>
     </w:p>
     <w:p/>
@@ -2850,7 +3018,15 @@
       </w:pPr>
       <w:bookmarkStart w:id="8" w:name="_Toc244258331"/>
       <w:r>
-        <w:t>#4 — En temps que joueur je souhaite avoir des ennemis de type manager afin de pouvoir gagner de l'argent</w:t>
+        <w:t xml:space="preserve">#4 — En </w:t>
+      </w:r>
+      <w:proofErr w:type="spellStart"/>
+      <w:r>
+        <w:t>temps</w:t>
+      </w:r>
+      <w:proofErr w:type="spellEnd"/>
+      <w:r>
+        <w:t xml:space="preserve"> que joueur je souhaite avoir des ennemis de type manager afin de pouvoir gagner de l'argent</w:t>
       </w:r>
       <w:bookmarkEnd w:id="8"/>
     </w:p>
@@ -2919,7 +3095,15 @@
         <w:ind w:left="708"/>
       </w:pPr>
       <w:r>
-        <w:t>• Un manager doit pouvoir se deplacer aléatoirement sur la carte</w:t>
+        <w:t xml:space="preserve">• Un manager doit pouvoir se </w:t>
+      </w:r>
+      <w:proofErr w:type="spellStart"/>
+      <w:r>
+        <w:t>deplacer</w:t>
+      </w:r>
+      <w:proofErr w:type="spellEnd"/>
+      <w:r>
+        <w:t xml:space="preserve"> aléatoirement sur la carte</w:t>
       </w:r>
     </w:p>
     <w:p>
@@ -2943,7 +3127,15 @@
         <w:ind w:left="708"/>
       </w:pPr>
       <w:r>
-        <w:t>• Les missiles burger disparaissent si ils touchent un manager</w:t>
+        <w:t xml:space="preserve">• Les missiles burger disparaissent </w:t>
+      </w:r>
+      <w:proofErr w:type="gramStart"/>
+      <w:r>
+        <w:t>si ils</w:t>
+      </w:r>
+      <w:proofErr w:type="gramEnd"/>
+      <w:r>
+        <w:t xml:space="preserve"> touchent un manager</w:t>
       </w:r>
     </w:p>
     <w:p>
@@ -2951,7 +3143,15 @@
         <w:ind w:left="708"/>
       </w:pPr>
       <w:r>
-        <w:t>• Un manager prend 3PV de dégat quand touché par une attaque de corp à corp</w:t>
+        <w:t xml:space="preserve">• Un manager prend 3PV de </w:t>
+      </w:r>
+      <w:proofErr w:type="spellStart"/>
+      <w:r>
+        <w:t>dégat</w:t>
+      </w:r>
+      <w:proofErr w:type="spellEnd"/>
+      <w:r>
+        <w:t xml:space="preserve"> quand touché par une attaque de corp à corp</w:t>
       </w:r>
     </w:p>
     <w:p>
@@ -2959,15 +3159,36 @@
         <w:ind w:left="708"/>
       </w:pPr>
       <w:r>
-        <w:t>• Un manager dans un rayons égal à la moitié de la largeur du joueur lors d'une attaque de mélée sera affécté</w:t>
-      </w:r>
+        <w:t xml:space="preserve">• Un manager dans un rayons égal à la moitié de la largeur du joueur lors d'une attaque de </w:t>
+      </w:r>
+      <w:proofErr w:type="spellStart"/>
+      <w:r>
+        <w:t>mélée</w:t>
+      </w:r>
+      <w:proofErr w:type="spellEnd"/>
+      <w:r>
+        <w:t xml:space="preserve"> sera </w:t>
+      </w:r>
+      <w:proofErr w:type="spellStart"/>
+      <w:r>
+        <w:t>affécté</w:t>
+      </w:r>
+      <w:proofErr w:type="spellEnd"/>
     </w:p>
     <w:p>
       <w:pPr>
         <w:ind w:left="708"/>
       </w:pPr>
       <w:r>
-        <w:t>• Un manager prend 5PV de dégat quand touché par une attaque burger</w:t>
+        <w:t xml:space="preserve">• Un manager prend 5PV de </w:t>
+      </w:r>
+      <w:proofErr w:type="spellStart"/>
+      <w:r>
+        <w:t>dégat</w:t>
+      </w:r>
+      <w:proofErr w:type="spellEnd"/>
+      <w:r>
+        <w:t xml:space="preserve"> quand touché par une attaque burger</w:t>
       </w:r>
     </w:p>
     <w:p>
@@ -2975,7 +3196,15 @@
         <w:ind w:left="708"/>
       </w:pPr>
       <w:r>
-        <w:t>• Un manager disparait lorsque ces points de vie sont inférieur ou égal à 0</w:t>
+        <w:t xml:space="preserve">• Un manager disparait lorsque ces points de vie sont </w:t>
+      </w:r>
+      <w:proofErr w:type="gramStart"/>
+      <w:r>
+        <w:t>inférieur ou égal</w:t>
+      </w:r>
+      <w:proofErr w:type="gramEnd"/>
+      <w:r>
+        <w:t xml:space="preserve"> à 0</w:t>
       </w:r>
     </w:p>
     <w:p>
@@ -2991,7 +3220,15 @@
         <w:ind w:left="708"/>
       </w:pPr>
       <w:r>
-        <w:t>• Il doit toujours y avoir 7 manager sur la carte</w:t>
+        <w:t xml:space="preserve">• Il doit toujours y avoir 7 </w:t>
+      </w:r>
+      <w:proofErr w:type="gramStart"/>
+      <w:r>
+        <w:t>manager</w:t>
+      </w:r>
+      <w:proofErr w:type="gramEnd"/>
+      <w:r>
+        <w:t xml:space="preserve"> sur la carte</w:t>
       </w:r>
     </w:p>
     <w:p/>
@@ -3007,7 +3244,15 @@
     </w:p>
     <w:p>
       <w:r>
-        <w:t>En temps que joueur je souhaite avoir des ennemis de type robot afin de pouvoir gagner de l'argent</w:t>
+        <w:t xml:space="preserve">En </w:t>
+      </w:r>
+      <w:proofErr w:type="spellStart"/>
+      <w:r>
+        <w:t>temps</w:t>
+      </w:r>
+      <w:proofErr w:type="spellEnd"/>
+      <w:r>
+        <w:t xml:space="preserve"> que joueur je souhaite avoir des ennemis de type robot afin de pouvoir gagner de l'argent</w:t>
       </w:r>
     </w:p>
     <w:p/>
@@ -3071,7 +3316,15 @@
         <w:ind w:left="708"/>
       </w:pPr>
       <w:r>
-        <w:t>• Un robot se déplace sur la carte en essayant de toujours se positionner directement au dessus/dessous/à droite/ à gauche du joueur</w:t>
+        <w:t xml:space="preserve">• Un robot se déplace sur la carte en essayant de toujours se positionner directement </w:t>
+      </w:r>
+      <w:proofErr w:type="spellStart"/>
+      <w:r>
+        <w:t>au dessus</w:t>
+      </w:r>
+      <w:proofErr w:type="spellEnd"/>
+      <w:r>
+        <w:t>/dessous/à droite/ à gauche du joueur</w:t>
       </w:r>
     </w:p>
     <w:p>
@@ -3103,7 +3356,15 @@
         <w:ind w:left="708"/>
       </w:pPr>
       <w:r>
-        <w:t>• Les missiles burger disparaissent si ils touchent un robot</w:t>
+        <w:t xml:space="preserve">• Les missiles burger disparaissent </w:t>
+      </w:r>
+      <w:proofErr w:type="gramStart"/>
+      <w:r>
+        <w:t>si ils</w:t>
+      </w:r>
+      <w:proofErr w:type="gramEnd"/>
+      <w:r>
+        <w:t xml:space="preserve"> touchent un robot</w:t>
       </w:r>
     </w:p>
     <w:p>
@@ -3111,7 +3372,15 @@
         <w:ind w:left="708"/>
       </w:pPr>
       <w:r>
-        <w:t>• Un robot prend 3PV de dégat quand touché par une attaque de corp à corp</w:t>
+        <w:t xml:space="preserve">• Un robot prend 3PV de </w:t>
+      </w:r>
+      <w:proofErr w:type="spellStart"/>
+      <w:r>
+        <w:t>dégat</w:t>
+      </w:r>
+      <w:proofErr w:type="spellEnd"/>
+      <w:r>
+        <w:t xml:space="preserve"> quand touché par une attaque de corp à corp</w:t>
       </w:r>
     </w:p>
     <w:p>
@@ -3119,15 +3388,36 @@
         <w:ind w:left="708"/>
       </w:pPr>
       <w:r>
-        <w:t>• Un robot dans un rayons égal à la moitié de la largeur du joueur lors d'une attaque de mélée sera affécté</w:t>
-      </w:r>
+        <w:t xml:space="preserve">• Un robot dans un rayons égal à la moitié de la largeur du joueur lors d'une attaque de </w:t>
+      </w:r>
+      <w:proofErr w:type="spellStart"/>
+      <w:r>
+        <w:t>mélée</w:t>
+      </w:r>
+      <w:proofErr w:type="spellEnd"/>
+      <w:r>
+        <w:t xml:space="preserve"> sera </w:t>
+      </w:r>
+      <w:proofErr w:type="spellStart"/>
+      <w:r>
+        <w:t>affécté</w:t>
+      </w:r>
+      <w:proofErr w:type="spellEnd"/>
     </w:p>
     <w:p>
       <w:pPr>
         <w:ind w:left="708"/>
       </w:pPr>
       <w:r>
-        <w:t>• Un robot prend 5PV de dégat quand touché par une attaque burger</w:t>
+        <w:t xml:space="preserve">• Un robot prend 5PV de </w:t>
+      </w:r>
+      <w:proofErr w:type="spellStart"/>
+      <w:r>
+        <w:t>dégat</w:t>
+      </w:r>
+      <w:proofErr w:type="spellEnd"/>
+      <w:r>
+        <w:t xml:space="preserve"> quand touché par une attaque burger</w:t>
       </w:r>
     </w:p>
     <w:p>
@@ -3135,7 +3425,15 @@
         <w:ind w:left="708"/>
       </w:pPr>
       <w:r>
-        <w:t>• Un robot disparait lorsque ces points de vie sont inférieur ou égal à 0</w:t>
+        <w:t xml:space="preserve">• Un robot disparait lorsque ces points de vie sont </w:t>
+      </w:r>
+      <w:proofErr w:type="gramStart"/>
+      <w:r>
+        <w:t>inférieur ou égal</w:t>
+      </w:r>
+      <w:proofErr w:type="gramEnd"/>
+      <w:r>
+        <w:t xml:space="preserve"> à 0</w:t>
       </w:r>
     </w:p>
     <w:p>
@@ -3143,7 +3441,15 @@
         <w:ind w:left="708"/>
       </w:pPr>
       <w:r>
-        <w:t>• Dès que le joueur atteint le niveau 2, il doit toujours y avoir 4 robot sur la carte</w:t>
+        <w:t xml:space="preserve">• Dès que le joueur atteint le niveau 2, il doit toujours y avoir 4 </w:t>
+      </w:r>
+      <w:proofErr w:type="gramStart"/>
+      <w:r>
+        <w:t>robot</w:t>
+      </w:r>
+      <w:proofErr w:type="gramEnd"/>
+      <w:r>
+        <w:t xml:space="preserve"> sur la carte</w:t>
       </w:r>
     </w:p>
     <w:p>
@@ -3158,8 +3464,13 @@
     </w:p>
     <w:p>
       <w:r>
-        <w:t>En tant que joueur je souhaite que les ennemis de type robot puisse me tirer dessus afin d'ajouter du challenge</w:t>
-      </w:r>
+        <w:t xml:space="preserve">En tant que joueur je souhaite que les ennemis de type robot puisse me tirer dessus afin d'ajouter du </w:t>
+      </w:r>
+      <w:proofErr w:type="gramStart"/>
+      <w:r>
+        <w:t>challenge</w:t>
+      </w:r>
+      <w:proofErr w:type="gramEnd"/>
     </w:p>
     <w:p>
       <w:r>
@@ -3245,7 +3556,39 @@
       </w:pPr>
       <w:r>
         <w:lastRenderedPageBreak/>
-        <w:t>• Les faisceaux font 25PV de dégats au joueur peut importe le niveau du robot qui les a tiré.</w:t>
+        <w:t xml:space="preserve">• Les faisceaux font 25PV de </w:t>
+      </w:r>
+      <w:proofErr w:type="spellStart"/>
+      <w:r>
+        <w:t>dégats</w:t>
+      </w:r>
+      <w:proofErr w:type="spellEnd"/>
+      <w:r>
+        <w:t xml:space="preserve"> au joueur </w:t>
+      </w:r>
+      <w:proofErr w:type="spellStart"/>
+      <w:r>
+        <w:t>peut</w:t>
+      </w:r>
+      <w:proofErr w:type="spellEnd"/>
+      <w:r>
+        <w:t xml:space="preserve"> </w:t>
+      </w:r>
+      <w:proofErr w:type="spellStart"/>
+      <w:r>
+        <w:t>importe</w:t>
+      </w:r>
+      <w:proofErr w:type="spellEnd"/>
+      <w:r>
+        <w:t xml:space="preserve"> le niveau du robot qui les a </w:t>
+      </w:r>
+      <w:proofErr w:type="gramStart"/>
+      <w:r>
+        <w:t>tiré</w:t>
+      </w:r>
+      <w:proofErr w:type="gramEnd"/>
+      <w:r>
+        <w:t>.</w:t>
       </w:r>
     </w:p>
     <w:p>
@@ -3253,7 +3596,15 @@
         <w:ind w:left="708"/>
       </w:pPr>
       <w:r>
-        <w:t>• Les faisceaux disparaissent si ils touchent un obstacle.</w:t>
+        <w:t xml:space="preserve">• Les faisceaux disparaissent </w:t>
+      </w:r>
+      <w:proofErr w:type="gramStart"/>
+      <w:r>
+        <w:t>si ils</w:t>
+      </w:r>
+      <w:proofErr w:type="gramEnd"/>
+      <w:r>
+        <w:t xml:space="preserve"> touchent un obstacle.</w:t>
       </w:r>
     </w:p>
     <w:p>
@@ -3261,7 +3612,23 @@
         <w:ind w:left="708"/>
       </w:pPr>
       <w:r>
-        <w:t>• Un robot prends 3 sec à lancer une attaque faisceau lorsqu'il est en position. Il ne peut plus bouger pendant cette période</w:t>
+        <w:t xml:space="preserve">• Un robot </w:t>
+      </w:r>
+      <w:proofErr w:type="gramStart"/>
+      <w:r>
+        <w:t>prends</w:t>
+      </w:r>
+      <w:proofErr w:type="gramEnd"/>
+      <w:r>
+        <w:t xml:space="preserve"> 3 </w:t>
+      </w:r>
+      <w:proofErr w:type="gramStart"/>
+      <w:r>
+        <w:t>sec</w:t>
+      </w:r>
+      <w:proofErr w:type="gramEnd"/>
+      <w:r>
+        <w:t xml:space="preserve"> à lancer une attaque faisceau lorsqu'il est en position. Il ne peut plus bouger pendant cette période</w:t>
       </w:r>
     </w:p>
     <w:p>
@@ -3276,8 +3643,21 @@
     </w:p>
     <w:p>
       <w:r>
-        <w:t>En tant que joueur je veut que les ennemis de type manager puisse me tirer dessus afin d'ajouter du challenge</w:t>
-      </w:r>
+        <w:t xml:space="preserve">En tant que joueur je </w:t>
+      </w:r>
+      <w:proofErr w:type="spellStart"/>
+      <w:r>
+        <w:t>veut</w:t>
+      </w:r>
+      <w:proofErr w:type="spellEnd"/>
+      <w:r>
+        <w:t xml:space="preserve"> que les ennemis de type manager puisse me tirer dessus afin d'ajouter du </w:t>
+      </w:r>
+      <w:proofErr w:type="gramStart"/>
+      <w:r>
+        <w:t>challenge</w:t>
+      </w:r>
+      <w:proofErr w:type="gramEnd"/>
     </w:p>
     <w:p>
       <w:r>
@@ -3346,7 +3726,23 @@
         <w:ind w:left="708"/>
       </w:pPr>
       <w:r>
-        <w:t>• Les sacs vont en directions de la position que le joueur avait quand le sacs à été lancé.</w:t>
+        <w:t xml:space="preserve">• Les sacs vont en directions de la position que le joueur avait quand </w:t>
+      </w:r>
+      <w:proofErr w:type="gramStart"/>
+      <w:r>
+        <w:t>le sacs</w:t>
+      </w:r>
+      <w:proofErr w:type="gramEnd"/>
+      <w:r>
+        <w:t xml:space="preserve"> </w:t>
+      </w:r>
+      <w:proofErr w:type="spellStart"/>
+      <w:r>
+        <w:t>à</w:t>
+      </w:r>
+      <w:proofErr w:type="spellEnd"/>
+      <w:r>
+        <w:t xml:space="preserve"> été lancé.</w:t>
       </w:r>
     </w:p>
     <w:p>
@@ -3362,7 +3758,31 @@
         <w:ind w:left="708"/>
       </w:pPr>
       <w:r>
-        <w:t>• Le sac fait 10PV de dégat si il à été lancé par un ennemis manager de niveau 1, 15 PV si c'est un manager de niveau 2 et 20PV si c'est un manager de niveau 3.</w:t>
+        <w:t xml:space="preserve">• Le sac fait 10PV de </w:t>
+      </w:r>
+      <w:proofErr w:type="spellStart"/>
+      <w:r>
+        <w:t>dégat</w:t>
+      </w:r>
+      <w:proofErr w:type="spellEnd"/>
+      <w:r>
+        <w:t xml:space="preserve"> </w:t>
+      </w:r>
+      <w:proofErr w:type="gramStart"/>
+      <w:r>
+        <w:t>si il</w:t>
+      </w:r>
+      <w:proofErr w:type="gramEnd"/>
+      <w:r>
+        <w:t xml:space="preserve"> </w:t>
+      </w:r>
+      <w:proofErr w:type="spellStart"/>
+      <w:r>
+        <w:t>à</w:t>
+      </w:r>
+      <w:proofErr w:type="spellEnd"/>
+      <w:r>
+        <w:t xml:space="preserve"> été lancé par un ennemis manager de niveau 1, 15 PV si c'est un manager de niveau 2 et 20PV si c'est un manager de niveau 3.</w:t>
       </w:r>
     </w:p>
     <w:p>
@@ -3370,7 +3790,15 @@
         <w:ind w:left="708"/>
       </w:pPr>
       <w:r>
-        <w:t>• Un sac doit prendre 4 sec à être recharger par un ennemi de type manager</w:t>
+        <w:t xml:space="preserve">• Un sac doit prendre 4 </w:t>
+      </w:r>
+      <w:proofErr w:type="gramStart"/>
+      <w:r>
+        <w:t>sec</w:t>
+      </w:r>
+      <w:proofErr w:type="gramEnd"/>
+      <w:r>
+        <w:t xml:space="preserve"> à être recharger par un ennemi de type manager</w:t>
       </w:r>
     </w:p>
     <w:p>
@@ -3464,7 +3892,15 @@
         <w:ind w:left="708"/>
       </w:pPr>
       <w:r>
-        <w:t>• La barre de vie se situt en bas à gauche</w:t>
+        <w:t xml:space="preserve">• La barre de vie se </w:t>
+      </w:r>
+      <w:proofErr w:type="spellStart"/>
+      <w:r>
+        <w:t>situt</w:t>
+      </w:r>
+      <w:proofErr w:type="spellEnd"/>
+      <w:r>
+        <w:t xml:space="preserve"> en bas à gauche</w:t>
       </w:r>
     </w:p>
     <w:p>
@@ -3549,7 +3985,23 @@
         <w:ind w:left="708"/>
       </w:pPr>
       <w:r>
-        <w:t>• Lorsque un manager meurt, le nombre d'argent du joueur augment de 5'000$</w:t>
+        <w:t xml:space="preserve">• </w:t>
+      </w:r>
+      <w:proofErr w:type="gramStart"/>
+      <w:r>
+        <w:t>Lorsque un</w:t>
+      </w:r>
+      <w:proofErr w:type="gramEnd"/>
+      <w:r>
+        <w:t xml:space="preserve"> manager meurt, le nombre d'argent du joueur </w:t>
+      </w:r>
+      <w:proofErr w:type="spellStart"/>
+      <w:r>
+        <w:t>augment</w:t>
+      </w:r>
+      <w:proofErr w:type="spellEnd"/>
+      <w:r>
+        <w:t xml:space="preserve"> de 5'000$</w:t>
       </w:r>
     </w:p>
     <w:p>
@@ -3557,7 +4009,15 @@
         <w:ind w:left="708"/>
       </w:pPr>
       <w:r>
-        <w:t>• L'argent que fait tomber le manager est quadruplé et ses PV sont doublé quand le joueur atteint 100'000$ (manager de niveau 2). Il le sont à nouveaux quand il atteint 500'000$ (manager de niveau 3).</w:t>
+        <w:t xml:space="preserve">• L'argent que fait tomber le manager est quadruplé et ses PV sont doublé quand le joueur atteint 100'000$ (manager de niveau 2). </w:t>
+      </w:r>
+      <w:proofErr w:type="gramStart"/>
+      <w:r>
+        <w:t>Il le sont</w:t>
+      </w:r>
+      <w:proofErr w:type="gramEnd"/>
+      <w:r>
+        <w:t xml:space="preserve"> à nouveaux quand il atteint 500'000$ (manager de niveau 3).</w:t>
       </w:r>
     </w:p>
     <w:p>
@@ -3566,7 +4026,15 @@
       </w:pPr>
       <w:bookmarkStart w:id="14" w:name="_Toc244258337"/>
       <w:r>
-        <w:t>#10 — avoir des obstacles afin de pouvoir me protéger des projectiles ennemies.</w:t>
+        <w:t xml:space="preserve">#10 — avoir des obstacles afin de pouvoir me protéger </w:t>
+      </w:r>
+      <w:proofErr w:type="gramStart"/>
+      <w:r>
+        <w:t>des projectiles ennemies</w:t>
+      </w:r>
+      <w:proofErr w:type="gramEnd"/>
+      <w:r>
+        <w:t>.</w:t>
       </w:r>
       <w:bookmarkEnd w:id="14"/>
     </w:p>
@@ -3577,7 +4045,23 @@
         </w:rPr>
       </w:pPr>
       <w:r>
-        <w:t>En tant que joueur je veut avoir des obstacles afin de pouvoir me protéger des projectiles ennemies.</w:t>
+        <w:t xml:space="preserve">En tant que joueur je </w:t>
+      </w:r>
+      <w:proofErr w:type="spellStart"/>
+      <w:r>
+        <w:t>veut</w:t>
+      </w:r>
+      <w:proofErr w:type="spellEnd"/>
+      <w:r>
+        <w:t xml:space="preserve"> avoir des obstacles afin de pouvoir me protéger </w:t>
+      </w:r>
+      <w:proofErr w:type="gramStart"/>
+      <w:r>
+        <w:t>des projectiles ennemies</w:t>
+      </w:r>
+      <w:proofErr w:type="gramEnd"/>
+      <w:r>
+        <w:t>.</w:t>
       </w:r>
     </w:p>
     <w:p>
@@ -3656,15 +4140,28 @@
         <w:ind w:left="708"/>
       </w:pPr>
       <w:r>
-        <w:t>• L'obstacle est indesctuctible</w:t>
-      </w:r>
+        <w:t xml:space="preserve">• L'obstacle est </w:t>
+      </w:r>
+      <w:proofErr w:type="spellStart"/>
+      <w:r>
+        <w:t>indesctuctible</w:t>
+      </w:r>
+      <w:proofErr w:type="spellEnd"/>
     </w:p>
     <w:p>
       <w:pPr>
         <w:ind w:left="708"/>
       </w:pPr>
       <w:r>
-        <w:t>• Les ennemis et les projectils ne peuvent pas passer à travers les obstacles</w:t>
+        <w:t xml:space="preserve">• Les ennemis et les </w:t>
+      </w:r>
+      <w:proofErr w:type="spellStart"/>
+      <w:r>
+        <w:t>projectils</w:t>
+      </w:r>
+      <w:proofErr w:type="spellEnd"/>
+      <w:r>
+        <w:t xml:space="preserve"> ne peuvent pas passer à travers les obstacles</w:t>
       </w:r>
     </w:p>
     <w:p>
@@ -3672,7 +4169,15 @@
         <w:ind w:left="708"/>
       </w:pPr>
       <w:r>
-        <w:t>• Les missiles burger et les faisceaux disparaissent si ils touchent un obstacle</w:t>
+        <w:t xml:space="preserve">• Les missiles burger et les faisceaux disparaissent </w:t>
+      </w:r>
+      <w:proofErr w:type="gramStart"/>
+      <w:r>
+        <w:t>si ils</w:t>
+      </w:r>
+      <w:proofErr w:type="gramEnd"/>
+      <w:r>
+        <w:t xml:space="preserve"> touchent un obstacle</w:t>
       </w:r>
     </w:p>
     <w:p>
@@ -3680,7 +4185,15 @@
         <w:ind w:left="708"/>
       </w:pPr>
       <w:r>
-        <w:t>• Un robot ou un manager doit trouver une nouvelle destination si il bute sur un obstacle</w:t>
+        <w:t xml:space="preserve">• Un robot ou un manager doit trouver une nouvelle destination </w:t>
+      </w:r>
+      <w:proofErr w:type="gramStart"/>
+      <w:r>
+        <w:t>si il</w:t>
+      </w:r>
+      <w:proofErr w:type="gramEnd"/>
+      <w:r>
+        <w:t xml:space="preserve"> bute sur un obstacle</w:t>
       </w:r>
     </w:p>
     <w:p>
@@ -3803,12 +4316,42 @@
           </w:tcPr>
           <w:p>
             <w:hyperlink r:id="rId20" w:history="1">
+              <w:proofErr w:type="gramStart"/>
               <w:r>
                 <w:rPr>
                   <w:rStyle w:val="Lienhypertexte"/>
                 </w:rPr>
-                <w:t>pouvoir tirer des projectile sur mes enemies</w:t>
+                <w:t>pouvoir</w:t>
               </w:r>
+              <w:proofErr w:type="gramEnd"/>
+              <w:r>
+                <w:rPr>
+                  <w:rStyle w:val="Lienhypertexte"/>
+                </w:rPr>
+                <w:t xml:space="preserve"> tirer </w:t>
+              </w:r>
+              <w:proofErr w:type="gramStart"/>
+              <w:r>
+                <w:rPr>
+                  <w:rStyle w:val="Lienhypertexte"/>
+                </w:rPr>
+                <w:t>des projectile</w:t>
+              </w:r>
+              <w:proofErr w:type="gramEnd"/>
+              <w:r>
+                <w:rPr>
+                  <w:rStyle w:val="Lienhypertexte"/>
+                </w:rPr>
+                <w:t xml:space="preserve"> sur mes </w:t>
+              </w:r>
+              <w:proofErr w:type="spellStart"/>
+              <w:r>
+                <w:rPr>
+                  <w:rStyle w:val="Lienhypertexte"/>
+                </w:rPr>
+                <w:t>enemies</w:t>
+              </w:r>
+              <w:proofErr w:type="spellEnd"/>
             </w:hyperlink>
           </w:p>
         </w:tc>
@@ -3830,11 +4373,47 @@
           </w:tcPr>
           <w:p>
             <w:hyperlink r:id="rId21" w:history="1">
+              <w:proofErr w:type="gramStart"/>
               <w:r>
                 <w:rPr>
                   <w:rStyle w:val="Lienhypertexte"/>
                 </w:rPr>
-                <w:t>pouvoir faire des degats au corp à corp</w:t>
+                <w:t>pouvoir</w:t>
+              </w:r>
+              <w:proofErr w:type="gramEnd"/>
+              <w:r>
+                <w:rPr>
+                  <w:rStyle w:val="Lienhypertexte"/>
+                </w:rPr>
+                <w:t xml:space="preserve"> faire des </w:t>
+              </w:r>
+              <w:proofErr w:type="spellStart"/>
+              <w:r>
+                <w:rPr>
+                  <w:rStyle w:val="Lienhypertexte"/>
+                </w:rPr>
+                <w:t>degats</w:t>
+              </w:r>
+              <w:proofErr w:type="spellEnd"/>
+              <w:r>
+                <w:rPr>
+                  <w:rStyle w:val="Lienhypertexte"/>
+                </w:rPr>
+                <w:t xml:space="preserve"> </w:t>
+              </w:r>
+              <w:proofErr w:type="gramStart"/>
+              <w:r>
+                <w:rPr>
+                  <w:rStyle w:val="Lienhypertexte"/>
+                </w:rPr>
+                <w:t>au corp</w:t>
+              </w:r>
+              <w:proofErr w:type="gramEnd"/>
+              <w:r>
+                <w:rPr>
+                  <w:rStyle w:val="Lienhypertexte"/>
+                </w:rPr>
+                <w:t xml:space="preserve"> à corp</w:t>
               </w:r>
             </w:hyperlink>
           </w:p>
@@ -3942,7 +4521,19 @@
                 <w:rPr>
                   <w:rStyle w:val="Lienhypertexte"/>
                 </w:rPr>
-                <w:t>Créer les projectiles des managers</w:t>
+                <w:t>Créer les projectil</w:t>
+              </w:r>
+              <w:r>
+                <w:rPr>
+                  <w:rStyle w:val="Lienhypertexte"/>
+                </w:rPr>
+                <w:t>e</w:t>
+              </w:r>
+              <w:r>
+                <w:rPr>
+                  <w:rStyle w:val="Lienhypertexte"/>
+                </w:rPr>
+                <w:t>s des managers</w:t>
               </w:r>
             </w:hyperlink>
           </w:p>
@@ -4002,7 +4593,19 @@
                 <w:rPr>
                   <w:rStyle w:val="Lienhypertexte"/>
                 </w:rPr>
-                <w:t>Créer les projectiles des robots</w:t>
+                <w:t>Créer les projectiles des</w:t>
+              </w:r>
+              <w:r>
+                <w:rPr>
+                  <w:rStyle w:val="Lienhypertexte"/>
+                </w:rPr>
+                <w:t xml:space="preserve"> </w:t>
+              </w:r>
+              <w:r>
+                <w:rPr>
+                  <w:rStyle w:val="Lienhypertexte"/>
+                </w:rPr>
+                <w:t>robots</w:t>
               </w:r>
             </w:hyperlink>
           </w:p>
@@ -4032,7 +4635,19 @@
                 <w:rPr>
                   <w:rStyle w:val="Lienhypertexte"/>
                 </w:rPr>
-                <w:t>Créer les obstacles</w:t>
+                <w:t>Créer les obst</w:t>
+              </w:r>
+              <w:r>
+                <w:rPr>
+                  <w:rStyle w:val="Lienhypertexte"/>
+                </w:rPr>
+                <w:t>a</w:t>
+              </w:r>
+              <w:r>
+                <w:rPr>
+                  <w:rStyle w:val="Lienhypertexte"/>
+                </w:rPr>
+                <w:t>cles</w:t>
               </w:r>
             </w:hyperlink>
           </w:p>
@@ -4060,10 +4675,12 @@
         <w:pStyle w:val="Titre3"/>
       </w:pPr>
       <w:bookmarkStart w:id="17" w:name="_Toc244258340"/>
+      <w:proofErr w:type="spellStart"/>
       <w:r>
         <w:t>HelpersTest</w:t>
       </w:r>
       <w:bookmarkEnd w:id="17"/>
+      <w:proofErr w:type="spellEnd"/>
     </w:p>
     <w:p>
       <w:r>
@@ -4074,6 +4691,7 @@
       <w:pPr>
         <w:ind w:left="708"/>
       </w:pPr>
+      <w:proofErr w:type="spellStart"/>
       <w:r>
         <w:rPr>
           <w:rStyle w:val="Titre4Car"/>
@@ -4092,6 +4710,7 @@
         </w:rPr>
         <w:t>ance</w:t>
       </w:r>
+      <w:proofErr w:type="spellEnd"/>
       <w:r>
         <w:rPr>
           <w:b/>
@@ -4102,9 +4721,11 @@
       <w:r>
         <w:t>Vérifie que le helper « </w:t>
       </w:r>
+      <w:proofErr w:type="spellStart"/>
       <w:r>
         <w:t>MathHelper.Distance</w:t>
       </w:r>
+      <w:proofErr w:type="spellEnd"/>
       <w:r>
         <w:t xml:space="preserve"> » fonctionne en lui donnant deux points ayant </w:t>
       </w:r>
@@ -4123,12 +4744,14 @@
       <w:pPr>
         <w:ind w:left="708"/>
       </w:pPr>
+      <w:proofErr w:type="spellStart"/>
       <w:r>
         <w:rPr>
           <w:rStyle w:val="Titre4Car"/>
         </w:rPr>
         <w:t>TestAreTouching</w:t>
       </w:r>
+      <w:proofErr w:type="spellEnd"/>
       <w:r>
         <w:rPr>
           <w:b/>
@@ -4139,9 +4762,11 @@
       <w:r>
         <w:t>Vérifie que le helpers « </w:t>
       </w:r>
+      <w:proofErr w:type="spellStart"/>
       <w:r>
         <w:t>MathHelper.AreTouching</w:t>
       </w:r>
+      <w:proofErr w:type="spellEnd"/>
       <w:r>
         <w:t xml:space="preserve"> » fonctionne en lui donnant deux rectangles ayant chacun </w:t>
       </w:r>
@@ -4160,14 +4785,24 @@
         <w:pStyle w:val="Titre3"/>
       </w:pPr>
       <w:bookmarkStart w:id="18" w:name="_Toc244258341"/>
+      <w:proofErr w:type="spellStart"/>
       <w:r>
         <w:t>ManagerTests</w:t>
       </w:r>
       <w:bookmarkEnd w:id="18"/>
-    </w:p>
-    <w:p>
-      <w:r>
-        <w:t xml:space="preserve">Cette classe contient deux tests et utilise une methode </w:t>
+      <w:proofErr w:type="spellEnd"/>
+    </w:p>
+    <w:p>
+      <w:r>
+        <w:t xml:space="preserve">Cette classe contient deux tests et utilise une </w:t>
+      </w:r>
+      <w:proofErr w:type="spellStart"/>
+      <w:r>
+        <w:t>methode</w:t>
+      </w:r>
+      <w:proofErr w:type="spellEnd"/>
+      <w:r>
+        <w:t xml:space="preserve"> </w:t>
       </w:r>
       <w:r>
         <w:t>Setup</w:t>
@@ -4176,7 +4811,15 @@
         <w:t xml:space="preserve"> lancé par </w:t>
       </w:r>
       <w:r>
-        <w:t>[TestInitialize]</w:t>
+        <w:t>[</w:t>
+      </w:r>
+      <w:proofErr w:type="spellStart"/>
+      <w:r>
+        <w:t>TestInitialize</w:t>
+      </w:r>
+      <w:proofErr w:type="spellEnd"/>
+      <w:r>
+        <w:t>]</w:t>
       </w:r>
       <w:r>
         <w:t xml:space="preserve"> afin de réinitialiser </w:t>
@@ -4195,12 +4838,14 @@
       <w:pPr>
         <w:ind w:left="708"/>
       </w:pPr>
+      <w:proofErr w:type="spellStart"/>
       <w:r>
         <w:rPr>
           <w:rStyle w:val="Titre4Car"/>
         </w:rPr>
         <w:t>ManagerFires</w:t>
       </w:r>
+      <w:proofErr w:type="spellEnd"/>
       <w:r>
         <w:rPr>
           <w:b/>
@@ -4212,7 +4857,19 @@
         <w:t>Cette méthode instancie un manager</w:t>
       </w:r>
       <w:r>
-        <w:t xml:space="preserve"> ainsi qu’un champ de bataille. Elle supprime ensuite tout les obstacles présent dans le champs de bataille. Puis</w:t>
+        <w:t xml:space="preserve"> ainsi qu’un champ de bataille. Elle supprime ensuite </w:t>
+      </w:r>
+      <w:r>
+        <w:t>tous les obstacles présents</w:t>
+      </w:r>
+      <w:r>
+        <w:t xml:space="preserve"> dans </w:t>
+      </w:r>
+      <w:r>
+        <w:t>le champ</w:t>
+      </w:r>
+      <w:r>
+        <w:t xml:space="preserve"> de bataille. Puis</w:t>
       </w:r>
       <w:r>
         <w:t xml:space="preserve"> </w:t>
@@ -4234,12 +4891,14 @@
       <w:pPr>
         <w:ind w:left="708"/>
       </w:pPr>
+      <w:proofErr w:type="spellStart"/>
       <w:r>
         <w:rPr>
           <w:rStyle w:val="Titre4Car"/>
         </w:rPr>
         <w:t>ManagerMoves</w:t>
       </w:r>
+      <w:proofErr w:type="spellEnd"/>
       <w:r>
         <w:rPr>
           <w:b/>
@@ -4260,17 +4919,75 @@
     </w:p>
     <w:p>
       <w:pPr>
+        <w:ind w:left="708"/>
+      </w:pPr>
+      <w:proofErr w:type="spellStart"/>
+      <w:r>
+        <w:rPr>
+          <w:rStyle w:val="Titre4Car"/>
+        </w:rPr>
+        <w:t>Manager</w:t>
+      </w:r>
+      <w:r>
+        <w:rPr>
+          <w:rStyle w:val="Titre4Car"/>
+        </w:rPr>
+        <w:t>StuckByObstacles</w:t>
+      </w:r>
+      <w:proofErr w:type="spellEnd"/>
+      <w:r>
+        <w:t xml:space="preserve"> : Cette méthode instancie un nouveau champ de bataille puis un nouveau </w:t>
+      </w:r>
+      <w:r>
+        <w:t>manager</w:t>
+      </w:r>
+      <w:r>
+        <w:t xml:space="preserve"> et créée 4 obstacles qui l’entourent. Il laisse ensuite </w:t>
+      </w:r>
+      <w:proofErr w:type="gramStart"/>
+      <w:r>
+        <w:t>une frame</w:t>
+      </w:r>
+      <w:proofErr w:type="gramEnd"/>
+      <w:r>
+        <w:t xml:space="preserve"> pass</w:t>
+      </w:r>
+      <w:r>
+        <w:t>er</w:t>
+      </w:r>
+      <w:r>
+        <w:t xml:space="preserve"> puis regarde si la position du </w:t>
+      </w:r>
+      <w:r>
+        <w:t>Manager</w:t>
+      </w:r>
+      <w:r>
+        <w:t xml:space="preserve"> à changer.</w:t>
+      </w:r>
+    </w:p>
+    <w:p>
+      <w:pPr>
         <w:pStyle w:val="Titre3"/>
       </w:pPr>
       <w:bookmarkStart w:id="19" w:name="_Toc244258342"/>
+      <w:proofErr w:type="spellStart"/>
       <w:r>
         <w:t>PlayerTests</w:t>
       </w:r>
       <w:bookmarkEnd w:id="19"/>
-    </w:p>
-    <w:p>
-      <w:r>
-        <w:t xml:space="preserve">Cette classe contient 7 tests et utilise une methode </w:t>
+      <w:proofErr w:type="spellEnd"/>
+    </w:p>
+    <w:p>
+      <w:r>
+        <w:t xml:space="preserve">Cette classe contient 7 tests et utilise une </w:t>
+      </w:r>
+      <w:proofErr w:type="spellStart"/>
+      <w:r>
+        <w:t>methode</w:t>
+      </w:r>
+      <w:proofErr w:type="spellEnd"/>
+      <w:r>
+        <w:t xml:space="preserve"> </w:t>
       </w:r>
       <w:r>
         <w:t>Setup</w:t>
@@ -4279,7 +4996,15 @@
         <w:t xml:space="preserve"> lancé par </w:t>
       </w:r>
       <w:r>
-        <w:t>[TestInitialize]</w:t>
+        <w:t>[</w:t>
+      </w:r>
+      <w:proofErr w:type="spellStart"/>
+      <w:r>
+        <w:t>TestInitialize</w:t>
+      </w:r>
+      <w:proofErr w:type="spellEnd"/>
+      <w:r>
+        <w:t>]</w:t>
       </w:r>
       <w:r>
         <w:t xml:space="preserve"> afin de réinitialiser le champ de batail entre les tests :</w:t>
@@ -4289,14 +5014,21 @@
       <w:pPr>
         <w:ind w:left="708"/>
       </w:pPr>
+      <w:proofErr w:type="spellStart"/>
+      <w:proofErr w:type="gramStart"/>
       <w:r>
         <w:rPr>
           <w:rStyle w:val="Titre4Car"/>
         </w:rPr>
         <w:t>PlayerBurgerAttack</w:t>
       </w:r>
-      <w:r>
-        <w:t xml:space="preserve">: Cette méthode </w:t>
+      <w:proofErr w:type="spellEnd"/>
+      <w:r>
+        <w:t>:</w:t>
+      </w:r>
+      <w:proofErr w:type="gramEnd"/>
+      <w:r>
+        <w:t xml:space="preserve"> Cette méthode </w:t>
       </w:r>
       <w:r>
         <w:t>créer un joueur puis simule un clic gauche. Elle regarde ensuite le nombre de balle présente dans le champ de bataille.</w:t>
@@ -4306,61 +5038,191 @@
       <w:pPr>
         <w:ind w:left="708"/>
       </w:pPr>
+      <w:proofErr w:type="spellStart"/>
       <w:r>
         <w:rPr>
           <w:rStyle w:val="Titre4Car"/>
         </w:rPr>
         <w:t>PlayerMeleeAtack</w:t>
       </w:r>
-      <w:r>
-        <w:t xml:space="preserve"> : Cette méthode créer un joueur puis attends une frame le temps que le cooldown de départ passe puis simule un clic droit. Elle laisse encore </w:t>
-      </w:r>
+      <w:proofErr w:type="spellEnd"/>
+      <w:r>
+        <w:t xml:space="preserve"> : Cette méthode créer un joueur puis attends une frame le temps que le </w:t>
+      </w:r>
+      <w:proofErr w:type="spellStart"/>
+      <w:r>
+        <w:t>cooldown</w:t>
+      </w:r>
+      <w:proofErr w:type="spellEnd"/>
+      <w:r>
+        <w:t xml:space="preserve"> de départ passe puis simule un clic droit. Elle laisse encore </w:t>
+      </w:r>
+      <w:proofErr w:type="gramStart"/>
       <w:r>
         <w:t>une frame</w:t>
       </w:r>
-      <w:r>
-        <w:t xml:space="preserve"> passer puis elle regarde si le joueur est en mode Melee ou non.</w:t>
+      <w:proofErr w:type="gramEnd"/>
+      <w:r>
+        <w:t xml:space="preserve"> passer puis elle regarde si le joueur est en mode </w:t>
+      </w:r>
+      <w:proofErr w:type="spellStart"/>
+      <w:r>
+        <w:t>Melee</w:t>
+      </w:r>
+      <w:proofErr w:type="spellEnd"/>
+      <w:r>
+        <w:t xml:space="preserve"> ou non.</w:t>
       </w:r>
     </w:p>
     <w:p>
       <w:pPr>
         <w:ind w:left="708"/>
       </w:pPr>
+      <w:proofErr w:type="spellStart"/>
       <w:r>
         <w:rPr>
           <w:rStyle w:val="Titre4Car"/>
         </w:rPr>
-        <w:t>PlayerGoUp/PlayerGoDown/PlayerGoLeft/PlayerGoRight</w:t>
-      </w:r>
-      <w:r>
-        <w:t xml:space="preserve"> : Ces quatres méthodes </w:t>
+        <w:t>PlayerGoUp</w:t>
+      </w:r>
+      <w:proofErr w:type="spellEnd"/>
+      <w:r>
+        <w:rPr>
+          <w:rStyle w:val="Titre4Car"/>
+        </w:rPr>
+        <w:t>/</w:t>
+      </w:r>
+      <w:proofErr w:type="spellStart"/>
+      <w:r>
+        <w:rPr>
+          <w:rStyle w:val="Titre4Car"/>
+        </w:rPr>
+        <w:t>PlayerGoDown</w:t>
+      </w:r>
+      <w:proofErr w:type="spellEnd"/>
+      <w:r>
+        <w:rPr>
+          <w:rStyle w:val="Titre4Car"/>
+        </w:rPr>
+        <w:t>/</w:t>
+      </w:r>
+      <w:proofErr w:type="spellStart"/>
+      <w:r>
+        <w:rPr>
+          <w:rStyle w:val="Titre4Car"/>
+        </w:rPr>
+        <w:t>PlayerGoLeft</w:t>
+      </w:r>
+      <w:proofErr w:type="spellEnd"/>
+      <w:r>
+        <w:rPr>
+          <w:rStyle w:val="Titre4Car"/>
+        </w:rPr>
+        <w:t>/</w:t>
+      </w:r>
+      <w:proofErr w:type="spellStart"/>
+      <w:r>
+        <w:rPr>
+          <w:rStyle w:val="Titre4Car"/>
+        </w:rPr>
+        <w:t>PlayerGoRight</w:t>
+      </w:r>
+      <w:proofErr w:type="spellEnd"/>
+      <w:r>
+        <w:t xml:space="preserve"> : Ces </w:t>
+      </w:r>
+      <w:proofErr w:type="spellStart"/>
+      <w:r>
+        <w:t>quatres</w:t>
+      </w:r>
+      <w:proofErr w:type="spellEnd"/>
+      <w:r>
+        <w:t xml:space="preserve"> méthodes </w:t>
       </w:r>
       <w:r>
         <w:t>i</w:t>
       </w:r>
       <w:r>
-        <w:t>nstancie toutes un joueur puis simule le pressage de la touche pour aller dans leur direction respective (WASD). Elle laisse toutes une frame passer avant de regarder si la position du joueur à changer de manière égal à sa vitesse et dans la bonne direction.</w:t>
+        <w:t xml:space="preserve">nstancie toutes un joueur puis simule le pressage de la touche pour aller dans leur direction respective (WASD). Elle laisse toutes </w:t>
+      </w:r>
+      <w:proofErr w:type="gramStart"/>
+      <w:r>
+        <w:t>une frame</w:t>
+      </w:r>
+      <w:proofErr w:type="gramEnd"/>
+      <w:r>
+        <w:t xml:space="preserve"> passer avant de regarder si la position du joueur à changer de </w:t>
+      </w:r>
+      <w:r>
+        <w:t>manière égale</w:t>
+      </w:r>
+      <w:r>
+        <w:t xml:space="preserve"> à sa vitesse et dans la bonne direction.</w:t>
       </w:r>
     </w:p>
     <w:p>
       <w:pPr>
         <w:ind w:left="708"/>
       </w:pPr>
+      <w:proofErr w:type="spellStart"/>
+      <w:r>
+        <w:rPr>
+          <w:rStyle w:val="Titre4Car"/>
+        </w:rPr>
+        <w:lastRenderedPageBreak/>
+        <w:t>PlayerCollisionWithObstacle</w:t>
+      </w:r>
+      <w:proofErr w:type="spellEnd"/>
+      <w:r>
+        <w:t xml:space="preserve"> : Cette méthode créer un joueur puis ajoute un obstacle dans le champ de bataille juste en face du joueur. Elle simule ensuite le fait de cliquer sur « W » pour avancer vers l’obstacle puis regarde si la position du joueur à changer. Le but est de voir si </w:t>
+      </w:r>
+      <w:r>
+        <w:t>la collision</w:t>
+      </w:r>
+      <w:r>
+        <w:t xml:space="preserve"> fonctionne. Si oui, le joueur ne changera pas de positio</w:t>
+      </w:r>
+      <w:r>
+        <w:t>n.</w:t>
+      </w:r>
+    </w:p>
+    <w:p>
+      <w:pPr>
+        <w:ind w:left="708"/>
+      </w:pPr>
+      <w:proofErr w:type="spellStart"/>
       <w:r>
         <w:rPr>
           <w:rStyle w:val="Titre4Car"/>
         </w:rPr>
         <w:t>PlayerCollisionWithObstacle</w:t>
       </w:r>
-      <w:r>
-        <w:t xml:space="preserve"> : Cette méthode créer un joueur puis ajoute un obstacle dans le champ de bataille juste en face du joueur. Elle simule ensuite le fait de cliquer sur « W » pour avancer vers l’obstacle puis regarde si la position du </w:t>
-      </w:r>
-      <w:r>
-        <w:lastRenderedPageBreak/>
-        <w:t>joueur à changer. Le but est de voir si le collision fonctionne. Si oui, le joueur ne changera pas de positio</w:t>
-      </w:r>
-      <w:r>
-        <w:t>n.</w:t>
+      <w:proofErr w:type="spellEnd"/>
+      <w:r>
+        <w:t xml:space="preserve"> : Cette méthode créer un joueur </w:t>
+      </w:r>
+      <w:r>
+        <w:t xml:space="preserve">au bord haut de la </w:t>
+      </w:r>
+      <w:proofErr w:type="spellStart"/>
+      <w:r>
+        <w:t>map</w:t>
+      </w:r>
+      <w:proofErr w:type="spellEnd"/>
+      <w:r>
+        <w:t xml:space="preserve">. Elle simule ensuite le fait de cliquer sur « W » pour avancer vers </w:t>
+      </w:r>
+      <w:r>
+        <w:t xml:space="preserve">le bord </w:t>
+      </w:r>
+      <w:r>
+        <w:t xml:space="preserve">puis regarde si la position du joueur à changer. Le but est de voir si </w:t>
+      </w:r>
+      <w:r>
+        <w:t>la collision</w:t>
+      </w:r>
+      <w:r>
+        <w:t xml:space="preserve"> fonctionne. Si oui, le joueur ne changera pas de position.</w:t>
       </w:r>
     </w:p>
     <w:p>
@@ -4368,14 +5230,24 @@
         <w:pStyle w:val="Titre3"/>
       </w:pPr>
       <w:bookmarkStart w:id="20" w:name="_Toc244258343"/>
+      <w:proofErr w:type="spellStart"/>
       <w:r>
         <w:t>RobotTests</w:t>
       </w:r>
       <w:bookmarkEnd w:id="20"/>
-    </w:p>
-    <w:p>
-      <w:r>
-        <w:t xml:space="preserve">Cette classe contient deux tests et utilise une methode </w:t>
+      <w:proofErr w:type="spellEnd"/>
+    </w:p>
+    <w:p>
+      <w:r>
+        <w:t xml:space="preserve">Cette classe contient deux tests et utilise une </w:t>
+      </w:r>
+      <w:proofErr w:type="spellStart"/>
+      <w:r>
+        <w:t>methode</w:t>
+      </w:r>
+      <w:proofErr w:type="spellEnd"/>
+      <w:r>
+        <w:t xml:space="preserve"> </w:t>
       </w:r>
       <w:r>
         <w:t>Setup</w:t>
@@ -4384,7 +5256,15 @@
         <w:t xml:space="preserve"> lancé par </w:t>
       </w:r>
       <w:r>
-        <w:t>[TestInitialize]</w:t>
+        <w:t>[</w:t>
+      </w:r>
+      <w:proofErr w:type="spellStart"/>
+      <w:r>
+        <w:t>TestInitialize</w:t>
+      </w:r>
+      <w:proofErr w:type="spellEnd"/>
+      <w:r>
+        <w:t>]</w:t>
       </w:r>
       <w:r>
         <w:t xml:space="preserve"> afin de réinitialiser le champ de batail entre les tests :</w:t>
@@ -4394,12 +5274,14 @@
       <w:pPr>
         <w:ind w:left="708"/>
       </w:pPr>
+      <w:proofErr w:type="spellStart"/>
       <w:r>
         <w:rPr>
           <w:rStyle w:val="Titre4Car"/>
         </w:rPr>
         <w:t>RobotFires</w:t>
       </w:r>
+      <w:proofErr w:type="spellEnd"/>
       <w:r>
         <w:t xml:space="preserve"> : </w:t>
       </w:r>
@@ -4413,57 +5295,225 @@
         <w:t xml:space="preserve"> du champ de bataille et attend que le Robot se mette en position et tire.</w:t>
       </w:r>
       <w:r>
-        <w:t xml:space="preserve"> Si le robot prend plus de temps à tirer que la taille de la map, alors c’est que le test ne fonctionne pas. Puis on regarde combien de tir sont présent dans le champ de batail pour valider ou non le test.</w:t>
+        <w:t xml:space="preserve"> Si le robot prend plus de temps à tirer que la taille de la </w:t>
+      </w:r>
+      <w:proofErr w:type="spellStart"/>
+      <w:r>
+        <w:t>map</w:t>
+      </w:r>
+      <w:proofErr w:type="spellEnd"/>
+      <w:r>
+        <w:t>, alors c’est que le test ne fonctionne pas. Puis on regarde combien de tir sont présent dans le champ de batail pour valider ou non le test.</w:t>
       </w:r>
     </w:p>
     <w:p>
       <w:pPr>
         <w:ind w:left="708"/>
       </w:pPr>
+      <w:proofErr w:type="spellStart"/>
       <w:r>
         <w:rPr>
           <w:rStyle w:val="Titre4Car"/>
         </w:rPr>
-        <w:t>RobotMoves </w:t>
+        <w:t>RobotMoves</w:t>
+      </w:r>
+      <w:proofErr w:type="spellEnd"/>
+      <w:r>
+        <w:rPr>
+          <w:rStyle w:val="Titre4Car"/>
+        </w:rPr>
+        <w:t> </w:t>
       </w:r>
       <w:r>
         <w:t>:</w:t>
       </w:r>
       <w:r>
-        <w:t xml:space="preserve"> Cette méthode instancie un nouveau champ de bataille puis un nouveau robot et supprime aussi tous les obstacles. Il laisse ensuite une frame passé puis regarde si la position du Robot à changé.</w:t>
+        <w:t xml:space="preserve"> Cette méthode instancie un nouveau champ de bataille puis un nouveau robot et supprime aussi tous les obstacles. Il laisse ensuite </w:t>
+      </w:r>
+      <w:proofErr w:type="gramStart"/>
+      <w:r>
+        <w:t>une frame</w:t>
+      </w:r>
+      <w:proofErr w:type="gramEnd"/>
+      <w:r>
+        <w:t xml:space="preserve"> passé puis regarde si la position du Robot à </w:t>
+      </w:r>
+      <w:r>
+        <w:t>changer</w:t>
+      </w:r>
+      <w:r>
+        <w:t>.</w:t>
+      </w:r>
+    </w:p>
+    <w:p>
+      <w:pPr>
+        <w:ind w:left="708"/>
+      </w:pPr>
+      <w:proofErr w:type="spellStart"/>
+      <w:r>
+        <w:rPr>
+          <w:rStyle w:val="Titre4Car"/>
+        </w:rPr>
+        <w:t>RobotStuckByObstacles</w:t>
+      </w:r>
+      <w:proofErr w:type="spellEnd"/>
+      <w:r>
+        <w:t xml:space="preserve"> : </w:t>
+      </w:r>
+      <w:r>
+        <w:t xml:space="preserve">Cette méthode instancie un nouveau champ de bataille puis un nouveau robot et </w:t>
+      </w:r>
+      <w:r>
+        <w:t>créée 4 obstacles qui l’entourent</w:t>
+      </w:r>
+      <w:r>
+        <w:t xml:space="preserve">. Il laisse ensuite </w:t>
+      </w:r>
+      <w:proofErr w:type="gramStart"/>
+      <w:r>
+        <w:t>une frame</w:t>
+      </w:r>
+      <w:proofErr w:type="gramEnd"/>
+      <w:r>
+        <w:t xml:space="preserve"> passé puis regarde si la position du Robot à </w:t>
+      </w:r>
+      <w:r>
+        <w:t>changer</w:t>
+      </w:r>
+      <w:r>
+        <w:t>.</w:t>
       </w:r>
     </w:p>
     <w:p>
       <w:pPr>
         <w:pStyle w:val="Titre3"/>
       </w:pPr>
+      <w:proofErr w:type="spellStart"/>
+      <w:r>
+        <w:t>ProjectileTests</w:t>
+      </w:r>
+      <w:proofErr w:type="spellEnd"/>
+    </w:p>
+    <w:p>
+      <w:r>
+        <w:t>Cette classe contient 3 tests pour les 3 type de projectiles</w:t>
+      </w:r>
+    </w:p>
+    <w:p>
+      <w:r>
+        <w:rPr>
+          <w:rStyle w:val="Titre4Car"/>
+        </w:rPr>
+        <w:t>MoneyBagDeplacementTest</w:t>
+      </w:r>
+      <w:r>
+        <w:rPr>
+          <w:rStyle w:val="Titre4Car"/>
+        </w:rPr>
+        <w:t>/</w:t>
+      </w:r>
+      <w:r>
+        <w:rPr>
+          <w:rStyle w:val="Titre4Car"/>
+        </w:rPr>
+        <w:t>FaisceauDeplacementTest</w:t>
+      </w:r>
+      <w:r>
+        <w:rPr>
+          <w:rStyle w:val="Titre4Car"/>
+        </w:rPr>
+        <w:t>/</w:t>
+      </w:r>
+      <w:r>
+        <w:rPr>
+          <w:rStyle w:val="Titre4Car"/>
+        </w:rPr>
+        <w:t>BurgerDeplacementTest</w:t>
+      </w:r>
+      <w:r>
+        <w:t> : Pour cha</w:t>
+      </w:r>
+      <w:r>
+        <w:t>cun de ces tests, on initialise un objet de chaque type essayant d’aller vers 0,0 (ou le nord dans le cas du faisceaux). On laisse ensuite passer une Update puis on regarde si la position à changer.</w:t>
+      </w:r>
+    </w:p>
+    <w:p>
+      <w:pPr>
+        <w:pStyle w:val="Titre3"/>
+      </w:pPr>
       <w:bookmarkStart w:id="21" w:name="_Toc244258344"/>
+      <w:proofErr w:type="spellStart"/>
       <w:r>
         <w:t>MSTestSettings</w:t>
       </w:r>
       <w:bookmarkEnd w:id="21"/>
-    </w:p>
-    <w:p>
-      <w:r>
-        <w:t xml:space="preserve">J’ai du modifié le fichier </w:t>
-      </w:r>
+      <w:proofErr w:type="spellEnd"/>
+    </w:p>
+    <w:p>
+      <w:r>
+        <w:t xml:space="preserve">J’ai </w:t>
+      </w:r>
+      <w:proofErr w:type="spellStart"/>
+      <w:r>
+        <w:t>du</w:t>
+      </w:r>
+      <w:proofErr w:type="spellEnd"/>
+      <w:r>
+        <w:t xml:space="preserve"> modifié le fichier </w:t>
+      </w:r>
+      <w:proofErr w:type="spellStart"/>
       <w:r>
         <w:t>MSTestSettings</w:t>
       </w:r>
       <w:r>
-        <w:t xml:space="preserve">.cs et changer la première ligne en </w:t>
-      </w:r>
-      <w:r>
-        <w:t>[assembly: DoNotParallelize]</w:t>
-      </w:r>
-      <w:r>
-        <w:t>. Cela était nécessaire car le champ de batail est une ressource partagé entre tous les tests ce qui amènerais autrement des tests à écrire dans la classe « </w:t>
-      </w:r>
+        <w:t>.cs</w:t>
+      </w:r>
+      <w:proofErr w:type="spellEnd"/>
+      <w:r>
+        <w:t xml:space="preserve"> et changer la première ligne en </w:t>
+      </w:r>
+      <w:r>
+        <w:t>[</w:t>
+      </w:r>
+      <w:proofErr w:type="spellStart"/>
+      <w:proofErr w:type="gramStart"/>
+      <w:r>
+        <w:t>assembly</w:t>
+      </w:r>
+      <w:proofErr w:type="spellEnd"/>
+      <w:r>
+        <w:t>:</w:t>
+      </w:r>
+      <w:proofErr w:type="gramEnd"/>
+      <w:r>
+        <w:t xml:space="preserve"> DoNotParallelize]</w:t>
+      </w:r>
+      <w:r>
+        <w:t xml:space="preserve">. Cela était nécessaire car le champ de batail est </w:t>
+      </w:r>
+      <w:proofErr w:type="gramStart"/>
+      <w:r>
+        <w:t>une ressource partagé</w:t>
+      </w:r>
+      <w:proofErr w:type="gramEnd"/>
+      <w:r>
+        <w:t xml:space="preserve"> entre tous les tests ce qui amènerais autrement des tests à écrire dans la classe « </w:t>
+      </w:r>
+      <w:proofErr w:type="spellStart"/>
       <w:r>
         <w:t>BattleMap</w:t>
       </w:r>
-      <w:r>
-        <w:t> » au moment ou un autre test allait le lire. J’ai donc du désactiver le parallélisme.</w:t>
+      <w:proofErr w:type="spellEnd"/>
+      <w:r>
+        <w:t xml:space="preserve"> » au moment ou un autre test allait le lire. J’ai donc </w:t>
+      </w:r>
+      <w:proofErr w:type="gramStart"/>
+      <w:r>
+        <w:t>du</w:t>
+      </w:r>
+      <w:proofErr w:type="gramEnd"/>
+      <w:r>
+        <w:t xml:space="preserve"> désactiver le parallélisme.</w:t>
       </w:r>
     </w:p>
     <w:p>
@@ -4546,19 +5596,37 @@
       <w:pPr>
         <w:pStyle w:val="Titre4"/>
       </w:pPr>
+      <w:proofErr w:type="spellStart"/>
       <w:r>
         <w:t>BattleMap</w:t>
       </w:r>
+      <w:proofErr w:type="spellEnd"/>
     </w:p>
     <w:p>
       <w:pPr>
         <w:ind w:left="708"/>
       </w:pPr>
       <w:r>
-        <w:t>Dans le programme, la première classe à être instancié est le BattleMap. Il à comme argument le joueur.</w:t>
-      </w:r>
-      <w:r>
-        <w:t xml:space="preserve"> BattleMap met </w:t>
+        <w:t xml:space="preserve">Dans le programme, la première classe à être instancié est le </w:t>
+      </w:r>
+      <w:proofErr w:type="spellStart"/>
+      <w:r>
+        <w:t>BattleMap</w:t>
+      </w:r>
+      <w:proofErr w:type="spellEnd"/>
+      <w:r>
+        <w:t>. Il à comme argument le joueur.</w:t>
+      </w:r>
+      <w:r>
+        <w:t xml:space="preserve"> </w:t>
+      </w:r>
+      <w:proofErr w:type="spellStart"/>
+      <w:r>
+        <w:t>BattleMap</w:t>
+      </w:r>
+      <w:proofErr w:type="spellEnd"/>
+      <w:r>
+        <w:t xml:space="preserve"> met </w:t>
       </w:r>
       <w:r>
         <w:t>tous les autres objets</w:t>
@@ -4577,10 +5645,26 @@
         <w:t>objet</w:t>
       </w:r>
       <w:r>
-        <w:t xml:space="preserve"> (Update et Render sont appelé par NewFrame).</w:t>
-      </w:r>
-      <w:r>
-        <w:t xml:space="preserve"> Il detecte aussi les touche de clavier et </w:t>
+        <w:t xml:space="preserve"> (Update et Render sont appelé par </w:t>
+      </w:r>
+      <w:proofErr w:type="spellStart"/>
+      <w:r>
+        <w:t>NewFrame</w:t>
+      </w:r>
+      <w:proofErr w:type="spellEnd"/>
+      <w:r>
+        <w:t>).</w:t>
+      </w:r>
+      <w:r>
+        <w:t xml:space="preserve"> Il </w:t>
+      </w:r>
+      <w:proofErr w:type="spellStart"/>
+      <w:r>
+        <w:t>detecte</w:t>
+      </w:r>
+      <w:proofErr w:type="spellEnd"/>
+      <w:r>
+        <w:t xml:space="preserve"> aussi les touche de clavier et </w:t>
       </w:r>
       <w:r>
         <w:t>les stockent</w:t>
@@ -4630,8 +5714,13 @@
         <w:pStyle w:val="Titre4"/>
       </w:pPr>
       <w:r>
-        <w:t>Joueur et ProjectileBurger</w:t>
-      </w:r>
+        <w:t xml:space="preserve">Joueur et </w:t>
+      </w:r>
+      <w:proofErr w:type="spellStart"/>
+      <w:r>
+        <w:t>ProjectileBurger</w:t>
+      </w:r>
+      <w:proofErr w:type="spellEnd"/>
     </w:p>
     <w:p>
       <w:pPr>
@@ -4668,7 +5757,31 @@
         <w:t xml:space="preserve"> </w:t>
       </w:r>
       <w:r>
-        <w:t>grâce à sa liste de touche et bûte sur les bords de la map (BattleMap stocke ses dimensions) ou les objets de type Obstacle. Il</w:t>
+        <w:t xml:space="preserve">grâce à sa liste de touche et </w:t>
+      </w:r>
+      <w:proofErr w:type="spellStart"/>
+      <w:r>
+        <w:t>bûte</w:t>
+      </w:r>
+      <w:proofErr w:type="spellEnd"/>
+      <w:r>
+        <w:t xml:space="preserve"> sur les bords de la </w:t>
+      </w:r>
+      <w:proofErr w:type="spellStart"/>
+      <w:r>
+        <w:t>map</w:t>
+      </w:r>
+      <w:proofErr w:type="spellEnd"/>
+      <w:r>
+        <w:t xml:space="preserve"> (</w:t>
+      </w:r>
+      <w:proofErr w:type="spellStart"/>
+      <w:r>
+        <w:t>BattleMap</w:t>
+      </w:r>
+      <w:proofErr w:type="spellEnd"/>
+      <w:r>
+        <w:t xml:space="preserve"> stocke ses dimensions) ou les objets de type Obstacle. Il</w:t>
       </w:r>
       <w:r>
         <w:t xml:space="preserve"> peut aussi </w:t>
@@ -4698,8 +5811,13 @@
         <w:t>lorsqu’il</w:t>
       </w:r>
       <w:r>
-        <w:t xml:space="preserve"> touche un objet de type Faisceau ou MoneyBag</w:t>
-      </w:r>
+        <w:t xml:space="preserve"> touche un objet de type Faisceau ou </w:t>
+      </w:r>
+      <w:proofErr w:type="spellStart"/>
+      <w:r>
+        <w:t>MoneyBag</w:t>
+      </w:r>
+      <w:proofErr w:type="spellEnd"/>
       <w:r>
         <w:t xml:space="preserve"> et une somme d’argent qui augmente </w:t>
       </w:r>
@@ -4718,8 +5836,29 @@
         <w:ind w:left="708"/>
       </w:pPr>
       <w:r>
-        <w:t>Le joueur peut instancier des projectiles Burger lorsqu’il reçoit un clic souri qui sont ensuite gérer par BattleMap en les stockant dans la liste allBurgers. Les burgers peuvent se déplacer sur la map</w:t>
-      </w:r>
+        <w:t xml:space="preserve">Le joueur peut instancier des projectiles Burger lorsqu’il reçoit un clic souri qui sont ensuite gérer par </w:t>
+      </w:r>
+      <w:proofErr w:type="spellStart"/>
+      <w:r>
+        <w:t>BattleMap</w:t>
+      </w:r>
+      <w:proofErr w:type="spellEnd"/>
+      <w:r>
+        <w:t xml:space="preserve"> en les stockant dans la liste </w:t>
+      </w:r>
+      <w:proofErr w:type="spellStart"/>
+      <w:r>
+        <w:t>allBurgers</w:t>
+      </w:r>
+      <w:proofErr w:type="spellEnd"/>
+      <w:r>
+        <w:t xml:space="preserve">. Les burgers peuvent se déplacer sur la </w:t>
+      </w:r>
+      <w:proofErr w:type="spellStart"/>
+      <w:r>
+        <w:t>map</w:t>
+      </w:r>
+      <w:proofErr w:type="spellEnd"/>
     </w:p>
     <w:p>
       <w:pPr>
@@ -4730,6 +5869,7 @@
       </w:r>
     </w:p>
     <w:p>
+      <w:proofErr w:type="spellStart"/>
       <w:r>
         <w:t>Ba</w:t>
       </w:r>
@@ -4740,7 +5880,11 @@
         <w:t>eM</w:t>
       </w:r>
       <w:r>
-        <w:t>ap de son côté instancie plusieurs listes d’éléments dont plusieurs Obstacle, plusieurs Manager et plusieurs Robot. Chaque liste à un nombre max d’élément gérer par leur constante respective.</w:t>
+        <w:t>ap</w:t>
+      </w:r>
+      <w:proofErr w:type="spellEnd"/>
+      <w:r>
+        <w:t xml:space="preserve"> de son côté instancie plusieurs listes d’éléments dont plusieurs Obstacle, plusieurs Manager et plusieurs Robot. Chaque liste à un nombre max d’élément gérer par leur constante respective.</w:t>
       </w:r>
     </w:p>
     <w:p>
@@ -4748,8 +5892,13 @@
         <w:pStyle w:val="Titre4"/>
       </w:pPr>
       <w:r>
-        <w:t>Manager et MoneyBag</w:t>
-      </w:r>
+        <w:t xml:space="preserve">Manager et </w:t>
+      </w:r>
+      <w:proofErr w:type="spellStart"/>
+      <w:r>
+        <w:t>MoneyBag</w:t>
+      </w:r>
+      <w:proofErr w:type="spellEnd"/>
     </w:p>
     <w:p>
       <w:pPr>
@@ -4759,10 +5908,26 @@
         <w:t>Les Managers</w:t>
       </w:r>
       <w:r>
-        <w:t xml:space="preserve"> se déplace aléatoirement sur la map en trouvant une nouvelle destination lorsqu’il butte sur un mur ou arrive à leur destination. </w:t>
-      </w:r>
-      <w:r>
-        <w:t xml:space="preserve">Ils ont également une santé qui baisse quand ils sont trop proche d’un joueur en mode mêlée (La distance max est stockée dans le joueur). Il possède également un « loot » qui correspond à l’argent </w:t>
+        <w:t xml:space="preserve"> se déplace aléatoirement sur la </w:t>
+      </w:r>
+      <w:proofErr w:type="spellStart"/>
+      <w:r>
+        <w:t>map</w:t>
+      </w:r>
+      <w:proofErr w:type="spellEnd"/>
+      <w:r>
+        <w:t xml:space="preserve"> en trouvant une nouvelle destination lorsqu’il butte sur un mur ou arrive à leur destination. </w:t>
+      </w:r>
+      <w:r>
+        <w:t>Ils ont également une santé qui baisse quand ils sont trop proche d’un joueur en mode mêlée (La distance max est stockée dans le joueur). Il possède également un « </w:t>
+      </w:r>
+      <w:proofErr w:type="spellStart"/>
+      <w:r>
+        <w:t>loot</w:t>
+      </w:r>
+      <w:proofErr w:type="spellEnd"/>
+      <w:r>
+        <w:t xml:space="preserve"> » qui correspond à l’argent </w:t>
       </w:r>
       <w:r>
         <w:t>qu’ils font</w:t>
@@ -4780,7 +5945,23 @@
         <w:t xml:space="preserve"> </w:t>
       </w:r>
       <w:r>
-        <w:t>Ils peuvent également être de niveau différent. Lesquels dépend de l’argent du joueur. Le threshold est définis par BattleMap.</w:t>
+        <w:t xml:space="preserve">Ils peuvent également être de niveau différent. Lesquels dépend de l’argent du joueur. Le </w:t>
+      </w:r>
+      <w:proofErr w:type="spellStart"/>
+      <w:r>
+        <w:t>threshold</w:t>
+      </w:r>
+      <w:proofErr w:type="spellEnd"/>
+      <w:r>
+        <w:t xml:space="preserve"> est définis par </w:t>
+      </w:r>
+      <w:proofErr w:type="spellStart"/>
+      <w:r>
+        <w:t>BattleMap</w:t>
+      </w:r>
+      <w:proofErr w:type="spellEnd"/>
+      <w:r>
+        <w:t>.</w:t>
       </w:r>
     </w:p>
     <w:p>
@@ -4812,7 +5993,15 @@
         <w:t>placés</w:t>
       </w:r>
       <w:r>
-        <w:t xml:space="preserve"> dans leur liste dans BattleMap. Les sacs d’argent vont en direction que le joueur avait lorsqu’ils </w:t>
+        <w:t xml:space="preserve"> dans leur liste dans </w:t>
+      </w:r>
+      <w:proofErr w:type="spellStart"/>
+      <w:r>
+        <w:t>BattleMap</w:t>
+      </w:r>
+      <w:proofErr w:type="spellEnd"/>
+      <w:r>
+        <w:t xml:space="preserve">. Les sacs d’argent vont en direction que le joueur avait lorsqu’ils </w:t>
       </w:r>
       <w:r>
         <w:t>ont</w:t>
@@ -4827,8 +6016,13 @@
         <w:t>.</w:t>
       </w:r>
       <w:r>
-        <w:t xml:space="preserve"> Ils se détruise lorsqu’il arrive au bord de la map</w:t>
-      </w:r>
+        <w:t xml:space="preserve"> Ils se détruise lorsqu’il arrive au bord de la </w:t>
+      </w:r>
+      <w:proofErr w:type="spellStart"/>
+      <w:r>
+        <w:t>map</w:t>
+      </w:r>
+      <w:proofErr w:type="spellEnd"/>
       <w:r>
         <w:t>,</w:t>
       </w:r>
@@ -4852,14 +6046,24 @@
         <w:ind w:left="708"/>
       </w:pPr>
       <w:r>
-        <w:t xml:space="preserve">Les Robot se déplace sur la map en trouvant une nouvelle destination qui doit toujours être directement au-dessus/dessous/droite/gauche du joueur. </w:t>
+        <w:t xml:space="preserve">Les Robot se déplace sur la </w:t>
+      </w:r>
+      <w:proofErr w:type="spellStart"/>
+      <w:r>
+        <w:t>map</w:t>
+      </w:r>
+      <w:proofErr w:type="spellEnd"/>
+      <w:r>
+        <w:t xml:space="preserve"> en trouvant une nouvelle destination qui doit toujours être directement au-dessus/dessous/droite/gauche du joueur. </w:t>
       </w:r>
       <w:r>
         <w:t xml:space="preserve">Il trouve un nouveau point ou aller </w:t>
       </w:r>
+      <w:proofErr w:type="gramStart"/>
       <w:r>
         <w:t>si ils</w:t>
       </w:r>
+      <w:proofErr w:type="gramEnd"/>
       <w:r>
         <w:t xml:space="preserve"> butent sur un obstacle</w:t>
       </w:r>
@@ -4871,7 +6075,23 @@
       </w:r>
       <w:r>
         <w:lastRenderedPageBreak/>
-        <w:t xml:space="preserve">différent. Lesquels dépend de l’argent du joueur. Le threshold est définis par BattleMap. </w:t>
+        <w:t xml:space="preserve">différent. Lesquels dépend de l’argent du joueur. Le </w:t>
+      </w:r>
+      <w:proofErr w:type="spellStart"/>
+      <w:r>
+        <w:t>threshold</w:t>
+      </w:r>
+      <w:proofErr w:type="spellEnd"/>
+      <w:r>
+        <w:t xml:space="preserve"> est définis par </w:t>
+      </w:r>
+      <w:proofErr w:type="spellStart"/>
+      <w:r>
+        <w:t>BattleMap</w:t>
+      </w:r>
+      <w:proofErr w:type="spellEnd"/>
+      <w:r>
+        <w:t xml:space="preserve">. </w:t>
       </w:r>
     </w:p>
     <w:p>
@@ -4879,7 +6099,15 @@
         <w:ind w:left="708"/>
       </w:pPr>
       <w:r>
-        <w:t xml:space="preserve">Ils peuvent instancier des éléments de type « Faisceau » chaque certain temps (FIRE_RATE). Les faisceaux sont ensuite placés dans leur liste dans BattleMap. </w:t>
+        <w:t xml:space="preserve">Ils peuvent instancier des éléments de type « Faisceau » chaque certain temps (FIRE_RATE). Les faisceaux sont ensuite placés dans leur liste dans </w:t>
+      </w:r>
+      <w:proofErr w:type="spellStart"/>
+      <w:r>
+        <w:t>BattleMap</w:t>
+      </w:r>
+      <w:proofErr w:type="spellEnd"/>
+      <w:r>
+        <w:t xml:space="preserve">. </w:t>
       </w:r>
       <w:r>
         <w:t>Les faisceaux</w:t>
@@ -4894,7 +6122,15 @@
         <w:t xml:space="preserve"> ils ont donc une direction</w:t>
       </w:r>
       <w:r>
-        <w:t>. Ils se détruise lorsqu’il arrive au bord de la map, qu’ils butent sur un obstacle ou qu’il touche le joueur.</w:t>
+        <w:t xml:space="preserve">. Ils se détruise lorsqu’il arrive au bord de la </w:t>
+      </w:r>
+      <w:proofErr w:type="spellStart"/>
+      <w:r>
+        <w:t>map</w:t>
+      </w:r>
+      <w:proofErr w:type="spellEnd"/>
+      <w:r>
+        <w:t>, qu’ils butent sur un obstacle ou qu’il touche le joueur.</w:t>
       </w:r>
     </w:p>
     <w:p>
@@ -4915,7 +6151,15 @@
     </w:p>
     <w:p>
       <w:r>
-        <w:t>Voici une explication de tout mes chat avec l’IA :</w:t>
+        <w:t xml:space="preserve">Voici une explication de tout </w:t>
+      </w:r>
+      <w:proofErr w:type="gramStart"/>
+      <w:r>
+        <w:t>mes chat</w:t>
+      </w:r>
+      <w:proofErr w:type="gramEnd"/>
+      <w:r>
+        <w:t xml:space="preserve"> avec l’IA :</w:t>
       </w:r>
     </w:p>
     <w:p>
@@ -5000,7 +6244,15 @@
         <w:t>expliqué</w:t>
       </w:r>
       <w:r>
-        <w:t xml:space="preserve"> que mon MSTest tournait sur « </w:t>
+        <w:t xml:space="preserve"> que mon </w:t>
+      </w:r>
+      <w:proofErr w:type="spellStart"/>
+      <w:r>
+        <w:t>MSTest</w:t>
+      </w:r>
+      <w:proofErr w:type="spellEnd"/>
+      <w:r>
+        <w:t xml:space="preserve"> tournait sur « </w:t>
       </w:r>
       <w:r>
         <w:t>.NET Framework 4.7.2</w:t>
@@ -5018,7 +6270,15 @@
         <w:t xml:space="preserve">recréé ma solution avec la </w:t>
       </w:r>
       <w:r>
-        <w:t>bonne version de MSTest et mes tests on alors recommencer à fonctionner correctement.</w:t>
+        <w:t xml:space="preserve">bonne version de </w:t>
+      </w:r>
+      <w:proofErr w:type="spellStart"/>
+      <w:r>
+        <w:t>MSTest</w:t>
+      </w:r>
+      <w:proofErr w:type="spellEnd"/>
+      <w:r>
+        <w:t xml:space="preserve"> et mes tests on alors recommencer à fonctionner correctement.</w:t>
       </w:r>
     </w:p>
     <w:p>
@@ -5032,13 +6292,27 @@
         <w:rPr>
           <w:lang w:val="de-CH"/>
         </w:rPr>
-        <w:t>Chat numér</w:t>
-      </w:r>
+        <w:t xml:space="preserve">Chat </w:t>
+      </w:r>
+      <w:proofErr w:type="spellStart"/>
       <w:r>
         <w:rPr>
           <w:lang w:val="de-CH"/>
         </w:rPr>
-        <w:t>o 2:</w:t>
+        <w:t>numér</w:t>
+      </w:r>
+      <w:r>
+        <w:rPr>
+          <w:lang w:val="de-CH"/>
+        </w:rPr>
+        <w:t>o</w:t>
+      </w:r>
+      <w:proofErr w:type="spellEnd"/>
+      <w:r>
+        <w:rPr>
+          <w:lang w:val="de-CH"/>
+        </w:rPr>
+        <w:t xml:space="preserve"> 2:</w:t>
       </w:r>
     </w:p>
     <w:p>
@@ -5050,14 +6324,26 @@
           <w:lang w:val="de-CH"/>
         </w:rPr>
       </w:pPr>
+      <w:proofErr w:type="spellStart"/>
+      <w:proofErr w:type="gramStart"/>
       <w:r>
         <w:rPr>
           <w:b/>
           <w:bCs/>
           <w:lang w:val="de-CH"/>
         </w:rPr>
-        <w:t>Historique :</w:t>
-      </w:r>
+        <w:t>Historique</w:t>
+      </w:r>
+      <w:proofErr w:type="spellEnd"/>
+      <w:r>
+        <w:rPr>
+          <w:b/>
+          <w:bCs/>
+          <w:lang w:val="de-CH"/>
+        </w:rPr>
+        <w:t xml:space="preserve"> :</w:t>
+      </w:r>
+      <w:proofErr w:type="gramEnd"/>
     </w:p>
     <w:p>
       <w:pPr>
@@ -5116,13 +6402,23 @@
           <w:lang w:val="de-CH"/>
         </w:rPr>
       </w:pPr>
+      <w:proofErr w:type="spellStart"/>
       <w:r>
         <w:rPr>
           <w:b/>
           <w:bCs/>
           <w:lang w:val="de-CH"/>
         </w:rPr>
-        <w:t>Contexte:</w:t>
+        <w:t>Contexte</w:t>
+      </w:r>
+      <w:proofErr w:type="spellEnd"/>
+      <w:r>
+        <w:rPr>
+          <w:b/>
+          <w:bCs/>
+          <w:lang w:val="de-CH"/>
+        </w:rPr>
+        <w:t>:</w:t>
       </w:r>
     </w:p>
     <w:p>
@@ -5130,13 +6426,29 @@
         <w:ind w:left="708"/>
       </w:pPr>
       <w:r>
-        <w:t>J’essayais de pinpoint la r</w:t>
+        <w:t xml:space="preserve">J’essayais de </w:t>
+      </w:r>
+      <w:proofErr w:type="spellStart"/>
+      <w:r>
+        <w:t>pinpoint</w:t>
+      </w:r>
+      <w:proofErr w:type="spellEnd"/>
+      <w:r>
+        <w:t xml:space="preserve"> la r</w:t>
       </w:r>
       <w:r>
         <w:t xml:space="preserve">aison d’un bug dans mes tests. Pour une raison que je ne comprenais pas, certains tests était valide </w:t>
       </w:r>
       <w:r>
-        <w:t xml:space="preserve">lors d’une execution </w:t>
+        <w:t xml:space="preserve">lors d’une </w:t>
+      </w:r>
+      <w:proofErr w:type="spellStart"/>
+      <w:r>
+        <w:t>execution</w:t>
+      </w:r>
+      <w:proofErr w:type="spellEnd"/>
+      <w:r>
+        <w:t xml:space="preserve"> </w:t>
       </w:r>
       <w:r>
         <w:t>et arrêtait de l’être ensuite. Claude m’a expliqué que la raison était que tous mes tests essay</w:t>
@@ -5145,7 +6457,23 @@
         <w:t>aient</w:t>
       </w:r>
       <w:r>
-        <w:t xml:space="preserve"> de lire et d’écrire dans la classe static BattleMap au même moment. La solution </w:t>
+        <w:t xml:space="preserve"> de lire et d’écrire dans la classe </w:t>
+      </w:r>
+      <w:proofErr w:type="spellStart"/>
+      <w:r>
+        <w:t>static</w:t>
+      </w:r>
+      <w:proofErr w:type="spellEnd"/>
+      <w:r>
+        <w:t xml:space="preserve"> </w:t>
+      </w:r>
+      <w:proofErr w:type="spellStart"/>
+      <w:r>
+        <w:t>BattleMap</w:t>
+      </w:r>
+      <w:proofErr w:type="spellEnd"/>
+      <w:r>
+        <w:t xml:space="preserve"> au même moment. La solution </w:t>
       </w:r>
       <w:r>
         <w:t>a</w:t>
@@ -5153,9 +6481,11 @@
       <w:r>
         <w:t xml:space="preserve"> été de désactiver le parallélisme des tests en allant dans le fichier </w:t>
       </w:r>
+      <w:proofErr w:type="spellStart"/>
       <w:r>
         <w:t>MSTestSettings.cs</w:t>
       </w:r>
+      <w:proofErr w:type="spellEnd"/>
       <w:r>
         <w:t xml:space="preserve"> et en modifiant la 1</w:t>
       </w:r>
@@ -5169,7 +6499,20 @@
         <w:t xml:space="preserve"> ligne en </w:t>
       </w:r>
       <w:r>
-        <w:t>[assembly: DoNotParallelize]</w:t>
+        <w:t>[</w:t>
+      </w:r>
+      <w:proofErr w:type="spellStart"/>
+      <w:proofErr w:type="gramStart"/>
+      <w:r>
+        <w:t>assembly</w:t>
+      </w:r>
+      <w:proofErr w:type="spellEnd"/>
+      <w:r>
+        <w:t>:</w:t>
+      </w:r>
+      <w:proofErr w:type="gramEnd"/>
+      <w:r>
+        <w:t xml:space="preserve"> DoNotParallelize]</w:t>
       </w:r>
       <w:r>
         <w:t>.</w:t>
@@ -5178,7 +6521,15 @@
         <w:t xml:space="preserve"> Il a aussi fallu ajouter une méthode </w:t>
       </w:r>
       <w:r>
-        <w:t>[TestInitialize]</w:t>
+        <w:t>[</w:t>
+      </w:r>
+      <w:proofErr w:type="spellStart"/>
+      <w:r>
+        <w:t>TestInitialize</w:t>
+      </w:r>
+      <w:proofErr w:type="spellEnd"/>
+      <w:r>
+        <w:t>]</w:t>
       </w:r>
       <w:r>
         <w:t xml:space="preserve"> pour faire table rase du test</w:t>
@@ -5273,9 +6624,11 @@
       <w:r>
         <w:t xml:space="preserve">Lors de la création du diagramme de classe, j’ai fait le premier à la main puis j’ai donner tout mon code à </w:t>
       </w:r>
+      <w:proofErr w:type="spellStart"/>
       <w:r>
         <w:t>claude</w:t>
       </w:r>
+      <w:proofErr w:type="spellEnd"/>
       <w:r>
         <w:t xml:space="preserve"> et </w:t>
       </w:r>
@@ -5340,6 +6693,684 @@
     </w:p>
     <w:p>
       <w:pPr>
+        <w:pStyle w:val="Titre3"/>
+      </w:pPr>
+      <w:r>
+        <w:t>Critique de mon planning</w:t>
+      </w:r>
+    </w:p>
+    <w:tbl>
+      <w:tblPr>
+        <w:tblStyle w:val="Grilledutableau"/>
+        <w:tblW w:w="0" w:type="auto"/>
+        <w:tblLook w:val="04A0" w:firstRow="1" w:lastRow="0" w:firstColumn="1" w:lastColumn="0" w:noHBand="0" w:noVBand="1"/>
+      </w:tblPr>
+      <w:tblGrid>
+        <w:gridCol w:w="1724"/>
+        <w:gridCol w:w="1957"/>
+        <w:gridCol w:w="5381"/>
+      </w:tblGrid>
+      <w:tr>
+        <w:tc>
+          <w:tcPr>
+            <w:tcW w:w="1724" w:type="dxa"/>
+          </w:tcPr>
+          <w:p>
+            <w:pPr>
+              <w:rPr>
+                <w:b/>
+                <w:bCs/>
+              </w:rPr>
+            </w:pPr>
+            <w:r>
+              <w:rPr>
+                <w:b/>
+                <w:bCs/>
+              </w:rPr>
+              <w:t>Date de fin prévu de la tâche</w:t>
+            </w:r>
+          </w:p>
+        </w:tc>
+        <w:tc>
+          <w:tcPr>
+            <w:tcW w:w="1957" w:type="dxa"/>
+          </w:tcPr>
+          <w:p>
+            <w:pPr>
+              <w:rPr>
+                <w:b/>
+                <w:bCs/>
+              </w:rPr>
+            </w:pPr>
+            <w:r>
+              <w:rPr>
+                <w:b/>
+                <w:bCs/>
+              </w:rPr>
+              <w:t>Date de fin réel de la tâche</w:t>
+            </w:r>
+          </w:p>
+        </w:tc>
+        <w:tc>
+          <w:tcPr>
+            <w:tcW w:w="5381" w:type="dxa"/>
+          </w:tcPr>
+          <w:p>
+            <w:pPr>
+              <w:rPr>
+                <w:b/>
+                <w:bCs/>
+              </w:rPr>
+            </w:pPr>
+            <w:r>
+              <w:rPr>
+                <w:b/>
+                <w:bCs/>
+              </w:rPr>
+              <w:t>Tâche</w:t>
+            </w:r>
+            <w:r>
+              <w:rPr>
+                <w:b/>
+                <w:bCs/>
+              </w:rPr>
+              <w:t xml:space="preserve"> à faire (lien vers leurs User Stories)</w:t>
+            </w:r>
+          </w:p>
+        </w:tc>
+      </w:tr>
+      <w:tr>
+        <w:tc>
+          <w:tcPr>
+            <w:tcW w:w="1724" w:type="dxa"/>
+          </w:tcPr>
+          <w:p>
+            <w:r>
+              <w:t>18.09.2026</w:t>
+            </w:r>
+          </w:p>
+        </w:tc>
+        <w:tc>
+          <w:tcPr>
+            <w:tcW w:w="1957" w:type="dxa"/>
+          </w:tcPr>
+          <w:p>
+            <w:r>
+              <w:t>18.09.2026</w:t>
+            </w:r>
+          </w:p>
+        </w:tc>
+        <w:tc>
+          <w:tcPr>
+            <w:tcW w:w="5381" w:type="dxa"/>
+          </w:tcPr>
+          <w:p>
+            <w:hyperlink r:id="rId34" w:history="1">
+              <w:r>
+                <w:rPr>
+                  <w:rStyle w:val="Lienhypertexte"/>
+                </w:rPr>
+                <w:t>Ajout du mouvement WASD</w:t>
+              </w:r>
+            </w:hyperlink>
+          </w:p>
+        </w:tc>
+      </w:tr>
+      <w:tr>
+        <w:tc>
+          <w:tcPr>
+            <w:tcW w:w="1724" w:type="dxa"/>
+          </w:tcPr>
+          <w:p>
+            <w:r>
+              <w:t>18.09.2026</w:t>
+            </w:r>
+          </w:p>
+        </w:tc>
+        <w:tc>
+          <w:tcPr>
+            <w:tcW w:w="1957" w:type="dxa"/>
+          </w:tcPr>
+          <w:p>
+            <w:r>
+              <w:t>25.09.2026</w:t>
+            </w:r>
+          </w:p>
+        </w:tc>
+        <w:tc>
+          <w:tcPr>
+            <w:tcW w:w="5381" w:type="dxa"/>
+          </w:tcPr>
+          <w:p>
+            <w:hyperlink r:id="rId35" w:history="1">
+              <w:proofErr w:type="gramStart"/>
+              <w:r>
+                <w:rPr>
+                  <w:rStyle w:val="Lienhypertexte"/>
+                </w:rPr>
+                <w:t>pouvoir</w:t>
+              </w:r>
+              <w:proofErr w:type="gramEnd"/>
+              <w:r>
+                <w:rPr>
+                  <w:rStyle w:val="Lienhypertexte"/>
+                </w:rPr>
+                <w:t xml:space="preserve"> tirer </w:t>
+              </w:r>
+              <w:proofErr w:type="gramStart"/>
+              <w:r>
+                <w:rPr>
+                  <w:rStyle w:val="Lienhypertexte"/>
+                </w:rPr>
+                <w:t>des projectile</w:t>
+              </w:r>
+              <w:proofErr w:type="gramEnd"/>
+              <w:r>
+                <w:rPr>
+                  <w:rStyle w:val="Lienhypertexte"/>
+                </w:rPr>
+                <w:t xml:space="preserve"> sur mes </w:t>
+              </w:r>
+              <w:proofErr w:type="spellStart"/>
+              <w:r>
+                <w:rPr>
+                  <w:rStyle w:val="Lienhypertexte"/>
+                </w:rPr>
+                <w:t>enemies</w:t>
+              </w:r>
+              <w:proofErr w:type="spellEnd"/>
+            </w:hyperlink>
+          </w:p>
+        </w:tc>
+      </w:tr>
+      <w:tr>
+        <w:tc>
+          <w:tcPr>
+            <w:tcW w:w="1724" w:type="dxa"/>
+          </w:tcPr>
+          <w:p>
+            <w:r>
+              <w:t>25.09.2026</w:t>
+            </w:r>
+          </w:p>
+        </w:tc>
+        <w:tc>
+          <w:tcPr>
+            <w:tcW w:w="1957" w:type="dxa"/>
+          </w:tcPr>
+          <w:p>
+            <w:r>
+              <w:t>25.09.2026</w:t>
+            </w:r>
+          </w:p>
+        </w:tc>
+        <w:tc>
+          <w:tcPr>
+            <w:tcW w:w="5381" w:type="dxa"/>
+          </w:tcPr>
+          <w:p>
+            <w:hyperlink r:id="rId36" w:history="1">
+              <w:proofErr w:type="gramStart"/>
+              <w:r>
+                <w:rPr>
+                  <w:rStyle w:val="Lienhypertexte"/>
+                </w:rPr>
+                <w:t>pouvoir</w:t>
+              </w:r>
+              <w:proofErr w:type="gramEnd"/>
+              <w:r>
+                <w:rPr>
+                  <w:rStyle w:val="Lienhypertexte"/>
+                </w:rPr>
+                <w:t xml:space="preserve"> faire des </w:t>
+              </w:r>
+              <w:proofErr w:type="spellStart"/>
+              <w:r>
+                <w:rPr>
+                  <w:rStyle w:val="Lienhypertexte"/>
+                </w:rPr>
+                <w:t>degats</w:t>
+              </w:r>
+              <w:proofErr w:type="spellEnd"/>
+              <w:r>
+                <w:rPr>
+                  <w:rStyle w:val="Lienhypertexte"/>
+                </w:rPr>
+                <w:t xml:space="preserve"> </w:t>
+              </w:r>
+              <w:proofErr w:type="gramStart"/>
+              <w:r>
+                <w:rPr>
+                  <w:rStyle w:val="Lienhypertexte"/>
+                </w:rPr>
+                <w:t>au corp</w:t>
+              </w:r>
+              <w:proofErr w:type="gramEnd"/>
+              <w:r>
+                <w:rPr>
+                  <w:rStyle w:val="Lienhypertexte"/>
+                </w:rPr>
+                <w:t xml:space="preserve"> à corp</w:t>
+              </w:r>
+            </w:hyperlink>
+          </w:p>
+        </w:tc>
+      </w:tr>
+      <w:tr>
+        <w:tc>
+          <w:tcPr>
+            <w:tcW w:w="1724" w:type="dxa"/>
+          </w:tcPr>
+          <w:p>
+            <w:r>
+              <w:t>25.09.2026</w:t>
+            </w:r>
+          </w:p>
+        </w:tc>
+        <w:tc>
+          <w:tcPr>
+            <w:tcW w:w="1957" w:type="dxa"/>
+          </w:tcPr>
+          <w:p>
+            <w:r>
+              <w:t>02.10.2026</w:t>
+            </w:r>
+          </w:p>
+        </w:tc>
+        <w:tc>
+          <w:tcPr>
+            <w:tcW w:w="5381" w:type="dxa"/>
+          </w:tcPr>
+          <w:p>
+            <w:hyperlink r:id="rId37" w:history="1">
+              <w:r>
+                <w:rPr>
+                  <w:rStyle w:val="Lienhypertexte"/>
+                </w:rPr>
+                <w:t>Ajouter un compteur de PV</w:t>
+              </w:r>
+            </w:hyperlink>
+          </w:p>
+        </w:tc>
+      </w:tr>
+      <w:tr>
+        <w:tc>
+          <w:tcPr>
+            <w:tcW w:w="1724" w:type="dxa"/>
+          </w:tcPr>
+          <w:p>
+            <w:r>
+              <w:t>25.09.2026</w:t>
+            </w:r>
+          </w:p>
+        </w:tc>
+        <w:tc>
+          <w:tcPr>
+            <w:tcW w:w="1957" w:type="dxa"/>
+          </w:tcPr>
+          <w:p>
+            <w:r>
+              <w:t>02.10.2026</w:t>
+            </w:r>
+          </w:p>
+        </w:tc>
+        <w:tc>
+          <w:tcPr>
+            <w:tcW w:w="5381" w:type="dxa"/>
+          </w:tcPr>
+          <w:p>
+            <w:hyperlink r:id="rId38" w:history="1">
+              <w:r>
+                <w:rPr>
+                  <w:rStyle w:val="Lienhypertexte"/>
+                </w:rPr>
+                <w:t>Ajouter un compteur d’argent</w:t>
+              </w:r>
+            </w:hyperlink>
+          </w:p>
+        </w:tc>
+      </w:tr>
+      <w:tr>
+        <w:tc>
+          <w:tcPr>
+            <w:tcW w:w="1724" w:type="dxa"/>
+          </w:tcPr>
+          <w:p>
+            <w:r>
+              <w:t>02.10.2026</w:t>
+            </w:r>
+          </w:p>
+        </w:tc>
+        <w:tc>
+          <w:tcPr>
+            <w:tcW w:w="1957" w:type="dxa"/>
+          </w:tcPr>
+          <w:p>
+            <w:r>
+              <w:t>02.10.2026</w:t>
+            </w:r>
+          </w:p>
+        </w:tc>
+        <w:tc>
+          <w:tcPr>
+            <w:tcW w:w="5381" w:type="dxa"/>
+          </w:tcPr>
+          <w:p>
+            <w:hyperlink r:id="rId39" w:history="1">
+              <w:r>
+                <w:rPr>
+                  <w:rStyle w:val="Lienhypertexte"/>
+                </w:rPr>
+                <w:t>Créer des ennemies de type manager</w:t>
+              </w:r>
+            </w:hyperlink>
+          </w:p>
+        </w:tc>
+      </w:tr>
+      <w:tr>
+        <w:tc>
+          <w:tcPr>
+            <w:tcW w:w="1724" w:type="dxa"/>
+          </w:tcPr>
+          <w:p>
+            <w:r>
+              <w:t>02.10.2026</w:t>
+            </w:r>
+          </w:p>
+        </w:tc>
+        <w:tc>
+          <w:tcPr>
+            <w:tcW w:w="1957" w:type="dxa"/>
+          </w:tcPr>
+          <w:p>
+            <w:r>
+              <w:t>02.10.2026</w:t>
+            </w:r>
+          </w:p>
+        </w:tc>
+        <w:tc>
+          <w:tcPr>
+            <w:tcW w:w="5381" w:type="dxa"/>
+          </w:tcPr>
+          <w:p>
+            <w:hyperlink r:id="rId40" w:history="1">
+              <w:r>
+                <w:rPr>
+                  <w:rStyle w:val="Lienhypertexte"/>
+                </w:rPr>
+                <w:t>Créer les projectiles des managers</w:t>
+              </w:r>
+            </w:hyperlink>
+          </w:p>
+        </w:tc>
+      </w:tr>
+      <w:tr>
+        <w:tc>
+          <w:tcPr>
+            <w:tcW w:w="1724" w:type="dxa"/>
+          </w:tcPr>
+          <w:p>
+            <w:r>
+              <w:t>09.10.2026</w:t>
+            </w:r>
+          </w:p>
+        </w:tc>
+        <w:tc>
+          <w:tcPr>
+            <w:tcW w:w="1957" w:type="dxa"/>
+          </w:tcPr>
+          <w:p>
+            <w:r>
+              <w:t>09.10.2026</w:t>
+            </w:r>
+          </w:p>
+        </w:tc>
+        <w:tc>
+          <w:tcPr>
+            <w:tcW w:w="5381" w:type="dxa"/>
+          </w:tcPr>
+          <w:p>
+            <w:hyperlink r:id="rId41" w:history="1">
+              <w:r>
+                <w:rPr>
+                  <w:rStyle w:val="Lienhypertexte"/>
+                </w:rPr>
+                <w:t>Créer des ennemies de type robot</w:t>
+              </w:r>
+            </w:hyperlink>
+          </w:p>
+        </w:tc>
+      </w:tr>
+      <w:tr>
+        <w:tc>
+          <w:tcPr>
+            <w:tcW w:w="1724" w:type="dxa"/>
+          </w:tcPr>
+          <w:p>
+            <w:r>
+              <w:t>30.10.2026</w:t>
+            </w:r>
+          </w:p>
+        </w:tc>
+        <w:tc>
+          <w:tcPr>
+            <w:tcW w:w="1957" w:type="dxa"/>
+          </w:tcPr>
+          <w:p>
+            <w:r>
+              <w:t>09.10.2026</w:t>
+            </w:r>
+          </w:p>
+        </w:tc>
+        <w:tc>
+          <w:tcPr>
+            <w:tcW w:w="5381" w:type="dxa"/>
+          </w:tcPr>
+          <w:p>
+            <w:hyperlink r:id="rId42" w:history="1">
+              <w:r>
+                <w:rPr>
+                  <w:rStyle w:val="Lienhypertexte"/>
+                </w:rPr>
+                <w:t>Créer les projectiles des robots</w:t>
+              </w:r>
+            </w:hyperlink>
+          </w:p>
+        </w:tc>
+      </w:tr>
+      <w:tr>
+        <w:tc>
+          <w:tcPr>
+            <w:tcW w:w="1724" w:type="dxa"/>
+          </w:tcPr>
+          <w:p>
+            <w:r>
+              <w:t>30.10.2026</w:t>
+            </w:r>
+          </w:p>
+        </w:tc>
+        <w:tc>
+          <w:tcPr>
+            <w:tcW w:w="1957" w:type="dxa"/>
+          </w:tcPr>
+          <w:p>
+            <w:r>
+              <w:t>23.10.2026</w:t>
+            </w:r>
+          </w:p>
+        </w:tc>
+        <w:tc>
+          <w:tcPr>
+            <w:tcW w:w="5381" w:type="dxa"/>
+          </w:tcPr>
+          <w:p>
+            <w:hyperlink r:id="rId43" w:history="1">
+              <w:r>
+                <w:rPr>
+                  <w:rStyle w:val="Lienhypertexte"/>
+                </w:rPr>
+                <w:t>Créer les obstacles</w:t>
+              </w:r>
+            </w:hyperlink>
+          </w:p>
+        </w:tc>
+      </w:tr>
+    </w:tbl>
+    <w:p>
+      <w:r>
+        <w:t>Comme vous pouvez le voir, toutes les tâches ont été compléter avec une marge d’une semaine par rapport à ce qui était prévu.</w:t>
+      </w:r>
+    </w:p>
+    <w:p>
+      <w:pPr>
+        <w:pStyle w:val="Titre3"/>
+      </w:pPr>
+      <w:r>
+        <w:t>Problème rencontré</w:t>
+      </w:r>
+    </w:p>
+    <w:p>
+      <w:pPr>
+        <w:pStyle w:val="Paragraphedeliste"/>
+        <w:numPr>
+          <w:ilvl w:val="0"/>
+          <w:numId w:val="5"/>
+        </w:numPr>
+      </w:pPr>
+      <w:r>
+        <w:t>Les ennemis de type manager ont été ajoutée avant le compteur de PV et le compteur d’argent</w:t>
+      </w:r>
+      <w:r>
+        <w:t xml:space="preserve"> contrairement au planning</w:t>
+      </w:r>
+      <w:r>
+        <w:t xml:space="preserve">. J’ai </w:t>
+      </w:r>
+      <w:r>
+        <w:t>réalisé</w:t>
+      </w:r>
+      <w:r>
+        <w:t xml:space="preserve"> que c’était plus logique car il fallait bien quelque chose qui me tirait dessus pour pouvoir perdre des PV.</w:t>
+      </w:r>
+    </w:p>
+    <w:p>
+      <w:pPr>
+        <w:pStyle w:val="Paragraphedeliste"/>
+        <w:numPr>
+          <w:ilvl w:val="0"/>
+          <w:numId w:val="5"/>
+        </w:numPr>
+      </w:pPr>
+      <w:r>
+        <w:t xml:space="preserve">J’ai eu </w:t>
+      </w:r>
+      <w:r>
+        <w:t>plusieurs problèmes</w:t>
+      </w:r>
+      <w:r>
+        <w:t xml:space="preserve"> avec les tests </w:t>
+      </w:r>
+      <w:r>
+        <w:t>dû</w:t>
+      </w:r>
+      <w:r>
+        <w:t xml:space="preserve"> à la version du </w:t>
+      </w:r>
+      <w:proofErr w:type="spellStart"/>
+      <w:r>
+        <w:t>frameWork</w:t>
+      </w:r>
+      <w:proofErr w:type="spellEnd"/>
+      <w:r>
+        <w:t xml:space="preserve"> et au parallélisme comme expliquer au chapitre « Utilisation de l’IA -&gt; Chat numéro </w:t>
+      </w:r>
+      <w:r>
+        <w:t>1</w:t>
+      </w:r>
+      <w:r>
+        <w:t> »</w:t>
+      </w:r>
+      <w:r>
+        <w:t xml:space="preserve"> et </w:t>
+      </w:r>
+      <w:r>
+        <w:t xml:space="preserve">« Utilisation de l’IA -&gt; Chat numéro </w:t>
+      </w:r>
+      <w:r>
+        <w:t>2</w:t>
+      </w:r>
+      <w:r>
+        <w:t> »</w:t>
+      </w:r>
+      <w:r>
+        <w:t>.</w:t>
+      </w:r>
+    </w:p>
+    <w:p>
+      <w:pPr>
+        <w:pStyle w:val="Paragraphedeliste"/>
+        <w:numPr>
+          <w:ilvl w:val="0"/>
+          <w:numId w:val="5"/>
+        </w:numPr>
+      </w:pPr>
+      <w:r>
+        <w:t xml:space="preserve">J’ai eu des problèmes avec la détection des touches du clavier et de la souris. J’ai cherché un peu partout dans le projet avant de trouver le fichier </w:t>
+      </w:r>
+      <w:proofErr w:type="spellStart"/>
+      <w:r>
+        <w:t>BattleMap.Designer.cs</w:t>
+      </w:r>
+      <w:proofErr w:type="spellEnd"/>
+      <w:r>
+        <w:t xml:space="preserve"> contenant </w:t>
+      </w:r>
+      <w:proofErr w:type="spellStart"/>
+      <w:r>
+        <w:t>KeyUp</w:t>
+      </w:r>
+      <w:proofErr w:type="spellEnd"/>
+      <w:r>
+        <w:t xml:space="preserve"> </w:t>
+      </w:r>
+      <w:r>
+        <w:t xml:space="preserve">et </w:t>
+      </w:r>
+      <w:proofErr w:type="spellStart"/>
+      <w:r>
+        <w:t>KeyDown</w:t>
+      </w:r>
+      <w:proofErr w:type="spellEnd"/>
+      <w:r>
+        <w:t>.</w:t>
+      </w:r>
+    </w:p>
+    <w:p>
+      <w:pPr>
+        <w:pStyle w:val="Paragraphedeliste"/>
+        <w:numPr>
+          <w:ilvl w:val="0"/>
+          <w:numId w:val="5"/>
+        </w:numPr>
+      </w:pPr>
+      <w:r>
+        <w:t xml:space="preserve">J’ai eu des problèmes avec le fait de faire tourner les faisceaux des robots. Un collègue m’est venu en aide en me montrant </w:t>
+      </w:r>
+      <w:proofErr w:type="gramStart"/>
+      <w:r>
+        <w:t>un technique</w:t>
+      </w:r>
+      <w:proofErr w:type="gramEnd"/>
+      <w:r>
+        <w:t xml:space="preserve"> consistant à faire </w:t>
+      </w:r>
+      <w:r>
+        <w:lastRenderedPageBreak/>
+        <w:t>tourner non pas l’objet mais le monde autour de lui pour donner l’impression qu’il était tourné.</w:t>
+      </w:r>
+    </w:p>
+    <w:p>
+      <w:pPr>
         <w:pStyle w:val="Titre2"/>
       </w:pPr>
       <w:bookmarkStart w:id="26" w:name="_Toc244258349"/>
@@ -5348,6 +7379,433 @@
       </w:r>
       <w:bookmarkEnd w:id="26"/>
     </w:p>
+    <w:tbl>
+      <w:tblPr>
+        <w:tblStyle w:val="Grilledutableau"/>
+        <w:tblW w:w="0" w:type="auto"/>
+        <w:tblLook w:val="04A0" w:firstRow="1" w:lastRow="0" w:firstColumn="1" w:lastColumn="0" w:noHBand="0" w:noVBand="1"/>
+      </w:tblPr>
+      <w:tblGrid>
+        <w:gridCol w:w="1724"/>
+        <w:gridCol w:w="5381"/>
+      </w:tblGrid>
+      <w:tr>
+        <w:tc>
+          <w:tcPr>
+            <w:tcW w:w="1724" w:type="dxa"/>
+          </w:tcPr>
+          <w:p>
+            <w:pPr>
+              <w:rPr>
+                <w:b/>
+                <w:bCs/>
+              </w:rPr>
+            </w:pPr>
+            <w:r>
+              <w:rPr>
+                <w:b/>
+                <w:bCs/>
+              </w:rPr>
+              <w:t>Finis ou non</w:t>
+            </w:r>
+          </w:p>
+        </w:tc>
+        <w:tc>
+          <w:tcPr>
+            <w:tcW w:w="5381" w:type="dxa"/>
+          </w:tcPr>
+          <w:p>
+            <w:pPr>
+              <w:rPr>
+                <w:b/>
+                <w:bCs/>
+              </w:rPr>
+            </w:pPr>
+            <w:r>
+              <w:rPr>
+                <w:b/>
+                <w:bCs/>
+              </w:rPr>
+              <w:t>Tâche</w:t>
+            </w:r>
+            <w:r>
+              <w:rPr>
+                <w:b/>
+                <w:bCs/>
+              </w:rPr>
+              <w:t xml:space="preserve"> à faire (lien vers leurs User Stories)</w:t>
+            </w:r>
+          </w:p>
+        </w:tc>
+      </w:tr>
+      <w:tr>
+        <w:tc>
+          <w:tcPr>
+            <w:tcW w:w="1724" w:type="dxa"/>
+            <w:shd w:val="clear" w:color="auto" w:fill="C1F0C7" w:themeFill="accent3" w:themeFillTint="33"/>
+          </w:tcPr>
+          <w:p>
+            <w:r>
+              <w:t>OUI</w:t>
+            </w:r>
+          </w:p>
+        </w:tc>
+        <w:tc>
+          <w:tcPr>
+            <w:tcW w:w="5381" w:type="dxa"/>
+            <w:shd w:val="clear" w:color="auto" w:fill="C1F0C7" w:themeFill="accent3" w:themeFillTint="33"/>
+          </w:tcPr>
+          <w:p>
+            <w:hyperlink r:id="rId44" w:history="1">
+              <w:r>
+                <w:rPr>
+                  <w:rStyle w:val="Lienhypertexte"/>
+                </w:rPr>
+                <w:t>Ajout du mouvement WASD</w:t>
+              </w:r>
+            </w:hyperlink>
+          </w:p>
+        </w:tc>
+      </w:tr>
+      <w:tr>
+        <w:tc>
+          <w:tcPr>
+            <w:tcW w:w="1724" w:type="dxa"/>
+            <w:shd w:val="clear" w:color="auto" w:fill="C1F0C7" w:themeFill="accent3" w:themeFillTint="33"/>
+          </w:tcPr>
+          <w:p>
+            <w:r>
+              <w:t>OUI</w:t>
+            </w:r>
+          </w:p>
+        </w:tc>
+        <w:tc>
+          <w:tcPr>
+            <w:tcW w:w="5381" w:type="dxa"/>
+            <w:shd w:val="clear" w:color="auto" w:fill="C1F0C7" w:themeFill="accent3" w:themeFillTint="33"/>
+          </w:tcPr>
+          <w:p>
+            <w:hyperlink r:id="rId45" w:history="1">
+              <w:proofErr w:type="gramStart"/>
+              <w:r>
+                <w:rPr>
+                  <w:rStyle w:val="Lienhypertexte"/>
+                </w:rPr>
+                <w:t>pouvoir</w:t>
+              </w:r>
+              <w:proofErr w:type="gramEnd"/>
+              <w:r>
+                <w:rPr>
+                  <w:rStyle w:val="Lienhypertexte"/>
+                </w:rPr>
+                <w:t xml:space="preserve"> tirer </w:t>
+              </w:r>
+              <w:proofErr w:type="gramStart"/>
+              <w:r>
+                <w:rPr>
+                  <w:rStyle w:val="Lienhypertexte"/>
+                </w:rPr>
+                <w:t>des projectile</w:t>
+              </w:r>
+              <w:proofErr w:type="gramEnd"/>
+              <w:r>
+                <w:rPr>
+                  <w:rStyle w:val="Lienhypertexte"/>
+                </w:rPr>
+                <w:t xml:space="preserve"> sur mes </w:t>
+              </w:r>
+              <w:proofErr w:type="spellStart"/>
+              <w:r>
+                <w:rPr>
+                  <w:rStyle w:val="Lienhypertexte"/>
+                </w:rPr>
+                <w:t>enemies</w:t>
+              </w:r>
+              <w:proofErr w:type="spellEnd"/>
+            </w:hyperlink>
+          </w:p>
+        </w:tc>
+      </w:tr>
+      <w:tr>
+        <w:tc>
+          <w:tcPr>
+            <w:tcW w:w="1724" w:type="dxa"/>
+            <w:shd w:val="clear" w:color="auto" w:fill="C1F0C7" w:themeFill="accent3" w:themeFillTint="33"/>
+          </w:tcPr>
+          <w:p>
+            <w:r>
+              <w:t>OUI</w:t>
+            </w:r>
+          </w:p>
+        </w:tc>
+        <w:tc>
+          <w:tcPr>
+            <w:tcW w:w="5381" w:type="dxa"/>
+            <w:shd w:val="clear" w:color="auto" w:fill="C1F0C7" w:themeFill="accent3" w:themeFillTint="33"/>
+          </w:tcPr>
+          <w:p>
+            <w:hyperlink r:id="rId46" w:history="1">
+              <w:proofErr w:type="gramStart"/>
+              <w:r>
+                <w:rPr>
+                  <w:rStyle w:val="Lienhypertexte"/>
+                </w:rPr>
+                <w:t>pouvoir</w:t>
+              </w:r>
+              <w:proofErr w:type="gramEnd"/>
+              <w:r>
+                <w:rPr>
+                  <w:rStyle w:val="Lienhypertexte"/>
+                </w:rPr>
+                <w:t xml:space="preserve"> faire des </w:t>
+              </w:r>
+              <w:proofErr w:type="spellStart"/>
+              <w:r>
+                <w:rPr>
+                  <w:rStyle w:val="Lienhypertexte"/>
+                </w:rPr>
+                <w:t>degats</w:t>
+              </w:r>
+              <w:proofErr w:type="spellEnd"/>
+              <w:r>
+                <w:rPr>
+                  <w:rStyle w:val="Lienhypertexte"/>
+                </w:rPr>
+                <w:t xml:space="preserve"> </w:t>
+              </w:r>
+              <w:proofErr w:type="gramStart"/>
+              <w:r>
+                <w:rPr>
+                  <w:rStyle w:val="Lienhypertexte"/>
+                </w:rPr>
+                <w:t>au corp</w:t>
+              </w:r>
+              <w:proofErr w:type="gramEnd"/>
+              <w:r>
+                <w:rPr>
+                  <w:rStyle w:val="Lienhypertexte"/>
+                </w:rPr>
+                <w:t xml:space="preserve"> à corp</w:t>
+              </w:r>
+            </w:hyperlink>
+          </w:p>
+        </w:tc>
+      </w:tr>
+      <w:tr>
+        <w:tc>
+          <w:tcPr>
+            <w:tcW w:w="1724" w:type="dxa"/>
+            <w:shd w:val="clear" w:color="auto" w:fill="C1F0C7" w:themeFill="accent3" w:themeFillTint="33"/>
+          </w:tcPr>
+          <w:p>
+            <w:r>
+              <w:t>OUI</w:t>
+            </w:r>
+          </w:p>
+        </w:tc>
+        <w:tc>
+          <w:tcPr>
+            <w:tcW w:w="5381" w:type="dxa"/>
+            <w:shd w:val="clear" w:color="auto" w:fill="C1F0C7" w:themeFill="accent3" w:themeFillTint="33"/>
+          </w:tcPr>
+          <w:p>
+            <w:hyperlink r:id="rId47" w:history="1">
+              <w:r>
+                <w:rPr>
+                  <w:rStyle w:val="Lienhypertexte"/>
+                </w:rPr>
+                <w:t>Ajouter un compteur de PV</w:t>
+              </w:r>
+            </w:hyperlink>
+          </w:p>
+        </w:tc>
+      </w:tr>
+      <w:tr>
+        <w:tc>
+          <w:tcPr>
+            <w:tcW w:w="1724" w:type="dxa"/>
+            <w:shd w:val="clear" w:color="auto" w:fill="C1F0C7" w:themeFill="accent3" w:themeFillTint="33"/>
+          </w:tcPr>
+          <w:p>
+            <w:r>
+              <w:t>OUI</w:t>
+            </w:r>
+          </w:p>
+        </w:tc>
+        <w:tc>
+          <w:tcPr>
+            <w:tcW w:w="5381" w:type="dxa"/>
+            <w:shd w:val="clear" w:color="auto" w:fill="C1F0C7" w:themeFill="accent3" w:themeFillTint="33"/>
+          </w:tcPr>
+          <w:p>
+            <w:hyperlink r:id="rId48" w:history="1">
+              <w:r>
+                <w:rPr>
+                  <w:rStyle w:val="Lienhypertexte"/>
+                </w:rPr>
+                <w:t>Ajouter un compteur d’argent</w:t>
+              </w:r>
+            </w:hyperlink>
+          </w:p>
+        </w:tc>
+      </w:tr>
+      <w:tr>
+        <w:tc>
+          <w:tcPr>
+            <w:tcW w:w="1724" w:type="dxa"/>
+            <w:shd w:val="clear" w:color="auto" w:fill="C1F0C7" w:themeFill="accent3" w:themeFillTint="33"/>
+          </w:tcPr>
+          <w:p>
+            <w:r>
+              <w:t>OUI</w:t>
+            </w:r>
+          </w:p>
+        </w:tc>
+        <w:tc>
+          <w:tcPr>
+            <w:tcW w:w="5381" w:type="dxa"/>
+            <w:shd w:val="clear" w:color="auto" w:fill="C1F0C7" w:themeFill="accent3" w:themeFillTint="33"/>
+          </w:tcPr>
+          <w:p>
+            <w:hyperlink r:id="rId49" w:history="1">
+              <w:r>
+                <w:rPr>
+                  <w:rStyle w:val="Lienhypertexte"/>
+                </w:rPr>
+                <w:t>Créer des ennemies de type manager</w:t>
+              </w:r>
+            </w:hyperlink>
+          </w:p>
+        </w:tc>
+      </w:tr>
+      <w:tr>
+        <w:tc>
+          <w:tcPr>
+            <w:tcW w:w="1724" w:type="dxa"/>
+            <w:shd w:val="clear" w:color="auto" w:fill="C1F0C7" w:themeFill="accent3" w:themeFillTint="33"/>
+          </w:tcPr>
+          <w:p>
+            <w:r>
+              <w:t>OUI</w:t>
+            </w:r>
+          </w:p>
+        </w:tc>
+        <w:tc>
+          <w:tcPr>
+            <w:tcW w:w="5381" w:type="dxa"/>
+            <w:shd w:val="clear" w:color="auto" w:fill="C1F0C7" w:themeFill="accent3" w:themeFillTint="33"/>
+          </w:tcPr>
+          <w:p>
+            <w:hyperlink r:id="rId50" w:history="1">
+              <w:r>
+                <w:rPr>
+                  <w:rStyle w:val="Lienhypertexte"/>
+                </w:rPr>
+                <w:t>Créer les projectiles des managers</w:t>
+              </w:r>
+            </w:hyperlink>
+          </w:p>
+        </w:tc>
+      </w:tr>
+      <w:tr>
+        <w:tc>
+          <w:tcPr>
+            <w:tcW w:w="1724" w:type="dxa"/>
+            <w:shd w:val="clear" w:color="auto" w:fill="C1F0C7" w:themeFill="accent3" w:themeFillTint="33"/>
+          </w:tcPr>
+          <w:p>
+            <w:r>
+              <w:t>OUI</w:t>
+            </w:r>
+          </w:p>
+        </w:tc>
+        <w:tc>
+          <w:tcPr>
+            <w:tcW w:w="5381" w:type="dxa"/>
+            <w:shd w:val="clear" w:color="auto" w:fill="C1F0C7" w:themeFill="accent3" w:themeFillTint="33"/>
+          </w:tcPr>
+          <w:p>
+            <w:hyperlink r:id="rId51" w:history="1">
+              <w:r>
+                <w:rPr>
+                  <w:rStyle w:val="Lienhypertexte"/>
+                </w:rPr>
+                <w:t>Créer des ennemies de type robot</w:t>
+              </w:r>
+            </w:hyperlink>
+          </w:p>
+        </w:tc>
+      </w:tr>
+      <w:tr>
+        <w:tc>
+          <w:tcPr>
+            <w:tcW w:w="1724" w:type="dxa"/>
+            <w:shd w:val="clear" w:color="auto" w:fill="C1F0C7" w:themeFill="accent3" w:themeFillTint="33"/>
+          </w:tcPr>
+          <w:p>
+            <w:r>
+              <w:t>OUI</w:t>
+            </w:r>
+          </w:p>
+        </w:tc>
+        <w:tc>
+          <w:tcPr>
+            <w:tcW w:w="5381" w:type="dxa"/>
+            <w:shd w:val="clear" w:color="auto" w:fill="C1F0C7" w:themeFill="accent3" w:themeFillTint="33"/>
+          </w:tcPr>
+          <w:p>
+            <w:hyperlink r:id="rId52" w:history="1">
+              <w:r>
+                <w:rPr>
+                  <w:rStyle w:val="Lienhypertexte"/>
+                </w:rPr>
+                <w:t>Créer les projectiles des robots</w:t>
+              </w:r>
+            </w:hyperlink>
+          </w:p>
+        </w:tc>
+      </w:tr>
+      <w:tr>
+        <w:tc>
+          <w:tcPr>
+            <w:tcW w:w="1724" w:type="dxa"/>
+            <w:shd w:val="clear" w:color="auto" w:fill="C1F0C7" w:themeFill="accent3" w:themeFillTint="33"/>
+          </w:tcPr>
+          <w:p>
+            <w:r>
+              <w:t>OUI</w:t>
+            </w:r>
+          </w:p>
+        </w:tc>
+        <w:tc>
+          <w:tcPr>
+            <w:tcW w:w="5381" w:type="dxa"/>
+            <w:shd w:val="clear" w:color="auto" w:fill="C1F0C7" w:themeFill="accent3" w:themeFillTint="33"/>
+          </w:tcPr>
+          <w:p>
+            <w:hyperlink r:id="rId53" w:history="1">
+              <w:r>
+                <w:rPr>
+                  <w:rStyle w:val="Lienhypertexte"/>
+                </w:rPr>
+                <w:t>Créer les obstacles</w:t>
+              </w:r>
+            </w:hyperlink>
+          </w:p>
+        </w:tc>
+      </w:tr>
+    </w:tbl>
+    <w:p>
+      <w:r>
+        <w:t xml:space="preserve">Comme vous pouvez le voir, tous ce qui était demander dans les US à été fait et </w:t>
+      </w:r>
+      <w:r>
+        <w:t>la version finale</w:t>
+      </w:r>
+      <w:r>
+        <w:t xml:space="preserve"> de contient aucun bug majeur,</w:t>
+      </w:r>
+    </w:p>
     <w:p>
       <w:pPr>
         <w:pStyle w:val="Titre2"/>
@@ -5357,11 +7815,45 @@
         <w:t>Conclusion</w:t>
       </w:r>
       <w:bookmarkEnd w:id="27"/>
+      <w:r>
+        <w:t xml:space="preserve"> personnelle</w:t>
+      </w:r>
+    </w:p>
+    <w:p>
+      <w:r>
+        <w:t>J’ai beaucoup apprécié ce projet car le C# et la programmation en général m’intéresse beaucoup</w:t>
+      </w:r>
+      <w:r>
+        <w:t>. J</w:t>
+      </w:r>
+      <w:r>
+        <w:t>’ai le sentiment d’avoir beaucoup progressé dans ce domaine. J’ai beaucoup aimé apprendre à propos des objets qui est un élément central de la programmation orienté objet.</w:t>
+      </w:r>
+      <w:r>
+        <w:t xml:space="preserve"> Je pense que cela va m’être très utile dans </w:t>
+      </w:r>
+      <w:r>
+        <w:t>mes projets personnels</w:t>
+      </w:r>
+      <w:r>
+        <w:t xml:space="preserve"> à la maison.</w:t>
+      </w:r>
+      <w:r>
+        <w:t xml:space="preserve"> </w:t>
+      </w:r>
+    </w:p>
+    <w:p>
+      <w:r>
+        <w:t xml:space="preserve">Je pense aussi que </w:t>
+      </w:r>
+      <w:r>
+        <w:t>le fait de s’entrainer à faire des tests est une bonne pratique car l’IA va nécessiter que de plus en plus de développeur soit à l’aise d’en écrire un grand nombre.</w:t>
+      </w:r>
     </w:p>
     <w:p/>
     <w:p/>
     <w:sectPr>
-      <w:footerReference w:type="default" r:id="rId34"/>
+      <w:footerReference w:type="default" r:id="rId54"/>
       <w:pgSz w:w="11906" w:h="16838"/>
       <w:pgMar w:top="1417" w:right="1417" w:bottom="1417" w:left="1417" w:header="708" w:footer="708" w:gutter="0"/>
       <w:cols w:space="708"/>
@@ -5497,16 +7989,16 @@
 <file path=word/numbering.xml><?xml version="1.0" encoding="utf-8"?>
 <w:numbering xmlns:wpc="http://schemas.microsoft.com/office/word/2010/wordprocessingCanvas" xmlns:cx="http://schemas.microsoft.com/office/drawing/2014/chartex" xmlns:cx1="http://schemas.microsoft.com/office/drawing/2015/9/8/chartex" xmlns:cx2="http://schemas.microsoft.com/office/drawing/2015/10/21/chartex" xmlns:cx3="http://schemas.microsoft.com/office/drawing/2016/5/9/chartex" xmlns:cx4="http://schemas.microsoft.com/office/drawing/2016/5/10/chartex" xmlns:cx5="http://schemas.microsoft.com/office/drawing/2016/5/11/chartex" xmlns:cx6="http://schemas.microsoft.com/office/drawing/2016/5/12/chartex" xmlns:cx7="http://schemas.microsoft.com/office/drawing/2016/5/13/chartex" xmlns:cx8="http://schemas.microsoft.com/office/drawing/2016/5/14/chartex" xmlns:mc="http://schemas.openxmlformats.org/markup-compatibility/2006" xmlns:aink="http://schemas.microsoft.com/office/drawing/2016/ink" xmlns:am3d="http://schemas.microsoft.com/office/drawing/2017/model3d" xmlns:o="urn:schemas-microsoft-com:office:office" xmlns:oel="http://schemas.microsoft.com/office/2019/extlst" xmlns:r="http://schemas.openxmlformats.org/officeDocument/2006/relationships" xmlns:m="http://schemas.openxmlformats.org/officeDocument/2006/math" xmlns:v="urn:schemas-microsoft-com:vml" xmlns:wp14="http://schemas.microsoft.com/office/word/2010/wordprocessingDrawing" xmlns:wp="http://schemas.openxmlformats.org/drawingml/2006/wordprocessingDrawing" xmlns:w10="urn:schemas-microsoft-com:office:word" xmlns:w="http://schemas.openxmlformats.org/wordprocessingml/2006/main" xmlns:w14="http://schemas.microsoft.com/office/word/2010/wordml" xmlns:w15="http://schemas.microsoft.com/office/word/2012/wordml" xmlns:w16cex="http://schemas.microsoft.com/office/word/2018/wordml/cex" xmlns:w16cid="http://schemas.microsoft.com/office/word/2016/wordml/cid" xmlns:w16="http://schemas.microsoft.com/office/word/2018/wordml" xmlns:w16du="http://schemas.microsoft.com/office/word/2023/wordml/word16du" xmlns:w16sdtdh="http://schemas.microsoft.com/office/word/2020/wordml/sdtdatahash" xmlns:w16sdtfl="http://schemas.microsoft.com/office/word/2024/wordml/sdtformatlock" xmlns:w16se="http://schemas.microsoft.com/office/word/2015/wordml/symex" xmlns:wpg="http://schemas.microsoft.com/office/word/2010/wordprocessingGroup" xmlns:wpi="http://schemas.microsoft.com/office/word/2010/wordprocessingInk" xmlns:wne="http://schemas.microsoft.com/office/word/2006/wordml" xmlns:wps="http://schemas.microsoft.com/office/word/2010/wordprocessingShape" mc:Ignorable="w14 w15 w16se w16cid w16 w16cex w16sdtdh w16sdtfl w16du wp14">
   <w:abstractNum w:abstractNumId="0" w15:restartNumberingAfterBreak="0">
-    <w:nsid w:val="18453E61"/>
+    <w:nsid w:val="024302BA"/>
     <w:multiLevelType w:val="hybridMultilevel"/>
-    <w:tmpl w:val="9C8ACA40"/>
+    <w:tmpl w:val="7F1CB2F4"/>
     <w:lvl w:ilvl="0" w:tplc="100C0001">
       <w:start w:val="1"/>
       <w:numFmt w:val="bullet"/>
       <w:lvlText w:val=""/>
       <w:lvlJc w:val="left"/>
       <w:pPr>
-        <w:ind w:left="1428" w:hanging="360"/>
+        <w:ind w:left="720" w:hanging="360"/>
       </w:pPr>
       <w:rPr>
         <w:rFonts w:ascii="Symbol" w:hAnsi="Symbol" w:hint="default"/>
@@ -5518,7 +8010,7 @@
       <w:lvlText w:val="o"/>
       <w:lvlJc w:val="left"/>
       <w:pPr>
-        <w:ind w:left="2148" w:hanging="360"/>
+        <w:ind w:left="1440" w:hanging="360"/>
       </w:pPr>
       <w:rPr>
         <w:rFonts w:ascii="Courier New" w:hAnsi="Courier New" w:cs="Courier New" w:hint="default"/>
@@ -5530,7 +8022,7 @@
       <w:lvlText w:val=""/>
       <w:lvlJc w:val="left"/>
       <w:pPr>
-        <w:ind w:left="2868" w:hanging="360"/>
+        <w:ind w:left="2160" w:hanging="360"/>
       </w:pPr>
       <w:rPr>
         <w:rFonts w:ascii="Wingdings" w:hAnsi="Wingdings" w:hint="default"/>
@@ -5542,7 +8034,7 @@
       <w:lvlText w:val=""/>
       <w:lvlJc w:val="left"/>
       <w:pPr>
-        <w:ind w:left="3588" w:hanging="360"/>
+        <w:ind w:left="2880" w:hanging="360"/>
       </w:pPr>
       <w:rPr>
         <w:rFonts w:ascii="Symbol" w:hAnsi="Symbol" w:hint="default"/>
@@ -5554,7 +8046,7 @@
       <w:lvlText w:val="o"/>
       <w:lvlJc w:val="left"/>
       <w:pPr>
-        <w:ind w:left="4308" w:hanging="360"/>
+        <w:ind w:left="3600" w:hanging="360"/>
       </w:pPr>
       <w:rPr>
         <w:rFonts w:ascii="Courier New" w:hAnsi="Courier New" w:cs="Courier New" w:hint="default"/>
@@ -5566,7 +8058,7 @@
       <w:lvlText w:val=""/>
       <w:lvlJc w:val="left"/>
       <w:pPr>
-        <w:ind w:left="5028" w:hanging="360"/>
+        <w:ind w:left="4320" w:hanging="360"/>
       </w:pPr>
       <w:rPr>
         <w:rFonts w:ascii="Wingdings" w:hAnsi="Wingdings" w:hint="default"/>
@@ -5578,7 +8070,7 @@
       <w:lvlText w:val=""/>
       <w:lvlJc w:val="left"/>
       <w:pPr>
-        <w:ind w:left="5748" w:hanging="360"/>
+        <w:ind w:left="5040" w:hanging="360"/>
       </w:pPr>
       <w:rPr>
         <w:rFonts w:ascii="Symbol" w:hAnsi="Symbol" w:hint="default"/>
@@ -5590,7 +8082,7 @@
       <w:lvlText w:val="o"/>
       <w:lvlJc w:val="left"/>
       <w:pPr>
-        <w:ind w:left="6468" w:hanging="360"/>
+        <w:ind w:left="5760" w:hanging="360"/>
       </w:pPr>
       <w:rPr>
         <w:rFonts w:ascii="Courier New" w:hAnsi="Courier New" w:cs="Courier New" w:hint="default"/>
@@ -5602,7 +8094,7 @@
       <w:lvlText w:val=""/>
       <w:lvlJc w:val="left"/>
       <w:pPr>
-        <w:ind w:left="7188" w:hanging="360"/>
+        <w:ind w:left="6480" w:hanging="360"/>
       </w:pPr>
       <w:rPr>
         <w:rFonts w:ascii="Wingdings" w:hAnsi="Wingdings" w:hint="default"/>
@@ -5610,9 +8102,9 @@
     </w:lvl>
   </w:abstractNum>
   <w:abstractNum w:abstractNumId="1" w15:restartNumberingAfterBreak="0">
-    <w:nsid w:val="2D7A620E"/>
+    <w:nsid w:val="18453E61"/>
     <w:multiLevelType w:val="hybridMultilevel"/>
-    <w:tmpl w:val="0FF81070"/>
+    <w:tmpl w:val="9C8ACA40"/>
     <w:lvl w:ilvl="0" w:tplc="100C0001">
       <w:start w:val="1"/>
       <w:numFmt w:val="bullet"/>
@@ -5723,95 +8215,9 @@
     </w:lvl>
   </w:abstractNum>
   <w:abstractNum w:abstractNumId="2" w15:restartNumberingAfterBreak="0">
-    <w:nsid w:val="3F7101C5"/>
+    <w:nsid w:val="2D7A620E"/>
     <w:multiLevelType w:val="hybridMultilevel"/>
-    <w:tmpl w:val="0C543136"/>
-    <w:lvl w:ilvl="0" w:tplc="100C000F">
-      <w:start w:val="1"/>
-      <w:numFmt w:val="decimal"/>
-      <w:lvlText w:val="%1."/>
-      <w:lvlJc w:val="left"/>
-      <w:pPr>
-        <w:ind w:left="1428" w:hanging="360"/>
-      </w:pPr>
-    </w:lvl>
-    <w:lvl w:ilvl="1" w:tplc="100C0019" w:tentative="1">
-      <w:start w:val="1"/>
-      <w:numFmt w:val="lowerLetter"/>
-      <w:lvlText w:val="%2."/>
-      <w:lvlJc w:val="left"/>
-      <w:pPr>
-        <w:ind w:left="2148" w:hanging="360"/>
-      </w:pPr>
-    </w:lvl>
-    <w:lvl w:ilvl="2" w:tplc="100C001B" w:tentative="1">
-      <w:start w:val="1"/>
-      <w:numFmt w:val="lowerRoman"/>
-      <w:lvlText w:val="%3."/>
-      <w:lvlJc w:val="right"/>
-      <w:pPr>
-        <w:ind w:left="2868" w:hanging="180"/>
-      </w:pPr>
-    </w:lvl>
-    <w:lvl w:ilvl="3" w:tplc="100C000F" w:tentative="1">
-      <w:start w:val="1"/>
-      <w:numFmt w:val="decimal"/>
-      <w:lvlText w:val="%4."/>
-      <w:lvlJc w:val="left"/>
-      <w:pPr>
-        <w:ind w:left="3588" w:hanging="360"/>
-      </w:pPr>
-    </w:lvl>
-    <w:lvl w:ilvl="4" w:tplc="100C0019" w:tentative="1">
-      <w:start w:val="1"/>
-      <w:numFmt w:val="lowerLetter"/>
-      <w:lvlText w:val="%5."/>
-      <w:lvlJc w:val="left"/>
-      <w:pPr>
-        <w:ind w:left="4308" w:hanging="360"/>
-      </w:pPr>
-    </w:lvl>
-    <w:lvl w:ilvl="5" w:tplc="100C001B" w:tentative="1">
-      <w:start w:val="1"/>
-      <w:numFmt w:val="lowerRoman"/>
-      <w:lvlText w:val="%6."/>
-      <w:lvlJc w:val="right"/>
-      <w:pPr>
-        <w:ind w:left="5028" w:hanging="180"/>
-      </w:pPr>
-    </w:lvl>
-    <w:lvl w:ilvl="6" w:tplc="100C000F" w:tentative="1">
-      <w:start w:val="1"/>
-      <w:numFmt w:val="decimal"/>
-      <w:lvlText w:val="%7."/>
-      <w:lvlJc w:val="left"/>
-      <w:pPr>
-        <w:ind w:left="5748" w:hanging="360"/>
-      </w:pPr>
-    </w:lvl>
-    <w:lvl w:ilvl="7" w:tplc="100C0019" w:tentative="1">
-      <w:start w:val="1"/>
-      <w:numFmt w:val="lowerLetter"/>
-      <w:lvlText w:val="%8."/>
-      <w:lvlJc w:val="left"/>
-      <w:pPr>
-        <w:ind w:left="6468" w:hanging="360"/>
-      </w:pPr>
-    </w:lvl>
-    <w:lvl w:ilvl="8" w:tplc="100C001B" w:tentative="1">
-      <w:start w:val="1"/>
-      <w:numFmt w:val="lowerRoman"/>
-      <w:lvlText w:val="%9."/>
-      <w:lvlJc w:val="right"/>
-      <w:pPr>
-        <w:ind w:left="7188" w:hanging="180"/>
-      </w:pPr>
-    </w:lvl>
-  </w:abstractNum>
-  <w:abstractNum w:abstractNumId="3" w15:restartNumberingAfterBreak="0">
-    <w:nsid w:val="545A582E"/>
-    <w:multiLevelType w:val="hybridMultilevel"/>
-    <w:tmpl w:val="3A622BE4"/>
+    <w:tmpl w:val="0FF81070"/>
     <w:lvl w:ilvl="0" w:tplc="100C0001">
       <w:start w:val="1"/>
       <w:numFmt w:val="bullet"/>
@@ -5921,17 +8327,219 @@
       </w:rPr>
     </w:lvl>
   </w:abstractNum>
+  <w:abstractNum w:abstractNumId="3" w15:restartNumberingAfterBreak="0">
+    <w:nsid w:val="3F7101C5"/>
+    <w:multiLevelType w:val="hybridMultilevel"/>
+    <w:tmpl w:val="0C543136"/>
+    <w:lvl w:ilvl="0" w:tplc="100C000F">
+      <w:start w:val="1"/>
+      <w:numFmt w:val="decimal"/>
+      <w:lvlText w:val="%1."/>
+      <w:lvlJc w:val="left"/>
+      <w:pPr>
+        <w:ind w:left="1428" w:hanging="360"/>
+      </w:pPr>
+    </w:lvl>
+    <w:lvl w:ilvl="1" w:tplc="100C0019" w:tentative="1">
+      <w:start w:val="1"/>
+      <w:numFmt w:val="lowerLetter"/>
+      <w:lvlText w:val="%2."/>
+      <w:lvlJc w:val="left"/>
+      <w:pPr>
+        <w:ind w:left="2148" w:hanging="360"/>
+      </w:pPr>
+    </w:lvl>
+    <w:lvl w:ilvl="2" w:tplc="100C001B" w:tentative="1">
+      <w:start w:val="1"/>
+      <w:numFmt w:val="lowerRoman"/>
+      <w:lvlText w:val="%3."/>
+      <w:lvlJc w:val="right"/>
+      <w:pPr>
+        <w:ind w:left="2868" w:hanging="180"/>
+      </w:pPr>
+    </w:lvl>
+    <w:lvl w:ilvl="3" w:tplc="100C000F" w:tentative="1">
+      <w:start w:val="1"/>
+      <w:numFmt w:val="decimal"/>
+      <w:lvlText w:val="%4."/>
+      <w:lvlJc w:val="left"/>
+      <w:pPr>
+        <w:ind w:left="3588" w:hanging="360"/>
+      </w:pPr>
+    </w:lvl>
+    <w:lvl w:ilvl="4" w:tplc="100C0019" w:tentative="1">
+      <w:start w:val="1"/>
+      <w:numFmt w:val="lowerLetter"/>
+      <w:lvlText w:val="%5."/>
+      <w:lvlJc w:val="left"/>
+      <w:pPr>
+        <w:ind w:left="4308" w:hanging="360"/>
+      </w:pPr>
+    </w:lvl>
+    <w:lvl w:ilvl="5" w:tplc="100C001B" w:tentative="1">
+      <w:start w:val="1"/>
+      <w:numFmt w:val="lowerRoman"/>
+      <w:lvlText w:val="%6."/>
+      <w:lvlJc w:val="right"/>
+      <w:pPr>
+        <w:ind w:left="5028" w:hanging="180"/>
+      </w:pPr>
+    </w:lvl>
+    <w:lvl w:ilvl="6" w:tplc="100C000F" w:tentative="1">
+      <w:start w:val="1"/>
+      <w:numFmt w:val="decimal"/>
+      <w:lvlText w:val="%7."/>
+      <w:lvlJc w:val="left"/>
+      <w:pPr>
+        <w:ind w:left="5748" w:hanging="360"/>
+      </w:pPr>
+    </w:lvl>
+    <w:lvl w:ilvl="7" w:tplc="100C0019" w:tentative="1">
+      <w:start w:val="1"/>
+      <w:numFmt w:val="lowerLetter"/>
+      <w:lvlText w:val="%8."/>
+      <w:lvlJc w:val="left"/>
+      <w:pPr>
+        <w:ind w:left="6468" w:hanging="360"/>
+      </w:pPr>
+    </w:lvl>
+    <w:lvl w:ilvl="8" w:tplc="100C001B" w:tentative="1">
+      <w:start w:val="1"/>
+      <w:numFmt w:val="lowerRoman"/>
+      <w:lvlText w:val="%9."/>
+      <w:lvlJc w:val="right"/>
+      <w:pPr>
+        <w:ind w:left="7188" w:hanging="180"/>
+      </w:pPr>
+    </w:lvl>
+  </w:abstractNum>
+  <w:abstractNum w:abstractNumId="4" w15:restartNumberingAfterBreak="0">
+    <w:nsid w:val="545A582E"/>
+    <w:multiLevelType w:val="hybridMultilevel"/>
+    <w:tmpl w:val="3A622BE4"/>
+    <w:lvl w:ilvl="0" w:tplc="100C0001">
+      <w:start w:val="1"/>
+      <w:numFmt w:val="bullet"/>
+      <w:lvlText w:val=""/>
+      <w:lvlJc w:val="left"/>
+      <w:pPr>
+        <w:ind w:left="1428" w:hanging="360"/>
+      </w:pPr>
+      <w:rPr>
+        <w:rFonts w:ascii="Symbol" w:hAnsi="Symbol" w:hint="default"/>
+      </w:rPr>
+    </w:lvl>
+    <w:lvl w:ilvl="1" w:tplc="100C0003" w:tentative="1">
+      <w:start w:val="1"/>
+      <w:numFmt w:val="bullet"/>
+      <w:lvlText w:val="o"/>
+      <w:lvlJc w:val="left"/>
+      <w:pPr>
+        <w:ind w:left="2148" w:hanging="360"/>
+      </w:pPr>
+      <w:rPr>
+        <w:rFonts w:ascii="Courier New" w:hAnsi="Courier New" w:cs="Courier New" w:hint="default"/>
+      </w:rPr>
+    </w:lvl>
+    <w:lvl w:ilvl="2" w:tplc="100C0005" w:tentative="1">
+      <w:start w:val="1"/>
+      <w:numFmt w:val="bullet"/>
+      <w:lvlText w:val=""/>
+      <w:lvlJc w:val="left"/>
+      <w:pPr>
+        <w:ind w:left="2868" w:hanging="360"/>
+      </w:pPr>
+      <w:rPr>
+        <w:rFonts w:ascii="Wingdings" w:hAnsi="Wingdings" w:hint="default"/>
+      </w:rPr>
+    </w:lvl>
+    <w:lvl w:ilvl="3" w:tplc="100C0001" w:tentative="1">
+      <w:start w:val="1"/>
+      <w:numFmt w:val="bullet"/>
+      <w:lvlText w:val=""/>
+      <w:lvlJc w:val="left"/>
+      <w:pPr>
+        <w:ind w:left="3588" w:hanging="360"/>
+      </w:pPr>
+      <w:rPr>
+        <w:rFonts w:ascii="Symbol" w:hAnsi="Symbol" w:hint="default"/>
+      </w:rPr>
+    </w:lvl>
+    <w:lvl w:ilvl="4" w:tplc="100C0003" w:tentative="1">
+      <w:start w:val="1"/>
+      <w:numFmt w:val="bullet"/>
+      <w:lvlText w:val="o"/>
+      <w:lvlJc w:val="left"/>
+      <w:pPr>
+        <w:ind w:left="4308" w:hanging="360"/>
+      </w:pPr>
+      <w:rPr>
+        <w:rFonts w:ascii="Courier New" w:hAnsi="Courier New" w:cs="Courier New" w:hint="default"/>
+      </w:rPr>
+    </w:lvl>
+    <w:lvl w:ilvl="5" w:tplc="100C0005" w:tentative="1">
+      <w:start w:val="1"/>
+      <w:numFmt w:val="bullet"/>
+      <w:lvlText w:val=""/>
+      <w:lvlJc w:val="left"/>
+      <w:pPr>
+        <w:ind w:left="5028" w:hanging="360"/>
+      </w:pPr>
+      <w:rPr>
+        <w:rFonts w:ascii="Wingdings" w:hAnsi="Wingdings" w:hint="default"/>
+      </w:rPr>
+    </w:lvl>
+    <w:lvl w:ilvl="6" w:tplc="100C0001" w:tentative="1">
+      <w:start w:val="1"/>
+      <w:numFmt w:val="bullet"/>
+      <w:lvlText w:val=""/>
+      <w:lvlJc w:val="left"/>
+      <w:pPr>
+        <w:ind w:left="5748" w:hanging="360"/>
+      </w:pPr>
+      <w:rPr>
+        <w:rFonts w:ascii="Symbol" w:hAnsi="Symbol" w:hint="default"/>
+      </w:rPr>
+    </w:lvl>
+    <w:lvl w:ilvl="7" w:tplc="100C0003" w:tentative="1">
+      <w:start w:val="1"/>
+      <w:numFmt w:val="bullet"/>
+      <w:lvlText w:val="o"/>
+      <w:lvlJc w:val="left"/>
+      <w:pPr>
+        <w:ind w:left="6468" w:hanging="360"/>
+      </w:pPr>
+      <w:rPr>
+        <w:rFonts w:ascii="Courier New" w:hAnsi="Courier New" w:cs="Courier New" w:hint="default"/>
+      </w:rPr>
+    </w:lvl>
+    <w:lvl w:ilvl="8" w:tplc="100C0005" w:tentative="1">
+      <w:start w:val="1"/>
+      <w:numFmt w:val="bullet"/>
+      <w:lvlText w:val=""/>
+      <w:lvlJc w:val="left"/>
+      <w:pPr>
+        <w:ind w:left="7188" w:hanging="360"/>
+      </w:pPr>
+      <w:rPr>
+        <w:rFonts w:ascii="Wingdings" w:hAnsi="Wingdings" w:hint="default"/>
+      </w:rPr>
+    </w:lvl>
+  </w:abstractNum>
   <w:num w:numId="1" w16cid:durableId="1366128865">
-    <w:abstractNumId w:val="0"/>
+    <w:abstractNumId w:val="1"/>
   </w:num>
   <w:num w:numId="2" w16cid:durableId="1372267493">
+    <w:abstractNumId w:val="3"/>
+  </w:num>
+  <w:num w:numId="3" w16cid:durableId="937493040">
     <w:abstractNumId w:val="2"/>
   </w:num>
-  <w:num w:numId="3" w16cid:durableId="937493040">
-    <w:abstractNumId w:val="1"/>
+  <w:num w:numId="4" w16cid:durableId="703211964">
+    <w:abstractNumId w:val="4"/>
   </w:num>
-  <w:num w:numId="4" w16cid:durableId="703211964">
-    <w:abstractNumId w:val="3"/>
+  <w:num w:numId="5" w16cid:durableId="1182403574">
+    <w:abstractNumId w:val="0"/>
   </w:num>
 </w:numbering>
 </file>

</xml_diff>